<commit_message>
feat: add P9/PGT submission enrichers and clean templates (#93)
* init

* updates linting

* Potential fix for pull request finding 'Missed opportunity to use Where'

Co-authored-by: Copilot Autofix powered by AI <223894421+github-code-quality[bot]@users.noreply.github.com>

* lint

---------

Co-authored-by: Copilot Autofix powered by AI <223894421+github-code-quality[bot]@users.noreply.github.com>
</commit_message>
<xml_diff>
--- a/api/Templates/P1.docx
+++ b/api/Templates/P1.docx
@@ -9,22 +9,27 @@
         <w:jc w:val="center"/>
         <w:rPr>
           <w:sz w:val="21"/>
+          <w:szCs w:val="21"/>
         </w:rPr>
       </w:pPr>
       <w:r>
         <w:rPr>
-          <w:b/>
+          <w:b w:val="1"/>
+          <w:bCs w:val="1"/>
           <w:color w:val="313131"/>
           <w:sz w:val="21"/>
+          <w:szCs w:val="21"/>
         </w:rPr>
         <w:t>FORM P1</w:t>
       </w:r>
       <w:r>
         <w:rPr>
-          <w:b/>
+          <w:b w:val="1"/>
+          <w:bCs w:val="1"/>
           <w:color w:val="313131"/>
           <w:spacing w:val="-1"/>
           <w:sz w:val="21"/>
+          <w:szCs w:val="21"/>
         </w:rPr>
         <w:t xml:space="preserve"> </w:t>
       </w:r>
@@ -32,14 +37,24 @@
         <w:rPr>
           <w:color w:val="313131"/>
           <w:sz w:val="21"/>
-        </w:rPr>
-        <w:t xml:space="preserve">(RULE 25-2 (3) </w:t>
+          <w:szCs w:val="21"/>
+        </w:rPr>
+        <w:t xml:space="preserve">(RULE 25-2 (3</w:t>
+      </w:r>
+      <w:r>
+        <w:rPr>
+          <w:color w:val="313131"/>
+          <w:sz w:val="21"/>
+          <w:szCs w:val="21"/>
+        </w:rPr>
+        <w:t xml:space="preserve">)</w:t>
       </w:r>
       <w:r>
         <w:rPr>
           <w:color w:val="313131"/>
           <w:spacing w:val="-10"/>
           <w:sz w:val="21"/>
+          <w:szCs w:val="21"/>
         </w:rPr>
         <w:t>)</w:t>
       </w:r>
@@ -218,12 +233,14 @@
         <w:ind w:left="288" w:right="325"/>
         <w:rPr>
           <w:sz w:val="20"/>
+          <w:szCs w:val="20"/>
         </w:rPr>
       </w:pPr>
       <w:r>
         <w:rPr>
           <w:color w:val="313131"/>
           <w:sz w:val="20"/>
+          <w:szCs w:val="20"/>
         </w:rPr>
         <w:t>The</w:t>
       </w:r>
@@ -232,13 +249,15 @@
           <w:color w:val="313131"/>
           <w:spacing w:val="-5"/>
           <w:sz w:val="20"/>
-        </w:rPr>
-        <w:t xml:space="preserve"> </w:t>
-      </w:r>
-      <w:r>
-        <w:rPr>
-          <w:color w:val="313131"/>
-          <w:sz w:val="20"/>
+          <w:szCs w:val="20"/>
+        </w:rPr>
+        <w:t xml:space="preserve"> </w:t>
+      </w:r>
+      <w:r>
+        <w:rPr>
+          <w:color w:val="313131"/>
+          <w:sz w:val="20"/>
+          <w:szCs w:val="20"/>
         </w:rPr>
         <w:t>applicant</w:t>
       </w:r>
@@ -247,19 +266,38 @@
           <w:color w:val="313131"/>
           <w:spacing w:val="-5"/>
           <w:sz w:val="20"/>
-        </w:rPr>
-        <w:t xml:space="preserve"> </w:t>
-      </w:r>
-      <w:r>
-        <w:rPr>
-          <w:b/>
-          <w:u w:val="single"/>
-        </w:rPr>
-        <w:t xml:space="preserve">{d.applicant.applicantName}</w:t>
-      </w:r>
-      <w:r>
-        <w:rPr>
-          <w:b/>
+          <w:szCs w:val="20"/>
+        </w:rPr>
+        <w:t xml:space="preserve"> </w:t>
+      </w:r>
+      <w:r>
+        <w:rPr>
+          <w:b w:val="1"/>
+          <w:bCs w:val="1"/>
+          <w:u w:val="single"/>
+        </w:rPr>
+        <w:t xml:space="preserve">{</w:t>
+      </w:r>
+      <w:r>
+        <w:rPr>
+          <w:b w:val="1"/>
+          <w:bCs w:val="1"/>
+          <w:u w:val="single"/>
+        </w:rPr>
+        <w:t xml:space="preserve">d.applicant.applicantName</w:t>
+      </w:r>
+      <w:r>
+        <w:rPr>
+          <w:b w:val="1"/>
+          <w:bCs w:val="1"/>
+          <w:u w:val="single"/>
+        </w:rPr>
+        <w:t xml:space="preserve">}</w:t>
+      </w:r>
+      <w:r>
+        <w:rPr>
+          <w:b w:val="1"/>
+          <w:bCs w:val="1"/>
           <w:spacing w:val="-10"/>
         </w:rPr>
         <w:t xml:space="preserve"> </w:t>
@@ -268,6 +306,7 @@
         <w:rPr>
           <w:color w:val="313131"/>
           <w:sz w:val="20"/>
+          <w:szCs w:val="20"/>
         </w:rPr>
         <w:t>proposes</w:t>
       </w:r>
@@ -276,13 +315,15 @@
           <w:color w:val="313131"/>
           <w:spacing w:val="-5"/>
           <w:sz w:val="20"/>
-        </w:rPr>
-        <w:t xml:space="preserve"> </w:t>
-      </w:r>
-      <w:r>
-        <w:rPr>
-          <w:color w:val="313131"/>
-          <w:sz w:val="20"/>
+          <w:szCs w:val="20"/>
+        </w:rPr>
+        <w:t xml:space="preserve"> </w:t>
+      </w:r>
+      <w:r>
+        <w:rPr>
+          <w:color w:val="313131"/>
+          <w:sz w:val="20"/>
+          <w:szCs w:val="20"/>
         </w:rPr>
         <w:t>to</w:t>
       </w:r>
@@ -291,13 +332,15 @@
           <w:color w:val="313131"/>
           <w:spacing w:val="-5"/>
           <w:sz w:val="20"/>
-        </w:rPr>
-        <w:t xml:space="preserve"> </w:t>
-      </w:r>
-      <w:r>
-        <w:rPr>
-          <w:color w:val="313131"/>
-          <w:sz w:val="20"/>
+          <w:szCs w:val="20"/>
+        </w:rPr>
+        <w:t xml:space="preserve"> </w:t>
+      </w:r>
+      <w:r>
+        <w:rPr>
+          <w:color w:val="313131"/>
+          <w:sz w:val="20"/>
+          <w:szCs w:val="20"/>
         </w:rPr>
         <w:t>apply,</w:t>
       </w:r>
@@ -306,13 +349,15 @@
           <w:color w:val="313131"/>
           <w:spacing w:val="-5"/>
           <w:sz w:val="20"/>
-        </w:rPr>
-        <w:t xml:space="preserve"> </w:t>
-      </w:r>
-      <w:r>
-        <w:rPr>
-          <w:color w:val="313131"/>
-          <w:sz w:val="20"/>
+          <w:szCs w:val="20"/>
+        </w:rPr>
+        <w:t xml:space="preserve"> </w:t>
+      </w:r>
+      <w:r>
+        <w:rPr>
+          <w:color w:val="313131"/>
+          <w:sz w:val="20"/>
+          <w:szCs w:val="20"/>
         </w:rPr>
         <w:t>in</w:t>
       </w:r>
@@ -321,13 +366,15 @@
           <w:color w:val="313131"/>
           <w:spacing w:val="-5"/>
           <w:sz w:val="20"/>
-        </w:rPr>
-        <w:t xml:space="preserve"> </w:t>
-      </w:r>
-      <w:r>
-        <w:rPr>
-          <w:color w:val="313131"/>
-          <w:sz w:val="20"/>
+          <w:szCs w:val="20"/>
+        </w:rPr>
+        <w:t xml:space="preserve"> </w:t>
+      </w:r>
+      <w:r>
+        <w:rPr>
+          <w:color w:val="313131"/>
+          <w:sz w:val="20"/>
+          <w:szCs w:val="20"/>
         </w:rPr>
         <w:t>the</w:t>
       </w:r>
@@ -336,19 +383,46 @@
           <w:color w:val="313131"/>
           <w:spacing w:val="-5"/>
           <w:sz w:val="20"/>
-        </w:rPr>
-        <w:t xml:space="preserve"> </w:t>
-      </w:r>
-      <w:r>
-        <w:rPr>
-          <w:b/>
-          <w:u w:val="single"/>
-        </w:rPr>
-        <w:t xml:space="preserve">{d.applicant.applicantCourthouse}</w:t>
-      </w:r>
-      <w:r>
-        <w:rPr>
-          <w:b/>
+          <w:szCs w:val="20"/>
+        </w:rPr>
+        <w:t xml:space="preserve"> </w:t>
+      </w:r>
+      <w:r>
+        <w:rPr>
+          <w:b w:val="1"/>
+          <w:bCs w:val="1"/>
+          <w:u w:val="single"/>
+        </w:rPr>
+        <w:t xml:space="preserve">{</w:t>
+      </w:r>
+      <w:r>
+        <w:rPr>
+          <w:b w:val="1"/>
+          <w:bCs w:val="1"/>
+          <w:u w:val="single"/>
+        </w:rPr>
+        <w:t xml:space="preserve">d.applicant.applicantCourthouse</w:t>
+      </w:r>
+      <w:r>
+        <w:rPr>
+          <w:b w:val="1"/>
+          <w:bCs w:val="1"/>
+          <w:u w:val="single"/>
+        </w:rPr>
+        <w:t xml:space="preserve">Name</w:t>
+      </w:r>
+      <w:r>
+        <w:rPr>
+          <w:b w:val="1"/>
+          <w:bCs w:val="1"/>
+          <w:u w:val="single"/>
+        </w:rPr>
+        <w:t xml:space="preserve">}</w:t>
+      </w:r>
+      <w:r>
+        <w:rPr>
+          <w:b w:val="1"/>
+          <w:bCs w:val="1"/>
           <w:spacing w:val="-10"/>
         </w:rPr>
         <w:t xml:space="preserve"> </w:t>
@@ -357,6 +431,7 @@
         <w:rPr>
           <w:color w:val="313131"/>
           <w:sz w:val="20"/>
+          <w:szCs w:val="20"/>
         </w:rPr>
         <w:t>registry,</w:t>
       </w:r>
@@ -365,13 +440,15 @@
           <w:color w:val="313131"/>
           <w:spacing w:val="-5"/>
           <w:sz w:val="20"/>
-        </w:rPr>
-        <w:t xml:space="preserve"> </w:t>
-      </w:r>
-      <w:r>
-        <w:rPr>
-          <w:color w:val="313131"/>
-          <w:sz w:val="20"/>
+          <w:szCs w:val="20"/>
+        </w:rPr>
+        <w:t xml:space="preserve"> </w:t>
+      </w:r>
+      <w:r>
+        <w:rPr>
+          <w:color w:val="313131"/>
+          <w:sz w:val="20"/>
+          <w:szCs w:val="20"/>
         </w:rPr>
         <w:t>for</w:t>
       </w:r>
@@ -380,13 +457,15 @@
           <w:color w:val="313131"/>
           <w:spacing w:val="-5"/>
           <w:sz w:val="20"/>
-        </w:rPr>
-        <w:t xml:space="preserve"> </w:t>
-      </w:r>
-      <w:r>
-        <w:rPr>
-          <w:color w:val="313131"/>
-          <w:sz w:val="20"/>
+          <w:szCs w:val="20"/>
+        </w:rPr>
+        <w:t xml:space="preserve"> </w:t>
+      </w:r>
+      <w:r>
+        <w:rPr>
+          <w:color w:val="313131"/>
+          <w:sz w:val="20"/>
+          <w:szCs w:val="20"/>
         </w:rPr>
         <w:t>a</w:t>
       </w:r>
@@ -395,25 +474,29 @@
           <w:color w:val="313131"/>
           <w:spacing w:val="-5"/>
           <w:sz w:val="20"/>
-        </w:rPr>
-        <w:t xml:space="preserve"> </w:t>
-      </w:r>
-      <w:r>
-        <w:rPr>
-          <w:b/>
+          <w:szCs w:val="20"/>
+        </w:rPr>
+        <w:t xml:space="preserve"> </w:t>
+      </w:r>
+      <w:r>
+        <w:rPr>
+          <w:b w:val="1"/>
+          <w:bCs w:val="1"/>
         </w:rPr>
         <w:t>Grant</w:t>
       </w:r>
       <w:r>
         <w:rPr>
-          <w:b/>
+          <w:b w:val="1"/>
+          <w:bCs w:val="1"/>
           <w:spacing w:val="-5"/>
         </w:rPr>
         <w:t xml:space="preserve"> </w:t>
       </w:r>
       <w:r>
         <w:rPr>
-          <w:b/>
+          <w:b w:val="1"/>
+          <w:bCs w:val="1"/>
         </w:rPr>
         <w:t xml:space="preserve">of Administration Without Will Annexed </w:t>
       </w:r>
@@ -421,20 +504,39 @@
         <w:rPr>
           <w:color w:val="313131"/>
           <w:sz w:val="20"/>
+          <w:szCs w:val="20"/>
         </w:rPr>
         <w:t xml:space="preserve">in relation to the estate of the deceased described below who died on </w:t>
       </w:r>
       <w:r>
         <w:rPr>
-          <w:b/>
-          <w:u w:val="single"/>
-        </w:rPr>
-        <w:t xml:space="preserve">{d.deceasedDeathDate}</w:t>
-      </w:r>
-      <w:r>
-        <w:rPr>
-          <w:color w:val="313131"/>
-          <w:sz w:val="20"/>
+          <w:b w:val="1"/>
+          <w:bCs w:val="1"/>
+          <w:u w:val="single"/>
+        </w:rPr>
+        <w:t xml:space="preserve">{</w:t>
+      </w:r>
+      <w:r>
+        <w:rPr>
+          <w:b w:val="1"/>
+          <w:bCs w:val="1"/>
+          <w:u w:val="single"/>
+        </w:rPr>
+        <w:t xml:space="preserve">d.deceasedDeathDate</w:t>
+      </w:r>
+      <w:r>
+        <w:rPr>
+          <w:b w:val="1"/>
+          <w:bCs w:val="1"/>
+          <w:u w:val="single"/>
+        </w:rPr>
+        <w:t xml:space="preserve">}</w:t>
+      </w:r>
+      <w:r>
+        <w:rPr>
+          <w:color w:val="313131"/>
+          <w:sz w:val="20"/>
+          <w:szCs w:val="20"/>
         </w:rPr>
         <w:t>.</w:t>
       </w:r>
@@ -462,13 +564,111 @@
     <w:p>
       <w:pPr>
         <w:pStyle w:val="Heading3"/>
+        <w:rPr>
+          <w:b w:val="1"/>
+          <w:bCs w:val="1"/>
+          <w:u w:val="single"/>
+          <w:lang w:val="fr-FR"/>
+        </w:rPr>
       </w:pPr>
       <w:r>
         <w:rPr>
-          <w:b w:val="0"/>
-          <w:u w:val="single"/>
-        </w:rPr>
-        <w:t xml:space="preserve">{d.firstNameGivenName}   {d.middleNameS}   {d.lastNameFamilyNameOrSurname}</w:t>
+          <w:b w:val="1"/>
+          <w:bCs w:val="1"/>
+          <w:u w:val="single"/>
+          <w:lang w:val="fr-FR"/>
+        </w:rPr>
+        <w:t>{</w:t>
+      </w:r>
+      <w:r>
+        <w:rPr>
+          <w:b w:val="1"/>
+          <w:bCs w:val="1"/>
+          <w:u w:val="single"/>
+          <w:lang w:val="fr-FR"/>
+        </w:rPr>
+        <w:t>d.firstNameGivenName</w:t>
+      </w:r>
+      <w:r>
+        <w:rPr>
+          <w:b w:val="1"/>
+          <w:bCs w:val="1"/>
+          <w:u w:val="single"/>
+          <w:lang w:val="fr-FR"/>
+        </w:rPr>
+        <w:t>}</w:t>
+      </w:r>
+      <w:r>
+        <w:rPr>
+          <w:b w:val="1"/>
+          <w:bCs w:val="1"/>
+          <w:u w:val="single"/>
+          <w:lang w:val="fr-FR"/>
+        </w:rPr>
+        <w:t xml:space="preserve"> </w:t>
+      </w:r>
+      <w:r>
+        <w:rPr>
+          <w:b w:val="1"/>
+          <w:bCs w:val="1"/>
+          <w:u w:val="single"/>
+          <w:lang w:val="fr-FR"/>
+        </w:rPr>
+        <w:t>{</w:t>
+      </w:r>
+      <w:r>
+        <w:rPr>
+          <w:b w:val="1"/>
+          <w:bCs w:val="1"/>
+          <w:u w:val="single"/>
+          <w:lang w:val="fr-FR"/>
+        </w:rPr>
+        <w:t>d.middleNameS</w:t>
+      </w:r>
+      <w:r>
+        <w:rPr>
+          <w:b w:val="1"/>
+          <w:bCs w:val="1"/>
+          <w:u w:val="single"/>
+          <w:lang w:val="fr-FR"/>
+        </w:rPr>
+        <w:t>}</w:t>
+      </w:r>
+      <w:r>
+        <w:rPr>
+          <w:b w:val="1"/>
+          <w:bCs w:val="1"/>
+          <w:u w:val="single"/>
+          <w:lang w:val="fr-FR"/>
+        </w:rPr>
+        <w:t xml:space="preserve"> </w:t>
+      </w:r>
+      <w:r>
+        <w:rPr>
+          <w:b w:val="1"/>
+          <w:bCs w:val="1"/>
+          <w:u w:val="single"/>
+          <w:lang w:val="fr-FR"/>
+        </w:rPr>
+        <w:t>{</w:t>
+      </w:r>
+      <w:r>
+        <w:rPr>
+          <w:b w:val="1"/>
+          <w:bCs w:val="1"/>
+          <w:u w:val="single"/>
+          <w:lang w:val="fr-FR"/>
+        </w:rPr>
+        <w:t>d.lastNameFamilyNameOrSurname</w:t>
+      </w:r>
+      <w:r>
+        <w:rPr>
+          <w:b w:val="1"/>
+          <w:bCs w:val="1"/>
+          <w:u w:val="single"/>
+          <w:lang w:val="fr-FR"/>
+        </w:rPr>
+        <w:t>}</w:t>
       </w:r>
     </w:p>
     <w:p>
@@ -561,18 +761,159 @@
     </w:p>
     <w:p>
       <w:pPr>
+        <w:pStyle w:val="Normal"/>
         <w:spacing w:before="29"/>
         <w:ind w:left="288"/>
         <w:rPr>
-          <w:b/>
+          <w:b w:val="1"/>
+          <w:bCs w:val="1"/>
+          <w:u w:val="single"/>
+          <w:lang w:val="en-US"/>
         </w:rPr>
       </w:pPr>
       <w:r>
         <w:rPr>
-          <w:b/>
-          <w:u w:val="single"/>
-        </w:rPr>
-        <w:t xml:space="preserve">{d.deceasedAddressStreet}, {d.deceasedAddressCity}, {d.deceasedAddressProvince} {d.deceasedAddressPostalCode}</w:t>
+          <w:b w:val="1"/>
+          <w:bCs w:val="1"/>
+          <w:u w:val="single"/>
+          <w:lang w:val="fr-FR"/>
+        </w:rPr>
+        <w:t>{</w:t>
+      </w:r>
+      <w:r>
+        <w:rPr>
+          <w:b w:val="1"/>
+          <w:bCs w:val="1"/>
+          <w:u w:val="single"/>
+          <w:lang w:val="fr-FR"/>
+        </w:rPr>
+        <w:t>d.deceasedAddressStreet</w:t>
+      </w:r>
+      <w:r>
+        <w:rPr>
+          <w:b w:val="1"/>
+          <w:bCs w:val="1"/>
+          <w:u w:val="single"/>
+          <w:lang w:val="fr-FR"/>
+        </w:rPr>
+        <w:t>}, {</w:t>
+      </w:r>
+      <w:r>
+        <w:rPr>
+          <w:b w:val="1"/>
+          <w:bCs w:val="1"/>
+          <w:u w:val="single"/>
+          <w:lang w:val="fr-FR"/>
+        </w:rPr>
+        <w:t>d.deceasedAddressCity</w:t>
+      </w:r>
+      <w:r>
+        <w:rPr>
+          <w:b w:val="1"/>
+          <w:bCs w:val="1"/>
+          <w:u w:val="single"/>
+          <w:lang w:val="fr-FR"/>
+        </w:rPr>
+        <w:t>}, {</w:t>
+      </w:r>
+      <w:r>
+        <w:rPr>
+          <w:b w:val="1"/>
+          <w:bCs w:val="1"/>
+          <w:u w:val="single"/>
+          <w:lang w:val="fr-FR"/>
+        </w:rPr>
+        <w:t>d.deceasedAddressProvince</w:t>
+      </w:r>
+      <w:r>
+        <w:rPr>
+          <w:b w:val="1"/>
+          <w:bCs w:val="1"/>
+          <w:u w:val="single"/>
+          <w:lang w:val="fr-FR"/>
+        </w:rPr>
+        <w:t>}</w:t>
+      </w:r>
+      <w:r>
+        <w:rPr>
+          <w:b w:val="1"/>
+          <w:bCs w:val="1"/>
+          <w:u w:val="single"/>
+          <w:lang w:val="fr-FR"/>
+        </w:rPr>
+        <w:t xml:space="preserve">, </w:t>
+      </w:r>
+      <w:r>
+        <w:rPr>
+          <w:b w:val="1"/>
+          <w:bCs w:val="1"/>
+          <w:u w:val="single"/>
+          <w:lang w:val="fr-FR"/>
+        </w:rPr>
+        <w:t>{</w:t>
+      </w:r>
+      <w:r>
+        <w:rPr>
+          <w:b w:val="1"/>
+          <w:bCs w:val="1"/>
+          <w:u w:val="single"/>
+          <w:lang w:val="fr-FR"/>
+        </w:rPr>
+        <w:t>d.deceasedAddressPostalCode</w:t>
+      </w:r>
+      <w:r>
+        <w:rPr>
+          <w:b w:val="1"/>
+          <w:bCs w:val="1"/>
+          <w:u w:val="single"/>
+          <w:lang w:val="fr-FR"/>
+        </w:rPr>
+        <w:t>}</w:t>
+      </w:r>
+      <w:r>
+        <w:rPr>
+          <w:b w:val="1"/>
+          <w:bCs w:val="1"/>
+          <w:u w:val="single"/>
+          <w:lang w:val="fr-FR"/>
+        </w:rPr>
+        <w:t xml:space="preserve"> </w:t>
+      </w:r>
+      <w:r>
+        <w:rPr>
+          <w:b w:val="1"/>
+          <w:bCs w:val="1"/>
+          <w:u w:val="single"/>
+          <w:lang w:val="en-US"/>
+        </w:rPr>
+        <w:t>{</w:t>
+      </w:r>
+      <w:r>
+        <w:rPr>
+          <w:b w:val="1"/>
+          <w:bCs w:val="1"/>
+          <w:u w:val="single"/>
+          <w:lang w:val="en-US"/>
+        </w:rPr>
+        <w:t>d.</w:t>
+      </w:r>
+      <w:r>
+        <w:rPr>
+          <w:b w:val="1"/>
+          <w:bCs w:val="1"/>
+          <w:u w:val="single"/>
+          <w:lang w:val="en-US"/>
+        </w:rPr>
+        <w:t>deceasedAddressCountry</w:t>
+      </w:r>
+      <w:r>
+        <w:rPr>
+          <w:b w:val="1"/>
+          <w:bCs w:val="1"/>
+          <w:u w:val="single"/>
+          <w:lang w:val="en-US"/>
+        </w:rPr>
+        <w:t>}</w:t>
       </w:r>
     </w:p>
     <w:p>
@@ -2288,13 +2629,16 @@
         <w:spacing w:before="272"/>
         <w:ind w:left="288"/>
         <w:rPr>
-          <w:b/>
+          <w:b w:val="1"/>
+          <w:bCs w:val="1"/>
+          <w:u w:val="single"/>
         </w:rPr>
       </w:pPr>
       <w:r>
         <w:rPr>
           <w:color w:val="313131"/>
           <w:sz w:val="20"/>
+          <w:szCs w:val="20"/>
         </w:rPr>
         <w:t>Name:</w:t>
       </w:r>
@@ -2303,84 +2647,640 @@
           <w:color w:val="313131"/>
           <w:spacing w:val="-1"/>
           <w:sz w:val="20"/>
-        </w:rPr>
-        <w:t xml:space="preserve"> </w:t>
-      </w:r>
-      <w:r>
-        <w:rPr>
-          <w:b/>
-          <w:u w:val="single"/>
-        </w:rPr>
-        <w:t xml:space="preserve">{d.applicant.applicantName}</w:t>
+          <w:szCs w:val="20"/>
+        </w:rPr>
+        <w:t xml:space="preserve"> </w:t>
+      </w:r>
+      <w:r>
+        <w:rPr>
+          <w:b w:val="1"/>
+          <w:bCs w:val="1"/>
+          <w:u w:val="single"/>
+        </w:rPr>
+        <w:t xml:space="preserve">{</w:t>
+      </w:r>
+      <w:r>
+        <w:rPr>
+          <w:b w:val="1"/>
+          <w:bCs w:val="1"/>
+          <w:u w:val="single"/>
+        </w:rPr>
+        <w:t xml:space="preserve">d.applicant.applicantName</w:t>
+      </w:r>
+      <w:r>
+        <w:rPr>
+          <w:b w:val="1"/>
+          <w:bCs w:val="1"/>
+          <w:u w:val="single"/>
+        </w:rPr>
+        <w:t xml:space="preserve">}</w:t>
+      </w:r>
+      <w:r>
+        <w:br/>
+      </w:r>
+      <w:r>
+        <w:rPr>
+          <w:b w:val="1"/>
+          <w:bCs w:val="1"/>
+          <w:u w:val="single"/>
+        </w:rPr>
+        <w:t>{</w:t>
+      </w:r>
+      <w:r>
+        <w:rPr>
+          <w:b w:val="1"/>
+          <w:bCs w:val="1"/>
+          <w:u w:val="single"/>
+        </w:rPr>
+        <w:t>d.applicant.</w:t>
+      </w:r>
+      <w:r>
+        <w:rPr>
+          <w:b w:val="1"/>
+          <w:bCs w:val="1"/>
+          <w:u w:val="single"/>
+        </w:rPr>
+        <w:t>applicantOrdinaryAddressReceiveMail</w:t>
+      </w:r>
+      <w:r>
+        <w:rPr>
+          <w:b w:val="1"/>
+          <w:bCs w:val="1"/>
+          <w:u w:val="single"/>
+        </w:rPr>
+        <w:t>:ifEQ</w:t>
+      </w:r>
+      <w:r>
+        <w:rPr>
+          <w:b w:val="1"/>
+          <w:bCs w:val="1"/>
+          <w:u w:val="single"/>
+        </w:rPr>
+        <w:t>('</w:t>
+      </w:r>
+      <w:r>
+        <w:rPr>
+          <w:b w:val="1"/>
+          <w:bCs w:val="1"/>
+          <w:u w:val="single"/>
+        </w:rPr>
+        <w:t>yes'</w:t>
+      </w:r>
+      <w:r>
+        <w:rPr>
+          <w:b w:val="1"/>
+          <w:bCs w:val="1"/>
+          <w:u w:val="single"/>
+        </w:rPr>
+        <w:t>)</w:t>
+      </w:r>
+      <w:r>
+        <w:rPr>
+          <w:b w:val="1"/>
+          <w:bCs w:val="1"/>
+          <w:u w:val="single"/>
+        </w:rPr>
+        <w:t>:</w:t>
+      </w:r>
+      <w:r>
+        <w:rPr>
+          <w:b w:val="1"/>
+          <w:bCs w:val="1"/>
+          <w:u w:val="single"/>
+        </w:rPr>
+        <w:t>showBegin</w:t>
+      </w:r>
+      <w:r>
+        <w:rPr>
+          <w:b w:val="1"/>
+          <w:bCs w:val="1"/>
+          <w:u w:val="single"/>
+        </w:rPr>
+        <w:t>}</w:t>
+      </w:r>
+      <w:r>
+        <w:rPr>
+          <w:b w:val="0"/>
+          <w:bCs w:val="0"/>
+          <w:color w:val="313131"/>
+          <w:sz w:val="20"/>
+          <w:szCs w:val="20"/>
+        </w:rPr>
+        <w:t xml:space="preserve">Mailing address: </w:t>
+      </w:r>
+      <w:r>
+        <w:rPr>
+          <w:b w:val="1"/>
+          <w:bCs w:val="1"/>
+          <w:u w:val="single"/>
+        </w:rPr>
+        <w:t>{</w:t>
+      </w:r>
+      <w:r>
+        <w:rPr>
+          <w:b w:val="1"/>
+          <w:bCs w:val="1"/>
+          <w:u w:val="single"/>
+        </w:rPr>
+        <w:t>d.applicant.applicantOrdinaryAddressStreet</w:t>
+      </w:r>
+      <w:r>
+        <w:rPr>
+          <w:b w:val="1"/>
+          <w:bCs w:val="1"/>
+          <w:u w:val="single"/>
+        </w:rPr>
+        <w:t>},</w:t>
+      </w:r>
+      <w:r>
+        <w:rPr>
+          <w:b w:val="1"/>
+          <w:bCs w:val="1"/>
+          <w:u w:val="single"/>
+        </w:rPr>
+        <w:t xml:space="preserve"> </w:t>
+      </w:r>
+      <w:r>
+        <w:rPr>
+          <w:b w:val="1"/>
+          <w:bCs w:val="1"/>
+          <w:u w:val="single"/>
+        </w:rPr>
+        <w:t>{</w:t>
+      </w:r>
+      <w:r>
+        <w:rPr>
+          <w:b w:val="1"/>
+          <w:bCs w:val="1"/>
+          <w:u w:val="single"/>
+        </w:rPr>
+        <w:t>d.applicant.applicantOrdinaryAddressCity</w:t>
+      </w:r>
+      <w:r>
+        <w:rPr>
+          <w:b w:val="1"/>
+          <w:bCs w:val="1"/>
+          <w:u w:val="single"/>
+        </w:rPr>
+        <w:t>}</w:t>
+      </w:r>
+      <w:r>
+        <w:rPr>
+          <w:b w:val="1"/>
+          <w:bCs w:val="1"/>
+          <w:u w:val="single"/>
+        </w:rPr>
+        <w:t>,</w:t>
+      </w:r>
+      <w:r>
+        <w:rPr>
+          <w:b w:val="1"/>
+          <w:bCs w:val="1"/>
+          <w:u w:val="single"/>
+        </w:rPr>
+        <w:t xml:space="preserve"> {</w:t>
+      </w:r>
+      <w:r>
+        <w:rPr>
+          <w:b w:val="1"/>
+          <w:bCs w:val="1"/>
+          <w:u w:val="single"/>
+        </w:rPr>
+        <w:t>d.applicant.applicant</w:t>
+      </w:r>
+      <w:r>
+        <w:rPr>
+          <w:b w:val="1"/>
+          <w:bCs w:val="1"/>
+          <w:u w:val="single"/>
+        </w:rPr>
+        <w:t>Ordinary</w:t>
+      </w:r>
+      <w:r>
+        <w:rPr>
+          <w:b w:val="1"/>
+          <w:bCs w:val="1"/>
+          <w:u w:val="single"/>
+        </w:rPr>
+        <w:t>AddressProvince</w:t>
+      </w:r>
+      <w:r>
+        <w:rPr>
+          <w:b w:val="1"/>
+          <w:bCs w:val="1"/>
+          <w:u w:val="single"/>
+        </w:rPr>
+        <w:t>}</w:t>
+      </w:r>
+      <w:r>
+        <w:rPr>
+          <w:b w:val="1"/>
+          <w:bCs w:val="1"/>
+          <w:u w:val="single"/>
+        </w:rPr>
+        <w:t>{</w:t>
+      </w:r>
+      <w:r>
+        <w:rPr>
+          <w:b w:val="1"/>
+          <w:bCs w:val="1"/>
+          <w:u w:val="single"/>
+        </w:rPr>
+        <w:t>d.applicant.applicantOrdinaryAddressState</w:t>
+      </w:r>
+      <w:r>
+        <w:rPr>
+          <w:b w:val="1"/>
+          <w:bCs w:val="1"/>
+          <w:u w:val="single"/>
+        </w:rPr>
+        <w:t>}</w:t>
+      </w:r>
+      <w:r>
+        <w:rPr>
+          <w:b w:val="1"/>
+          <w:bCs w:val="1"/>
+          <w:u w:val="single"/>
+        </w:rPr>
+        <w:t xml:space="preserve"> {</w:t>
+      </w:r>
+      <w:r>
+        <w:rPr>
+          <w:b w:val="1"/>
+          <w:bCs w:val="1"/>
+          <w:u w:val="single"/>
+        </w:rPr>
+        <w:t>d.applicant.applicant</w:t>
+      </w:r>
+      <w:r>
+        <w:rPr>
+          <w:b w:val="1"/>
+          <w:bCs w:val="1"/>
+          <w:u w:val="single"/>
+        </w:rPr>
+        <w:t>Ordinary</w:t>
+      </w:r>
+      <w:r>
+        <w:rPr>
+          <w:b w:val="1"/>
+          <w:bCs w:val="1"/>
+          <w:u w:val="single"/>
+        </w:rPr>
+        <w:t>AddressPostalCode</w:t>
+      </w:r>
+      <w:r>
+        <w:rPr>
+          <w:b w:val="1"/>
+          <w:bCs w:val="1"/>
+          <w:u w:val="single"/>
+        </w:rPr>
+        <w:t>}, {</w:t>
+      </w:r>
+      <w:r>
+        <w:rPr>
+          <w:b w:val="1"/>
+          <w:bCs w:val="1"/>
+          <w:u w:val="single"/>
+        </w:rPr>
+        <w:t>d.applicant.applicant</w:t>
+      </w:r>
+      <w:r>
+        <w:rPr>
+          <w:b w:val="1"/>
+          <w:bCs w:val="1"/>
+          <w:u w:val="single"/>
+        </w:rPr>
+        <w:t>Ordinary</w:t>
+      </w:r>
+      <w:r>
+        <w:rPr>
+          <w:b w:val="1"/>
+          <w:bCs w:val="1"/>
+          <w:u w:val="single"/>
+        </w:rPr>
+        <w:t>AddressCountry</w:t>
+      </w:r>
+      <w:r>
+        <w:rPr>
+          <w:b w:val="1"/>
+          <w:bCs w:val="1"/>
+          <w:u w:val="single"/>
+        </w:rPr>
+        <w:t>}</w:t>
       </w:r>
     </w:p>
     <w:p>
       <w:pPr>
-        <w:pStyle w:val="Heading3"/>
-        <w:spacing w:before="54" w:line="264" w:lineRule="auto"/>
-        <w:ind w:right="325"/>
+        <w:pStyle w:val="Normal"/>
+        <w:spacing w:before="54"/>
+        <w:ind w:left="288"/>
+        <w:rPr>
+          <w:b w:val="1"/>
+          <w:bCs w:val="1"/>
+          <w:u w:val="single"/>
+        </w:rPr>
       </w:pPr>
       <w:r>
         <w:rPr>
+          <w:b w:val="1"/>
+          <w:bCs w:val="1"/>
+          <w:u w:val="single"/>
+        </w:rPr>
+        <w:t>{</w:t>
+      </w:r>
+      <w:r>
+        <w:rPr>
+          <w:b w:val="1"/>
+          <w:bCs w:val="1"/>
+          <w:u w:val="single"/>
+        </w:rPr>
+        <w:t>d.applicant.</w:t>
+      </w:r>
+      <w:r>
+        <w:rPr>
+          <w:b w:val="1"/>
+          <w:bCs w:val="1"/>
+          <w:u w:val="single"/>
+        </w:rPr>
+        <w:t>applicantOrdinaryAddressReceiveMail</w:t>
+      </w:r>
+      <w:r>
+        <w:rPr>
+          <w:b w:val="1"/>
+          <w:bCs w:val="1"/>
+          <w:u w:val="single"/>
+        </w:rPr>
+        <w:t>:showEnd</w:t>
+      </w:r>
+      <w:r>
+        <w:rPr>
+          <w:b w:val="1"/>
+          <w:bCs w:val="1"/>
+          <w:u w:val="single"/>
+        </w:rPr>
+        <w:t>}</w:t>
+      </w:r>
+      <w:r>
+        <w:rPr>
+          <w:b w:val="1"/>
+          <w:bCs w:val="1"/>
+          <w:u w:val="single"/>
+        </w:rPr>
+        <w:t>{</w:t>
+      </w:r>
+      <w:r>
+        <w:rPr>
+          <w:b w:val="1"/>
+          <w:bCs w:val="1"/>
+          <w:u w:val="single"/>
+        </w:rPr>
+        <w:t>d.applicant.</w:t>
+      </w:r>
+      <w:r>
+        <w:rPr>
+          <w:b w:val="1"/>
+          <w:bCs w:val="1"/>
+          <w:u w:val="single"/>
+        </w:rPr>
+        <w:t>applicantOrdinaryAddressReceiveMail</w:t>
+      </w:r>
+      <w:r>
+        <w:rPr>
+          <w:b w:val="1"/>
+          <w:bCs w:val="1"/>
+          <w:u w:val="single"/>
+        </w:rPr>
+        <w:t>:ifEQ</w:t>
+      </w:r>
+      <w:r>
+        <w:rPr>
+          <w:b w:val="1"/>
+          <w:bCs w:val="1"/>
+          <w:u w:val="single"/>
+        </w:rPr>
+        <w:t>('</w:t>
+      </w:r>
+      <w:r>
+        <w:rPr>
+          <w:b w:val="1"/>
+          <w:bCs w:val="1"/>
+          <w:u w:val="single"/>
+        </w:rPr>
+        <w:t>yes'</w:t>
+      </w:r>
+      <w:r>
+        <w:rPr>
+          <w:b w:val="1"/>
+          <w:bCs w:val="1"/>
+          <w:u w:val="single"/>
+        </w:rPr>
+        <w:t>)</w:t>
+      </w:r>
+      <w:r>
+        <w:rPr>
+          <w:b w:val="1"/>
+          <w:bCs w:val="1"/>
+          <w:u w:val="single"/>
+        </w:rPr>
+        <w:t>:</w:t>
+      </w:r>
+      <w:r>
+        <w:rPr>
+          <w:b w:val="1"/>
+          <w:bCs w:val="1"/>
+          <w:u w:val="single"/>
+        </w:rPr>
+        <w:t>hideBegin</w:t>
+      </w:r>
+      <w:r>
+        <w:rPr>
+          <w:b w:val="1"/>
+          <w:bCs w:val="1"/>
+          <w:u w:val="single"/>
+        </w:rPr>
+        <w:t>}</w:t>
+      </w:r>
+      <w:r>
+        <w:rPr>
           <w:b w:val="0"/>
-          <w:color w:val="313131"/>
-          <w:sz w:val="20"/>
-        </w:rPr>
-        <w:t>Mailing</w:t>
-      </w:r>
-      <w:r>
-        <w:rPr>
-          <w:b w:val="0"/>
-          <w:color w:val="313131"/>
-          <w:spacing w:val="-5"/>
-          <w:sz w:val="20"/>
-        </w:rPr>
-        <w:t xml:space="preserve"> </w:t>
-      </w:r>
-      <w:r>
-        <w:rPr>
-          <w:b w:val="0"/>
-          <w:color w:val="313131"/>
-          <w:sz w:val="20"/>
-        </w:rPr>
-        <w:t>address:</w:t>
-      </w:r>
-      <w:r>
-        <w:rPr>
-          <w:b w:val="0"/>
-          <w:color w:val="313131"/>
-          <w:spacing w:val="-6"/>
-          <w:sz w:val="20"/>
-        </w:rPr>
-        <w:t xml:space="preserve"> </w:t>
-      </w:r>
-      <w:r>
-        <w:rPr>
-          <w:b w:val="0"/>
-          <w:u w:val="single"/>
-        </w:rPr>
-        <w:t xml:space="preserve">{d.applicant.applicantMailingAddressStreet}, {d.applicant.applicantMailingAddressCity}</w:t>
-      </w:r>
-      <w:r>
-        <w:rPr>
-          <w:b w:val="0"/>
-          <w:u w:val="single"/>
-        </w:rPr>
-        <w:br/>
-      </w:r>
-      <w:r>
-        <w:rPr>
-          <w:b w:val="0"/>
-          <w:u w:val="single"/>
-        </w:rPr>
-        <w:t xml:space="preserve">{d.applicant.applicantMailingAddressProvince} {d.applicant.applicantMailingAddressPostalCode}, {d.applicant.applicantMailingAddressCountry}</w:t>
+          <w:bCs w:val="0"/>
+          <w:color w:val="313131"/>
+          <w:sz w:val="20"/>
+          <w:szCs w:val="20"/>
+        </w:rPr>
+        <w:t xml:space="preserve">Mailing address: </w:t>
+      </w:r>
+      <w:r>
+        <w:rPr>
+          <w:b w:val="1"/>
+          <w:bCs w:val="1"/>
+          <w:u w:val="single"/>
+        </w:rPr>
+        <w:t>{</w:t>
+      </w:r>
+      <w:r>
+        <w:rPr>
+          <w:b w:val="1"/>
+          <w:bCs w:val="1"/>
+          <w:u w:val="single"/>
+        </w:rPr>
+        <w:t>d.applicant.applicantMailingAddressStreet</w:t>
+      </w:r>
+      <w:r>
+        <w:rPr>
+          <w:b w:val="1"/>
+          <w:bCs w:val="1"/>
+          <w:u w:val="single"/>
+        </w:rPr>
+        <w:t>}, {</w:t>
+      </w:r>
+      <w:r>
+        <w:rPr>
+          <w:b w:val="1"/>
+          <w:bCs w:val="1"/>
+          <w:u w:val="single"/>
+        </w:rPr>
+        <w:t>d.applicant.applicantMailingAddressCity</w:t>
+      </w:r>
+      <w:r>
+        <w:rPr>
+          <w:b w:val="1"/>
+          <w:bCs w:val="1"/>
+          <w:u w:val="single"/>
+        </w:rPr>
+        <w:t>}, {</w:t>
+      </w:r>
+      <w:r>
+        <w:rPr>
+          <w:b w:val="1"/>
+          <w:bCs w:val="1"/>
+          <w:u w:val="single"/>
+        </w:rPr>
+        <w:t>d.applicant.applicantMailingAddressProvince</w:t>
+      </w:r>
+      <w:r>
+        <w:rPr>
+          <w:b w:val="1"/>
+          <w:bCs w:val="1"/>
+          <w:u w:val="single"/>
+        </w:rPr>
+        <w:t>}</w:t>
+      </w:r>
+      <w:r>
+        <w:rPr>
+          <w:b w:val="1"/>
+          <w:bCs w:val="1"/>
+          <w:u w:val="single"/>
+        </w:rPr>
+        <w:t>{</w:t>
+      </w:r>
+      <w:r>
+        <w:rPr>
+          <w:b w:val="1"/>
+          <w:bCs w:val="1"/>
+          <w:u w:val="single"/>
+        </w:rPr>
+        <w:t>d.applicant.applicantMailingAddressState</w:t>
+      </w:r>
+      <w:r>
+        <w:rPr>
+          <w:b w:val="1"/>
+          <w:bCs w:val="1"/>
+          <w:u w:val="single"/>
+        </w:rPr>
+        <w:t>}</w:t>
+      </w:r>
+      <w:r>
+        <w:rPr>
+          <w:b w:val="1"/>
+          <w:bCs w:val="1"/>
+          <w:u w:val="single"/>
+        </w:rPr>
+        <w:t xml:space="preserve"> {</w:t>
+      </w:r>
+      <w:r>
+        <w:rPr>
+          <w:b w:val="1"/>
+          <w:bCs w:val="1"/>
+          <w:u w:val="single"/>
+        </w:rPr>
+        <w:t>d.applicant.applicantMailingAddressPostalCode</w:t>
+      </w:r>
+      <w:r>
+        <w:rPr>
+          <w:b w:val="1"/>
+          <w:bCs w:val="1"/>
+          <w:u w:val="single"/>
+        </w:rPr>
+        <w:t>}, {</w:t>
+      </w:r>
+      <w:r>
+        <w:rPr>
+          <w:b w:val="1"/>
+          <w:bCs w:val="1"/>
+          <w:u w:val="single"/>
+        </w:rPr>
+        <w:t>d.applicant.applicantMailingAddressCountry</w:t>
+      </w:r>
+      <w:r>
+        <w:rPr>
+          <w:b w:val="1"/>
+          <w:bCs w:val="1"/>
+          <w:u w:val="single"/>
+        </w:rPr>
+        <w:t>}</w:t>
+      </w:r>
+      <w:r>
+        <w:rPr>
+          <w:b w:val="1"/>
+          <w:bCs w:val="1"/>
+          <w:u w:val="single"/>
+        </w:rPr>
+        <w:t>{</w:t>
+      </w:r>
+      <w:r>
+        <w:rPr>
+          <w:b w:val="1"/>
+          <w:bCs w:val="1"/>
+          <w:u w:val="single"/>
+        </w:rPr>
+        <w:t>d.applicant.</w:t>
+      </w:r>
+      <w:r>
+        <w:rPr>
+          <w:b w:val="1"/>
+          <w:bCs w:val="1"/>
+          <w:u w:val="single"/>
+        </w:rPr>
+        <w:t>applicantOrdinaryAddressReceiveMail</w:t>
+      </w:r>
+      <w:r>
+        <w:rPr>
+          <w:b w:val="1"/>
+          <w:bCs w:val="1"/>
+          <w:u w:val="single"/>
+        </w:rPr>
+        <w:t>:hideEnd</w:t>
+      </w:r>
+      <w:r>
+        <w:rPr>
+          <w:b w:val="1"/>
+          <w:bCs w:val="1"/>
+          <w:u w:val="single"/>
+        </w:rPr>
+        <w:t>}</w:t>
       </w:r>
     </w:p>
     <w:p>
       <w:pPr>
-        <w:pStyle w:val="BodyText"/>
-        <w:spacing w:before="24"/>
+        <w:pStyle w:val="Normal"/>
+        <w:spacing w:before="54"/>
         <w:ind w:left="288"/>
+        <w:rPr>
+          <w:b w:val="1"/>
+          <w:bCs w:val="1"/>
+          <w:u w:val="single"/>
+        </w:rPr>
       </w:pPr>
       <w:r>
         <w:rPr>
@@ -2549,48 +3449,166 @@
         <w:pStyle w:val="Heading3"/>
         <w:spacing w:before="272"/>
         <w:rPr>
+          <w:b w:val="1"/>
+          <w:bCs w:val="1"/>
           <w:u w:val="single"/>
         </w:rPr>
       </w:pPr>
       <w:r>
         <w:rPr>
           <w:b w:val="0"/>
-          <w:color w:val="313131"/>
-          <w:sz w:val="20"/>
+          <w:bCs w:val="0"/>
+          <w:color w:val="313131"/>
+          <w:sz w:val="20"/>
+          <w:szCs w:val="20"/>
         </w:rPr>
         <w:t>Street</w:t>
       </w:r>
       <w:r>
         <w:rPr>
           <w:b w:val="0"/>
+          <w:bCs w:val="0"/>
           <w:color w:val="313131"/>
           <w:spacing w:val="-2"/>
           <w:sz w:val="20"/>
+          <w:szCs w:val="20"/>
         </w:rPr>
         <w:t xml:space="preserve"> </w:t>
       </w:r>
       <w:r>
         <w:rPr>
           <w:b w:val="0"/>
-          <w:color w:val="313131"/>
-          <w:sz w:val="20"/>
+          <w:bCs w:val="0"/>
+          <w:color w:val="313131"/>
+          <w:sz w:val="20"/>
+          <w:szCs w:val="20"/>
         </w:rPr>
         <w:t>address:</w:t>
       </w:r>
       <w:r>
         <w:rPr>
           <w:b w:val="0"/>
+          <w:bCs w:val="0"/>
           <w:color w:val="313131"/>
           <w:spacing w:val="-3"/>
           <w:sz w:val="20"/>
-        </w:rPr>
-        <w:t xml:space="preserve"> </w:t>
-      </w:r>
-      <w:r>
-        <w:rPr>
-          <w:u w:val="single"/>
-        </w:rPr>
-        <w:t xml:space="preserve">{d.applicant.applicantServiceAddressStreet}, {d.applicant.applicantServiceAddressCity}, {d.applicant.applicantServiceAddressProvince} {d.applicant.applicantServiceAddressPostalCode}</w:t>
+          <w:szCs w:val="20"/>
+        </w:rPr>
+        <w:t xml:space="preserve"> </w:t>
+      </w:r>
+      <w:r>
+        <w:rPr>
+          <w:u w:val="single"/>
+        </w:rPr>
+        <w:t xml:space="preserve">{</w:t>
+      </w:r>
+      <w:r>
+        <w:rPr>
+          <w:u w:val="single"/>
+        </w:rPr>
+        <w:t xml:space="preserve">d.applicant.applicantServiceAddressStreet</w:t>
+      </w:r>
+      <w:r>
+        <w:rPr>
+          <w:u w:val="single"/>
+        </w:rPr>
+        <w:t xml:space="preserve">}, {</w:t>
+      </w:r>
+      <w:r>
+        <w:rPr>
+          <w:u w:val="single"/>
+        </w:rPr>
+        <w:t xml:space="preserve">d.applicant.applicantServiceAddressCity</w:t>
+      </w:r>
+      <w:r>
+        <w:rPr>
+          <w:u w:val="single"/>
+        </w:rPr>
+        <w:t xml:space="preserve">}, {</w:t>
+      </w:r>
+      <w:r>
+        <w:rPr>
+          <w:u w:val="single"/>
+        </w:rPr>
+        <w:t xml:space="preserve">d.applicant.applicantServiceAddressProvince</w:t>
+      </w:r>
+      <w:r>
+        <w:rPr>
+          <w:u w:val="single"/>
+        </w:rPr>
+        <w:t xml:space="preserve">}</w:t>
+      </w:r>
+      <w:r>
+        <w:rPr>
+          <w:u w:val="single"/>
+        </w:rPr>
+        <w:t xml:space="preserve"> {</w:t>
+      </w:r>
+      <w:r>
+        <w:rPr>
+          <w:u w:val="single"/>
+        </w:rPr>
+        <w:t>d.applicant.applicantServiceAddressState</w:t>
+      </w:r>
+      <w:r>
+        <w:rPr>
+          <w:u w:val="single"/>
+        </w:rPr>
+        <w:t>}</w:t>
+      </w:r>
+      <w:r>
+        <w:rPr>
+          <w:u w:val="single"/>
+        </w:rPr>
+        <w:t xml:space="preserve">, </w:t>
+      </w:r>
+      <w:r>
+        <w:rPr>
+          <w:u w:val="single"/>
+        </w:rPr>
+        <w:t xml:space="preserve">{</w:t>
+      </w:r>
+      <w:r>
+        <w:rPr>
+          <w:u w:val="single"/>
+        </w:rPr>
+        <w:t xml:space="preserve">d.applicant.applicantServiceAddressPostalCode</w:t>
+      </w:r>
+      <w:r>
+        <w:rPr>
+          <w:u w:val="single"/>
+        </w:rPr>
+        <w:t xml:space="preserve">}</w:t>
+      </w:r>
+      <w:r>
+        <w:rPr>
+          <w:u w:val="single"/>
+        </w:rPr>
+        <w:t xml:space="preserve">, </w:t>
+      </w:r>
+      <w:r>
+        <w:rPr>
+          <w:b w:val="1"/>
+          <w:bCs w:val="1"/>
+          <w:u w:val="single"/>
+        </w:rPr>
+        <w:t>{</w:t>
+      </w:r>
+      <w:r>
+        <w:rPr>
+          <w:b w:val="1"/>
+          <w:bCs w:val="1"/>
+          <w:u w:val="single"/>
+        </w:rPr>
+        <w:t>d.applicant.applicantServiceAddressCountry</w:t>
+      </w:r>
+      <w:r>
+        <w:rPr>
+          <w:b w:val="1"/>
+          <w:bCs w:val="1"/>
+          <w:u w:val="single"/>
+        </w:rPr>
+        <w:t>}</w:t>
       </w:r>
     </w:p>
     <w:p>
@@ -2641,16 +3659,20 @@
     </w:p>
     <w:p>
       <w:pPr>
+        <w:pStyle w:val="Normal"/>
         <w:spacing w:before="54"/>
         <w:ind w:left="288"/>
         <w:rPr>
-          <w:b/>
+          <w:b w:val="1"/>
+          <w:bCs w:val="1"/>
+          <w:u w:val="single"/>
         </w:rPr>
       </w:pPr>
       <w:r>
         <w:rPr>
           <w:color w:val="313131"/>
           <w:sz w:val="20"/>
+          <w:szCs w:val="20"/>
         </w:rPr>
         <w:t>E-mail</w:t>
       </w:r>
@@ -2659,13 +3681,15 @@
           <w:color w:val="313131"/>
           <w:spacing w:val="-3"/>
           <w:sz w:val="20"/>
-        </w:rPr>
-        <w:t xml:space="preserve"> </w:t>
-      </w:r>
-      <w:r>
-        <w:rPr>
-          <w:color w:val="313131"/>
-          <w:sz w:val="20"/>
+          <w:szCs w:val="20"/>
+        </w:rPr>
+        <w:t xml:space="preserve"> </w:t>
+      </w:r>
+      <w:r>
+        <w:rPr>
+          <w:color w:val="313131"/>
+          <w:sz w:val="20"/>
+          <w:szCs w:val="20"/>
         </w:rPr>
         <w:t>address:</w:t>
       </w:r>
@@ -2674,15 +3698,207 @@
           <w:color w:val="313131"/>
           <w:spacing w:val="-2"/>
           <w:sz w:val="20"/>
-        </w:rPr>
-        <w:t xml:space="preserve"> </w:t>
-      </w:r>
-      <w:r>
-        <w:rPr>
-          <w:b/>
-          <w:u w:val="single"/>
-        </w:rPr>
-        <w:t xml:space="preserve">{d.applicant.applicantServiceEmail}</w:t>
+          <w:szCs w:val="20"/>
+        </w:rPr>
+        <w:t xml:space="preserve"> </w:t>
+      </w:r>
+      <w:r>
+        <w:rPr>
+          <w:b w:val="1"/>
+          <w:bCs w:val="1"/>
+          <w:u w:val="single"/>
+        </w:rPr>
+        <w:t xml:space="preserve">{</w:t>
+      </w:r>
+      <w:r>
+        <w:rPr>
+          <w:b w:val="1"/>
+          <w:bCs w:val="1"/>
+          <w:u w:val="single"/>
+        </w:rPr>
+        <w:t xml:space="preserve">d.applicant.applicantServiceEmai</w:t>
+      </w:r>
+      <w:r>
+        <w:rPr>
+          <w:b w:val="1"/>
+          <w:bCs w:val="1"/>
+          <w:u w:val="single"/>
+        </w:rPr>
+        <w:t xml:space="preserve">l</w:t>
+      </w:r>
+      <w:r>
+        <w:rPr>
+          <w:b w:val="1"/>
+          <w:bCs w:val="1"/>
+          <w:u w:val="single"/>
+        </w:rPr>
+        <w:t xml:space="preserve">}</w:t>
+      </w:r>
+      <w:r>
+        <w:br/>
+      </w:r>
+      <w:r>
+        <w:rPr>
+          <w:b w:val="1"/>
+          <w:bCs w:val="1"/>
+          <w:u w:val="single"/>
+        </w:rPr>
+        <w:t>{</w:t>
+      </w:r>
+      <w:r>
+        <w:rPr>
+          <w:b w:val="1"/>
+          <w:bCs w:val="1"/>
+          <w:u w:val="single"/>
+        </w:rPr>
+        <w:t>d.applicant.applicantHasFax:ifEQ</w:t>
+      </w:r>
+      <w:r>
+        <w:rPr>
+          <w:b w:val="1"/>
+          <w:bCs w:val="1"/>
+          <w:u w:val="single"/>
+        </w:rPr>
+        <w:t>('</w:t>
+      </w:r>
+      <w:r>
+        <w:rPr>
+          <w:b w:val="1"/>
+          <w:bCs w:val="1"/>
+          <w:u w:val="single"/>
+        </w:rPr>
+        <w:t>yes'</w:t>
+      </w:r>
+      <w:r>
+        <w:rPr>
+          <w:b w:val="1"/>
+          <w:bCs w:val="1"/>
+          <w:u w:val="single"/>
+        </w:rPr>
+        <w:t>)</w:t>
+      </w:r>
+      <w:r>
+        <w:rPr>
+          <w:b w:val="1"/>
+          <w:bCs w:val="1"/>
+          <w:u w:val="single"/>
+        </w:rPr>
+        <w:t>:</w:t>
+      </w:r>
+      <w:r>
+        <w:rPr>
+          <w:b w:val="1"/>
+          <w:bCs w:val="1"/>
+          <w:u w:val="single"/>
+        </w:rPr>
+        <w:t>showBegin</w:t>
+      </w:r>
+      <w:r>
+        <w:rPr>
+          <w:b w:val="1"/>
+          <w:bCs w:val="1"/>
+          <w:u w:val="single"/>
+        </w:rPr>
+        <w:t>}</w:t>
+      </w:r>
+      <w:r>
+        <w:rPr>
+          <w:color w:val="313131"/>
+          <w:sz w:val="20"/>
+          <w:szCs w:val="20"/>
+        </w:rPr>
+        <w:t>Fax number</w:t>
+      </w:r>
+      <w:r>
+        <w:rPr>
+          <w:color w:val="313131"/>
+          <w:sz w:val="20"/>
+          <w:szCs w:val="20"/>
+        </w:rPr>
+        <w:t>:</w:t>
+      </w:r>
+      <w:r>
+        <w:rPr>
+          <w:color w:val="313131"/>
+          <w:sz w:val="20"/>
+          <w:szCs w:val="20"/>
+        </w:rPr>
+        <w:t xml:space="preserve"> </w:t>
+      </w:r>
+      <w:r>
+        <w:rPr>
+          <w:b w:val="1"/>
+          <w:bCs w:val="1"/>
+          <w:u w:val="single"/>
+        </w:rPr>
+        <w:t>{</w:t>
+      </w:r>
+      <w:r>
+        <w:rPr>
+          <w:b w:val="1"/>
+          <w:bCs w:val="1"/>
+          <w:u w:val="single"/>
+        </w:rPr>
+        <w:t>d.</w:t>
+      </w:r>
+      <w:r>
+        <w:rPr>
+          <w:b w:val="1"/>
+          <w:bCs w:val="1"/>
+          <w:u w:val="single"/>
+        </w:rPr>
+        <w:t>applicant.</w:t>
+      </w:r>
+      <w:r>
+        <w:rPr>
+          <w:b w:val="1"/>
+          <w:bCs w:val="1"/>
+          <w:u w:val="single"/>
+        </w:rPr>
+        <w:t>applicantServiceFax</w:t>
+      </w:r>
+      <w:r>
+        <w:rPr>
+          <w:b w:val="1"/>
+          <w:bCs w:val="1"/>
+          <w:u w:val="single"/>
+        </w:rPr>
+        <w:t>}</w:t>
+      </w:r>
+      <w:r>
+        <w:br/>
+      </w:r>
+      <w:r>
+        <w:rPr>
+          <w:b w:val="1"/>
+          <w:bCs w:val="1"/>
+          <w:u w:val="single"/>
+        </w:rPr>
+        <w:t>{</w:t>
+      </w:r>
+      <w:r>
+        <w:rPr>
+          <w:b w:val="1"/>
+          <w:bCs w:val="1"/>
+          <w:u w:val="single"/>
+        </w:rPr>
+        <w:t>d.applicant.applicantHasFax</w:t>
+      </w:r>
+      <w:r>
+        <w:rPr>
+          <w:b w:val="1"/>
+          <w:bCs w:val="1"/>
+          <w:u w:val="single"/>
+        </w:rPr>
+        <w:t>:showEnd</w:t>
+      </w:r>
+      <w:r>
+        <w:rPr>
+          <w:b w:val="1"/>
+          <w:bCs w:val="1"/>
+          <w:u w:val="single"/>
+        </w:rPr>
+        <w:t>}</w:t>
       </w:r>
     </w:p>
     <w:p>
@@ -2864,297 +4080,6 @@
       <w:pStyle w:val="BodyText"/>
       <w:spacing w:line="14" w:lineRule="auto"/>
     </w:pPr>
-    <w:r>
-      <w:rPr>
-        <w:noProof/>
-      </w:rPr>
-      <mc:AlternateContent>
-        <mc:Choice Requires="wps">
-          <w:drawing>
-            <wp:anchor distT="0" distB="0" distL="0" distR="0" simplePos="0" relativeHeight="487544832" behindDoc="1" locked="0" layoutInCell="1" allowOverlap="1" wp14:anchorId="36437D51" wp14:editId="36437D52">
-              <wp:simplePos x="0" y="0"/>
-              <wp:positionH relativeFrom="page">
-                <wp:posOffset>627380</wp:posOffset>
-              </wp:positionH>
-              <wp:positionV relativeFrom="page">
-                <wp:posOffset>9573676</wp:posOffset>
-              </wp:positionV>
-              <wp:extent cx="2313940" cy="146685"/>
-              <wp:effectExtent l="0" t="0" r="0" b="0"/>
-              <wp:wrapNone/>
-              <wp:docPr id="1" name="Textbox 1"/>
-              <wp:cNvGraphicFramePr>
-                <a:graphicFrameLocks xmlns:a="http://schemas.openxmlformats.org/drawingml/2006/main"/>
-              </wp:cNvGraphicFramePr>
-              <a:graphic xmlns:a="http://schemas.openxmlformats.org/drawingml/2006/main">
-                <a:graphicData uri="http://schemas.microsoft.com/office/word/2010/wordprocessingShape">
-                  <wps:wsp>
-                    <wps:cNvSpPr txBox="1">
-                      <a:spLocks/>
-                    </wps:cNvSpPr>
-                    <wps:spPr>
-                      <a:xfrm>
-                        <a:off x="0" y="0"/>
-                        <a:ext cx="2313940" cy="146685"/>
-                      </a:xfrm>
-                      <a:prstGeom prst="rect">
-                        <a:avLst/>
-                      </a:prstGeom>
-                    </wps:spPr>
-                    <wps:txbx>
-                      <w:txbxContent>
-                        <w:p>
-                          <w:pPr>
-                            <w:spacing w:before="20"/>
-                            <w:ind w:left="20"/>
-                            <w:rPr>
-                              <w:rFonts w:ascii="Noto Sans" w:hAnsi="Noto Sans"/>
-                              <w:sz w:val="14"/>
-                            </w:rPr>
-                          </w:pPr>
-                          <w:r>
-                            <w:rPr>
-                              <w:rFonts w:ascii="Noto Sans" w:hAnsi="Noto Sans"/>
-                              <w:color w:val="606060"/>
-                              <w:sz w:val="14"/>
-                            </w:rPr>
-                            <w:t>Generated</w:t>
-                          </w:r>
-                          <w:r>
-                            <w:rPr>
-                              <w:rFonts w:ascii="Noto Sans" w:hAnsi="Noto Sans"/>
-                              <w:color w:val="606060"/>
-                              <w:spacing w:val="-10"/>
-                              <w:sz w:val="14"/>
-                            </w:rPr>
-                            <w:t xml:space="preserve"> </w:t>
-                          </w:r>
-                          <w:r>
-                            <w:rPr>
-                              <w:rFonts w:ascii="Noto Sans" w:hAnsi="Noto Sans"/>
-                              <w:color w:val="606060"/>
-                              <w:sz w:val="14"/>
-                            </w:rPr>
-                            <w:t>by</w:t>
-                          </w:r>
-                          <w:r>
-                            <w:rPr>
-                              <w:rFonts w:ascii="Noto Sans" w:hAnsi="Noto Sans"/>
-                              <w:color w:val="606060"/>
-                              <w:spacing w:val="-8"/>
-                              <w:sz w:val="14"/>
-                            </w:rPr>
-                            <w:t xml:space="preserve"> </w:t>
-                          </w:r>
-                          <w:r>
-                            <w:rPr>
-                              <w:rFonts w:ascii="Noto Sans" w:hAnsi="Noto Sans"/>
-                              <w:color w:val="606060"/>
-                              <w:sz w:val="14"/>
-                            </w:rPr>
-                            <w:t>“</w:t>
-                          </w:r>
-                          <w:r>
-                            <w:rPr>
-                              <w:rFonts w:ascii="Noto Sans" w:hAnsi="Noto Sans"/>
-                              <w:color w:val="606060"/>
-                              <w:sz w:val="14"/>
-                            </w:rPr>
-                            <w:t>Probate Application</w:t>
-                          </w:r>
-                          <w:r>
-                            <w:rPr>
-                              <w:rFonts w:ascii="Noto Sans" w:hAnsi="Noto Sans"/>
-                              <w:color w:val="606060"/>
-                              <w:sz w:val="14"/>
-                            </w:rPr>
-                            <w:t>”</w:t>
-                          </w:r>
-                          <w:r>
-                            <w:rPr>
-                              <w:rFonts w:ascii="Noto Sans" w:hAnsi="Noto Sans"/>
-                              <w:color w:val="606060"/>
-                              <w:spacing w:val="-9"/>
-                              <w:sz w:val="14"/>
-                            </w:rPr>
-                            <w:t xml:space="preserve"> </w:t>
-                          </w:r>
-                          <w:r>
-                            <w:rPr>
-                              <w:rFonts w:ascii="Noto Sans" w:hAnsi="Noto Sans"/>
-                              <w:color w:val="606060"/>
-                              <w:sz w:val="14"/>
-                            </w:rPr>
-                            <w:t>on</w:t>
-                          </w:r>
-                          <w:r>
-                            <w:rPr>
-                              <w:rFonts w:ascii="Noto Sans" w:hAnsi="Noto Sans"/>
-                              <w:color w:val="606060"/>
-                              <w:sz w:val="14"/>
-                              <w:u w:val="single"/>
-                            </w:rPr>
-                            <w:tab/>
-                          </w:r>
-                          <w:r>
-                            <w:rPr>
-                              <w:rFonts w:ascii="Noto Sans" w:hAnsi="Noto Sans"/>
-                              <w:color w:val="606060"/>
-                              <w:sz w:val="14"/>
-                              <w:u w:val="single"/>
-                            </w:rPr>
-                            <w:tab/>
-                          </w:r>
-                          <w:r>
-                            <w:rPr>
-                              <w:rFonts w:ascii="Noto Sans" w:hAnsi="Noto Sans"/>
-                              <w:color w:val="606060"/>
-                              <w:spacing w:val="-2"/>
-                              <w:sz w:val="14"/>
-                            </w:rPr>
-                            <w:t>.</w:t>
-                          </w:r>
-                        </w:p>
-                      </w:txbxContent>
-                    </wps:txbx>
-                    <wps:bodyPr wrap="square" lIns="0" tIns="0" rIns="0" bIns="0" rtlCol="0">
-                      <a:noAutofit/>
-                    </wps:bodyPr>
-                  </wps:wsp>
-                </a:graphicData>
-              </a:graphic>
-            </wp:anchor>
-          </w:drawing>
-        </mc:Choice>
-        <mc:Fallback>
-          <w:pict>
-            <v:shapetype id="_x0000_t202" coordsize="21600,21600" o:spt="202" path="m,l,21600r21600,l21600,xe" w14:anchorId="36437D51">
-              <v:stroke joinstyle="miter"/>
-              <v:path gradientshapeok="t" o:connecttype="rect"/>
-            </v:shapetype>
-            <v:shape id="Textbox 1" style="position:absolute;margin-left:49.4pt;margin-top:753.85pt;width:182.2pt;height:11.55pt;z-index:-15771648;visibility:visible;mso-wrap-style:square;mso-wrap-distance-left:0;mso-wrap-distance-top:0;mso-wrap-distance-right:0;mso-wrap-distance-bottom:0;mso-position-horizontal:absolute;mso-position-horizontal-relative:page;mso-position-vertical:absolute;mso-position-vertical-relative:page;v-text-anchor:top" o:spid="_x0000_s1026" filled="f" stroked="f" type="#_x0000_t202" o:gfxdata="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">
-              <v:textbox inset="0,0,0,0">
-                <w:txbxContent>
-                  <w:p>
-                    <w:pPr>
-                      <w:spacing w:before="20"/>
-                      <w:ind w:left="20"/>
-                      <w:rPr>
-                        <w:rFonts w:ascii="Noto Sans" w:hAnsi="Noto Sans"/>
-                        <w:sz w:val="14"/>
-                      </w:rPr>
-                    </w:pPr>
-                    <w:r>
-                      <w:rPr>
-                        <w:rFonts w:ascii="Noto Sans" w:hAnsi="Noto Sans"/>
-                        <w:color w:val="606060"/>
-                        <w:sz w:val="14"/>
-                      </w:rPr>
-                      <w:t>Generated</w:t>
-                    </w:r>
-                    <w:r>
-                      <w:rPr>
-                        <w:rFonts w:ascii="Noto Sans" w:hAnsi="Noto Sans"/>
-                        <w:color w:val="606060"/>
-                        <w:spacing w:val="-10"/>
-                        <w:sz w:val="14"/>
-                      </w:rPr>
-                      <w:t xml:space="preserve"> </w:t>
-                    </w:r>
-                    <w:r>
-                      <w:rPr>
-                        <w:rFonts w:ascii="Noto Sans" w:hAnsi="Noto Sans"/>
-                        <w:color w:val="606060"/>
-                        <w:sz w:val="14"/>
-                      </w:rPr>
-                      <w:t>by</w:t>
-                    </w:r>
-                    <w:r>
-                      <w:rPr>
-                        <w:rFonts w:ascii="Noto Sans" w:hAnsi="Noto Sans"/>
-                        <w:color w:val="606060"/>
-                        <w:spacing w:val="-8"/>
-                        <w:sz w:val="14"/>
-                      </w:rPr>
-                      <w:t xml:space="preserve"> </w:t>
-                    </w:r>
-                    <w:r>
-                      <w:rPr>
-                        <w:rFonts w:ascii="Noto Sans" w:hAnsi="Noto Sans"/>
-                        <w:color w:val="606060"/>
-                        <w:sz w:val="14"/>
-                      </w:rPr>
-                      <w:t>“</w:t>
-                    </w:r>
-                    <w:r>
-                      <w:rPr>
-                        <w:rFonts w:ascii="Noto Sans" w:hAnsi="Noto Sans"/>
-                        <w:color w:val="606060"/>
-                        <w:sz w:val="14"/>
-                      </w:rPr>
-                      <w:t>Probate Application</w:t>
-                    </w:r>
-                    <w:r>
-                      <w:rPr>
-                        <w:rFonts w:ascii="Noto Sans" w:hAnsi="Noto Sans"/>
-                        <w:color w:val="606060"/>
-                        <w:sz w:val="14"/>
-                      </w:rPr>
-                      <w:t>”</w:t>
-                    </w:r>
-                    <w:r>
-                      <w:rPr>
-                        <w:rFonts w:ascii="Noto Sans" w:hAnsi="Noto Sans"/>
-                        <w:color w:val="606060"/>
-                        <w:spacing w:val="-9"/>
-                        <w:sz w:val="14"/>
-                      </w:rPr>
-                      <w:t xml:space="preserve"> </w:t>
-                    </w:r>
-                    <w:r>
-                      <w:rPr>
-                        <w:rFonts w:ascii="Noto Sans" w:hAnsi="Noto Sans"/>
-                        <w:color w:val="606060"/>
-                        <w:sz w:val="14"/>
-                      </w:rPr>
-                      <w:t>on</w:t>
-                    </w:r>
-                    <w:r>
-                      <w:rPr>
-                        <w:rFonts w:ascii="Noto Sans" w:hAnsi="Noto Sans"/>
-                        <w:color w:val="606060"/>
-                        <w:sz w:val="14"/>
-                        <w:u w:val="single"/>
-                      </w:rPr>
-                      <w:tab/>
-                    </w:r>
-                    <w:r>
-                      <w:rPr>
-                        <w:rFonts w:ascii="Noto Sans" w:hAnsi="Noto Sans"/>
-                        <w:color w:val="606060"/>
-                        <w:sz w:val="14"/>
-                        <w:u w:val="single"/>
-                      </w:rPr>
-                      <w:tab/>
-                    </w:r>
-                    <w:r>
-                      <w:rPr>
-                        <w:rFonts w:ascii="Noto Sans" w:hAnsi="Noto Sans"/>
-                        <w:color w:val="606060"/>
-                        <w:spacing w:val="-2"/>
-                        <w:sz w:val="14"/>
-                      </w:rPr>
-                      <w:t>.</w:t>
-                    </w:r>
-                  </w:p>
-                </w:txbxContent>
-              </v:textbox>
-              <w10:wrap anchorx="page" anchory="page"/>
-            </v:shape>
-          </w:pict>
-        </mc:Fallback>
-      </mc:AlternateContent>
-    </w:r>
     <w:r>
       <w:rPr>
         <w:noProof/>
@@ -3487,6 +4412,289 @@
                 </w:txbxContent>
               </v:textbox>
               <w10:wrap anchorx="page" anchory="page"/>
+            </v:shape>
+          </w:pict>
+        </mc:Fallback>
+      </mc:AlternateContent>
+    </w:r>
+    <w:r>
+      <w:rPr>
+        <w:noProof/>
+      </w:rPr>
+      <mc:AlternateContent xmlns:mc="http://schemas.openxmlformats.org/markup-compatibility/2006">
+        <mc:Choice xmlns:mc="http://schemas.openxmlformats.org/markup-compatibility/2006" Requires="wps">
+          <w:drawing xmlns:w="http://schemas.openxmlformats.org/wordprocessingml/2006/main">
+            <wp:inline xmlns:wp14="http://schemas.microsoft.com/office/word/2010/wordprocessingDrawing" xmlns:wp="http://schemas.openxmlformats.org/drawingml/2006/wordprocessingDrawing" distT="0" distB="0" distL="0" distR="0" wp14:anchorId="13838CED" wp14:editId="531A8887">
+              <wp:extent xmlns:wp="http://schemas.openxmlformats.org/drawingml/2006/wordprocessingDrawing" cx="2313940" cy="146685"/>
+              <wp:effectExtent xmlns:wp="http://schemas.openxmlformats.org/drawingml/2006/wordprocessingDrawing" l="0" t="0" r="0" b="0"/>
+              <wp:docPr xmlns:wp="http://schemas.openxmlformats.org/drawingml/2006/wordprocessingDrawing" id="2081936356" name="Textbox 1"/>
+              <wp:cNvGraphicFramePr xmlns:wp="http://schemas.openxmlformats.org/drawingml/2006/wordprocessingDrawing">
+                <a:graphicFrameLocks xmlns:a="http://schemas.openxmlformats.org/drawingml/2006/main"/>
+              </wp:cNvGraphicFramePr>
+              <a:graphic xmlns:a="http://schemas.openxmlformats.org/drawingml/2006/main">
+                <a:graphicData uri="http://schemas.microsoft.com/office/word/2010/wordprocessingShape">
+                  <wps:wsp xmlns:wps="http://schemas.microsoft.com/office/word/2010/wordprocessingShape">
+                    <wps:cNvSpPr txBox="1">
+                      <a:spLocks/>
+                    </wps:cNvSpPr>
+                    <wps:spPr>
+                      <a:xfrm>
+                        <a:off x="0" y="0"/>
+                        <a:ext cx="2313940" cy="146685"/>
+                      </a:xfrm>
+                      <a:prstGeom prst="rect">
+                        <a:avLst/>
+                      </a:prstGeom>
+                    </wps:spPr>
+                    <wps:txbx>
+                      <w:txbxContent xmlns:w="http://schemas.openxmlformats.org/wordprocessingml/2006/main">
+                        <w:p xmlns:w14="http://schemas.microsoft.com/office/word/2010/wordml">
+                          <w:pPr>
+                            <w:spacing w:before="20"/>
+                            <w:ind w:left="20"/>
+                            <w:rPr>
+                              <w:rFonts w:ascii="Noto Sans" w:hAnsi="Noto Sans"/>
+                              <w:sz w:val="14"/>
+                            </w:rPr>
+                          </w:pPr>
+                          <w:r>
+                            <w:rPr>
+                              <w:rFonts w:ascii="Noto Sans" w:hAnsi="Noto Sans"/>
+                              <w:color w:val="606060"/>
+                              <w:sz w:val="14"/>
+                            </w:rPr>
+                            <w:t>Generated</w:t>
+                          </w:r>
+                          <w:r>
+                            <w:rPr>
+                              <w:rFonts w:ascii="Noto Sans" w:hAnsi="Noto Sans"/>
+                              <w:color w:val="606060"/>
+                              <w:spacing w:val="-10"/>
+                              <w:sz w:val="14"/>
+                            </w:rPr>
+                            <w:t xml:space="preserve"> </w:t>
+                          </w:r>
+                          <w:r>
+                            <w:rPr>
+                              <w:rFonts w:ascii="Noto Sans" w:hAnsi="Noto Sans"/>
+                              <w:color w:val="606060"/>
+                              <w:sz w:val="14"/>
+                            </w:rPr>
+                            <w:t>by</w:t>
+                          </w:r>
+                          <w:r>
+                            <w:rPr>
+                              <w:rFonts w:ascii="Noto Sans" w:hAnsi="Noto Sans"/>
+                              <w:color w:val="606060"/>
+                              <w:spacing w:val="-8"/>
+                              <w:sz w:val="14"/>
+                            </w:rPr>
+                            <w:t xml:space="preserve"> </w:t>
+                          </w:r>
+                          <w:r>
+                            <w:rPr>
+                              <w:rFonts w:ascii="Noto Sans" w:hAnsi="Noto Sans"/>
+                              <w:color w:val="606060"/>
+                              <w:sz w:val="14"/>
+                            </w:rPr>
+                            <w:t>“</w:t>
+                          </w:r>
+                          <w:r>
+                            <w:rPr>
+                              <w:rFonts w:ascii="Noto Sans" w:hAnsi="Noto Sans"/>
+                              <w:color w:val="606060"/>
+                              <w:sz w:val="14"/>
+                            </w:rPr>
+                            <w:t>Probate Application</w:t>
+                          </w:r>
+                          <w:r>
+                            <w:rPr>
+                              <w:rFonts w:ascii="Noto Sans" w:hAnsi="Noto Sans"/>
+                              <w:color w:val="606060"/>
+                              <w:sz w:val="14"/>
+                            </w:rPr>
+                            <w:t>”</w:t>
+                          </w:r>
+                          <w:r>
+                            <w:rPr>
+                              <w:rFonts w:ascii="Noto Sans" w:hAnsi="Noto Sans"/>
+                              <w:color w:val="606060"/>
+                              <w:spacing w:val="-9"/>
+                              <w:sz w:val="14"/>
+                            </w:rPr>
+                            <w:t xml:space="preserve"> </w:t>
+                          </w:r>
+                          <w:r>
+                            <w:rPr>
+                              <w:rFonts w:ascii="Noto Sans" w:hAnsi="Noto Sans"/>
+                              <w:color w:val="606060"/>
+                              <w:sz w:val="14"/>
+                            </w:rPr>
+                            <w:t>on</w:t>
+                          </w:r>
+                          <w:r>
+                            <w:rPr>
+                              <w:rFonts w:ascii="Noto Sans" w:hAnsi="Noto Sans"/>
+                              <w:color w:val="606060"/>
+                              <w:sz w:val="14"/>
+                              <w:u w:val="single"/>
+                            </w:rPr>
+                            <w:tab/>
+                          </w:r>
+                          <w:r>
+                            <w:rPr>
+                              <w:rFonts w:ascii="Noto Sans" w:hAnsi="Noto Sans"/>
+                              <w:color w:val="606060"/>
+                              <w:sz w:val="14"/>
+                              <w:u w:val="single"/>
+                            </w:rPr>
+                            <w:tab/>
+                          </w:r>
+                          <w:r>
+                            <w:rPr>
+                              <w:rFonts w:ascii="Noto Sans" w:hAnsi="Noto Sans"/>
+                              <w:color w:val="606060"/>
+                              <w:spacing w:val="-2"/>
+                              <w:sz w:val="14"/>
+                            </w:rPr>
+                            <w:t>.</w:t>
+                          </w:r>
+                        </w:p>
+                      </w:txbxContent>
+                    </wps:txbx>
+                    <wps:bodyPr wrap="square" lIns="0" tIns="0" rIns="0" bIns="0" rtlCol="0">
+                      <a:noAutofit/>
+                    </wps:bodyPr>
+                  </wps:wsp>
+                </a:graphicData>
+              </a:graphic>
+            </wp:inline>
+          </w:drawing>
+        </mc:Choice>
+        <mc:Fallback xmlns:mc="http://schemas.openxmlformats.org/markup-compatibility/2006">
+          <w:pict xmlns:w="http://schemas.openxmlformats.org/wordprocessingml/2006/main">
+            <v:shapetype xmlns:w14="http://schemas.microsoft.com/office/word/2010/wordml" xmlns:o="urn:schemas-microsoft-com:office:office" xmlns:v="urn:schemas-microsoft-com:vml" id="_x0000_t202" coordsize="21600,21600" o:spt="202" path="m,l,21600r21600,l21600,xe" w14:anchorId="36437D51">
+              <v:stroke joinstyle="miter"/>
+              <v:path gradientshapeok="t" o:connecttype="rect"/>
+            </v:shapetype>
+            <v:shape xmlns:o="urn:schemas-microsoft-com:office:office" xmlns:v="urn:schemas-microsoft-com:vml" id="Textbox 1" style="position:absolute;margin-left:49.4pt;margin-top:753.85pt;width:182.2pt;height:11.55pt;z-index:-15771648;visibility:visible;mso-wrap-style:square;mso-wrap-distance-left:0;mso-wrap-distance-top:0;mso-wrap-distance-right:0;mso-wrap-distance-bottom:0;mso-position-horizontal:absolute;mso-position-horizontal-relative:page;mso-position-vertical:absolute;mso-position-vertical-relative:page;v-text-anchor:top" o:spid="_x0000_s1026" filled="f" stroked="f" type="#_x0000_t202" o:gfxdata="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">
+              <v:textbox inset="0,0,0,0">
+                <w:txbxContent>
+                  <w:p xmlns:w14="http://schemas.microsoft.com/office/word/2010/wordml">
+                    <w:pPr>
+                      <w:spacing w:before="20"/>
+                      <w:ind w:left="20"/>
+                      <w:rPr>
+                        <w:rFonts w:ascii="Noto Sans" w:hAnsi="Noto Sans"/>
+                        <w:sz w:val="14"/>
+                      </w:rPr>
+                    </w:pPr>
+                    <w:r>
+                      <w:rPr>
+                        <w:rFonts w:ascii="Noto Sans" w:hAnsi="Noto Sans"/>
+                        <w:color w:val="606060"/>
+                        <w:sz w:val="14"/>
+                      </w:rPr>
+                      <w:t>Generated</w:t>
+                    </w:r>
+                    <w:r>
+                      <w:rPr>
+                        <w:rFonts w:ascii="Noto Sans" w:hAnsi="Noto Sans"/>
+                        <w:color w:val="606060"/>
+                        <w:spacing w:val="-10"/>
+                        <w:sz w:val="14"/>
+                      </w:rPr>
+                      <w:t xml:space="preserve"> </w:t>
+                    </w:r>
+                    <w:r>
+                      <w:rPr>
+                        <w:rFonts w:ascii="Noto Sans" w:hAnsi="Noto Sans"/>
+                        <w:color w:val="606060"/>
+                        <w:sz w:val="14"/>
+                      </w:rPr>
+                      <w:t>by</w:t>
+                    </w:r>
+                    <w:r>
+                      <w:rPr>
+                        <w:rFonts w:ascii="Noto Sans" w:hAnsi="Noto Sans"/>
+                        <w:color w:val="606060"/>
+                        <w:spacing w:val="-8"/>
+                        <w:sz w:val="14"/>
+                      </w:rPr>
+                      <w:t xml:space="preserve"> </w:t>
+                    </w:r>
+                    <w:r>
+                      <w:rPr>
+                        <w:rFonts w:ascii="Noto Sans" w:hAnsi="Noto Sans"/>
+                        <w:color w:val="606060"/>
+                        <w:sz w:val="14"/>
+                      </w:rPr>
+                      <w:t>“</w:t>
+                    </w:r>
+                    <w:r>
+                      <w:rPr>
+                        <w:rFonts w:ascii="Noto Sans" w:hAnsi="Noto Sans"/>
+                        <w:color w:val="606060"/>
+                        <w:sz w:val="14"/>
+                      </w:rPr>
+                      <w:t>Probate Application</w:t>
+                    </w:r>
+                    <w:r>
+                      <w:rPr>
+                        <w:rFonts w:ascii="Noto Sans" w:hAnsi="Noto Sans"/>
+                        <w:color w:val="606060"/>
+                        <w:sz w:val="14"/>
+                      </w:rPr>
+                      <w:t>”</w:t>
+                    </w:r>
+                    <w:r>
+                      <w:rPr>
+                        <w:rFonts w:ascii="Noto Sans" w:hAnsi="Noto Sans"/>
+                        <w:color w:val="606060"/>
+                        <w:spacing w:val="-9"/>
+                        <w:sz w:val="14"/>
+                      </w:rPr>
+                      <w:t xml:space="preserve"> </w:t>
+                    </w:r>
+                    <w:r>
+                      <w:rPr>
+                        <w:rFonts w:ascii="Noto Sans" w:hAnsi="Noto Sans"/>
+                        <w:color w:val="606060"/>
+                        <w:sz w:val="14"/>
+                      </w:rPr>
+                      <w:t>on</w:t>
+                    </w:r>
+                    <w:r>
+                      <w:rPr>
+                        <w:rFonts w:ascii="Noto Sans" w:hAnsi="Noto Sans"/>
+                        <w:color w:val="606060"/>
+                        <w:sz w:val="14"/>
+                        <w:u w:val="single"/>
+                      </w:rPr>
+                      <w:tab/>
+                    </w:r>
+                    <w:r>
+                      <w:rPr>
+                        <w:rFonts w:ascii="Noto Sans" w:hAnsi="Noto Sans"/>
+                        <w:color w:val="606060"/>
+                        <w:sz w:val="14"/>
+                        <w:u w:val="single"/>
+                      </w:rPr>
+                      <w:tab/>
+                    </w:r>
+                    <w:r>
+                      <w:rPr>
+                        <w:rFonts w:ascii="Noto Sans" w:hAnsi="Noto Sans"/>
+                        <w:color w:val="606060"/>
+                        <w:spacing w:val="-2"/>
+                        <w:sz w:val="14"/>
+                      </w:rPr>
+                      <w:t>.</w:t>
+                    </w:r>
+                  </w:p>
+                </w:txbxContent>
+              </v:textbox>
+              <w10:wrap xmlns:w10="urn:schemas-microsoft-com:office:word" anchorx="page" anchory="page"/>
             </v:shape>
           </w:pict>
         </mc:Fallback>

</xml_diff>

<commit_message>
REPGRANT-625: Fix address region enrichment + template update
</commit_message>
<xml_diff>
--- a/api/Templates/P1.docx
+++ b/api/Templates/P1.docx
@@ -1,6 +1,6 @@
 
 <file path=word/document.xml><?xml version="1.0" encoding="utf-8"?>
-<w:document xmlns:wpc="http://schemas.microsoft.com/office/word/2010/wordprocessingCanvas" xmlns:cx="http://schemas.microsoft.com/office/drawing/2014/chartex" xmlns:cx1="http://schemas.microsoft.com/office/drawing/2015/9/8/chartex" xmlns:cx2="http://schemas.microsoft.com/office/drawing/2015/10/21/chartex" xmlns:cx3="http://schemas.microsoft.com/office/drawing/2016/5/9/chartex" xmlns:cx4="http://schemas.microsoft.com/office/drawing/2016/5/10/chartex" xmlns:cx5="http://schemas.microsoft.com/office/drawing/2016/5/11/chartex" xmlns:cx6="http://schemas.microsoft.com/office/drawing/2016/5/12/chartex" xmlns:cx7="http://schemas.microsoft.com/office/drawing/2016/5/13/chartex" xmlns:cx8="http://schemas.microsoft.com/office/drawing/2016/5/14/chartex" xmlns:mc="http://schemas.openxmlformats.org/markup-compatibility/2006" xmlns:aink="http://schemas.microsoft.com/office/drawing/2016/ink" xmlns:am3d="http://schemas.microsoft.com/office/drawing/2017/model3d" xmlns:o="urn:schemas-microsoft-com:office:office" xmlns:oel="http://schemas.microsoft.com/office/2019/extlst" xmlns:r="http://schemas.openxmlformats.org/officeDocument/2006/relationships" xmlns:m="http://schemas.openxmlformats.org/officeDocument/2006/math" xmlns:v="urn:schemas-microsoft-com:vml" xmlns:wp14="http://schemas.microsoft.com/office/word/2010/wordprocessingDrawing" xmlns:wp="http://schemas.openxmlformats.org/drawingml/2006/wordprocessingDrawing" xmlns:w10="urn:schemas-microsoft-com:office:word" xmlns:w="http://schemas.openxmlformats.org/wordprocessingml/2006/main" xmlns:w14="http://schemas.microsoft.com/office/word/2010/wordml" xmlns:w15="http://schemas.microsoft.com/office/word/2012/wordml" xmlns:w16cex="http://schemas.microsoft.com/office/word/2018/wordml/cex" xmlns:w16cid="http://schemas.microsoft.com/office/word/2016/wordml/cid" xmlns:w16="http://schemas.microsoft.com/office/word/2018/wordml" xmlns:w16du="http://schemas.microsoft.com/office/word/2023/wordml/word16du" xmlns:w16sdtdh="http://schemas.microsoft.com/office/word/2020/wordml/sdtdatahash" xmlns:w16sdtfl="http://schemas.microsoft.com/office/word/2024/wordml/sdtformatlock" xmlns:w16se="http://schemas.microsoft.com/office/word/2015/wordml/symex" xmlns:wpg="http://schemas.microsoft.com/office/word/2010/wordprocessingGroup" xmlns:wpi="http://schemas.microsoft.com/office/word/2010/wordprocessingInk" xmlns:wne="http://schemas.microsoft.com/office/word/2006/wordml" xmlns:wps="http://schemas.microsoft.com/office/word/2010/wordprocessingShape" mc:Ignorable="w14 w15 w16se w16cid w16 w16cex w16sdtdh w16sdtfl w16du wp14">
+<w:document xmlns:wpc="http://schemas.microsoft.com/office/word/2010/wordprocessingCanvas" xmlns:cx="http://schemas.microsoft.com/office/drawing/2014/chartex" xmlns:cx1="http://schemas.microsoft.com/office/drawing/2015/9/8/chartex" xmlns:cx2="http://schemas.microsoft.com/office/drawing/2015/10/21/chartex" xmlns:cx3="http://schemas.microsoft.com/office/drawing/2016/5/9/chartex" xmlns:cx4="http://schemas.microsoft.com/office/drawing/2016/5/10/chartex" xmlns:cx5="http://schemas.microsoft.com/office/drawing/2016/5/11/chartex" xmlns:cx6="http://schemas.microsoft.com/office/drawing/2016/5/12/chartex" xmlns:cx7="http://schemas.microsoft.com/office/drawing/2016/5/13/chartex" xmlns:cx8="http://schemas.microsoft.com/office/drawing/2016/5/14/chartex" xmlns:mc="http://schemas.openxmlformats.org/markup-compatibility/2006" xmlns:aink="http://schemas.microsoft.com/office/drawing/2016/ink" xmlns:am3d="http://schemas.microsoft.com/office/drawing/2017/model3d" xmlns:o="urn:schemas-microsoft-com:office:office" xmlns:oel="http://schemas.microsoft.com/office/2019/extlst" xmlns:r="http://schemas.openxmlformats.org/officeDocument/2006/relationships" xmlns:m="http://schemas.openxmlformats.org/officeDocument/2006/math" xmlns:v="urn:schemas-microsoft-com:vml" xmlns:wp14="http://schemas.microsoft.com/office/word/2010/wordprocessingDrawing" xmlns:wp="http://schemas.openxmlformats.org/drawingml/2006/wordprocessingDrawing" xmlns:w10="urn:schemas-microsoft-com:office:word" xmlns:w="http://schemas.openxmlformats.org/wordprocessingml/2006/main" xmlns:w14="http://schemas.microsoft.com/office/word/2010/wordml" xmlns:w15="http://schemas.microsoft.com/office/word/2012/wordml" xmlns:w16cei="http://schemas.microsoft.com/office/word/2026/wordml/cei" xmlns:w16cex="http://schemas.microsoft.com/office/word/2018/wordml/cex" xmlns:w16cid="http://schemas.microsoft.com/office/word/2016/wordml/cid" xmlns:w16="http://schemas.microsoft.com/office/word/2018/wordml" xmlns:w16du="http://schemas.microsoft.com/office/word/2023/wordml/word16du" xmlns:w16sdtdh="http://schemas.microsoft.com/office/word/2020/wordml/sdtdatahash" xmlns:w16sdtfl="http://schemas.microsoft.com/office/word/2024/wordml/sdtformatlock" xmlns:w16se="http://schemas.microsoft.com/office/word/2015/wordml/symex" xmlns:wpg="http://schemas.microsoft.com/office/word/2010/wordprocessingGroup" xmlns:wpi="http://schemas.microsoft.com/office/word/2010/wordprocessingInk" xmlns:wne="http://schemas.microsoft.com/office/word/2006/wordml" xmlns:wps="http://schemas.microsoft.com/office/word/2010/wordprocessingShape" mc:Ignorable="w14 w15 w16se w16cid w16 w16cex w16sdtdh w16sdtfl w16du wp14">
   <w:body>
     <w:p>
       <w:pPr>
@@ -14,8 +14,8 @@
       </w:pPr>
       <w:r>
         <w:rPr>
-          <w:b w:val="1"/>
-          <w:bCs w:val="1"/>
+          <w:b/>
+          <w:bCs/>
           <w:color w:val="313131"/>
           <w:sz w:val="21"/>
           <w:szCs w:val="21"/>
@@ -24,8 +24,8 @@
       </w:r>
       <w:r>
         <w:rPr>
-          <w:b w:val="1"/>
-          <w:bCs w:val="1"/>
+          <w:b/>
+          <w:bCs/>
           <w:color w:val="313131"/>
           <w:spacing w:val="-1"/>
           <w:sz w:val="21"/>
@@ -39,7 +39,7 @@
           <w:sz w:val="21"/>
           <w:szCs w:val="21"/>
         </w:rPr>
-        <w:t xml:space="preserve">(RULE 25-2 (3</w:t>
+        <w:t>(RULE 25-2 (3</w:t>
       </w:r>
       <w:r>
         <w:rPr>
@@ -47,7 +47,7 @@
           <w:sz w:val="21"/>
           <w:szCs w:val="21"/>
         </w:rPr>
-        <w:t xml:space="preserve">)</w:t>
+        <w:t>)</w:t>
       </w:r>
       <w:r>
         <w:rPr>
@@ -272,32 +272,31 @@
       </w:r>
       <w:r>
         <w:rPr>
-          <w:b w:val="1"/>
-          <w:bCs w:val="1"/>
-          <w:u w:val="none"/>
-        </w:rPr>
-        <w:t xml:space="preserve">{</w:t>
-      </w:r>
-      <w:r>
-        <w:rPr>
-          <w:b w:val="1"/>
-          <w:bCs w:val="1"/>
-          <w:u w:val="none"/>
-        </w:rPr>
-        <w:t xml:space="preserve">d.applicant.applicantName</w:t>
-      </w:r>
-      <w:r>
-        <w:rPr>
-          <w:b w:val="1"/>
-          <w:bCs w:val="1"/>
-          <w:u w:val="none"/>
-        </w:rPr>
-        <w:t xml:space="preserve">}</w:t>
-      </w:r>
-      <w:r>
-        <w:rPr>
-          <w:b w:val="1"/>
-          <w:bCs w:val="1"/>
+          <w:b/>
+          <w:bCs/>
+        </w:rPr>
+        <w:t>{</w:t>
+      </w:r>
+      <w:proofErr w:type="gramStart"/>
+      <w:r>
+        <w:rPr>
+          <w:b/>
+          <w:bCs/>
+        </w:rPr>
+        <w:t>d.applicant</w:t>
+      </w:r>
+      <w:proofErr w:type="gramEnd"/>
+      <w:r>
+        <w:rPr>
+          <w:b/>
+          <w:bCs/>
+        </w:rPr>
+        <w:t>.applicantName}</w:t>
+      </w:r>
+      <w:r>
+        <w:rPr>
+          <w:b/>
+          <w:bCs/>
           <w:spacing w:val="-10"/>
         </w:rPr>
         <w:t xml:space="preserve"> </w:t>
@@ -389,40 +388,45 @@
       </w:r>
       <w:r>
         <w:rPr>
-          <w:b w:val="1"/>
-          <w:bCs w:val="1"/>
-          <w:u w:val="none"/>
-        </w:rPr>
-        <w:t xml:space="preserve">{</w:t>
-      </w:r>
-      <w:r>
-        <w:rPr>
-          <w:b w:val="1"/>
-          <w:bCs w:val="1"/>
-          <w:u w:val="none"/>
-        </w:rPr>
-        <w:t xml:space="preserve">d.applicant.applicantCourthouse</w:t>
-      </w:r>
-      <w:r>
-        <w:rPr>
-          <w:b w:val="1"/>
-          <w:bCs w:val="1"/>
-          <w:u w:val="none"/>
-        </w:rPr>
-        <w:t xml:space="preserve">Name</w:t>
-      </w:r>
-      <w:r>
-        <w:rPr>
-          <w:b w:val="1"/>
-          <w:bCs w:val="1"/>
-          <w:u w:val="none"/>
-        </w:rPr>
-        <w:t xml:space="preserve">}</w:t>
-      </w:r>
-      <w:r>
-        <w:rPr>
-          <w:b w:val="1"/>
-          <w:bCs w:val="1"/>
+          <w:b/>
+          <w:bCs/>
+        </w:rPr>
+        <w:t>{</w:t>
+      </w:r>
+      <w:proofErr w:type="gramStart"/>
+      <w:r>
+        <w:rPr>
+          <w:b/>
+          <w:bCs/>
+        </w:rPr>
+        <w:t>d.applicant</w:t>
+      </w:r>
+      <w:proofErr w:type="gramEnd"/>
+      <w:r>
+        <w:rPr>
+          <w:b/>
+          <w:bCs/>
+        </w:rPr>
+        <w:t>.applicantCourthouse</w:t>
+      </w:r>
+      <w:r>
+        <w:rPr>
+          <w:b/>
+          <w:bCs/>
+        </w:rPr>
+        <w:t>Name</w:t>
+      </w:r>
+      <w:r>
+        <w:rPr>
+          <w:b/>
+          <w:bCs/>
+        </w:rPr>
+        <w:t>}</w:t>
+      </w:r>
+      <w:r>
+        <w:rPr>
+          <w:b/>
+          <w:bCs/>
           <w:spacing w:val="-10"/>
         </w:rPr>
         <w:t xml:space="preserve"> </w:t>
@@ -480,23 +484,23 @@
       </w:r>
       <w:r>
         <w:rPr>
-          <w:b w:val="1"/>
-          <w:bCs w:val="1"/>
+          <w:b/>
+          <w:bCs/>
         </w:rPr>
         <w:t>Grant</w:t>
       </w:r>
       <w:r>
         <w:rPr>
-          <w:b w:val="1"/>
-          <w:bCs w:val="1"/>
+          <w:b/>
+          <w:bCs/>
           <w:spacing w:val="-5"/>
         </w:rPr>
         <w:t xml:space="preserve"> </w:t>
       </w:r>
       <w:r>
         <w:rPr>
-          <w:b w:val="1"/>
-          <w:bCs w:val="1"/>
+          <w:b/>
+          <w:bCs/>
         </w:rPr>
         <w:t xml:space="preserve">of Administration Without Will Annexed </w:t>
       </w:r>
@@ -506,7 +510,7 @@
           <w:sz w:val="20"/>
           <w:szCs w:val="20"/>
         </w:rPr>
-        <w:t xml:space="preserve">in relation to the estate of the deceased described below who died on</w:t>
+        <w:t>in relation to the estate of the deceased described below who died on</w:t>
       </w:r>
       <w:r>
         <w:rPr>
@@ -516,22 +520,34 @@
         </w:rPr>
         <w:t xml:space="preserve"> {</w:t>
       </w:r>
+      <w:proofErr w:type="gramStart"/>
       <w:r>
         <w:rPr>
           <w:color w:val="313131"/>
           <w:sz w:val="20"/>
           <w:szCs w:val="20"/>
         </w:rPr>
-        <w:t>d.deceasedDeathDate:formatD</w:t>
-      </w:r>
+        <w:t>d.deceasedDeathDate</w:t>
+      </w:r>
+      <w:proofErr w:type="gramEnd"/>
       <w:r>
         <w:rPr>
           <w:color w:val="313131"/>
           <w:sz w:val="20"/>
           <w:szCs w:val="20"/>
         </w:rPr>
-        <w:t>(</w:t>
-      </w:r>
+        <w:t>:</w:t>
+      </w:r>
+      <w:proofErr w:type="gramStart"/>
+      <w:r>
+        <w:rPr>
+          <w:color w:val="313131"/>
+          <w:sz w:val="20"/>
+          <w:szCs w:val="20"/>
+        </w:rPr>
+        <w:t>formatD(</w:t>
+      </w:r>
+      <w:proofErr w:type="gramEnd"/>
       <w:r>
         <w:rPr>
           <w:color w:val="313131"/>
@@ -581,107 +597,78 @@
       <w:pPr>
         <w:pStyle w:val="Heading3"/>
         <w:rPr>
-          <w:b w:val="1"/>
-          <w:bCs w:val="1"/>
           <w:u w:val="single"/>
           <w:lang w:val="fr-FR"/>
         </w:rPr>
       </w:pPr>
       <w:r>
         <w:rPr>
-          <w:b w:val="1"/>
-          <w:bCs w:val="1"/>
-          <w:u w:val="none"/>
           <w:lang w:val="fr-FR"/>
         </w:rPr>
         <w:t>{</w:t>
       </w:r>
-      <w:r>
-        <w:rPr>
-          <w:b w:val="1"/>
-          <w:bCs w:val="1"/>
-          <w:u w:val="none"/>
+      <w:proofErr w:type="gramStart"/>
+      <w:r>
+        <w:rPr>
           <w:lang w:val="fr-FR"/>
         </w:rPr>
         <w:t>d.firstNameGivenName</w:t>
       </w:r>
-      <w:r>
-        <w:rPr>
-          <w:b w:val="1"/>
-          <w:bCs w:val="1"/>
-          <w:u w:val="none"/>
+      <w:proofErr w:type="gramEnd"/>
+      <w:r>
+        <w:rPr>
           <w:lang w:val="fr-FR"/>
         </w:rPr>
         <w:t>}</w:t>
       </w:r>
       <w:r>
         <w:rPr>
-          <w:b w:val="1"/>
-          <w:bCs w:val="1"/>
-          <w:u w:val="none"/>
           <w:lang w:val="fr-FR"/>
         </w:rPr>
         <w:t xml:space="preserve"> </w:t>
       </w:r>
       <w:r>
         <w:rPr>
-          <w:b w:val="1"/>
-          <w:bCs w:val="1"/>
-          <w:u w:val="none"/>
           <w:lang w:val="fr-FR"/>
         </w:rPr>
         <w:t>{</w:t>
       </w:r>
-      <w:r>
-        <w:rPr>
-          <w:b w:val="1"/>
-          <w:bCs w:val="1"/>
-          <w:u w:val="none"/>
+      <w:proofErr w:type="gramStart"/>
+      <w:r>
+        <w:rPr>
           <w:lang w:val="fr-FR"/>
         </w:rPr>
         <w:t>d.middleNameS</w:t>
       </w:r>
-      <w:r>
-        <w:rPr>
-          <w:b w:val="1"/>
-          <w:bCs w:val="1"/>
-          <w:u w:val="none"/>
+      <w:proofErr w:type="gramEnd"/>
+      <w:r>
+        <w:rPr>
           <w:lang w:val="fr-FR"/>
         </w:rPr>
         <w:t>}</w:t>
       </w:r>
       <w:r>
         <w:rPr>
-          <w:b w:val="1"/>
-          <w:bCs w:val="1"/>
-          <w:u w:val="none"/>
           <w:lang w:val="fr-FR"/>
         </w:rPr>
         <w:t xml:space="preserve"> </w:t>
       </w:r>
       <w:r>
         <w:rPr>
-          <w:b w:val="1"/>
-          <w:bCs w:val="1"/>
-          <w:u w:val="none"/>
           <w:lang w:val="fr-FR"/>
         </w:rPr>
         <w:t>{</w:t>
       </w:r>
-      <w:r>
-        <w:rPr>
-          <w:b w:val="1"/>
-          <w:bCs w:val="1"/>
-          <w:u w:val="none"/>
+      <w:proofErr w:type="gramStart"/>
+      <w:r>
+        <w:rPr>
           <w:lang w:val="fr-FR"/>
         </w:rPr>
         <w:t>d.lastNameFamilyNameOrSurname</w:t>
       </w:r>
-      <w:r>
-        <w:rPr>
-          <w:b w:val="1"/>
-          <w:bCs w:val="1"/>
-          <w:u w:val="none"/>
+      <w:proofErr w:type="gramEnd"/>
+      <w:r>
+        <w:rPr>
           <w:lang w:val="fr-FR"/>
         </w:rPr>
         <w:t>}</w:t>
@@ -777,211 +764,223 @@
     </w:p>
     <w:p>
       <w:pPr>
-        <w:pStyle w:val="Normal"/>
         <w:spacing w:before="29"/>
         <w:ind w:left="288"/>
         <w:rPr>
-          <w:b w:val="1"/>
-          <w:bCs w:val="1"/>
+          <w:b/>
+          <w:bCs/>
           <w:u w:val="single"/>
-          <w:lang w:val="en-US"/>
         </w:rPr>
       </w:pPr>
       <w:r>
         <w:rPr>
-          <w:b w:val="1"/>
-          <w:bCs w:val="1"/>
-          <w:u w:val="none"/>
+          <w:b/>
+          <w:bCs/>
           <w:lang w:val="fr-FR"/>
         </w:rPr>
         <w:t>{</w:t>
       </w:r>
-      <w:r>
-        <w:rPr>
-          <w:b w:val="1"/>
-          <w:bCs w:val="1"/>
-          <w:u w:val="none"/>
+      <w:proofErr w:type="spellStart"/>
+      <w:proofErr w:type="gramStart"/>
+      <w:r>
+        <w:rPr>
+          <w:b/>
+          <w:bCs/>
           <w:lang w:val="fr-FR"/>
         </w:rPr>
         <w:t>d.deceasedAddressStreet</w:t>
       </w:r>
-      <w:r>
-        <w:rPr>
-          <w:b w:val="1"/>
-          <w:bCs w:val="1"/>
-          <w:u w:val="none"/>
+      <w:proofErr w:type="spellEnd"/>
+      <w:proofErr w:type="gramEnd"/>
+      <w:r>
+        <w:rPr>
+          <w:b/>
+          <w:bCs/>
           <w:lang w:val="fr-FR"/>
         </w:rPr>
         <w:t>}, {</w:t>
       </w:r>
-      <w:r>
-        <w:rPr>
-          <w:b w:val="1"/>
-          <w:bCs w:val="1"/>
-          <w:u w:val="none"/>
+      <w:proofErr w:type="spellStart"/>
+      <w:proofErr w:type="gramStart"/>
+      <w:r>
+        <w:rPr>
+          <w:b/>
+          <w:bCs/>
           <w:lang w:val="fr-FR"/>
         </w:rPr>
         <w:t>d.deceasedAddressCity</w:t>
       </w:r>
-      <w:r>
-        <w:rPr>
-          <w:b w:val="1"/>
-          <w:bCs w:val="1"/>
-          <w:u w:val="none"/>
+      <w:proofErr w:type="spellEnd"/>
+      <w:proofErr w:type="gramEnd"/>
+      <w:r>
+        <w:rPr>
+          <w:b/>
+          <w:bCs/>
           <w:lang w:val="fr-FR"/>
         </w:rPr>
         <w:t>}, {</w:t>
       </w:r>
-      <w:r>
-        <w:rPr>
-          <w:b w:val="1"/>
-          <w:bCs w:val="1"/>
-          <w:u w:val="none"/>
+      <w:proofErr w:type="spellStart"/>
+      <w:proofErr w:type="gramStart"/>
+      <w:r>
+        <w:rPr>
+          <w:b/>
+          <w:bCs/>
           <w:lang w:val="fr-FR"/>
         </w:rPr>
         <w:t>d.deceasedAddressProvince</w:t>
       </w:r>
-      <w:r>
-        <w:rPr>
-          <w:b w:val="1"/>
-          <w:bCs w:val="1"/>
-          <w:u w:val="none"/>
+      <w:proofErr w:type="spellEnd"/>
+      <w:r>
+        <w:rPr>
+          <w:b/>
+          <w:bCs/>
           <w:lang w:val="fr-FR"/>
         </w:rPr>
         <w:t>}</w:t>
       </w:r>
       <w:r>
         <w:rPr>
-          <w:b w:val="1"/>
-          <w:bCs w:val="1"/>
-          <w:u w:val="none"/>
+          <w:b/>
+          <w:bCs/>
           <w:lang w:val="fr-FR"/>
         </w:rPr>
-        <w:t xml:space="preserve"> </w:t>
-      </w:r>
-      <w:r>
-        <w:rPr>
-          <w:b w:val="1"/>
-          <w:bCs w:val="1"/>
-          <w:u w:val="none"/>
+        <w:t>{</w:t>
+      </w:r>
+      <w:proofErr w:type="gramEnd"/>
+      <w:r>
+        <w:rPr>
+          <w:b/>
+          <w:bCs/>
           <w:lang w:val="fr-FR"/>
         </w:rPr>
+        <w:t xml:space="preserve">d. </w:t>
+      </w:r>
+      <w:proofErr w:type="spellStart"/>
+      <w:proofErr w:type="gramStart"/>
+      <w:r>
+        <w:rPr>
+          <w:b/>
+          <w:bCs/>
+          <w:lang w:val="fr-FR"/>
+        </w:rPr>
+        <w:t>deceasedAddressState</w:t>
+      </w:r>
+      <w:proofErr w:type="spellEnd"/>
+      <w:r>
+        <w:rPr>
+          <w:b/>
+          <w:bCs/>
+          <w:lang w:val="fr-FR"/>
+        </w:rPr>
+        <w:t>}</w:t>
+      </w:r>
+      <w:r>
+        <w:rPr>
+          <w:b/>
+          <w:bCs/>
+          <w:lang w:val="fr-FR"/>
+        </w:rPr>
         <w:t>{</w:t>
       </w:r>
-      <w:r>
-        <w:rPr>
-          <w:b w:val="1"/>
-          <w:bCs w:val="1"/>
-          <w:u w:val="none"/>
+      <w:proofErr w:type="spellStart"/>
+      <w:r>
+        <w:rPr>
+          <w:b/>
+          <w:bCs/>
           <w:lang w:val="fr-FR"/>
         </w:rPr>
-        <w:t xml:space="preserve">d. </w:t>
-      </w:r>
-      <w:r>
-        <w:rPr>
-          <w:b w:val="1"/>
-          <w:bCs w:val="1"/>
-          <w:u w:val="none"/>
+        <w:t>d.</w:t>
+      </w:r>
+      <w:r>
+        <w:rPr>
+          <w:b/>
+          <w:bCs/>
           <w:lang w:val="fr-FR"/>
         </w:rPr>
-        <w:t>deceasedAddressState</w:t>
-      </w:r>
-      <w:r>
-        <w:rPr>
-          <w:b w:val="1"/>
-          <w:bCs w:val="1"/>
-          <w:u w:val="none"/>
+        <w:t>deceasedAddressProvinceText</w:t>
+      </w:r>
+      <w:proofErr w:type="spellEnd"/>
+      <w:proofErr w:type="gramEnd"/>
+      <w:r>
+        <w:rPr>
+          <w:b/>
+          <w:bCs/>
           <w:lang w:val="fr-FR"/>
         </w:rPr>
         <w:t>}</w:t>
       </w:r>
       <w:r>
         <w:rPr>
-          <w:b w:val="1"/>
-          <w:bCs w:val="1"/>
-          <w:u w:val="none"/>
+          <w:b/>
+          <w:bCs/>
           <w:lang w:val="fr-FR"/>
         </w:rPr>
         <w:t xml:space="preserve">, </w:t>
       </w:r>
       <w:r>
         <w:rPr>
-          <w:b w:val="1"/>
-          <w:bCs w:val="1"/>
-          <w:u w:val="none"/>
+          <w:b/>
+          <w:bCs/>
           <w:lang w:val="fr-FR"/>
         </w:rPr>
         <w:t>{</w:t>
       </w:r>
-      <w:r>
-        <w:rPr>
-          <w:b w:val="1"/>
-          <w:bCs w:val="1"/>
-          <w:u w:val="none"/>
+      <w:proofErr w:type="spellStart"/>
+      <w:proofErr w:type="gramStart"/>
+      <w:r>
+        <w:rPr>
+          <w:b/>
+          <w:bCs/>
           <w:lang w:val="fr-FR"/>
         </w:rPr>
         <w:t>d.deceasedAddressPostalCode</w:t>
       </w:r>
-      <w:r>
-        <w:rPr>
-          <w:b w:val="1"/>
-          <w:bCs w:val="1"/>
-          <w:u w:val="none"/>
+      <w:proofErr w:type="spellEnd"/>
+      <w:proofErr w:type="gramEnd"/>
+      <w:r>
+        <w:rPr>
+          <w:b/>
+          <w:bCs/>
           <w:lang w:val="fr-FR"/>
         </w:rPr>
         <w:t>}</w:t>
       </w:r>
       <w:r>
         <w:rPr>
-          <w:b w:val="1"/>
-          <w:bCs w:val="1"/>
-          <w:u w:val="none"/>
+          <w:b/>
+          <w:bCs/>
           <w:lang w:val="fr-FR"/>
         </w:rPr>
         <w:t xml:space="preserve"> </w:t>
       </w:r>
       <w:r>
         <w:rPr>
-          <w:b w:val="1"/>
-          <w:bCs w:val="1"/>
-          <w:u w:val="none"/>
-          <w:lang w:val="en-US"/>
+          <w:b/>
+          <w:bCs/>
         </w:rPr>
         <w:t>{</w:t>
       </w:r>
-      <w:r>
-        <w:rPr>
-          <w:b w:val="1"/>
-          <w:bCs w:val="1"/>
-          <w:u w:val="none"/>
-          <w:lang w:val="en-US"/>
+      <w:proofErr w:type="gramStart"/>
+      <w:r>
+        <w:rPr>
+          <w:b/>
+          <w:bCs/>
         </w:rPr>
         <w:t>d.</w:t>
       </w:r>
       <w:r>
         <w:rPr>
-          <w:b w:val="1"/>
-          <w:bCs w:val="1"/>
-          <w:u w:val="none"/>
-          <w:lang w:val="en-US"/>
-        </w:rPr>
-        <w:t>deceasedAddressCo</w:t>
-      </w:r>
-      <w:r>
-        <w:rPr>
-          <w:b w:val="1"/>
-          <w:bCs w:val="1"/>
-          <w:u w:val="none"/>
-          <w:lang w:val="en-US"/>
-        </w:rPr>
-        <w:t>untry</w:t>
-      </w:r>
-      <w:r>
-        <w:rPr>
-          <w:b w:val="1"/>
-          <w:bCs w:val="1"/>
-          <w:u w:val="none"/>
-          <w:lang w:val="en-US"/>
+          <w:b/>
+          <w:bCs/>
+        </w:rPr>
+        <w:t>deceasedAddressCountry</w:t>
+      </w:r>
+      <w:proofErr w:type="gramEnd"/>
+      <w:r>
+        <w:rPr>
+          <w:b/>
+          <w:bCs/>
         </w:rPr>
         <w:t>}</w:t>
       </w:r>
@@ -2169,13 +2168,23 @@
         </w:rPr>
         <w:t xml:space="preserve">the </w:t>
       </w:r>
+      <w:proofErr w:type="gramStart"/>
       <w:r>
         <w:rPr>
           <w:color w:val="313131"/>
           <w:spacing w:val="-2"/>
           <w:sz w:val="20"/>
         </w:rPr>
-        <w:t>estate.</w:t>
+        <w:t>estate</w:t>
+      </w:r>
+      <w:proofErr w:type="gramEnd"/>
+      <w:r>
+        <w:rPr>
+          <w:color w:val="313131"/>
+          <w:spacing w:val="-2"/>
+          <w:sz w:val="20"/>
+        </w:rPr>
+        <w:t>.</w:t>
       </w:r>
     </w:p>
     <w:p>
@@ -2235,7 +2244,23 @@
           <w:color w:val="313131"/>
           <w:sz w:val="20"/>
         </w:rPr>
-        <w:t>An authorization to obtain estate information or a grant may issue to the applicant on any date that is at</w:t>
+        <w:t xml:space="preserve">An authorization to obtain estate information or a grant may </w:t>
+      </w:r>
+      <w:proofErr w:type="gramStart"/>
+      <w:r>
+        <w:rPr>
+          <w:color w:val="313131"/>
+          <w:sz w:val="20"/>
+        </w:rPr>
+        <w:t>issue</w:t>
+      </w:r>
+      <w:proofErr w:type="gramEnd"/>
+      <w:r>
+        <w:rPr>
+          <w:color w:val="313131"/>
+          <w:sz w:val="20"/>
+        </w:rPr>
+        <w:t xml:space="preserve"> to the applicant on any date that is at</w:t>
       </w:r>
       <w:r>
         <w:rPr>
@@ -2579,7 +2604,7 @@
           <w:headerReference w:type="first" r:id="rId14"/>
           <w:footerReference w:type="first" r:id="rId15"/>
           <w:type w:val="continuous"/>
-          <w:pgSz w:w="12240" w:h="15840" w:orient="portrait"/>
+          <w:pgSz w:w="12240" w:h="15840"/>
           <w:pgMar w:top="940" w:right="720" w:bottom="740" w:left="720" w:header="0" w:footer="543" w:gutter="0"/>
           <w:pgNumType w:start="1"/>
           <w:cols w:space="720"/>
@@ -2609,7 +2634,39 @@
           <w:sz w:val="20"/>
         </w:rPr>
         <w:lastRenderedPageBreak/>
-        <w:t>If an authorization to obtain estate information issues to the applicant, the applicant may apply for a grant without further notice.</w:t>
+        <w:t xml:space="preserve">If an authorization </w:t>
+      </w:r>
+      <w:proofErr w:type="gramStart"/>
+      <w:r>
+        <w:rPr>
+          <w:color w:val="313131"/>
+          <w:sz w:val="20"/>
+        </w:rPr>
+        <w:t>to obtain</w:t>
+      </w:r>
+      <w:proofErr w:type="gramEnd"/>
+      <w:r>
+        <w:rPr>
+          <w:color w:val="313131"/>
+          <w:sz w:val="20"/>
+        </w:rPr>
+        <w:t xml:space="preserve"> estate information </w:t>
+      </w:r>
+      <w:proofErr w:type="gramStart"/>
+      <w:r>
+        <w:rPr>
+          <w:color w:val="313131"/>
+          <w:sz w:val="20"/>
+        </w:rPr>
+        <w:t>issues</w:t>
+      </w:r>
+      <w:proofErr w:type="gramEnd"/>
+      <w:r>
+        <w:rPr>
+          <w:color w:val="313131"/>
+          <w:sz w:val="20"/>
+        </w:rPr>
+        <w:t xml:space="preserve"> to the applicant, the applicant may apply for a grant without further notice.</w:t>
       </w:r>
     </w:p>
     <w:p>
@@ -2634,7 +2691,23 @@
           <w:color w:val="313131"/>
           <w:sz w:val="20"/>
         </w:rPr>
-        <w:t>If a grant issues to the applicant, the applicant must provide, to intestate successors of the deceased, an accounting as to how the estate was administered and how the estate assets were distributed.</w:t>
+        <w:t xml:space="preserve">If a grant </w:t>
+      </w:r>
+      <w:proofErr w:type="gramStart"/>
+      <w:r>
+        <w:rPr>
+          <w:color w:val="313131"/>
+          <w:sz w:val="20"/>
+        </w:rPr>
+        <w:t>issues</w:t>
+      </w:r>
+      <w:proofErr w:type="gramEnd"/>
+      <w:r>
+        <w:rPr>
+          <w:color w:val="313131"/>
+          <w:sz w:val="20"/>
+        </w:rPr>
+        <w:t xml:space="preserve"> to the applicant, the applicant must provide, to intestate successors of the deceased, an accounting as to how the estate was administered and how the estate assets were distributed.</w:t>
       </w:r>
     </w:p>
     <w:p>
@@ -2699,9 +2772,8 @@
         <w:spacing w:before="272"/>
         <w:ind w:left="288"/>
         <w:rPr>
-          <w:b w:val="1"/>
-          <w:bCs w:val="1"/>
-          <w:u w:val="none"/>
+          <w:b/>
+          <w:bCs/>
         </w:rPr>
       </w:pPr>
       <w:r>
@@ -2723,627 +2795,442 @@
       </w:r>
       <w:r>
         <w:rPr>
-          <w:b w:val="1"/>
-          <w:bCs w:val="1"/>
-          <w:u w:val="none"/>
-        </w:rPr>
-        <w:t xml:space="preserve">{</w:t>
-      </w:r>
-      <w:r>
-        <w:rPr>
-          <w:b w:val="1"/>
-          <w:bCs w:val="1"/>
-          <w:u w:val="none"/>
-        </w:rPr>
-        <w:t xml:space="preserve">d.applicant.applicantName</w:t>
-      </w:r>
-      <w:r>
-        <w:rPr>
-          <w:b w:val="1"/>
-          <w:bCs w:val="1"/>
-          <w:u w:val="none"/>
-        </w:rPr>
-        <w:t xml:space="preserve">}</w:t>
+          <w:b/>
+          <w:bCs/>
+        </w:rPr>
+        <w:t>{</w:t>
+      </w:r>
+      <w:proofErr w:type="spellStart"/>
+      <w:r>
+        <w:rPr>
+          <w:b/>
+          <w:bCs/>
+        </w:rPr>
+        <w:t>d.applicant.applicantName</w:t>
+      </w:r>
+      <w:proofErr w:type="spellEnd"/>
+      <w:r>
+        <w:rPr>
+          <w:b/>
+          <w:bCs/>
+        </w:rPr>
+        <w:t>}</w:t>
       </w:r>
       <w:r>
         <w:br/>
       </w:r>
       <w:r>
         <w:rPr>
-          <w:b w:val="1"/>
-          <w:bCs w:val="1"/>
-          <w:u w:val="none"/>
+          <w:b/>
+          <w:bCs/>
+        </w:rPr>
+        <w:t>{d.applicant.applicantOrdinaryAddressReceiveMail:ifEQ('yes')</w:t>
+      </w:r>
+      <w:r>
+        <w:rPr>
+          <w:b/>
+          <w:bCs/>
+        </w:rPr>
+        <w:t>:showBegin</w:t>
+      </w:r>
+      <w:r>
+        <w:rPr>
+          <w:b/>
+          <w:bCs/>
+        </w:rPr>
+        <w:t>}</w:t>
+      </w:r>
+      <w:r>
+        <w:br/>
+      </w:r>
+      <w:r>
+        <w:rPr>
+          <w:color w:val="313131"/>
+          <w:sz w:val="20"/>
+          <w:szCs w:val="20"/>
+        </w:rPr>
+        <w:t xml:space="preserve">Mailing address: </w:t>
+      </w:r>
+      <w:r>
+        <w:rPr>
+          <w:b/>
+          <w:bCs/>
         </w:rPr>
         <w:t>{</w:t>
       </w:r>
-      <w:r>
-        <w:rPr>
-          <w:b w:val="1"/>
-          <w:bCs w:val="1"/>
-          <w:u w:val="none"/>
-        </w:rPr>
-        <w:t>d.applicant.</w:t>
-      </w:r>
-      <w:r>
-        <w:rPr>
-          <w:b w:val="1"/>
-          <w:bCs w:val="1"/>
-          <w:u w:val="none"/>
-        </w:rPr>
-        <w:t>applicantOrdinaryAddressReceiveMail</w:t>
-      </w:r>
-      <w:r>
-        <w:rPr>
-          <w:b w:val="1"/>
-          <w:bCs w:val="1"/>
-          <w:u w:val="none"/>
-        </w:rPr>
-        <w:t>:ifEQ</w:t>
-      </w:r>
-      <w:r>
-        <w:rPr>
-          <w:b w:val="1"/>
-          <w:bCs w:val="1"/>
-          <w:u w:val="none"/>
-        </w:rPr>
-        <w:t>('</w:t>
-      </w:r>
-      <w:r>
-        <w:rPr>
-          <w:b w:val="1"/>
-          <w:bCs w:val="1"/>
-          <w:u w:val="none"/>
-        </w:rPr>
-        <w:t>yes'</w:t>
-      </w:r>
-      <w:r>
-        <w:rPr>
-          <w:b w:val="1"/>
-          <w:bCs w:val="1"/>
-          <w:u w:val="none"/>
-        </w:rPr>
-        <w:t>)</w:t>
-      </w:r>
-      <w:r>
-        <w:rPr>
-          <w:b w:val="1"/>
-          <w:bCs w:val="1"/>
-          <w:u w:val="none"/>
-        </w:rPr>
-        <w:t>:</w:t>
-      </w:r>
-      <w:r>
-        <w:rPr>
-          <w:b w:val="1"/>
-          <w:bCs w:val="1"/>
-          <w:u w:val="none"/>
-        </w:rPr>
-        <w:t>showBegin</w:t>
-      </w:r>
-      <w:r>
-        <w:rPr>
-          <w:b w:val="1"/>
-          <w:bCs w:val="1"/>
-          <w:u w:val="none"/>
+      <w:proofErr w:type="spellStart"/>
+      <w:r>
+        <w:rPr>
+          <w:b/>
+          <w:bCs/>
+        </w:rPr>
+        <w:t>d.applicant.applicantOrdinaryAddressStreet</w:t>
+      </w:r>
+      <w:proofErr w:type="spellEnd"/>
+      <w:r>
+        <w:rPr>
+          <w:b/>
+          <w:bCs/>
+        </w:rPr>
+        <w:t>},</w:t>
+      </w:r>
+      <w:r>
+        <w:rPr>
+          <w:b/>
+          <w:bCs/>
+        </w:rPr>
+        <w:t xml:space="preserve"> </w:t>
+      </w:r>
+      <w:r>
+        <w:rPr>
+          <w:b/>
+          <w:bCs/>
+        </w:rPr>
+        <w:t>{</w:t>
+      </w:r>
+      <w:proofErr w:type="spellStart"/>
+      <w:r>
+        <w:rPr>
+          <w:b/>
+          <w:bCs/>
+        </w:rPr>
+        <w:t>d.applicant.applicantOrdinaryAddressCity</w:t>
+      </w:r>
+      <w:proofErr w:type="spellEnd"/>
+      <w:r>
+        <w:rPr>
+          <w:b/>
+          <w:bCs/>
         </w:rPr>
         <w:t>}</w:t>
       </w:r>
       <w:r>
+        <w:rPr>
+          <w:b/>
+          <w:bCs/>
+        </w:rPr>
+        <w:t>,</w:t>
+      </w:r>
+      <w:r>
+        <w:rPr>
+          <w:b/>
+          <w:bCs/>
+        </w:rPr>
+        <w:t xml:space="preserve"> {d.applicant.applicant</w:t>
+      </w:r>
+      <w:r>
+        <w:rPr>
+          <w:b/>
+          <w:bCs/>
+        </w:rPr>
+        <w:t>Ordinary</w:t>
+      </w:r>
+      <w:r>
+        <w:rPr>
+          <w:b/>
+          <w:bCs/>
+        </w:rPr>
+        <w:t>AddressProvince}</w:t>
+      </w:r>
+      <w:r>
+        <w:rPr>
+          <w:b/>
+          <w:bCs/>
+        </w:rPr>
+        <w:t>{d.applicant.applicantOrdinaryAddressState}</w:t>
+      </w:r>
+      <w:r>
+        <w:rPr>
+          <w:b/>
+          <w:bCs/>
+        </w:rPr>
+        <w:t>{d.</w:t>
+      </w:r>
+      <w:r>
+        <w:rPr>
+          <w:b/>
+          <w:bCs/>
+        </w:rPr>
+        <w:t>applicant.</w:t>
+      </w:r>
+      <w:r>
+        <w:rPr>
+          <w:b/>
+          <w:bCs/>
+        </w:rPr>
+        <w:t xml:space="preserve">applicantOrdinaryAddressProvinceText </w:t>
+      </w:r>
+      <w:r>
+        <w:rPr>
+          <w:b/>
+          <w:bCs/>
+        </w:rPr>
+        <w:t>}</w:t>
+      </w:r>
+      <w:r>
+        <w:rPr>
+          <w:b/>
+          <w:bCs/>
+        </w:rPr>
+        <w:t>,</w:t>
+      </w:r>
+      <w:r>
+        <w:rPr>
+          <w:b/>
+          <w:bCs/>
+        </w:rPr>
+        <w:t xml:space="preserve"> {</w:t>
+      </w:r>
+      <w:proofErr w:type="spellStart"/>
+      <w:r>
+        <w:rPr>
+          <w:b/>
+          <w:bCs/>
+        </w:rPr>
+        <w:t>d.applicant.applicant</w:t>
+      </w:r>
+      <w:r>
+        <w:rPr>
+          <w:b/>
+          <w:bCs/>
+        </w:rPr>
+        <w:t>Ordinary</w:t>
+      </w:r>
+      <w:r>
+        <w:rPr>
+          <w:b/>
+          <w:bCs/>
+        </w:rPr>
+        <w:t>AddressPostalCode</w:t>
+      </w:r>
+      <w:proofErr w:type="spellEnd"/>
+      <w:r>
+        <w:rPr>
+          <w:b/>
+          <w:bCs/>
+        </w:rPr>
+        <w:t>}, {d.applicant.applicant</w:t>
+      </w:r>
+      <w:r>
+        <w:rPr>
+          <w:b/>
+          <w:bCs/>
+        </w:rPr>
+        <w:t>Ordinary</w:t>
+      </w:r>
+      <w:r>
+        <w:rPr>
+          <w:b/>
+          <w:bCs/>
+        </w:rPr>
+        <w:t>AddressCountry</w:t>
+      </w:r>
+      <w:r>
+        <w:rPr>
+          <w:b/>
+          <w:bCs/>
+        </w:rPr>
+        <w:t>}</w:t>
+      </w:r>
+      <w:r>
+        <w:rPr>
+          <w:b/>
+          <w:bCs/>
+        </w:rPr>
+        <w:t>{</w:t>
+      </w:r>
+      <w:r>
+        <w:rPr>
+          <w:b/>
+          <w:bCs/>
+        </w:rPr>
+        <w:t>d.applicant.applicantOrdinaryAddressReceiveMail</w:t>
+      </w:r>
+      <w:r>
+        <w:rPr>
+          <w:b/>
+          <w:bCs/>
+        </w:rPr>
+        <w:t>:showEnd</w:t>
+      </w:r>
+      <w:r>
+        <w:rPr>
+          <w:b/>
+          <w:bCs/>
+        </w:rPr>
+        <w:t>}</w:t>
+      </w:r>
+      <w:r>
         <w:br/>
       </w:r>
       <w:r>
         <w:rPr>
-          <w:b w:val="0"/>
-          <w:bCs w:val="0"/>
+          <w:b/>
+          <w:bCs/>
+        </w:rPr>
+        <w:t>{d.applicant.applicantOrdinaryAddressReceiveMail:ifEQ('yes')</w:t>
+      </w:r>
+      <w:r>
+        <w:rPr>
+          <w:b/>
+          <w:bCs/>
+        </w:rPr>
+        <w:t>:hideBegin</w:t>
+      </w:r>
+      <w:r>
+        <w:rPr>
+          <w:b/>
+          <w:bCs/>
+        </w:rPr>
+        <w:t>}</w:t>
+      </w:r>
+      <w:r>
+        <w:br/>
+      </w:r>
+      <w:r>
+        <w:rPr>
           <w:color w:val="313131"/>
           <w:sz w:val="20"/>
           <w:szCs w:val="20"/>
-          <w:u w:val="none"/>
         </w:rPr>
         <w:t xml:space="preserve">Mailing address: </w:t>
       </w:r>
       <w:r>
         <w:rPr>
-          <w:b w:val="1"/>
-          <w:bCs w:val="1"/>
-          <w:u w:val="none"/>
+          <w:b/>
+          <w:bCs/>
         </w:rPr>
         <w:t>{</w:t>
       </w:r>
-      <w:r>
-        <w:rPr>
-          <w:b w:val="1"/>
-          <w:bCs w:val="1"/>
-          <w:u w:val="none"/>
-        </w:rPr>
-        <w:t>d.applicant.applicantOrdinaryAddressStreet</w:t>
-      </w:r>
-      <w:r>
-        <w:rPr>
-          <w:b w:val="1"/>
-          <w:bCs w:val="1"/>
-          <w:u w:val="none"/>
+      <w:proofErr w:type="spellStart"/>
+      <w:r>
+        <w:rPr>
+          <w:b/>
+          <w:bCs/>
+        </w:rPr>
+        <w:t>d.applicant.applicantMailingAddressStreet</w:t>
+      </w:r>
+      <w:proofErr w:type="spellEnd"/>
+      <w:r>
+        <w:rPr>
+          <w:b/>
+          <w:bCs/>
+        </w:rPr>
+        <w:t>}, {</w:t>
+      </w:r>
+      <w:proofErr w:type="spellStart"/>
+      <w:r>
+        <w:rPr>
+          <w:b/>
+          <w:bCs/>
+        </w:rPr>
+        <w:t>d.applicant.applicantMailingAddressCity</w:t>
+      </w:r>
+      <w:proofErr w:type="spellEnd"/>
+      <w:r>
+        <w:rPr>
+          <w:b/>
+          <w:bCs/>
+        </w:rPr>
+        <w:t>}, {d.applicant.applicantMailingAddressProvince}</w:t>
+      </w:r>
+      <w:r>
+        <w:rPr>
+          <w:b/>
+          <w:bCs/>
+        </w:rPr>
+        <w:t>{d.applicant.applicantMailingAddressState}</w:t>
+      </w:r>
+      <w:r>
+        <w:rPr>
+          <w:b/>
+          <w:bCs/>
+        </w:rPr>
+        <w:t>{d</w:t>
+      </w:r>
+      <w:r>
+        <w:rPr>
+          <w:b/>
+          <w:bCs/>
+        </w:rPr>
+        <w:t>.applicant</w:t>
+      </w:r>
+      <w:r>
+        <w:rPr>
+          <w:b/>
+          <w:bCs/>
+        </w:rPr>
+        <w:t>.</w:t>
+      </w:r>
+      <w:r>
+        <w:rPr>
+          <w:b/>
+          <w:bCs/>
+        </w:rPr>
+        <w:t xml:space="preserve">applicantMailingAddressProvinceText </w:t>
+      </w:r>
+      <w:r>
+        <w:rPr>
+          <w:b/>
+          <w:bCs/>
         </w:rPr>
         <w:t>},</w:t>
       </w:r>
       <w:r>
         <w:rPr>
-          <w:b w:val="1"/>
-          <w:bCs w:val="1"/>
-          <w:u w:val="none"/>
-        </w:rPr>
-        <w:t xml:space="preserve"> </w:t>
-      </w:r>
-      <w:r>
-        <w:rPr>
-          <w:b w:val="1"/>
-          <w:bCs w:val="1"/>
-          <w:u w:val="none"/>
+          <w:b/>
+          <w:bCs/>
+        </w:rPr>
+        <w:t xml:space="preserve"> {</w:t>
+      </w:r>
+      <w:proofErr w:type="spellStart"/>
+      <w:r>
+        <w:rPr>
+          <w:b/>
+          <w:bCs/>
+        </w:rPr>
+        <w:t>d.applicant.applicantMailingAddressPostalCode</w:t>
+      </w:r>
+      <w:proofErr w:type="spellEnd"/>
+      <w:r>
+        <w:rPr>
+          <w:b/>
+          <w:bCs/>
+        </w:rPr>
+        <w:t>}, {d.applicant.applicantMailingAddressCountry</w:t>
+      </w:r>
+      <w:r>
+        <w:rPr>
+          <w:b/>
+          <w:bCs/>
+        </w:rPr>
+        <w:t>}</w:t>
+      </w:r>
+      <w:r>
+        <w:rPr>
+          <w:b/>
+          <w:bCs/>
         </w:rPr>
         <w:t>{</w:t>
       </w:r>
       <w:r>
         <w:rPr>
-          <w:b w:val="1"/>
-          <w:bCs w:val="1"/>
-          <w:u w:val="none"/>
-        </w:rPr>
-        <w:t>d.applicant.applicantOrdinaryAddressCity</w:t>
-      </w:r>
-      <w:r>
-        <w:rPr>
-          <w:b w:val="1"/>
-          <w:bCs w:val="1"/>
-          <w:u w:val="none"/>
-        </w:rPr>
-        <w:t>}</w:t>
-      </w:r>
-      <w:r>
-        <w:rPr>
-          <w:b w:val="1"/>
-          <w:bCs w:val="1"/>
-          <w:u w:val="none"/>
-        </w:rPr>
-        <w:t>,</w:t>
-      </w:r>
-      <w:r>
-        <w:rPr>
-          <w:b w:val="1"/>
-          <w:bCs w:val="1"/>
-          <w:u w:val="none"/>
-        </w:rPr>
-        <w:t xml:space="preserve"> {</w:t>
-      </w:r>
-      <w:r>
-        <w:rPr>
-          <w:b w:val="1"/>
-          <w:bCs w:val="1"/>
-          <w:u w:val="none"/>
-        </w:rPr>
-        <w:t>d.applicant.applicant</w:t>
-      </w:r>
-      <w:r>
-        <w:rPr>
-          <w:b w:val="1"/>
-          <w:bCs w:val="1"/>
-          <w:u w:val="none"/>
-        </w:rPr>
-        <w:t>Ordinary</w:t>
-      </w:r>
-      <w:r>
-        <w:rPr>
-          <w:b w:val="1"/>
-          <w:bCs w:val="1"/>
-          <w:u w:val="none"/>
-        </w:rPr>
-        <w:t>AddressProvince</w:t>
-      </w:r>
-      <w:r>
-        <w:rPr>
-          <w:b w:val="1"/>
-          <w:bCs w:val="1"/>
-          <w:u w:val="none"/>
-        </w:rPr>
-        <w:t>}</w:t>
-      </w:r>
-      <w:r>
-        <w:rPr>
-          <w:b w:val="1"/>
-          <w:bCs w:val="1"/>
-          <w:u w:val="none"/>
-        </w:rPr>
-        <w:t>{</w:t>
-      </w:r>
-      <w:r>
-        <w:rPr>
-          <w:b w:val="1"/>
-          <w:bCs w:val="1"/>
-          <w:u w:val="none"/>
-        </w:rPr>
-        <w:t>d.applicant.applicantOrdinaryAddressState</w:t>
-      </w:r>
-      <w:r>
-        <w:rPr>
-          <w:b w:val="1"/>
-          <w:bCs w:val="1"/>
-          <w:u w:val="none"/>
-        </w:rPr>
-        <w:t>}</w:t>
-      </w:r>
-      <w:r>
-        <w:rPr>
-          <w:b w:val="1"/>
-          <w:bCs w:val="1"/>
-          <w:u w:val="none"/>
-        </w:rPr>
-        <w:t>,</w:t>
-      </w:r>
-      <w:r>
-        <w:rPr>
-          <w:b w:val="1"/>
-          <w:bCs w:val="1"/>
-          <w:u w:val="none"/>
-        </w:rPr>
-        <w:t xml:space="preserve"> {</w:t>
-      </w:r>
-      <w:r>
-        <w:rPr>
-          <w:b w:val="1"/>
-          <w:bCs w:val="1"/>
-          <w:u w:val="none"/>
-        </w:rPr>
-        <w:t>d.applicant.applicant</w:t>
-      </w:r>
-      <w:r>
-        <w:rPr>
-          <w:b w:val="1"/>
-          <w:bCs w:val="1"/>
-          <w:u w:val="none"/>
-        </w:rPr>
-        <w:t>Ordinary</w:t>
-      </w:r>
-      <w:r>
-        <w:rPr>
-          <w:b w:val="1"/>
-          <w:bCs w:val="1"/>
-          <w:u w:val="none"/>
-        </w:rPr>
-        <w:t>AddressPostalCode</w:t>
-      </w:r>
-      <w:r>
-        <w:rPr>
-          <w:b w:val="1"/>
-          <w:bCs w:val="1"/>
-          <w:u w:val="none"/>
-        </w:rPr>
-        <w:t>}, {</w:t>
-      </w:r>
-      <w:r>
-        <w:rPr>
-          <w:b w:val="1"/>
-          <w:bCs w:val="1"/>
-          <w:u w:val="none"/>
-        </w:rPr>
-        <w:t>d.applicant.applicant</w:t>
-      </w:r>
-      <w:r>
-        <w:rPr>
-          <w:b w:val="1"/>
-          <w:bCs w:val="1"/>
-          <w:u w:val="none"/>
-        </w:rPr>
-        <w:t>Ordinary</w:t>
-      </w:r>
-      <w:r>
-        <w:rPr>
-          <w:b w:val="1"/>
-          <w:bCs w:val="1"/>
-          <w:u w:val="none"/>
-        </w:rPr>
-        <w:t>AddressCountry</w:t>
-      </w:r>
-      <w:r>
-        <w:rPr>
-          <w:b w:val="1"/>
-          <w:bCs w:val="1"/>
-          <w:u w:val="none"/>
-        </w:rPr>
-        <w:t>}</w:t>
-      </w:r>
-      <w:r>
-        <w:rPr>
-          <w:b w:val="1"/>
-          <w:bCs w:val="1"/>
-          <w:u w:val="none"/>
-        </w:rPr>
-        <w:t>{</w:t>
-      </w:r>
-      <w:r>
-        <w:rPr>
-          <w:b w:val="1"/>
-          <w:bCs w:val="1"/>
-          <w:u w:val="none"/>
-        </w:rPr>
-        <w:t>d.applicant.</w:t>
-      </w:r>
-      <w:r>
-        <w:rPr>
-          <w:b w:val="1"/>
-          <w:bCs w:val="1"/>
-          <w:u w:val="none"/>
-        </w:rPr>
-        <w:t>applicantOrdinaryAddressReceiveMail</w:t>
-      </w:r>
-      <w:r>
-        <w:rPr>
-          <w:b w:val="1"/>
-          <w:bCs w:val="1"/>
-          <w:u w:val="none"/>
-        </w:rPr>
-        <w:t>:showEnd</w:t>
-      </w:r>
-      <w:r>
-        <w:rPr>
-          <w:b w:val="1"/>
-          <w:bCs w:val="1"/>
-          <w:u w:val="none"/>
-        </w:rPr>
-        <w:t>}</w:t>
-      </w:r>
-      <w:r>
-        <w:br/>
-      </w:r>
-      <w:r>
-        <w:rPr>
-          <w:b w:val="1"/>
-          <w:bCs w:val="1"/>
-          <w:u w:val="none"/>
-        </w:rPr>
-        <w:t>{</w:t>
-      </w:r>
-      <w:r>
-        <w:rPr>
-          <w:b w:val="1"/>
-          <w:bCs w:val="1"/>
-          <w:u w:val="none"/>
-        </w:rPr>
-        <w:t>d.applicant.</w:t>
-      </w:r>
-      <w:r>
-        <w:rPr>
-          <w:b w:val="1"/>
-          <w:bCs w:val="1"/>
-          <w:u w:val="none"/>
-        </w:rPr>
-        <w:t>applicantOrdinaryAddressReceiveMail</w:t>
-      </w:r>
-      <w:r>
-        <w:rPr>
-          <w:b w:val="1"/>
-          <w:bCs w:val="1"/>
-          <w:u w:val="none"/>
-        </w:rPr>
-        <w:t>:ifEQ</w:t>
-      </w:r>
-      <w:r>
-        <w:rPr>
-          <w:b w:val="1"/>
-          <w:bCs w:val="1"/>
-          <w:u w:val="none"/>
-        </w:rPr>
-        <w:t>('</w:t>
-      </w:r>
-      <w:r>
-        <w:rPr>
-          <w:b w:val="1"/>
-          <w:bCs w:val="1"/>
-          <w:u w:val="none"/>
-        </w:rPr>
-        <w:t>yes'</w:t>
-      </w:r>
-      <w:r>
-        <w:rPr>
-          <w:b w:val="1"/>
-          <w:bCs w:val="1"/>
-          <w:u w:val="none"/>
-        </w:rPr>
-        <w:t>)</w:t>
-      </w:r>
-      <w:r>
-        <w:rPr>
-          <w:b w:val="1"/>
-          <w:bCs w:val="1"/>
-          <w:u w:val="none"/>
-        </w:rPr>
-        <w:t>:</w:t>
-      </w:r>
-      <w:r>
-        <w:rPr>
-          <w:b w:val="1"/>
-          <w:bCs w:val="1"/>
-          <w:u w:val="none"/>
-        </w:rPr>
-        <w:t>hideBegin</w:t>
-      </w:r>
-      <w:r>
-        <w:rPr>
-          <w:b w:val="1"/>
-          <w:bCs w:val="1"/>
-          <w:u w:val="none"/>
-        </w:rPr>
-        <w:t>}</w:t>
-      </w:r>
-      <w:r>
-        <w:br/>
-      </w:r>
-      <w:r>
-        <w:rPr>
-          <w:b w:val="0"/>
-          <w:bCs w:val="0"/>
-          <w:color w:val="313131"/>
-          <w:sz w:val="20"/>
-          <w:szCs w:val="20"/>
-          <w:u w:val="none"/>
-        </w:rPr>
-        <w:t xml:space="preserve">Mailing address: </w:t>
-      </w:r>
-      <w:r>
-        <w:rPr>
-          <w:b w:val="1"/>
-          <w:bCs w:val="1"/>
-          <w:u w:val="none"/>
-        </w:rPr>
-        <w:t>{</w:t>
-      </w:r>
-      <w:r>
-        <w:rPr>
-          <w:b w:val="1"/>
-          <w:bCs w:val="1"/>
-          <w:u w:val="none"/>
-        </w:rPr>
-        <w:t>d.applicant.applicantMailingAddressStreet</w:t>
-      </w:r>
-      <w:r>
-        <w:rPr>
-          <w:b w:val="1"/>
-          <w:bCs w:val="1"/>
-          <w:u w:val="none"/>
-        </w:rPr>
-        <w:t>}, {</w:t>
-      </w:r>
-      <w:r>
-        <w:rPr>
-          <w:b w:val="1"/>
-          <w:bCs w:val="1"/>
-          <w:u w:val="none"/>
-        </w:rPr>
-        <w:t>d.applicant.applicantMailingAddressCity</w:t>
-      </w:r>
-      <w:r>
-        <w:rPr>
-          <w:b w:val="1"/>
-          <w:bCs w:val="1"/>
-          <w:u w:val="none"/>
-        </w:rPr>
-        <w:t>}, {</w:t>
-      </w:r>
-      <w:r>
-        <w:rPr>
-          <w:b w:val="1"/>
-          <w:bCs w:val="1"/>
-          <w:u w:val="none"/>
-        </w:rPr>
-        <w:t>d.applicant.applicantMailingAddressProvince</w:t>
-      </w:r>
-      <w:r>
-        <w:rPr>
-          <w:b w:val="1"/>
-          <w:bCs w:val="1"/>
-          <w:u w:val="none"/>
-        </w:rPr>
-        <w:t>}</w:t>
-      </w:r>
-      <w:r>
-        <w:rPr>
-          <w:b w:val="1"/>
-          <w:bCs w:val="1"/>
-          <w:u w:val="none"/>
-        </w:rPr>
-        <w:t>{</w:t>
-      </w:r>
-      <w:r>
-        <w:rPr>
-          <w:b w:val="1"/>
-          <w:bCs w:val="1"/>
-          <w:u w:val="none"/>
-        </w:rPr>
-        <w:t>d.applicant.applicantMailingAddressState</w:t>
-      </w:r>
-      <w:r>
-        <w:rPr>
-          <w:b w:val="1"/>
-          <w:bCs w:val="1"/>
-          <w:u w:val="none"/>
-        </w:rPr>
-        <w:t>}</w:t>
-      </w:r>
-      <w:r>
-        <w:rPr>
-          <w:b w:val="1"/>
-          <w:bCs w:val="1"/>
-          <w:u w:val="none"/>
-        </w:rPr>
-        <w:t xml:space="preserve"> {</w:t>
-      </w:r>
-      <w:r>
-        <w:rPr>
-          <w:b w:val="1"/>
-          <w:bCs w:val="1"/>
-          <w:u w:val="none"/>
-        </w:rPr>
-        <w:t>d.applicant.applicantMailingAddressPostalCode</w:t>
-      </w:r>
-      <w:r>
-        <w:rPr>
-          <w:b w:val="1"/>
-          <w:bCs w:val="1"/>
-          <w:u w:val="none"/>
-        </w:rPr>
-        <w:t>}, {</w:t>
-      </w:r>
-      <w:r>
-        <w:rPr>
-          <w:b w:val="1"/>
-          <w:bCs w:val="1"/>
-          <w:u w:val="none"/>
-        </w:rPr>
-        <w:t>d.applicant.applicantMailingAddressCountry</w:t>
-      </w:r>
-      <w:r>
-        <w:rPr>
-          <w:b w:val="1"/>
-          <w:bCs w:val="1"/>
-          <w:u w:val="none"/>
-        </w:rPr>
-        <w:t>}</w:t>
-      </w:r>
-      <w:r>
-        <w:rPr>
-          <w:b w:val="1"/>
-          <w:bCs w:val="1"/>
-          <w:u w:val="none"/>
-        </w:rPr>
-        <w:t>{</w:t>
-      </w:r>
-      <w:r>
-        <w:rPr>
-          <w:b w:val="1"/>
-          <w:bCs w:val="1"/>
-          <w:u w:val="none"/>
-        </w:rPr>
-        <w:t>d.applicant.</w:t>
-      </w:r>
-      <w:r>
-        <w:rPr>
-          <w:b w:val="1"/>
-          <w:bCs w:val="1"/>
-          <w:u w:val="none"/>
-        </w:rPr>
-        <w:t>applicantOrdinaryAddressReceiveMail</w:t>
-      </w:r>
-      <w:r>
-        <w:rPr>
-          <w:b w:val="1"/>
-          <w:bCs w:val="1"/>
-          <w:u w:val="none"/>
+          <w:b/>
+          <w:bCs/>
+        </w:rPr>
+        <w:t>d.applicant.applicantOrdinaryAddressReceiveMail</w:t>
+      </w:r>
+      <w:r>
+        <w:rPr>
+          <w:b/>
+          <w:bCs/>
         </w:rPr>
         <w:t>:hideEnd</w:t>
       </w:r>
       <w:r>
         <w:rPr>
-          <w:b w:val="1"/>
-          <w:bCs w:val="1"/>
-          <w:u w:val="none"/>
+          <w:b/>
+          <w:bCs/>
         </w:rPr>
         <w:t>}</w:t>
       </w:r>
@@ -3356,7 +3243,6 @@
     </w:p>
     <w:p>
       <w:pPr>
-        <w:pStyle w:val="Normal"/>
         <w:spacing w:before="54"/>
         <w:ind w:left="288"/>
         <w:rPr>
@@ -3367,61 +3253,7 @@
         <w:rPr>
           <w:color w:val="313131"/>
         </w:rPr>
-        <w:t>{</w:t>
-      </w:r>
-      <w:r>
-        <w:rPr>
-          <w:color w:val="313131"/>
-        </w:rPr>
-        <w:t>d.isApplicantOrg:ifEQ</w:t>
-      </w:r>
-      <w:r>
-        <w:rPr>
-          <w:color w:val="313131"/>
-        </w:rPr>
-        <w:t>('</w:t>
-      </w:r>
-      <w:r>
-        <w:rPr>
-          <w:color w:val="313131"/>
-        </w:rPr>
-        <w:t>yes'</w:t>
-      </w:r>
-      <w:r>
-        <w:rPr>
-          <w:color w:val="313131"/>
-        </w:rPr>
-        <w:t>):</w:t>
-      </w:r>
-      <w:r>
-        <w:rPr>
-          <w:color w:val="313131"/>
-        </w:rPr>
-        <w:t>showBegin</w:t>
-      </w:r>
-      <w:r>
-        <w:rPr>
-          <w:color w:val="313131"/>
-        </w:rPr>
-        <w:t xml:space="preserve">}This applicant is not an </w:t>
-      </w:r>
-      <w:r>
-        <w:rPr>
-          <w:color w:val="313131"/>
-        </w:rPr>
-        <w:t>individual.{</w:t>
-      </w:r>
-      <w:r>
-        <w:rPr>
-          <w:color w:val="313131"/>
-        </w:rPr>
-        <w:t>d.isApplicantOrg:showEnd</w:t>
-      </w:r>
-      <w:r>
-        <w:rPr>
-          <w:color w:val="313131"/>
-        </w:rPr>
-        <w:t>}</w:t>
+        <w:t>{d.isApplicantOrg:ifEQ('yes'):showBegin}This applicant is not an individual.{d.isApplicantOrg:showEnd}</w:t>
       </w:r>
       <w:r>
         <w:br/>
@@ -3430,115 +3262,13 @@
         <w:rPr>
           <w:color w:val="313131"/>
         </w:rPr>
-        <w:t>{</w:t>
-      </w:r>
-      <w:r>
-        <w:rPr>
-          <w:color w:val="313131"/>
-        </w:rPr>
-        <w:t>d.isApplicantOrg:ifEQ</w:t>
-      </w:r>
-      <w:r>
-        <w:rPr>
-          <w:color w:val="313131"/>
-        </w:rPr>
-        <w:t>('</w:t>
-      </w:r>
-      <w:r>
-        <w:rPr>
-          <w:color w:val="313131"/>
-        </w:rPr>
-        <w:t>yes'</w:t>
-      </w:r>
-      <w:r>
-        <w:rPr>
-          <w:color w:val="313131"/>
-        </w:rPr>
-        <w:t>):</w:t>
-      </w:r>
-      <w:r>
-        <w:rPr>
-          <w:color w:val="313131"/>
-        </w:rPr>
-        <w:t>h</w:t>
-      </w:r>
-      <w:r>
-        <w:rPr>
-          <w:color w:val="313131"/>
-        </w:rPr>
-        <w:t>ideBegin</w:t>
-      </w:r>
-      <w:r>
-        <w:rPr>
-          <w:color w:val="313131"/>
-        </w:rPr>
-        <w:t>}{</w:t>
-      </w:r>
-      <w:r>
-        <w:rPr>
-          <w:color w:val="313131"/>
-        </w:rPr>
-        <w:t>d.applicant.applicantOrdinaryAddressReceiveMail:ifEQ</w:t>
-      </w:r>
-      <w:r>
-        <w:rPr>
-          <w:color w:val="313131"/>
-        </w:rPr>
-        <w:t>('</w:t>
-      </w:r>
-      <w:r>
-        <w:rPr>
-          <w:color w:val="313131"/>
-        </w:rPr>
-        <w:t>yes'</w:t>
-      </w:r>
-      <w:r>
-        <w:rPr>
-          <w:color w:val="313131"/>
-        </w:rPr>
-        <w:t>):</w:t>
-      </w:r>
-      <w:r>
-        <w:rPr>
-          <w:color w:val="313131"/>
-        </w:rPr>
-        <w:t>showBegin</w:t>
-      </w:r>
-      <w:r>
-        <w:rPr>
-          <w:color w:val="313131"/>
-        </w:rPr>
-        <w:t>}</w:t>
-      </w:r>
-      <w:r>
-        <w:rPr>
-          <w:color w:val="313131"/>
-        </w:rPr>
-        <w:t xml:space="preserve">This applicant is an individual and ordinarily lives </w:t>
-      </w:r>
-      <w:r>
-        <w:rPr>
-          <w:color w:val="313131"/>
-        </w:rPr>
-        <w:t xml:space="preserve">at the mailing address noted </w:t>
-      </w:r>
-      <w:r>
-        <w:rPr>
-          <w:color w:val="313131"/>
-        </w:rPr>
-        <w:t>above.{</w:t>
-      </w:r>
-      <w:r>
-        <w:rPr>
-          <w:color w:val="313131"/>
-        </w:rPr>
-        <w:t>d.applicant.applicantOrdinaryAddressReceiveMail:showEnd</w:t>
-      </w:r>
-      <w:r>
-        <w:rPr>
-          <w:color w:val="313131"/>
-        </w:rPr>
-        <w:t>}</w:t>
+        <w:t>{d.isApplicantOrg:ifEQ('yes'):hideBegin}{d.applicant.applicantOrdinaryAddressReceiveMail:ifEQ('yes'):showBegin}</w:t>
+      </w:r>
+      <w:r>
+        <w:rPr>
+          <w:color w:val="313131"/>
+        </w:rPr>
+        <w:t>This applicant is an individual and ordinarily lives at the mailing address noted above.{d.applicant.applicantOrdinaryAddressReceiveMail:showEnd}</w:t>
       </w:r>
       <w:r>
         <w:br/>
@@ -3547,49 +3277,7 @@
         <w:rPr>
           <w:color w:val="313131"/>
         </w:rPr>
-        <w:t>{</w:t>
-      </w:r>
-      <w:r>
-        <w:rPr>
-          <w:color w:val="313131"/>
-        </w:rPr>
-        <w:t>d.applicant.applicantOrdinaryAddressRece</w:t>
-      </w:r>
-      <w:r>
-        <w:rPr>
-          <w:color w:val="313131"/>
-        </w:rPr>
-        <w:t>iveMail:ifEQ</w:t>
-      </w:r>
-      <w:r>
-        <w:rPr>
-          <w:color w:val="313131"/>
-        </w:rPr>
-        <w:t>('</w:t>
-      </w:r>
-      <w:r>
-        <w:rPr>
-          <w:color w:val="313131"/>
-        </w:rPr>
-        <w:t>yes'</w:t>
-      </w:r>
-      <w:r>
-        <w:rPr>
-          <w:color w:val="313131"/>
-        </w:rPr>
-        <w:t>):</w:t>
-      </w:r>
-      <w:r>
-        <w:rPr>
-          <w:color w:val="313131"/>
-        </w:rPr>
-        <w:t>hideBegin</w:t>
-      </w:r>
-      <w:r>
-        <w:rPr>
-          <w:color w:val="313131"/>
-        </w:rPr>
-        <w:t>}</w:t>
+        <w:t>{d.applicant.applicantOrdinaryAddressReceiveMail:ifEQ('yes'):hideBegin}</w:t>
       </w:r>
       <w:r>
         <w:br/>
@@ -3598,61 +3286,7 @@
         <w:rPr>
           <w:color w:val="313131"/>
         </w:rPr>
-        <w:t>This applicant is an individual and lives in the following city and country: {</w:t>
-      </w:r>
-      <w:r>
-        <w:rPr>
-          <w:color w:val="313131"/>
-        </w:rPr>
-        <w:t>d.applicant.applicantOrdinaryAddressCity</w:t>
-      </w:r>
-      <w:r>
-        <w:rPr>
-          <w:color w:val="313131"/>
-        </w:rPr>
-        <w:t>}, {</w:t>
-      </w:r>
-      <w:r>
-        <w:rPr>
-          <w:color w:val="313131"/>
-        </w:rPr>
-        <w:t>d.applicant.applicantOrdinaryAddressCountry</w:t>
-      </w:r>
-      <w:r>
-        <w:rPr>
-          <w:color w:val="313131"/>
-        </w:rPr>
-        <w:t>}</w:t>
-      </w:r>
-      <w:r>
-        <w:rPr>
-          <w:color w:val="313131"/>
-        </w:rPr>
-        <w:t>{</w:t>
-      </w:r>
-      <w:r>
-        <w:rPr>
-          <w:color w:val="313131"/>
-        </w:rPr>
-        <w:t>d.applicant.applicantOrdinaryAddressReceiveMail:hideEnd</w:t>
-      </w:r>
-      <w:r>
-        <w:rPr>
-          <w:color w:val="313131"/>
-        </w:rPr>
-        <w:t>}{</w:t>
-      </w:r>
-      <w:r>
-        <w:rPr>
-          <w:color w:val="313131"/>
-        </w:rPr>
-        <w:t>d.isApplicantOrg:hideEnd</w:t>
-      </w:r>
-      <w:r>
-        <w:rPr>
-          <w:color w:val="313131"/>
-        </w:rPr>
-        <w:t>}</w:t>
+        <w:t>This applicant is an individual and lives in the following city and country: {d.applicant.applicantOrdinaryAddressCity}, {d.applicant.applicantOrdinaryAddressCountry}{d.applicant.applicantOrdinaryAddressReceiveMail:hideEnd}{d.isApplicantOrg:hideEnd}</w:t>
       </w:r>
     </w:p>
     <w:p>
@@ -3703,11 +3337,6 @@
       <w:pPr>
         <w:pStyle w:val="Heading3"/>
         <w:spacing w:before="272"/>
-        <w:rPr>
-          <w:b w:val="1"/>
-          <w:bCs w:val="1"/>
-          <w:u w:val="none"/>
-        </w:rPr>
       </w:pPr>
       <w:r>
         <w:rPr>
@@ -3748,122 +3377,110 @@
           <w:spacing w:val="-3"/>
           <w:sz w:val="20"/>
           <w:szCs w:val="20"/>
-          <w:u w:val="none"/>
-        </w:rPr>
-        <w:t xml:space="preserve"> </w:t>
-      </w:r>
-      <w:r>
-        <w:rPr>
-          <w:u w:val="none"/>
-        </w:rPr>
-        <w:t xml:space="preserve">{</w:t>
-      </w:r>
-      <w:r>
-        <w:rPr>
-          <w:u w:val="none"/>
-        </w:rPr>
-        <w:t xml:space="preserve">d.applicant.applicantServiceAddressStreet</w:t>
-      </w:r>
-      <w:r>
-        <w:rPr>
-          <w:u w:val="none"/>
-        </w:rPr>
-        <w:t xml:space="preserve">}, {</w:t>
-      </w:r>
-      <w:r>
-        <w:rPr>
-          <w:u w:val="none"/>
-        </w:rPr>
-        <w:t xml:space="preserve">d.applicant.applicantServiceAddressCity</w:t>
-      </w:r>
-      <w:r>
-        <w:rPr>
-          <w:u w:val="none"/>
-        </w:rPr>
-        <w:t xml:space="preserve">}, {</w:t>
-      </w:r>
-      <w:r>
-        <w:rPr>
-          <w:u w:val="none"/>
-        </w:rPr>
-        <w:t xml:space="preserve">d.applicant.applicantServiceAddressProvince</w:t>
-      </w:r>
-      <w:r>
-        <w:rPr>
-          <w:u w:val="none"/>
-        </w:rPr>
-        <w:t xml:space="preserve">}</w:t>
-      </w:r>
-      <w:r>
-        <w:rPr>
-          <w:u w:val="none"/>
-        </w:rPr>
-        <w:t xml:space="preserve"> {</w:t>
-      </w:r>
-      <w:r>
-        <w:rPr>
-          <w:u w:val="none"/>
-        </w:rPr>
-        <w:t>d.applicant.applicantServiceAddressState</w:t>
-      </w:r>
-      <w:r>
-        <w:rPr>
-          <w:u w:val="none"/>
-        </w:rPr>
+        </w:rPr>
+        <w:t xml:space="preserve"> </w:t>
+      </w:r>
+      <w:r>
+        <w:t>{</w:t>
+      </w:r>
+      <w:proofErr w:type="spellStart"/>
+      <w:proofErr w:type="gramStart"/>
+      <w:r>
+        <w:t>d.applicant</w:t>
+      </w:r>
+      <w:proofErr w:type="gramEnd"/>
+      <w:r>
+        <w:t>.applicantServiceAddressStreet</w:t>
+      </w:r>
+      <w:proofErr w:type="spellEnd"/>
+      <w:r>
+        <w:t>}, {</w:t>
+      </w:r>
+      <w:proofErr w:type="spellStart"/>
+      <w:proofErr w:type="gramStart"/>
+      <w:r>
+        <w:t>d.applicant</w:t>
+      </w:r>
+      <w:proofErr w:type="gramEnd"/>
+      <w:r>
+        <w:t>.applicantServiceAddressCity</w:t>
+      </w:r>
+      <w:proofErr w:type="spellEnd"/>
+      <w:r>
+        <w:t>}, {</w:t>
+      </w:r>
+      <w:proofErr w:type="gramStart"/>
+      <w:r>
+        <w:t>d.applicant</w:t>
+      </w:r>
+      <w:proofErr w:type="gramEnd"/>
+      <w:r>
+        <w:t>.</w:t>
+      </w:r>
+      <w:proofErr w:type="gramStart"/>
+      <w:r>
+        <w:t>applicantServiceAddressProvince}</w:t>
+      </w:r>
+      <w:r>
+        <w:t>{d.applicant</w:t>
+      </w:r>
+      <w:proofErr w:type="gramEnd"/>
+      <w:r>
+        <w:t>.</w:t>
+      </w:r>
+      <w:proofErr w:type="gramStart"/>
+      <w:r>
+        <w:t>applicantServiceAddressState}</w:t>
+      </w:r>
+      <w:r>
+        <w:t>{d.</w:t>
+      </w:r>
+      <w:r>
+        <w:t>applicant</w:t>
+      </w:r>
+      <w:proofErr w:type="gramEnd"/>
+      <w:r>
+        <w:t>.</w:t>
+      </w:r>
+      <w:r>
+        <w:t>applicantServiceAddressProvinceText</w:t>
+      </w:r>
+      <w:r>
         <w:t>}</w:t>
       </w:r>
       <w:r>
-        <w:rPr>
-          <w:u w:val="none"/>
-        </w:rPr>
         <w:t xml:space="preserve">, </w:t>
       </w:r>
       <w:r>
-        <w:rPr>
-          <w:u w:val="none"/>
-        </w:rPr>
-        <w:t xml:space="preserve">{</w:t>
-      </w:r>
-      <w:r>
-        <w:rPr>
-          <w:u w:val="none"/>
-        </w:rPr>
-        <w:t xml:space="preserve">d.applicant.applicantServiceAddressPostalCode</w:t>
-      </w:r>
-      <w:r>
-        <w:rPr>
-          <w:u w:val="none"/>
-        </w:rPr>
-        <w:t xml:space="preserve">}</w:t>
-      </w:r>
-      <w:r>
-        <w:rPr>
-          <w:u w:val="none"/>
-        </w:rPr>
-        <w:t xml:space="preserve">, </w:t>
-      </w:r>
-      <w:r>
-        <w:rPr>
-          <w:b w:val="1"/>
-          <w:bCs w:val="1"/>
-          <w:u w:val="none"/>
-        </w:rPr>
         <w:t>{</w:t>
       </w:r>
-      <w:r>
-        <w:rPr>
-          <w:b w:val="1"/>
-          <w:bCs w:val="1"/>
-          <w:u w:val="none"/>
-        </w:rPr>
-        <w:t>d.applicant.applicantServiceAddressCountry</w:t>
-      </w:r>
-      <w:r>
-        <w:rPr>
-          <w:b w:val="1"/>
-          <w:bCs w:val="1"/>
-          <w:u w:val="none"/>
-        </w:rPr>
+      <w:proofErr w:type="spellStart"/>
+      <w:proofErr w:type="gramStart"/>
+      <w:r>
+        <w:t>d.applicant</w:t>
+      </w:r>
+      <w:proofErr w:type="gramEnd"/>
+      <w:r>
+        <w:t>.applicantServiceAddressPostalCode</w:t>
+      </w:r>
+      <w:proofErr w:type="spellEnd"/>
+      <w:r>
+        <w:t>}</w:t>
+      </w:r>
+      <w:r>
+        <w:t>, {</w:t>
+      </w:r>
+      <w:proofErr w:type="spellStart"/>
+      <w:proofErr w:type="gramStart"/>
+      <w:r>
+        <w:t>d.applicant</w:t>
+      </w:r>
+      <w:proofErr w:type="gramEnd"/>
+      <w:r>
+        <w:t>.applicantServiceAddressCountry</w:t>
+      </w:r>
+      <w:proofErr w:type="spellEnd"/>
+      <w:r>
         <w:t>}</w:t>
       </w:r>
     </w:p>
@@ -3872,9 +3489,8 @@
         <w:spacing w:before="54"/>
         <w:ind w:left="288"/>
         <w:rPr>
-          <w:b w:val="1"/>
-          <w:bCs w:val="1"/>
-          <w:u w:val="none"/>
+          <w:b/>
+          <w:bCs/>
         </w:rPr>
       </w:pPr>
       <w:r>
@@ -3882,7 +3498,6 @@
           <w:color w:val="313131"/>
           <w:sz w:val="20"/>
           <w:szCs w:val="20"/>
-          <w:u w:val="none"/>
         </w:rPr>
         <w:t>Telephone</w:t>
       </w:r>
@@ -3892,16 +3507,15 @@
           <w:spacing w:val="-8"/>
           <w:sz w:val="20"/>
           <w:szCs w:val="20"/>
-          <w:u w:val="none"/>
-        </w:rPr>
-        <w:t xml:space="preserve"> </w:t>
-      </w:r>
+        </w:rPr>
+        <w:t xml:space="preserve"> </w:t>
+      </w:r>
+      <w:proofErr w:type="gramStart"/>
       <w:r>
         <w:rPr>
           <w:color w:val="313131"/>
           <w:sz w:val="20"/>
           <w:szCs w:val="20"/>
-          <w:u w:val="none"/>
         </w:rPr>
         <w:t>number:</w:t>
       </w:r>
@@ -3911,27 +3525,32 @@
           <w:spacing w:val="-1"/>
           <w:sz w:val="20"/>
           <w:szCs w:val="20"/>
-          <w:u w:val="none"/>
-        </w:rPr>
-        <w:t xml:space="preserve"> </w:t>
-      </w:r>
-      <w:r>
-        <w:rPr>
-          <w:b w:val="1"/>
-          <w:bCs w:val="1"/>
-          <w:u w:val="none"/>
-        </w:rPr>
-        <w:t xml:space="preserve">{d.applicant.applicantServicePhone}</w:t>
+        </w:rPr>
+        <w:t xml:space="preserve"> </w:t>
+      </w:r>
+      <w:r>
+        <w:rPr>
+          <w:b/>
+          <w:bCs/>
+        </w:rPr>
+        <w:t>{d.applicant</w:t>
+      </w:r>
+      <w:proofErr w:type="gramEnd"/>
+      <w:r>
+        <w:rPr>
+          <w:b/>
+          <w:bCs/>
+        </w:rPr>
+        <w:t>.applicantServicePhone}</w:t>
       </w:r>
     </w:p>
     <w:p>
       <w:pPr>
-        <w:pStyle w:val="Normal"/>
         <w:spacing w:before="54"/>
         <w:ind w:left="288"/>
         <w:rPr>
-          <w:b w:val="1"/>
-          <w:bCs w:val="1"/>
+          <w:b/>
+          <w:bCs/>
         </w:rPr>
       </w:pPr>
       <w:r>
@@ -3939,7 +3558,6 @@
           <w:color w:val="313131"/>
           <w:sz w:val="20"/>
           <w:szCs w:val="20"/>
-          <w:u w:val="none"/>
         </w:rPr>
         <w:t>E-mail</w:t>
       </w:r>
@@ -3949,7 +3567,6 @@
           <w:spacing w:val="-3"/>
           <w:sz w:val="20"/>
           <w:szCs w:val="20"/>
-          <w:u w:val="none"/>
         </w:rPr>
         <w:t xml:space="preserve"> </w:t>
       </w:r>
@@ -3958,7 +3575,6 @@
           <w:color w:val="313131"/>
           <w:sz w:val="20"/>
           <w:szCs w:val="20"/>
-          <w:u w:val="none"/>
         </w:rPr>
         <w:t>address:</w:t>
       </w:r>
@@ -3968,106 +3584,221 @@
           <w:spacing w:val="-2"/>
           <w:sz w:val="20"/>
           <w:szCs w:val="20"/>
-          <w:u w:val="none"/>
-        </w:rPr>
-        <w:t xml:space="preserve"> </w:t>
-      </w:r>
-      <w:r>
-        <w:rPr>
-          <w:b w:val="1"/>
-          <w:bCs w:val="1"/>
-          <w:u w:val="none"/>
-        </w:rPr>
-        <w:t xml:space="preserve">{</w:t>
-      </w:r>
-      <w:r>
-        <w:rPr>
-          <w:b w:val="1"/>
-          <w:bCs w:val="1"/>
-          <w:u w:val="none"/>
-        </w:rPr>
-        <w:t xml:space="preserve">d.applicant.applicantServiceEmai</w:t>
-      </w:r>
-      <w:r>
-        <w:rPr>
-          <w:b w:val="1"/>
-          <w:bCs w:val="1"/>
-          <w:u w:val="none"/>
-        </w:rPr>
-        <w:t xml:space="preserve">l</w:t>
-      </w:r>
-      <w:r>
-        <w:rPr>
-          <w:b w:val="1"/>
-          <w:bCs w:val="1"/>
-          <w:u w:val="none"/>
-        </w:rPr>
-        <w:t xml:space="preserve">}</w:t>
+        </w:rPr>
+        <w:t xml:space="preserve"> </w:t>
+      </w:r>
+      <w:r>
+        <w:rPr>
+          <w:b/>
+          <w:bCs/>
+        </w:rPr>
+        <w:t>{</w:t>
+      </w:r>
+      <w:proofErr w:type="gramStart"/>
+      <w:r>
+        <w:rPr>
+          <w:b/>
+          <w:bCs/>
+        </w:rPr>
+        <w:t>d.applicant</w:t>
+      </w:r>
+      <w:proofErr w:type="gramEnd"/>
+      <w:r>
+        <w:rPr>
+          <w:b/>
+          <w:bCs/>
+        </w:rPr>
+        <w:t>.applicantServiceEmai</w:t>
+      </w:r>
+      <w:r>
+        <w:rPr>
+          <w:b/>
+          <w:bCs/>
+        </w:rPr>
+        <w:t>l</w:t>
+      </w:r>
+      <w:r>
+        <w:rPr>
+          <w:b/>
+          <w:bCs/>
+        </w:rPr>
+        <w:t>}</w:t>
       </w:r>
       <w:r>
         <w:br/>
       </w:r>
       <w:r>
         <w:rPr>
-          <w:b w:val="1"/>
-          <w:bCs w:val="1"/>
-          <w:u w:val="none"/>
+          <w:b/>
+          <w:bCs/>
         </w:rPr>
         <w:t>{</w:t>
       </w:r>
-      <w:r>
-        <w:rPr>
-          <w:b w:val="1"/>
-          <w:bCs w:val="1"/>
-          <w:u w:val="none"/>
-        </w:rPr>
-        <w:t>d.applicant.applicantHasFax:ifEQ</w:t>
-      </w:r>
-      <w:r>
-        <w:rPr>
-          <w:b w:val="1"/>
-          <w:bCs w:val="1"/>
-          <w:u w:val="none"/>
-        </w:rPr>
-        <w:t>('</w:t>
-      </w:r>
-      <w:r>
-        <w:rPr>
-          <w:b w:val="1"/>
-          <w:bCs w:val="1"/>
-          <w:u w:val="none"/>
-        </w:rPr>
-        <w:t>yes'</w:t>
-      </w:r>
-      <w:r>
-        <w:rPr>
-          <w:b w:val="1"/>
-          <w:bCs w:val="1"/>
-          <w:u w:val="none"/>
+      <w:proofErr w:type="gramStart"/>
+      <w:r>
+        <w:rPr>
+          <w:b/>
+          <w:bCs/>
+        </w:rPr>
+        <w:t>d.applicant</w:t>
+      </w:r>
+      <w:proofErr w:type="gramEnd"/>
+      <w:r>
+        <w:rPr>
+          <w:b/>
+          <w:bCs/>
+        </w:rPr>
+        <w:t>.</w:t>
+      </w:r>
+      <w:proofErr w:type="gramStart"/>
+      <w:r>
+        <w:rPr>
+          <w:b/>
+          <w:bCs/>
+        </w:rPr>
+        <w:t>applicantHasFax:ifEQ</w:t>
+      </w:r>
+      <w:proofErr w:type="gramEnd"/>
+      <w:r>
+        <w:rPr>
+          <w:b/>
+          <w:bCs/>
+        </w:rPr>
+        <w:t>('yes'</w:t>
+      </w:r>
+      <w:proofErr w:type="gramStart"/>
+      <w:r>
+        <w:rPr>
+          <w:b/>
+          <w:bCs/>
         </w:rPr>
         <w:t>)</w:t>
       </w:r>
       <w:r>
         <w:rPr>
-          <w:b w:val="1"/>
-          <w:bCs w:val="1"/>
-          <w:u w:val="none"/>
+          <w:b/>
+          <w:bCs/>
+        </w:rPr>
+        <w:t>:showBegin</w:t>
+      </w:r>
+      <w:proofErr w:type="gramEnd"/>
+      <w:r>
+        <w:rPr>
+          <w:b/>
+          <w:bCs/>
+        </w:rPr>
+        <w:t>}</w:t>
+      </w:r>
+      <w:r>
+        <w:br/>
+      </w:r>
+      <w:r>
+        <w:rPr>
+          <w:color w:val="313131"/>
+          <w:sz w:val="20"/>
+          <w:szCs w:val="20"/>
+        </w:rPr>
+        <w:t>Fax number</w:t>
+      </w:r>
+      <w:r>
+        <w:rPr>
+          <w:color w:val="313131"/>
+          <w:sz w:val="20"/>
+          <w:szCs w:val="20"/>
         </w:rPr>
         <w:t>:</w:t>
       </w:r>
       <w:r>
         <w:rPr>
-          <w:b w:val="1"/>
-          <w:bCs w:val="1"/>
-          <w:u w:val="none"/>
-        </w:rPr>
-        <w:t>showBegin</w:t>
-      </w:r>
-      <w:r>
-        <w:rPr>
-          <w:b w:val="1"/>
-          <w:bCs w:val="1"/>
-          <w:u w:val="none"/>
+          <w:color w:val="313131"/>
+          <w:sz w:val="20"/>
+          <w:szCs w:val="20"/>
+        </w:rPr>
+        <w:t xml:space="preserve"> </w:t>
+      </w:r>
+      <w:r>
+        <w:rPr>
+          <w:b/>
+          <w:bCs/>
+        </w:rPr>
+        <w:t>{</w:t>
+      </w:r>
+      <w:proofErr w:type="gramStart"/>
+      <w:r>
+        <w:rPr>
+          <w:b/>
+          <w:bCs/>
+        </w:rPr>
+        <w:t>d.</w:t>
+      </w:r>
+      <w:r>
+        <w:rPr>
+          <w:b/>
+          <w:bCs/>
+        </w:rPr>
+        <w:t>applicant</w:t>
+      </w:r>
+      <w:proofErr w:type="gramEnd"/>
+      <w:r>
+        <w:rPr>
+          <w:b/>
+          <w:bCs/>
+        </w:rPr>
+        <w:t>.</w:t>
+      </w:r>
+      <w:r>
+        <w:rPr>
+          <w:b/>
+          <w:bCs/>
+        </w:rPr>
+        <w:t>applicantServiceFax}</w:t>
+      </w:r>
+      <w:r>
+        <w:br/>
+      </w:r>
+      <w:r>
+        <w:rPr>
+          <w:b/>
+          <w:bCs/>
+        </w:rPr>
+        <w:t>{</w:t>
+      </w:r>
+      <w:proofErr w:type="gramStart"/>
+      <w:r>
+        <w:rPr>
+          <w:b/>
+          <w:bCs/>
+        </w:rPr>
+        <w:t>d.applicant</w:t>
+      </w:r>
+      <w:proofErr w:type="gramEnd"/>
+      <w:r>
+        <w:rPr>
+          <w:b/>
+          <w:bCs/>
+        </w:rPr>
+        <w:t>.</w:t>
+      </w:r>
+      <w:proofErr w:type="gramStart"/>
+      <w:r>
+        <w:rPr>
+          <w:b/>
+          <w:bCs/>
+        </w:rPr>
+        <w:t>applicantHasFax</w:t>
+      </w:r>
+      <w:r>
+        <w:rPr>
+          <w:b/>
+          <w:bCs/>
+        </w:rPr>
+        <w:t>:showEnd</w:t>
+      </w:r>
+      <w:proofErr w:type="gramEnd"/>
+      <w:r>
+        <w:rPr>
+          <w:b/>
+          <w:bCs/>
         </w:rPr>
         <w:t>}</w:t>
       </w:r>
@@ -4079,220 +3810,69 @@
           <w:color w:val="313131"/>
           <w:sz w:val="20"/>
           <w:szCs w:val="20"/>
-          <w:u w:val="none"/>
-        </w:rPr>
-        <w:t>Fax number</w:t>
-      </w:r>
-      <w:r>
-        <w:rPr>
-          <w:color w:val="313131"/>
-          <w:sz w:val="20"/>
-          <w:szCs w:val="20"/>
-          <w:u w:val="none"/>
-        </w:rPr>
-        <w:t>:</w:t>
-      </w:r>
-      <w:r>
-        <w:rPr>
-          <w:color w:val="313131"/>
-          <w:sz w:val="20"/>
-          <w:szCs w:val="20"/>
-          <w:u w:val="none"/>
-        </w:rPr>
-        <w:t xml:space="preserve"> </w:t>
-      </w:r>
-      <w:r>
-        <w:rPr>
-          <w:b w:val="1"/>
-          <w:bCs w:val="1"/>
-          <w:u w:val="none"/>
+        </w:rPr>
+        <w:lastRenderedPageBreak/>
+        <w:t xml:space="preserve">Date: </w:t>
+      </w:r>
+      <w:r>
+        <w:rPr>
+          <w:b/>
+          <w:bCs/>
         </w:rPr>
         <w:t>{</w:t>
       </w:r>
-      <w:r>
-        <w:rPr>
-          <w:b w:val="1"/>
-          <w:bCs w:val="1"/>
-          <w:u w:val="none"/>
-        </w:rPr>
-        <w:t>d.</w:t>
-      </w:r>
-      <w:r>
-        <w:rPr>
-          <w:b w:val="1"/>
-          <w:bCs w:val="1"/>
-          <w:u w:val="none"/>
-        </w:rPr>
-        <w:t>applicant.</w:t>
-      </w:r>
-      <w:r>
-        <w:rPr>
-          <w:b w:val="1"/>
-          <w:bCs w:val="1"/>
-          <w:u w:val="none"/>
-        </w:rPr>
-        <w:t>applicantServiceFax</w:t>
-      </w:r>
-      <w:r>
-        <w:rPr>
-          <w:b w:val="1"/>
-          <w:bCs w:val="1"/>
-          <w:u w:val="none"/>
+      <w:proofErr w:type="gramStart"/>
+      <w:r>
+        <w:rPr>
+          <w:b/>
+          <w:bCs/>
+        </w:rPr>
+        <w:t>d.applicationDate</w:t>
+      </w:r>
+      <w:proofErr w:type="gramEnd"/>
+      <w:r>
+        <w:rPr>
+          <w:b/>
+          <w:bCs/>
         </w:rPr>
         <w:t>}</w:t>
       </w:r>
       <w:r>
-        <w:br/>
-      </w:r>
-      <w:r>
-        <w:rPr>
-          <w:b w:val="1"/>
-          <w:bCs w:val="1"/>
-          <w:u w:val="none"/>
+        <w:tab/>
+      </w:r>
+      <w:r>
+        <w:rPr>
+          <w:b/>
+          <w:bCs/>
+          <w:u w:val="single"/>
+        </w:rPr>
+        <w:t xml:space="preserve">Signed Electronically by </w:t>
+      </w:r>
+      <w:r>
+        <w:rPr>
+          <w:b/>
+          <w:bCs/>
+          <w:u w:val="single"/>
         </w:rPr>
         <w:t>{</w:t>
       </w:r>
-      <w:r>
-        <w:rPr>
-          <w:b w:val="1"/>
-          <w:bCs w:val="1"/>
-          <w:u w:val="none"/>
-        </w:rPr>
-        <w:t>d.applicant.applicantHasFax</w:t>
-      </w:r>
-      <w:r>
-        <w:rPr>
-          <w:b w:val="1"/>
-          <w:bCs w:val="1"/>
-          <w:u w:val="none"/>
-        </w:rPr>
-        <w:t>:showEnd</w:t>
-      </w:r>
-      <w:r>
-        <w:rPr>
-          <w:b w:val="1"/>
-          <w:bCs w:val="1"/>
-          <w:u w:val="none"/>
-        </w:rPr>
-        <w:t>}</w:t>
-      </w:r>
-      <w:r>
-        <w:br/>
-      </w:r>
-      <w:r>
-        <w:rPr>
-          <w:color w:val="313131"/>
-          <w:sz w:val="20"/>
-          <w:szCs w:val="20"/>
-        </w:rPr>
-        <w:t>Date:</w:t>
-      </w:r>
-      <w:r>
-        <w:rPr>
-          <w:color w:val="313131"/>
-          <w:sz w:val="20"/>
-          <w:szCs w:val="20"/>
-        </w:rPr>
-        <w:t xml:space="preserve"> </w:t>
-      </w:r>
-      <w:r>
-        <w:rPr>
-          <w:b w:val="1"/>
-          <w:bCs w:val="1"/>
-          <w:u w:val="none"/>
-        </w:rPr>
-        <w:t>{</w:t>
-      </w:r>
-      <w:r>
-        <w:rPr>
-          <w:b w:val="1"/>
-          <w:bCs w:val="1"/>
-          <w:u w:val="none"/>
-        </w:rPr>
-        <w:t>d.applicationDate</w:t>
-      </w:r>
-      <w:r>
-        <w:rPr>
-          <w:b w:val="1"/>
-          <w:bCs w:val="1"/>
-          <w:u w:val="none"/>
-        </w:rPr>
-        <w:t>}</w:t>
-      </w:r>
-      <w:r>
-        <w:tab/>
-      </w:r>
-      <w:r>
-        <w:rPr>
-          <w:b w:val="1"/>
-          <w:bCs w:val="1"/>
+      <w:proofErr w:type="gramStart"/>
+      <w:r>
+        <w:rPr>
+          <w:b/>
+          <w:bCs/>
           <w:u w:val="single"/>
         </w:rPr>
-        <w:t>Signed</w:t>
-      </w:r>
-      <w:r>
-        <w:rPr>
-          <w:b w:val="1"/>
-          <w:bCs w:val="1"/>
+        <w:t>d.applicant</w:t>
+      </w:r>
+      <w:proofErr w:type="gramEnd"/>
+      <w:r>
+        <w:rPr>
+          <w:b/>
+          <w:bCs/>
           <w:u w:val="single"/>
         </w:rPr>
-        <w:t xml:space="preserve"> </w:t>
-      </w:r>
-      <w:r>
-        <w:rPr>
-          <w:b w:val="1"/>
-          <w:bCs w:val="1"/>
-          <w:u w:val="single"/>
-        </w:rPr>
-        <w:t>Electronically</w:t>
-      </w:r>
-      <w:r>
-        <w:rPr>
-          <w:b w:val="1"/>
-          <w:bCs w:val="1"/>
-          <w:u w:val="single"/>
-        </w:rPr>
-        <w:t xml:space="preserve"> </w:t>
-      </w:r>
-      <w:r>
-        <w:rPr>
-          <w:b w:val="1"/>
-          <w:bCs w:val="1"/>
-          <w:u w:val="single"/>
-        </w:rPr>
-        <w:t>by</w:t>
-      </w:r>
-      <w:r>
-        <w:rPr>
-          <w:b w:val="1"/>
-          <w:bCs w:val="1"/>
-          <w:u w:val="single"/>
-        </w:rPr>
-        <w:t xml:space="preserve"> </w:t>
-      </w:r>
-      <w:r>
-        <w:rPr>
-          <w:b w:val="1"/>
-          <w:bCs w:val="1"/>
-          <w:u w:val="single"/>
-        </w:rPr>
-        <w:t>{</w:t>
-      </w:r>
-      <w:r>
-        <w:rPr>
-          <w:b w:val="1"/>
-          <w:bCs w:val="1"/>
-          <w:u w:val="single"/>
-        </w:rPr>
-        <w:t>d.applicant.applicantName</w:t>
-      </w:r>
-      <w:r>
-        <w:rPr>
-          <w:b w:val="1"/>
-          <w:bCs w:val="1"/>
-          <w:u w:val="single"/>
-        </w:rPr>
-        <w:t>}</w:t>
+        <w:t>.applicantName}</w:t>
       </w:r>
     </w:p>
     <w:p>
@@ -4327,20 +3907,32 @@
         <w:rPr>
           <w:color w:val="313131"/>
           <w:spacing w:val="-1"/>
-          <w:u w:val="none"/>
-        </w:rPr>
-        <w:t xml:space="preserve"> </w:t>
-      </w:r>
-      <w:r>
-        <w:rPr>
-          <w:color w:val="313131"/>
-          <w:u w:val="none"/>
-        </w:rPr>
-        <w:t xml:space="preserve">{d.applicant.applicantName}</w:t>
+        </w:rPr>
+        <w:t xml:space="preserve"> </w:t>
+      </w:r>
+      <w:r>
+        <w:rPr>
+          <w:color w:val="313131"/>
+        </w:rPr>
+        <w:t>{</w:t>
+      </w:r>
+      <w:proofErr w:type="gramStart"/>
+      <w:r>
+        <w:rPr>
+          <w:color w:val="313131"/>
+        </w:rPr>
+        <w:t>d.applicant</w:t>
+      </w:r>
+      <w:proofErr w:type="gramEnd"/>
+      <w:r>
+        <w:rPr>
+          <w:color w:val="313131"/>
+        </w:rPr>
+        <w:t>.applicantName}</w:t>
       </w:r>
     </w:p>
     <w:sectPr>
-      <w:pgSz w:w="12240" w:h="15840" w:orient="portrait"/>
+      <w:pgSz w:w="12240" w:h="15840"/>
       <w:pgMar w:top="940" w:right="720" w:bottom="740" w:left="720" w:header="0" w:footer="543" w:gutter="0"/>
       <w:cols w:space="720"/>
     </w:sectPr>
@@ -4349,7 +3941,7 @@
 </file>
 
 <file path=word/endnotes.xml><?xml version="1.0" encoding="utf-8"?>
-<w:endnotes xmlns:wpc="http://schemas.microsoft.com/office/word/2010/wordprocessingCanvas" xmlns:cx="http://schemas.microsoft.com/office/drawing/2014/chartex" xmlns:cx1="http://schemas.microsoft.com/office/drawing/2015/9/8/chartex" xmlns:cx2="http://schemas.microsoft.com/office/drawing/2015/10/21/chartex" xmlns:cx3="http://schemas.microsoft.com/office/drawing/2016/5/9/chartex" xmlns:cx4="http://schemas.microsoft.com/office/drawing/2016/5/10/chartex" xmlns:cx5="http://schemas.microsoft.com/office/drawing/2016/5/11/chartex" xmlns:cx6="http://schemas.microsoft.com/office/drawing/2016/5/12/chartex" xmlns:cx7="http://schemas.microsoft.com/office/drawing/2016/5/13/chartex" xmlns:cx8="http://schemas.microsoft.com/office/drawing/2016/5/14/chartex" xmlns:mc="http://schemas.openxmlformats.org/markup-compatibility/2006" xmlns:aink="http://schemas.microsoft.com/office/drawing/2016/ink" xmlns:am3d="http://schemas.microsoft.com/office/drawing/2017/model3d" xmlns:o="urn:schemas-microsoft-com:office:office" xmlns:oel="http://schemas.microsoft.com/office/2019/extlst" xmlns:r="http://schemas.openxmlformats.org/officeDocument/2006/relationships" xmlns:m="http://schemas.openxmlformats.org/officeDocument/2006/math" xmlns:v="urn:schemas-microsoft-com:vml" xmlns:wp14="http://schemas.microsoft.com/office/word/2010/wordprocessingDrawing" xmlns:wp="http://schemas.openxmlformats.org/drawingml/2006/wordprocessingDrawing" xmlns:w10="urn:schemas-microsoft-com:office:word" xmlns:w="http://schemas.openxmlformats.org/wordprocessingml/2006/main" xmlns:w14="http://schemas.microsoft.com/office/word/2010/wordml" xmlns:w15="http://schemas.microsoft.com/office/word/2012/wordml" xmlns:w16cex="http://schemas.microsoft.com/office/word/2018/wordml/cex" xmlns:w16cid="http://schemas.microsoft.com/office/word/2016/wordml/cid" xmlns:w16="http://schemas.microsoft.com/office/word/2018/wordml" xmlns:w16du="http://schemas.microsoft.com/office/word/2023/wordml/word16du" xmlns:w16sdtdh="http://schemas.microsoft.com/office/word/2020/wordml/sdtdatahash" xmlns:w16sdtfl="http://schemas.microsoft.com/office/word/2024/wordml/sdtformatlock" xmlns:w16se="http://schemas.microsoft.com/office/word/2015/wordml/symex" xmlns:wpg="http://schemas.microsoft.com/office/word/2010/wordprocessingGroup" xmlns:wpi="http://schemas.microsoft.com/office/word/2010/wordprocessingInk" xmlns:wne="http://schemas.microsoft.com/office/word/2006/wordml" xmlns:wps="http://schemas.microsoft.com/office/word/2010/wordprocessingShape" mc:Ignorable="w14 w15 w16se w16cid w16 w16cex w16sdtdh w16sdtfl w16du wp14">
+<w:endnotes xmlns:wpc="http://schemas.microsoft.com/office/word/2010/wordprocessingCanvas" xmlns:cx="http://schemas.microsoft.com/office/drawing/2014/chartex" xmlns:cx1="http://schemas.microsoft.com/office/drawing/2015/9/8/chartex" xmlns:cx2="http://schemas.microsoft.com/office/drawing/2015/10/21/chartex" xmlns:cx3="http://schemas.microsoft.com/office/drawing/2016/5/9/chartex" xmlns:cx4="http://schemas.microsoft.com/office/drawing/2016/5/10/chartex" xmlns:cx5="http://schemas.microsoft.com/office/drawing/2016/5/11/chartex" xmlns:cx6="http://schemas.microsoft.com/office/drawing/2016/5/12/chartex" xmlns:cx7="http://schemas.microsoft.com/office/drawing/2016/5/13/chartex" xmlns:cx8="http://schemas.microsoft.com/office/drawing/2016/5/14/chartex" xmlns:mc="http://schemas.openxmlformats.org/markup-compatibility/2006" xmlns:aink="http://schemas.microsoft.com/office/drawing/2016/ink" xmlns:am3d="http://schemas.microsoft.com/office/drawing/2017/model3d" xmlns:o="urn:schemas-microsoft-com:office:office" xmlns:oel="http://schemas.microsoft.com/office/2019/extlst" xmlns:r="http://schemas.openxmlformats.org/officeDocument/2006/relationships" xmlns:m="http://schemas.openxmlformats.org/officeDocument/2006/math" xmlns:v="urn:schemas-microsoft-com:vml" xmlns:wp14="http://schemas.microsoft.com/office/word/2010/wordprocessingDrawing" xmlns:wp="http://schemas.openxmlformats.org/drawingml/2006/wordprocessingDrawing" xmlns:w10="urn:schemas-microsoft-com:office:word" xmlns:w="http://schemas.openxmlformats.org/wordprocessingml/2006/main" xmlns:w14="http://schemas.microsoft.com/office/word/2010/wordml" xmlns:w15="http://schemas.microsoft.com/office/word/2012/wordml" xmlns:w16cei="http://schemas.microsoft.com/office/word/2026/wordml/cei" xmlns:w16cex="http://schemas.microsoft.com/office/word/2018/wordml/cex" xmlns:w16cid="http://schemas.microsoft.com/office/word/2016/wordml/cid" xmlns:w16="http://schemas.microsoft.com/office/word/2018/wordml" xmlns:w16du="http://schemas.microsoft.com/office/word/2023/wordml/word16du" xmlns:w16sdtdh="http://schemas.microsoft.com/office/word/2020/wordml/sdtdatahash" xmlns:w16sdtfl="http://schemas.microsoft.com/office/word/2024/wordml/sdtformatlock" xmlns:w16se="http://schemas.microsoft.com/office/word/2015/wordml/symex" xmlns:wpg="http://schemas.microsoft.com/office/word/2010/wordprocessingGroup" xmlns:wpi="http://schemas.microsoft.com/office/word/2010/wordprocessingInk" xmlns:wne="http://schemas.microsoft.com/office/word/2006/wordml" xmlns:wps="http://schemas.microsoft.com/office/word/2010/wordprocessingShape" mc:Ignorable="w14 w15 w16se w16cid w16 w16cex w16sdtdh w16sdtfl w16du wp14">
   <w:endnote w:type="separator" w:id="-1">
     <w:p>
       <w:r>
@@ -4368,7 +3960,7 @@
 </file>
 
 <file path=word/footer1.xml><?xml version="1.0" encoding="utf-8"?>
-<w:ftr xmlns:wpc="http://schemas.microsoft.com/office/word/2010/wordprocessingCanvas" xmlns:cx="http://schemas.microsoft.com/office/drawing/2014/chartex" xmlns:cx1="http://schemas.microsoft.com/office/drawing/2015/9/8/chartex" xmlns:cx2="http://schemas.microsoft.com/office/drawing/2015/10/21/chartex" xmlns:cx3="http://schemas.microsoft.com/office/drawing/2016/5/9/chartex" xmlns:cx4="http://schemas.microsoft.com/office/drawing/2016/5/10/chartex" xmlns:cx5="http://schemas.microsoft.com/office/drawing/2016/5/11/chartex" xmlns:cx6="http://schemas.microsoft.com/office/drawing/2016/5/12/chartex" xmlns:cx7="http://schemas.microsoft.com/office/drawing/2016/5/13/chartex" xmlns:cx8="http://schemas.microsoft.com/office/drawing/2016/5/14/chartex" xmlns:mc="http://schemas.openxmlformats.org/markup-compatibility/2006" xmlns:aink="http://schemas.microsoft.com/office/drawing/2016/ink" xmlns:am3d="http://schemas.microsoft.com/office/drawing/2017/model3d" xmlns:o="urn:schemas-microsoft-com:office:office" xmlns:oel="http://schemas.microsoft.com/office/2019/extlst" xmlns:r="http://schemas.openxmlformats.org/officeDocument/2006/relationships" xmlns:m="http://schemas.openxmlformats.org/officeDocument/2006/math" xmlns:v="urn:schemas-microsoft-com:vml" xmlns:wp14="http://schemas.microsoft.com/office/word/2010/wordprocessingDrawing" xmlns:wp="http://schemas.openxmlformats.org/drawingml/2006/wordprocessingDrawing" xmlns:w10="urn:schemas-microsoft-com:office:word" xmlns:w="http://schemas.openxmlformats.org/wordprocessingml/2006/main" xmlns:w14="http://schemas.microsoft.com/office/word/2010/wordml" xmlns:w15="http://schemas.microsoft.com/office/word/2012/wordml" xmlns:w16cex="http://schemas.microsoft.com/office/word/2018/wordml/cex" xmlns:w16cid="http://schemas.microsoft.com/office/word/2016/wordml/cid" xmlns:w16="http://schemas.microsoft.com/office/word/2018/wordml" xmlns:w16du="http://schemas.microsoft.com/office/word/2023/wordml/word16du" xmlns:w16sdtdh="http://schemas.microsoft.com/office/word/2020/wordml/sdtdatahash" xmlns:w16sdtfl="http://schemas.microsoft.com/office/word/2024/wordml/sdtformatlock" xmlns:w16se="http://schemas.microsoft.com/office/word/2015/wordml/symex" xmlns:wpg="http://schemas.microsoft.com/office/word/2010/wordprocessingGroup" xmlns:wpi="http://schemas.microsoft.com/office/word/2010/wordprocessingInk" xmlns:wne="http://schemas.microsoft.com/office/word/2006/wordml" xmlns:wps="http://schemas.microsoft.com/office/word/2010/wordprocessingShape" mc:Ignorable="w14 w15 w16se w16cid w16 w16cex w16sdtdh w16sdtfl w16du wp14">
+<w:ftr xmlns:wpc="http://schemas.microsoft.com/office/word/2010/wordprocessingCanvas" xmlns:cx="http://schemas.microsoft.com/office/drawing/2014/chartex" xmlns:cx1="http://schemas.microsoft.com/office/drawing/2015/9/8/chartex" xmlns:cx2="http://schemas.microsoft.com/office/drawing/2015/10/21/chartex" xmlns:cx3="http://schemas.microsoft.com/office/drawing/2016/5/9/chartex" xmlns:cx4="http://schemas.microsoft.com/office/drawing/2016/5/10/chartex" xmlns:cx5="http://schemas.microsoft.com/office/drawing/2016/5/11/chartex" xmlns:cx6="http://schemas.microsoft.com/office/drawing/2016/5/12/chartex" xmlns:cx7="http://schemas.microsoft.com/office/drawing/2016/5/13/chartex" xmlns:cx8="http://schemas.microsoft.com/office/drawing/2016/5/14/chartex" xmlns:mc="http://schemas.openxmlformats.org/markup-compatibility/2006" xmlns:aink="http://schemas.microsoft.com/office/drawing/2016/ink" xmlns:am3d="http://schemas.microsoft.com/office/drawing/2017/model3d" xmlns:o="urn:schemas-microsoft-com:office:office" xmlns:oel="http://schemas.microsoft.com/office/2019/extlst" xmlns:r="http://schemas.openxmlformats.org/officeDocument/2006/relationships" xmlns:m="http://schemas.openxmlformats.org/officeDocument/2006/math" xmlns:v="urn:schemas-microsoft-com:vml" xmlns:wp14="http://schemas.microsoft.com/office/word/2010/wordprocessingDrawing" xmlns:wp="http://schemas.openxmlformats.org/drawingml/2006/wordprocessingDrawing" xmlns:w10="urn:schemas-microsoft-com:office:word" xmlns:w="http://schemas.openxmlformats.org/wordprocessingml/2006/main" xmlns:w14="http://schemas.microsoft.com/office/word/2010/wordml" xmlns:w15="http://schemas.microsoft.com/office/word/2012/wordml" xmlns:w16cei="http://schemas.microsoft.com/office/word/2026/wordml/cei" xmlns:w16cex="http://schemas.microsoft.com/office/word/2018/wordml/cex" xmlns:w16cid="http://schemas.microsoft.com/office/word/2016/wordml/cid" xmlns:w16="http://schemas.microsoft.com/office/word/2018/wordml" xmlns:w16du="http://schemas.microsoft.com/office/word/2023/wordml/word16du" xmlns:w16sdtdh="http://schemas.microsoft.com/office/word/2020/wordml/sdtdatahash" xmlns:w16sdtfl="http://schemas.microsoft.com/office/word/2024/wordml/sdtformatlock" xmlns:w16se="http://schemas.microsoft.com/office/word/2015/wordml/symex" xmlns:wpg="http://schemas.microsoft.com/office/word/2010/wordprocessingGroup" xmlns:wpi="http://schemas.microsoft.com/office/word/2010/wordprocessingInk" xmlns:wne="http://schemas.microsoft.com/office/word/2006/wordml" xmlns:wps="http://schemas.microsoft.com/office/word/2010/wordprocessingShape" mc:Ignorable="w14 w15 w16se w16cid w16 w16cex w16sdtdh w16sdtfl w16du wp14">
   <w:p>
     <w:pPr>
       <w:pStyle w:val="Footer"/>
@@ -4378,7 +3970,7 @@
 </file>
 
 <file path=word/footer2.xml><?xml version="1.0" encoding="utf-8"?>
-<w:ftr xmlns:wpc="http://schemas.microsoft.com/office/word/2010/wordprocessingCanvas" xmlns:cx="http://schemas.microsoft.com/office/drawing/2014/chartex" xmlns:cx1="http://schemas.microsoft.com/office/drawing/2015/9/8/chartex" xmlns:cx2="http://schemas.microsoft.com/office/drawing/2015/10/21/chartex" xmlns:cx3="http://schemas.microsoft.com/office/drawing/2016/5/9/chartex" xmlns:cx4="http://schemas.microsoft.com/office/drawing/2016/5/10/chartex" xmlns:cx5="http://schemas.microsoft.com/office/drawing/2016/5/11/chartex" xmlns:cx6="http://schemas.microsoft.com/office/drawing/2016/5/12/chartex" xmlns:cx7="http://schemas.microsoft.com/office/drawing/2016/5/13/chartex" xmlns:cx8="http://schemas.microsoft.com/office/drawing/2016/5/14/chartex" xmlns:mc="http://schemas.openxmlformats.org/markup-compatibility/2006" xmlns:aink="http://schemas.microsoft.com/office/drawing/2016/ink" xmlns:am3d="http://schemas.microsoft.com/office/drawing/2017/model3d" xmlns:o="urn:schemas-microsoft-com:office:office" xmlns:oel="http://schemas.microsoft.com/office/2019/extlst" xmlns:r="http://schemas.openxmlformats.org/officeDocument/2006/relationships" xmlns:m="http://schemas.openxmlformats.org/officeDocument/2006/math" xmlns:v="urn:schemas-microsoft-com:vml" xmlns:wp14="http://schemas.microsoft.com/office/word/2010/wordprocessingDrawing" xmlns:wp="http://schemas.openxmlformats.org/drawingml/2006/wordprocessingDrawing" xmlns:w10="urn:schemas-microsoft-com:office:word" xmlns:w="http://schemas.openxmlformats.org/wordprocessingml/2006/main" xmlns:w14="http://schemas.microsoft.com/office/word/2010/wordml" xmlns:w15="http://schemas.microsoft.com/office/word/2012/wordml" xmlns:w16cex="http://schemas.microsoft.com/office/word/2018/wordml/cex" xmlns:w16cid="http://schemas.microsoft.com/office/word/2016/wordml/cid" xmlns:w16="http://schemas.microsoft.com/office/word/2018/wordml" xmlns:w16du="http://schemas.microsoft.com/office/word/2023/wordml/word16du" xmlns:w16sdtdh="http://schemas.microsoft.com/office/word/2020/wordml/sdtdatahash" xmlns:w16sdtfl="http://schemas.microsoft.com/office/word/2024/wordml/sdtformatlock" xmlns:w16se="http://schemas.microsoft.com/office/word/2015/wordml/symex" xmlns:wpg="http://schemas.microsoft.com/office/word/2010/wordprocessingGroup" xmlns:wpi="http://schemas.microsoft.com/office/word/2010/wordprocessingInk" xmlns:wne="http://schemas.microsoft.com/office/word/2006/wordml" xmlns:wps="http://schemas.microsoft.com/office/word/2010/wordprocessingShape" xmlns:a="http://schemas.openxmlformats.org/drawingml/2006/main" mc:Ignorable="w14 w15 w16se w16cid w16 w16cex w16sdtdh w16sdtfl w16du wp14">
+<w:ftr xmlns:wpc="http://schemas.microsoft.com/office/word/2010/wordprocessingCanvas" xmlns:cx="http://schemas.microsoft.com/office/drawing/2014/chartex" xmlns:cx1="http://schemas.microsoft.com/office/drawing/2015/9/8/chartex" xmlns:cx2="http://schemas.microsoft.com/office/drawing/2015/10/21/chartex" xmlns:cx3="http://schemas.microsoft.com/office/drawing/2016/5/9/chartex" xmlns:cx4="http://schemas.microsoft.com/office/drawing/2016/5/10/chartex" xmlns:cx5="http://schemas.microsoft.com/office/drawing/2016/5/11/chartex" xmlns:cx6="http://schemas.microsoft.com/office/drawing/2016/5/12/chartex" xmlns:cx7="http://schemas.microsoft.com/office/drawing/2016/5/13/chartex" xmlns:cx8="http://schemas.microsoft.com/office/drawing/2016/5/14/chartex" xmlns:mc="http://schemas.openxmlformats.org/markup-compatibility/2006" xmlns:aink="http://schemas.microsoft.com/office/drawing/2016/ink" xmlns:am3d="http://schemas.microsoft.com/office/drawing/2017/model3d" xmlns:o="urn:schemas-microsoft-com:office:office" xmlns:oel="http://schemas.microsoft.com/office/2019/extlst" xmlns:r="http://schemas.openxmlformats.org/officeDocument/2006/relationships" xmlns:m="http://schemas.openxmlformats.org/officeDocument/2006/math" xmlns:v="urn:schemas-microsoft-com:vml" xmlns:wp14="http://schemas.microsoft.com/office/word/2010/wordprocessingDrawing" xmlns:wp="http://schemas.openxmlformats.org/drawingml/2006/wordprocessingDrawing" xmlns:w10="urn:schemas-microsoft-com:office:word" xmlns:w="http://schemas.openxmlformats.org/wordprocessingml/2006/main" xmlns:w14="http://schemas.microsoft.com/office/word/2010/wordml" xmlns:w15="http://schemas.microsoft.com/office/word/2012/wordml" xmlns:w16cei="http://schemas.microsoft.com/office/word/2026/wordml/cei" xmlns:w16cex="http://schemas.microsoft.com/office/word/2018/wordml/cex" xmlns:w16cid="http://schemas.microsoft.com/office/word/2016/wordml/cid" xmlns:w16="http://schemas.microsoft.com/office/word/2018/wordml" xmlns:w16du="http://schemas.microsoft.com/office/word/2023/wordml/word16du" xmlns:w16sdtdh="http://schemas.microsoft.com/office/word/2020/wordml/sdtdatahash" xmlns:w16sdtfl="http://schemas.microsoft.com/office/word/2024/wordml/sdtformatlock" xmlns:w16se="http://schemas.microsoft.com/office/word/2015/wordml/symex" xmlns:wpg="http://schemas.microsoft.com/office/word/2010/wordprocessingGroup" xmlns:wpi="http://schemas.microsoft.com/office/word/2010/wordprocessingInk" xmlns:wne="http://schemas.microsoft.com/office/word/2006/wordml" xmlns:wps="http://schemas.microsoft.com/office/word/2010/wordprocessingShape" mc:Ignorable="w14 w15 w16se w16cid w16 w16cex w16sdtdh w16sdtfl w16du wp14">
   <w:p>
     <w:pPr>
       <w:pStyle w:val="BodyText"/>
@@ -4391,6 +3983,7 @@
       </w:rPr>
       <w:t xml:space="preserve">Generated </w:t>
     </w:r>
+    <w:proofErr w:type="gramStart"/>
     <w:r>
       <w:rPr>
         <w:sz w:val="16"/>
@@ -4398,6 +3991,7 @@
       </w:rPr>
       <w:t>by ”Probate</w:t>
     </w:r>
+    <w:proofErr w:type="gramEnd"/>
     <w:r>
       <w:rPr>
         <w:sz w:val="16"/>
@@ -4405,6 +3999,8 @@
       </w:rPr>
       <w:t xml:space="preserve"> Application” on {</w:t>
     </w:r>
+    <w:proofErr w:type="spellStart"/>
+    <w:proofErr w:type="gramStart"/>
     <w:r>
       <w:rPr>
         <w:sz w:val="16"/>
@@ -4412,6 +4008,8 @@
       </w:rPr>
       <w:t>d.applicationDate</w:t>
     </w:r>
+    <w:proofErr w:type="spellEnd"/>
+    <w:proofErr w:type="gramEnd"/>
     <w:r>
       <w:rPr>
         <w:sz w:val="16"/>
@@ -4451,26 +4049,37 @@
       <w:fldChar w:fldCharType="begin"/>
     </w:r>
     <w:r>
-      <w:instrText xml:space="preserve">PAGE</w:instrText>
+      <w:instrText>PAGE</w:instrText>
     </w:r>
     <w:r>
       <w:fldChar w:fldCharType="separate"/>
     </w:r>
     <w:r>
+      <w:rPr>
+        <w:noProof/>
+      </w:rPr>
+      <w:t>1</w:t>
+    </w:r>
+    <w:r>
       <w:fldChar w:fldCharType="end"/>
     </w:r>
     <w:r>
-      <w:rPr/>
       <w:t xml:space="preserve"> of </w:t>
     </w:r>
     <w:r>
       <w:fldChar w:fldCharType="begin"/>
     </w:r>
     <w:r>
-      <w:instrText xml:space="preserve">NUMPAGES</w:instrText>
+      <w:instrText>NUMPAGES</w:instrText>
     </w:r>
     <w:r>
       <w:fldChar w:fldCharType="separate"/>
+    </w:r>
+    <w:r>
+      <w:rPr>
+        <w:noProof/>
+      </w:rPr>
+      <w:t>2</w:t>
     </w:r>
     <w:r>
       <w:fldChar w:fldCharType="end"/>
@@ -4490,7 +4099,7 @@
 </file>
 
 <file path=word/footer3.xml><?xml version="1.0" encoding="utf-8"?>
-<w:ftr xmlns:wpc="http://schemas.microsoft.com/office/word/2010/wordprocessingCanvas" xmlns:cx="http://schemas.microsoft.com/office/drawing/2014/chartex" xmlns:cx1="http://schemas.microsoft.com/office/drawing/2015/9/8/chartex" xmlns:cx2="http://schemas.microsoft.com/office/drawing/2015/10/21/chartex" xmlns:cx3="http://schemas.microsoft.com/office/drawing/2016/5/9/chartex" xmlns:cx4="http://schemas.microsoft.com/office/drawing/2016/5/10/chartex" xmlns:cx5="http://schemas.microsoft.com/office/drawing/2016/5/11/chartex" xmlns:cx6="http://schemas.microsoft.com/office/drawing/2016/5/12/chartex" xmlns:cx7="http://schemas.microsoft.com/office/drawing/2016/5/13/chartex" xmlns:cx8="http://schemas.microsoft.com/office/drawing/2016/5/14/chartex" xmlns:mc="http://schemas.openxmlformats.org/markup-compatibility/2006" xmlns:aink="http://schemas.microsoft.com/office/drawing/2016/ink" xmlns:am3d="http://schemas.microsoft.com/office/drawing/2017/model3d" xmlns:o="urn:schemas-microsoft-com:office:office" xmlns:oel="http://schemas.microsoft.com/office/2019/extlst" xmlns:r="http://schemas.openxmlformats.org/officeDocument/2006/relationships" xmlns:m="http://schemas.openxmlformats.org/officeDocument/2006/math" xmlns:v="urn:schemas-microsoft-com:vml" xmlns:wp14="http://schemas.microsoft.com/office/word/2010/wordprocessingDrawing" xmlns:wp="http://schemas.openxmlformats.org/drawingml/2006/wordprocessingDrawing" xmlns:w10="urn:schemas-microsoft-com:office:word" xmlns:w="http://schemas.openxmlformats.org/wordprocessingml/2006/main" xmlns:w14="http://schemas.microsoft.com/office/word/2010/wordml" xmlns:w15="http://schemas.microsoft.com/office/word/2012/wordml" xmlns:w16cex="http://schemas.microsoft.com/office/word/2018/wordml/cex" xmlns:w16cid="http://schemas.microsoft.com/office/word/2016/wordml/cid" xmlns:w16="http://schemas.microsoft.com/office/word/2018/wordml" xmlns:w16du="http://schemas.microsoft.com/office/word/2023/wordml/word16du" xmlns:w16sdtdh="http://schemas.microsoft.com/office/word/2020/wordml/sdtdatahash" xmlns:w16sdtfl="http://schemas.microsoft.com/office/word/2024/wordml/sdtformatlock" xmlns:w16se="http://schemas.microsoft.com/office/word/2015/wordml/symex" xmlns:wpg="http://schemas.microsoft.com/office/word/2010/wordprocessingGroup" xmlns:wpi="http://schemas.microsoft.com/office/word/2010/wordprocessingInk" xmlns:wne="http://schemas.microsoft.com/office/word/2006/wordml" xmlns:wps="http://schemas.microsoft.com/office/word/2010/wordprocessingShape" mc:Ignorable="w14 w15 w16se w16cid w16 w16cex w16sdtdh w16sdtfl w16du wp14">
+<w:ftr xmlns:wpc="http://schemas.microsoft.com/office/word/2010/wordprocessingCanvas" xmlns:cx="http://schemas.microsoft.com/office/drawing/2014/chartex" xmlns:cx1="http://schemas.microsoft.com/office/drawing/2015/9/8/chartex" xmlns:cx2="http://schemas.microsoft.com/office/drawing/2015/10/21/chartex" xmlns:cx3="http://schemas.microsoft.com/office/drawing/2016/5/9/chartex" xmlns:cx4="http://schemas.microsoft.com/office/drawing/2016/5/10/chartex" xmlns:cx5="http://schemas.microsoft.com/office/drawing/2016/5/11/chartex" xmlns:cx6="http://schemas.microsoft.com/office/drawing/2016/5/12/chartex" xmlns:cx7="http://schemas.microsoft.com/office/drawing/2016/5/13/chartex" xmlns:cx8="http://schemas.microsoft.com/office/drawing/2016/5/14/chartex" xmlns:mc="http://schemas.openxmlformats.org/markup-compatibility/2006" xmlns:aink="http://schemas.microsoft.com/office/drawing/2016/ink" xmlns:am3d="http://schemas.microsoft.com/office/drawing/2017/model3d" xmlns:o="urn:schemas-microsoft-com:office:office" xmlns:oel="http://schemas.microsoft.com/office/2019/extlst" xmlns:r="http://schemas.openxmlformats.org/officeDocument/2006/relationships" xmlns:m="http://schemas.openxmlformats.org/officeDocument/2006/math" xmlns:v="urn:schemas-microsoft-com:vml" xmlns:wp14="http://schemas.microsoft.com/office/word/2010/wordprocessingDrawing" xmlns:wp="http://schemas.openxmlformats.org/drawingml/2006/wordprocessingDrawing" xmlns:w10="urn:schemas-microsoft-com:office:word" xmlns:w="http://schemas.openxmlformats.org/wordprocessingml/2006/main" xmlns:w14="http://schemas.microsoft.com/office/word/2010/wordml" xmlns:w15="http://schemas.microsoft.com/office/word/2012/wordml" xmlns:w16cei="http://schemas.microsoft.com/office/word/2026/wordml/cei" xmlns:w16cex="http://schemas.microsoft.com/office/word/2018/wordml/cex" xmlns:w16cid="http://schemas.microsoft.com/office/word/2016/wordml/cid" xmlns:w16="http://schemas.microsoft.com/office/word/2018/wordml" xmlns:w16du="http://schemas.microsoft.com/office/word/2023/wordml/word16du" xmlns:w16sdtdh="http://schemas.microsoft.com/office/word/2020/wordml/sdtdatahash" xmlns:w16sdtfl="http://schemas.microsoft.com/office/word/2024/wordml/sdtformatlock" xmlns:w16se="http://schemas.microsoft.com/office/word/2015/wordml/symex" xmlns:wpg="http://schemas.microsoft.com/office/word/2010/wordprocessingGroup" xmlns:wpi="http://schemas.microsoft.com/office/word/2010/wordprocessingInk" xmlns:wne="http://schemas.microsoft.com/office/word/2006/wordml" xmlns:wps="http://schemas.microsoft.com/office/word/2010/wordprocessingShape" mc:Ignorable="w14 w15 w16se w16cid w16 w16cex w16sdtdh w16sdtfl w16du wp14">
   <w:p>
     <w:pPr>
       <w:pStyle w:val="Footer"/>
@@ -4500,7 +4109,7 @@
 </file>
 
 <file path=word/footnotes.xml><?xml version="1.0" encoding="utf-8"?>
-<w:footnotes xmlns:wpc="http://schemas.microsoft.com/office/word/2010/wordprocessingCanvas" xmlns:cx="http://schemas.microsoft.com/office/drawing/2014/chartex" xmlns:cx1="http://schemas.microsoft.com/office/drawing/2015/9/8/chartex" xmlns:cx2="http://schemas.microsoft.com/office/drawing/2015/10/21/chartex" xmlns:cx3="http://schemas.microsoft.com/office/drawing/2016/5/9/chartex" xmlns:cx4="http://schemas.microsoft.com/office/drawing/2016/5/10/chartex" xmlns:cx5="http://schemas.microsoft.com/office/drawing/2016/5/11/chartex" xmlns:cx6="http://schemas.microsoft.com/office/drawing/2016/5/12/chartex" xmlns:cx7="http://schemas.microsoft.com/office/drawing/2016/5/13/chartex" xmlns:cx8="http://schemas.microsoft.com/office/drawing/2016/5/14/chartex" xmlns:mc="http://schemas.openxmlformats.org/markup-compatibility/2006" xmlns:aink="http://schemas.microsoft.com/office/drawing/2016/ink" xmlns:am3d="http://schemas.microsoft.com/office/drawing/2017/model3d" xmlns:o="urn:schemas-microsoft-com:office:office" xmlns:oel="http://schemas.microsoft.com/office/2019/extlst" xmlns:r="http://schemas.openxmlformats.org/officeDocument/2006/relationships" xmlns:m="http://schemas.openxmlformats.org/officeDocument/2006/math" xmlns:v="urn:schemas-microsoft-com:vml" xmlns:wp14="http://schemas.microsoft.com/office/word/2010/wordprocessingDrawing" xmlns:wp="http://schemas.openxmlformats.org/drawingml/2006/wordprocessingDrawing" xmlns:w10="urn:schemas-microsoft-com:office:word" xmlns:w="http://schemas.openxmlformats.org/wordprocessingml/2006/main" xmlns:w14="http://schemas.microsoft.com/office/word/2010/wordml" xmlns:w15="http://schemas.microsoft.com/office/word/2012/wordml" xmlns:w16cex="http://schemas.microsoft.com/office/word/2018/wordml/cex" xmlns:w16cid="http://schemas.microsoft.com/office/word/2016/wordml/cid" xmlns:w16="http://schemas.microsoft.com/office/word/2018/wordml" xmlns:w16du="http://schemas.microsoft.com/office/word/2023/wordml/word16du" xmlns:w16sdtdh="http://schemas.microsoft.com/office/word/2020/wordml/sdtdatahash" xmlns:w16sdtfl="http://schemas.microsoft.com/office/word/2024/wordml/sdtformatlock" xmlns:w16se="http://schemas.microsoft.com/office/word/2015/wordml/symex" xmlns:wpg="http://schemas.microsoft.com/office/word/2010/wordprocessingGroup" xmlns:wpi="http://schemas.microsoft.com/office/word/2010/wordprocessingInk" xmlns:wne="http://schemas.microsoft.com/office/word/2006/wordml" xmlns:wps="http://schemas.microsoft.com/office/word/2010/wordprocessingShape" mc:Ignorable="w14 w15 w16se w16cid w16 w16cex w16sdtdh w16sdtfl w16du wp14">
+<w:footnotes xmlns:wpc="http://schemas.microsoft.com/office/word/2010/wordprocessingCanvas" xmlns:cx="http://schemas.microsoft.com/office/drawing/2014/chartex" xmlns:cx1="http://schemas.microsoft.com/office/drawing/2015/9/8/chartex" xmlns:cx2="http://schemas.microsoft.com/office/drawing/2015/10/21/chartex" xmlns:cx3="http://schemas.microsoft.com/office/drawing/2016/5/9/chartex" xmlns:cx4="http://schemas.microsoft.com/office/drawing/2016/5/10/chartex" xmlns:cx5="http://schemas.microsoft.com/office/drawing/2016/5/11/chartex" xmlns:cx6="http://schemas.microsoft.com/office/drawing/2016/5/12/chartex" xmlns:cx7="http://schemas.microsoft.com/office/drawing/2016/5/13/chartex" xmlns:cx8="http://schemas.microsoft.com/office/drawing/2016/5/14/chartex" xmlns:mc="http://schemas.openxmlformats.org/markup-compatibility/2006" xmlns:aink="http://schemas.microsoft.com/office/drawing/2016/ink" xmlns:am3d="http://schemas.microsoft.com/office/drawing/2017/model3d" xmlns:o="urn:schemas-microsoft-com:office:office" xmlns:oel="http://schemas.microsoft.com/office/2019/extlst" xmlns:r="http://schemas.openxmlformats.org/officeDocument/2006/relationships" xmlns:m="http://schemas.openxmlformats.org/officeDocument/2006/math" xmlns:v="urn:schemas-microsoft-com:vml" xmlns:wp14="http://schemas.microsoft.com/office/word/2010/wordprocessingDrawing" xmlns:wp="http://schemas.openxmlformats.org/drawingml/2006/wordprocessingDrawing" xmlns:w10="urn:schemas-microsoft-com:office:word" xmlns:w="http://schemas.openxmlformats.org/wordprocessingml/2006/main" xmlns:w14="http://schemas.microsoft.com/office/word/2010/wordml" xmlns:w15="http://schemas.microsoft.com/office/word/2012/wordml" xmlns:w16cei="http://schemas.microsoft.com/office/word/2026/wordml/cei" xmlns:w16cex="http://schemas.microsoft.com/office/word/2018/wordml/cex" xmlns:w16cid="http://schemas.microsoft.com/office/word/2016/wordml/cid" xmlns:w16="http://schemas.microsoft.com/office/word/2018/wordml" xmlns:w16du="http://schemas.microsoft.com/office/word/2023/wordml/word16du" xmlns:w16sdtdh="http://schemas.microsoft.com/office/word/2020/wordml/sdtdatahash" xmlns:w16sdtfl="http://schemas.microsoft.com/office/word/2024/wordml/sdtformatlock" xmlns:w16se="http://schemas.microsoft.com/office/word/2015/wordml/symex" xmlns:wpg="http://schemas.microsoft.com/office/word/2010/wordprocessingGroup" xmlns:wpi="http://schemas.microsoft.com/office/word/2010/wordprocessingInk" xmlns:wne="http://schemas.microsoft.com/office/word/2006/wordml" xmlns:wps="http://schemas.microsoft.com/office/word/2010/wordprocessingShape" mc:Ignorable="w14 w15 w16se w16cid w16 w16cex w16sdtdh w16sdtfl w16du wp14">
   <w:footnote w:type="separator" w:id="-1">
     <w:p>
       <w:r>
@@ -4519,7 +4128,7 @@
 </file>
 
 <file path=word/header1.xml><?xml version="1.0" encoding="utf-8"?>
-<w:hdr xmlns:wpc="http://schemas.microsoft.com/office/word/2010/wordprocessingCanvas" xmlns:cx="http://schemas.microsoft.com/office/drawing/2014/chartex" xmlns:cx1="http://schemas.microsoft.com/office/drawing/2015/9/8/chartex" xmlns:cx2="http://schemas.microsoft.com/office/drawing/2015/10/21/chartex" xmlns:cx3="http://schemas.microsoft.com/office/drawing/2016/5/9/chartex" xmlns:cx4="http://schemas.microsoft.com/office/drawing/2016/5/10/chartex" xmlns:cx5="http://schemas.microsoft.com/office/drawing/2016/5/11/chartex" xmlns:cx6="http://schemas.microsoft.com/office/drawing/2016/5/12/chartex" xmlns:cx7="http://schemas.microsoft.com/office/drawing/2016/5/13/chartex" xmlns:cx8="http://schemas.microsoft.com/office/drawing/2016/5/14/chartex" xmlns:mc="http://schemas.openxmlformats.org/markup-compatibility/2006" xmlns:aink="http://schemas.microsoft.com/office/drawing/2016/ink" xmlns:am3d="http://schemas.microsoft.com/office/drawing/2017/model3d" xmlns:o="urn:schemas-microsoft-com:office:office" xmlns:oel="http://schemas.microsoft.com/office/2019/extlst" xmlns:r="http://schemas.openxmlformats.org/officeDocument/2006/relationships" xmlns:m="http://schemas.openxmlformats.org/officeDocument/2006/math" xmlns:v="urn:schemas-microsoft-com:vml" xmlns:wp14="http://schemas.microsoft.com/office/word/2010/wordprocessingDrawing" xmlns:wp="http://schemas.openxmlformats.org/drawingml/2006/wordprocessingDrawing" xmlns:w10="urn:schemas-microsoft-com:office:word" xmlns:w="http://schemas.openxmlformats.org/wordprocessingml/2006/main" xmlns:w14="http://schemas.microsoft.com/office/word/2010/wordml" xmlns:w15="http://schemas.microsoft.com/office/word/2012/wordml" xmlns:w16cex="http://schemas.microsoft.com/office/word/2018/wordml/cex" xmlns:w16cid="http://schemas.microsoft.com/office/word/2016/wordml/cid" xmlns:w16="http://schemas.microsoft.com/office/word/2018/wordml" xmlns:w16du="http://schemas.microsoft.com/office/word/2023/wordml/word16du" xmlns:w16sdtdh="http://schemas.microsoft.com/office/word/2020/wordml/sdtdatahash" xmlns:w16sdtfl="http://schemas.microsoft.com/office/word/2024/wordml/sdtformatlock" xmlns:w16se="http://schemas.microsoft.com/office/word/2015/wordml/symex" xmlns:wpg="http://schemas.microsoft.com/office/word/2010/wordprocessingGroup" xmlns:wpi="http://schemas.microsoft.com/office/word/2010/wordprocessingInk" xmlns:wne="http://schemas.microsoft.com/office/word/2006/wordml" xmlns:wps="http://schemas.microsoft.com/office/word/2010/wordprocessingShape" mc:Ignorable="w14 w15 w16se w16cid w16 w16cex w16sdtdh w16sdtfl w16du wp14">
+<w:hdr xmlns:wpc="http://schemas.microsoft.com/office/word/2010/wordprocessingCanvas" xmlns:cx="http://schemas.microsoft.com/office/drawing/2014/chartex" xmlns:cx1="http://schemas.microsoft.com/office/drawing/2015/9/8/chartex" xmlns:cx2="http://schemas.microsoft.com/office/drawing/2015/10/21/chartex" xmlns:cx3="http://schemas.microsoft.com/office/drawing/2016/5/9/chartex" xmlns:cx4="http://schemas.microsoft.com/office/drawing/2016/5/10/chartex" xmlns:cx5="http://schemas.microsoft.com/office/drawing/2016/5/11/chartex" xmlns:cx6="http://schemas.microsoft.com/office/drawing/2016/5/12/chartex" xmlns:cx7="http://schemas.microsoft.com/office/drawing/2016/5/13/chartex" xmlns:cx8="http://schemas.microsoft.com/office/drawing/2016/5/14/chartex" xmlns:mc="http://schemas.openxmlformats.org/markup-compatibility/2006" xmlns:aink="http://schemas.microsoft.com/office/drawing/2016/ink" xmlns:am3d="http://schemas.microsoft.com/office/drawing/2017/model3d" xmlns:o="urn:schemas-microsoft-com:office:office" xmlns:oel="http://schemas.microsoft.com/office/2019/extlst" xmlns:r="http://schemas.openxmlformats.org/officeDocument/2006/relationships" xmlns:m="http://schemas.openxmlformats.org/officeDocument/2006/math" xmlns:v="urn:schemas-microsoft-com:vml" xmlns:wp14="http://schemas.microsoft.com/office/word/2010/wordprocessingDrawing" xmlns:wp="http://schemas.openxmlformats.org/drawingml/2006/wordprocessingDrawing" xmlns:w10="urn:schemas-microsoft-com:office:word" xmlns:w="http://schemas.openxmlformats.org/wordprocessingml/2006/main" xmlns:w14="http://schemas.microsoft.com/office/word/2010/wordml" xmlns:w15="http://schemas.microsoft.com/office/word/2012/wordml" xmlns:w16cei="http://schemas.microsoft.com/office/word/2026/wordml/cei" xmlns:w16cex="http://schemas.microsoft.com/office/word/2018/wordml/cex" xmlns:w16cid="http://schemas.microsoft.com/office/word/2016/wordml/cid" xmlns:w16="http://schemas.microsoft.com/office/word/2018/wordml" xmlns:w16du="http://schemas.microsoft.com/office/word/2023/wordml/word16du" xmlns:w16sdtdh="http://schemas.microsoft.com/office/word/2020/wordml/sdtdatahash" xmlns:w16sdtfl="http://schemas.microsoft.com/office/word/2024/wordml/sdtformatlock" xmlns:w16se="http://schemas.microsoft.com/office/word/2015/wordml/symex" xmlns:wpg="http://schemas.microsoft.com/office/word/2010/wordprocessingGroup" xmlns:wpi="http://schemas.microsoft.com/office/word/2010/wordprocessingInk" xmlns:wne="http://schemas.microsoft.com/office/word/2006/wordml" xmlns:wps="http://schemas.microsoft.com/office/word/2010/wordprocessingShape" mc:Ignorable="w14 w15 w16se w16cid w16 w16cex w16sdtdh w16sdtfl w16du wp14">
   <w:p>
     <w:pPr>
       <w:pStyle w:val="Header"/>
@@ -4529,7 +4138,7 @@
 </file>
 
 <file path=word/header2.xml><?xml version="1.0" encoding="utf-8"?>
-<w:hdr xmlns:wpc="http://schemas.microsoft.com/office/word/2010/wordprocessingCanvas" xmlns:cx="http://schemas.microsoft.com/office/drawing/2014/chartex" xmlns:cx1="http://schemas.microsoft.com/office/drawing/2015/9/8/chartex" xmlns:cx2="http://schemas.microsoft.com/office/drawing/2015/10/21/chartex" xmlns:cx3="http://schemas.microsoft.com/office/drawing/2016/5/9/chartex" xmlns:cx4="http://schemas.microsoft.com/office/drawing/2016/5/10/chartex" xmlns:cx5="http://schemas.microsoft.com/office/drawing/2016/5/11/chartex" xmlns:cx6="http://schemas.microsoft.com/office/drawing/2016/5/12/chartex" xmlns:cx7="http://schemas.microsoft.com/office/drawing/2016/5/13/chartex" xmlns:cx8="http://schemas.microsoft.com/office/drawing/2016/5/14/chartex" xmlns:mc="http://schemas.openxmlformats.org/markup-compatibility/2006" xmlns:aink="http://schemas.microsoft.com/office/drawing/2016/ink" xmlns:am3d="http://schemas.microsoft.com/office/drawing/2017/model3d" xmlns:o="urn:schemas-microsoft-com:office:office" xmlns:oel="http://schemas.microsoft.com/office/2019/extlst" xmlns:r="http://schemas.openxmlformats.org/officeDocument/2006/relationships" xmlns:m="http://schemas.openxmlformats.org/officeDocument/2006/math" xmlns:v="urn:schemas-microsoft-com:vml" xmlns:wp14="http://schemas.microsoft.com/office/word/2010/wordprocessingDrawing" xmlns:wp="http://schemas.openxmlformats.org/drawingml/2006/wordprocessingDrawing" xmlns:w10="urn:schemas-microsoft-com:office:word" xmlns:w="http://schemas.openxmlformats.org/wordprocessingml/2006/main" xmlns:w14="http://schemas.microsoft.com/office/word/2010/wordml" xmlns:w15="http://schemas.microsoft.com/office/word/2012/wordml" xmlns:w16cex="http://schemas.microsoft.com/office/word/2018/wordml/cex" xmlns:w16cid="http://schemas.microsoft.com/office/word/2016/wordml/cid" xmlns:w16="http://schemas.microsoft.com/office/word/2018/wordml" xmlns:w16du="http://schemas.microsoft.com/office/word/2023/wordml/word16du" xmlns:w16sdtdh="http://schemas.microsoft.com/office/word/2020/wordml/sdtdatahash" xmlns:w16sdtfl="http://schemas.microsoft.com/office/word/2024/wordml/sdtformatlock" xmlns:w16se="http://schemas.microsoft.com/office/word/2015/wordml/symex" xmlns:wpg="http://schemas.microsoft.com/office/word/2010/wordprocessingGroup" xmlns:wpi="http://schemas.microsoft.com/office/word/2010/wordprocessingInk" xmlns:wne="http://schemas.microsoft.com/office/word/2006/wordml" xmlns:wps="http://schemas.microsoft.com/office/word/2010/wordprocessingShape" mc:Ignorable="w14 w15 w16se w16cid w16 w16cex w16sdtdh w16sdtfl w16du wp14">
+<w:hdr xmlns:wpc="http://schemas.microsoft.com/office/word/2010/wordprocessingCanvas" xmlns:cx="http://schemas.microsoft.com/office/drawing/2014/chartex" xmlns:cx1="http://schemas.microsoft.com/office/drawing/2015/9/8/chartex" xmlns:cx2="http://schemas.microsoft.com/office/drawing/2015/10/21/chartex" xmlns:cx3="http://schemas.microsoft.com/office/drawing/2016/5/9/chartex" xmlns:cx4="http://schemas.microsoft.com/office/drawing/2016/5/10/chartex" xmlns:cx5="http://schemas.microsoft.com/office/drawing/2016/5/11/chartex" xmlns:cx6="http://schemas.microsoft.com/office/drawing/2016/5/12/chartex" xmlns:cx7="http://schemas.microsoft.com/office/drawing/2016/5/13/chartex" xmlns:cx8="http://schemas.microsoft.com/office/drawing/2016/5/14/chartex" xmlns:mc="http://schemas.openxmlformats.org/markup-compatibility/2006" xmlns:aink="http://schemas.microsoft.com/office/drawing/2016/ink" xmlns:am3d="http://schemas.microsoft.com/office/drawing/2017/model3d" xmlns:o="urn:schemas-microsoft-com:office:office" xmlns:oel="http://schemas.microsoft.com/office/2019/extlst" xmlns:r="http://schemas.openxmlformats.org/officeDocument/2006/relationships" xmlns:m="http://schemas.openxmlformats.org/officeDocument/2006/math" xmlns:v="urn:schemas-microsoft-com:vml" xmlns:wp14="http://schemas.microsoft.com/office/word/2010/wordprocessingDrawing" xmlns:wp="http://schemas.openxmlformats.org/drawingml/2006/wordprocessingDrawing" xmlns:w10="urn:schemas-microsoft-com:office:word" xmlns:w="http://schemas.openxmlformats.org/wordprocessingml/2006/main" xmlns:w14="http://schemas.microsoft.com/office/word/2010/wordml" xmlns:w15="http://schemas.microsoft.com/office/word/2012/wordml" xmlns:w16cei="http://schemas.microsoft.com/office/word/2026/wordml/cei" xmlns:w16cex="http://schemas.microsoft.com/office/word/2018/wordml/cex" xmlns:w16cid="http://schemas.microsoft.com/office/word/2016/wordml/cid" xmlns:w16="http://schemas.microsoft.com/office/word/2018/wordml" xmlns:w16du="http://schemas.microsoft.com/office/word/2023/wordml/word16du" xmlns:w16sdtdh="http://schemas.microsoft.com/office/word/2020/wordml/sdtdatahash" xmlns:w16sdtfl="http://schemas.microsoft.com/office/word/2024/wordml/sdtformatlock" xmlns:w16se="http://schemas.microsoft.com/office/word/2015/wordml/symex" xmlns:wpg="http://schemas.microsoft.com/office/word/2010/wordprocessingGroup" xmlns:wpi="http://schemas.microsoft.com/office/word/2010/wordprocessingInk" xmlns:wne="http://schemas.microsoft.com/office/word/2006/wordml" xmlns:wps="http://schemas.microsoft.com/office/word/2010/wordprocessingShape" mc:Ignorable="w14 w15 w16se w16cid w16 w16cex w16sdtdh w16sdtfl w16du wp14">
   <w:p>
     <w:pPr>
       <w:pStyle w:val="Header"/>
@@ -4539,7 +4148,7 @@
 </file>
 
 <file path=word/header3.xml><?xml version="1.0" encoding="utf-8"?>
-<w:hdr xmlns:wpc="http://schemas.microsoft.com/office/word/2010/wordprocessingCanvas" xmlns:cx="http://schemas.microsoft.com/office/drawing/2014/chartex" xmlns:cx1="http://schemas.microsoft.com/office/drawing/2015/9/8/chartex" xmlns:cx2="http://schemas.microsoft.com/office/drawing/2015/10/21/chartex" xmlns:cx3="http://schemas.microsoft.com/office/drawing/2016/5/9/chartex" xmlns:cx4="http://schemas.microsoft.com/office/drawing/2016/5/10/chartex" xmlns:cx5="http://schemas.microsoft.com/office/drawing/2016/5/11/chartex" xmlns:cx6="http://schemas.microsoft.com/office/drawing/2016/5/12/chartex" xmlns:cx7="http://schemas.microsoft.com/office/drawing/2016/5/13/chartex" xmlns:cx8="http://schemas.microsoft.com/office/drawing/2016/5/14/chartex" xmlns:mc="http://schemas.openxmlformats.org/markup-compatibility/2006" xmlns:aink="http://schemas.microsoft.com/office/drawing/2016/ink" xmlns:am3d="http://schemas.microsoft.com/office/drawing/2017/model3d" xmlns:o="urn:schemas-microsoft-com:office:office" xmlns:oel="http://schemas.microsoft.com/office/2019/extlst" xmlns:r="http://schemas.openxmlformats.org/officeDocument/2006/relationships" xmlns:m="http://schemas.openxmlformats.org/officeDocument/2006/math" xmlns:v="urn:schemas-microsoft-com:vml" xmlns:wp14="http://schemas.microsoft.com/office/word/2010/wordprocessingDrawing" xmlns:wp="http://schemas.openxmlformats.org/drawingml/2006/wordprocessingDrawing" xmlns:w10="urn:schemas-microsoft-com:office:word" xmlns:w="http://schemas.openxmlformats.org/wordprocessingml/2006/main" xmlns:w14="http://schemas.microsoft.com/office/word/2010/wordml" xmlns:w15="http://schemas.microsoft.com/office/word/2012/wordml" xmlns:w16cex="http://schemas.microsoft.com/office/word/2018/wordml/cex" xmlns:w16cid="http://schemas.microsoft.com/office/word/2016/wordml/cid" xmlns:w16="http://schemas.microsoft.com/office/word/2018/wordml" xmlns:w16du="http://schemas.microsoft.com/office/word/2023/wordml/word16du" xmlns:w16sdtdh="http://schemas.microsoft.com/office/word/2020/wordml/sdtdatahash" xmlns:w16sdtfl="http://schemas.microsoft.com/office/word/2024/wordml/sdtformatlock" xmlns:w16se="http://schemas.microsoft.com/office/word/2015/wordml/symex" xmlns:wpg="http://schemas.microsoft.com/office/word/2010/wordprocessingGroup" xmlns:wpi="http://schemas.microsoft.com/office/word/2010/wordprocessingInk" xmlns:wne="http://schemas.microsoft.com/office/word/2006/wordml" xmlns:wps="http://schemas.microsoft.com/office/word/2010/wordprocessingShape" mc:Ignorable="w14 w15 w16se w16cid w16 w16cex w16sdtdh w16sdtfl w16du wp14">
+<w:hdr xmlns:wpc="http://schemas.microsoft.com/office/word/2010/wordprocessingCanvas" xmlns:cx="http://schemas.microsoft.com/office/drawing/2014/chartex" xmlns:cx1="http://schemas.microsoft.com/office/drawing/2015/9/8/chartex" xmlns:cx2="http://schemas.microsoft.com/office/drawing/2015/10/21/chartex" xmlns:cx3="http://schemas.microsoft.com/office/drawing/2016/5/9/chartex" xmlns:cx4="http://schemas.microsoft.com/office/drawing/2016/5/10/chartex" xmlns:cx5="http://schemas.microsoft.com/office/drawing/2016/5/11/chartex" xmlns:cx6="http://schemas.microsoft.com/office/drawing/2016/5/12/chartex" xmlns:cx7="http://schemas.microsoft.com/office/drawing/2016/5/13/chartex" xmlns:cx8="http://schemas.microsoft.com/office/drawing/2016/5/14/chartex" xmlns:mc="http://schemas.openxmlformats.org/markup-compatibility/2006" xmlns:aink="http://schemas.microsoft.com/office/drawing/2016/ink" xmlns:am3d="http://schemas.microsoft.com/office/drawing/2017/model3d" xmlns:o="urn:schemas-microsoft-com:office:office" xmlns:oel="http://schemas.microsoft.com/office/2019/extlst" xmlns:r="http://schemas.openxmlformats.org/officeDocument/2006/relationships" xmlns:m="http://schemas.openxmlformats.org/officeDocument/2006/math" xmlns:v="urn:schemas-microsoft-com:vml" xmlns:wp14="http://schemas.microsoft.com/office/word/2010/wordprocessingDrawing" xmlns:wp="http://schemas.openxmlformats.org/drawingml/2006/wordprocessingDrawing" xmlns:w10="urn:schemas-microsoft-com:office:word" xmlns:w="http://schemas.openxmlformats.org/wordprocessingml/2006/main" xmlns:w14="http://schemas.microsoft.com/office/word/2010/wordml" xmlns:w15="http://schemas.microsoft.com/office/word/2012/wordml" xmlns:w16cei="http://schemas.microsoft.com/office/word/2026/wordml/cei" xmlns:w16cex="http://schemas.microsoft.com/office/word/2018/wordml/cex" xmlns:w16cid="http://schemas.microsoft.com/office/word/2016/wordml/cid" xmlns:w16="http://schemas.microsoft.com/office/word/2018/wordml" xmlns:w16du="http://schemas.microsoft.com/office/word/2023/wordml/word16du" xmlns:w16sdtdh="http://schemas.microsoft.com/office/word/2020/wordml/sdtdatahash" xmlns:w16sdtfl="http://schemas.microsoft.com/office/word/2024/wordml/sdtformatlock" xmlns:w16se="http://schemas.microsoft.com/office/word/2015/wordml/symex" xmlns:wpg="http://schemas.microsoft.com/office/word/2010/wordprocessingGroup" xmlns:wpi="http://schemas.microsoft.com/office/word/2010/wordprocessingInk" xmlns:wne="http://schemas.microsoft.com/office/word/2006/wordml" xmlns:wps="http://schemas.microsoft.com/office/word/2010/wordprocessingShape" mc:Ignorable="w14 w15 w16se w16cid w16 w16cex w16sdtdh w16sdtfl w16du wp14">
   <w:p>
     <w:pPr>
       <w:pStyle w:val="Header"/>
@@ -4549,7 +4158,7 @@
 </file>
 
 <file path=word/numbering.xml><?xml version="1.0" encoding="utf-8"?>
-<w:numbering xmlns:wpc="http://schemas.microsoft.com/office/word/2010/wordprocessingCanvas" xmlns:cx="http://schemas.microsoft.com/office/drawing/2014/chartex" xmlns:cx1="http://schemas.microsoft.com/office/drawing/2015/9/8/chartex" xmlns:cx2="http://schemas.microsoft.com/office/drawing/2015/10/21/chartex" xmlns:cx3="http://schemas.microsoft.com/office/drawing/2016/5/9/chartex" xmlns:cx4="http://schemas.microsoft.com/office/drawing/2016/5/10/chartex" xmlns:cx5="http://schemas.microsoft.com/office/drawing/2016/5/11/chartex" xmlns:cx6="http://schemas.microsoft.com/office/drawing/2016/5/12/chartex" xmlns:cx7="http://schemas.microsoft.com/office/drawing/2016/5/13/chartex" xmlns:cx8="http://schemas.microsoft.com/office/drawing/2016/5/14/chartex" xmlns:mc="http://schemas.openxmlformats.org/markup-compatibility/2006" xmlns:aink="http://schemas.microsoft.com/office/drawing/2016/ink" xmlns:am3d="http://schemas.microsoft.com/office/drawing/2017/model3d" xmlns:o="urn:schemas-microsoft-com:office:office" xmlns:oel="http://schemas.microsoft.com/office/2019/extlst" xmlns:r="http://schemas.openxmlformats.org/officeDocument/2006/relationships" xmlns:m="http://schemas.openxmlformats.org/officeDocument/2006/math" xmlns:v="urn:schemas-microsoft-com:vml" xmlns:wp14="http://schemas.microsoft.com/office/word/2010/wordprocessingDrawing" xmlns:wp="http://schemas.openxmlformats.org/drawingml/2006/wordprocessingDrawing" xmlns:w10="urn:schemas-microsoft-com:office:word" xmlns:w="http://schemas.openxmlformats.org/wordprocessingml/2006/main" xmlns:w14="http://schemas.microsoft.com/office/word/2010/wordml" xmlns:w15="http://schemas.microsoft.com/office/word/2012/wordml" xmlns:w16cex="http://schemas.microsoft.com/office/word/2018/wordml/cex" xmlns:w16cid="http://schemas.microsoft.com/office/word/2016/wordml/cid" xmlns:w16="http://schemas.microsoft.com/office/word/2018/wordml" xmlns:w16du="http://schemas.microsoft.com/office/word/2023/wordml/word16du" xmlns:w16sdtdh="http://schemas.microsoft.com/office/word/2020/wordml/sdtdatahash" xmlns:w16sdtfl="http://schemas.microsoft.com/office/word/2024/wordml/sdtformatlock" xmlns:w16se="http://schemas.microsoft.com/office/word/2015/wordml/symex" xmlns:wpg="http://schemas.microsoft.com/office/word/2010/wordprocessingGroup" xmlns:wpi="http://schemas.microsoft.com/office/word/2010/wordprocessingInk" xmlns:wne="http://schemas.microsoft.com/office/word/2006/wordml" xmlns:wps="http://schemas.microsoft.com/office/word/2010/wordprocessingShape" mc:Ignorable="w14 w15 w16se w16cid w16 w16cex w16sdtdh w16sdtfl w16du wp14">
+<w:numbering xmlns:wpc="http://schemas.microsoft.com/office/word/2010/wordprocessingCanvas" xmlns:cx="http://schemas.microsoft.com/office/drawing/2014/chartex" xmlns:cx1="http://schemas.microsoft.com/office/drawing/2015/9/8/chartex" xmlns:cx2="http://schemas.microsoft.com/office/drawing/2015/10/21/chartex" xmlns:cx3="http://schemas.microsoft.com/office/drawing/2016/5/9/chartex" xmlns:cx4="http://schemas.microsoft.com/office/drawing/2016/5/10/chartex" xmlns:cx5="http://schemas.microsoft.com/office/drawing/2016/5/11/chartex" xmlns:cx6="http://schemas.microsoft.com/office/drawing/2016/5/12/chartex" xmlns:cx7="http://schemas.microsoft.com/office/drawing/2016/5/13/chartex" xmlns:cx8="http://schemas.microsoft.com/office/drawing/2016/5/14/chartex" xmlns:mc="http://schemas.openxmlformats.org/markup-compatibility/2006" xmlns:aink="http://schemas.microsoft.com/office/drawing/2016/ink" xmlns:am3d="http://schemas.microsoft.com/office/drawing/2017/model3d" xmlns:o="urn:schemas-microsoft-com:office:office" xmlns:oel="http://schemas.microsoft.com/office/2019/extlst" xmlns:r="http://schemas.openxmlformats.org/officeDocument/2006/relationships" xmlns:m="http://schemas.openxmlformats.org/officeDocument/2006/math" xmlns:v="urn:schemas-microsoft-com:vml" xmlns:wp14="http://schemas.microsoft.com/office/word/2010/wordprocessingDrawing" xmlns:wp="http://schemas.openxmlformats.org/drawingml/2006/wordprocessingDrawing" xmlns:w10="urn:schemas-microsoft-com:office:word" xmlns:w="http://schemas.openxmlformats.org/wordprocessingml/2006/main" xmlns:w14="http://schemas.microsoft.com/office/word/2010/wordml" xmlns:w15="http://schemas.microsoft.com/office/word/2012/wordml" xmlns:w16cei="http://schemas.microsoft.com/office/word/2026/wordml/cei" xmlns:w16cex="http://schemas.microsoft.com/office/word/2018/wordml/cex" xmlns:w16cid="http://schemas.microsoft.com/office/word/2016/wordml/cid" xmlns:w16="http://schemas.microsoft.com/office/word/2018/wordml" xmlns:w16du="http://schemas.microsoft.com/office/word/2023/wordml/word16du" xmlns:w16sdtdh="http://schemas.microsoft.com/office/word/2020/wordml/sdtdatahash" xmlns:w16sdtfl="http://schemas.microsoft.com/office/word/2024/wordml/sdtformatlock" xmlns:w16se="http://schemas.microsoft.com/office/word/2015/wordml/symex" xmlns:wpg="http://schemas.microsoft.com/office/word/2010/wordprocessingGroup" xmlns:wpi="http://schemas.microsoft.com/office/word/2010/wordprocessingInk" xmlns:wne="http://schemas.microsoft.com/office/word/2006/wordml" xmlns:wps="http://schemas.microsoft.com/office/word/2010/wordprocessingShape" mc:Ignorable="w14 w15 w16se w16cid w16 w16cex w16sdtdh w16sdtfl w16du wp14">
   <w:abstractNum w:abstractNumId="0" w15:restartNumberingAfterBreak="0">
     <w:nsid w:val="56246D06"/>
     <w:multiLevelType w:val="hybridMultilevel"/>
@@ -4564,7 +4173,7 @@
         <w:jc w:val="left"/>
       </w:pPr>
       <w:rPr>
-        <w:rFonts w:hint="default" w:ascii="BC Sans" w:hAnsi="BC Sans" w:eastAsia="BC Sans" w:cs="BC Sans"/>
+        <w:rFonts w:ascii="BC Sans" w:eastAsia="BC Sans" w:hAnsi="BC Sans" w:cs="BC Sans" w:hint="default"/>
         <w:b/>
         <w:bCs/>
         <w:i w:val="0"/>
@@ -4587,7 +4196,7 @@
         <w:jc w:val="left"/>
       </w:pPr>
       <w:rPr>
-        <w:rFonts w:hint="default" w:ascii="BC Sans" w:hAnsi="BC Sans" w:eastAsia="BC Sans" w:cs="BC Sans"/>
+        <w:rFonts w:ascii="BC Sans" w:eastAsia="BC Sans" w:hAnsi="BC Sans" w:cs="BC Sans" w:hint="default"/>
         <w:b w:val="0"/>
         <w:bCs w:val="0"/>
         <w:i w:val="0"/>
@@ -4696,7 +4305,7 @@
   <w:docDefaults>
     <w:rPrDefault>
       <w:rPr>
-        <w:rFonts w:asciiTheme="minorHAnsi" w:hAnsiTheme="minorHAnsi" w:eastAsiaTheme="minorHAnsi" w:cstheme="minorBidi"/>
+        <w:rFonts w:asciiTheme="minorHAnsi" w:eastAsiaTheme="minorHAnsi" w:hAnsiTheme="minorHAnsi" w:cstheme="minorBidi"/>
         <w:sz w:val="22"/>
         <w:szCs w:val="22"/>
         <w:lang w:val="en-US" w:eastAsia="en-US" w:bidi="ar-SA"/>
@@ -4713,14 +4322,14 @@
   <w:latentStyles w:defLockedState="0" w:defUIPriority="99" w:defSemiHidden="0" w:defUnhideWhenUsed="0" w:defQFormat="0" w:count="376">
     <w:lsdException w:name="Normal" w:uiPriority="0" w:qFormat="1"/>
     <w:lsdException w:name="heading 1" w:uiPriority="9" w:qFormat="1"/>
-    <w:lsdException w:name="heading 2" w:uiPriority="9" w:semiHidden="1" w:unhideWhenUsed="1" w:qFormat="1"/>
-    <w:lsdException w:name="heading 3" w:uiPriority="9" w:semiHidden="1" w:unhideWhenUsed="1" w:qFormat="1"/>
-    <w:lsdException w:name="heading 4" w:uiPriority="9" w:semiHidden="1" w:unhideWhenUsed="1" w:qFormat="1"/>
-    <w:lsdException w:name="heading 5" w:uiPriority="9" w:semiHidden="1" w:unhideWhenUsed="1" w:qFormat="1"/>
-    <w:lsdException w:name="heading 6" w:uiPriority="9" w:semiHidden="1" w:unhideWhenUsed="1" w:qFormat="1"/>
-    <w:lsdException w:name="heading 7" w:uiPriority="9" w:semiHidden="1" w:unhideWhenUsed="1" w:qFormat="1"/>
-    <w:lsdException w:name="heading 8" w:uiPriority="9" w:semiHidden="1" w:unhideWhenUsed="1" w:qFormat="1"/>
-    <w:lsdException w:name="heading 9" w:uiPriority="9" w:semiHidden="1" w:unhideWhenUsed="1" w:qFormat="1"/>
+    <w:lsdException w:name="heading 2" w:semiHidden="1" w:uiPriority="9" w:unhideWhenUsed="1" w:qFormat="1"/>
+    <w:lsdException w:name="heading 3" w:semiHidden="1" w:uiPriority="9" w:unhideWhenUsed="1" w:qFormat="1"/>
+    <w:lsdException w:name="heading 4" w:semiHidden="1" w:uiPriority="9" w:unhideWhenUsed="1" w:qFormat="1"/>
+    <w:lsdException w:name="heading 5" w:semiHidden="1" w:uiPriority="9" w:unhideWhenUsed="1" w:qFormat="1"/>
+    <w:lsdException w:name="heading 6" w:semiHidden="1" w:uiPriority="9" w:unhideWhenUsed="1" w:qFormat="1"/>
+    <w:lsdException w:name="heading 7" w:semiHidden="1" w:uiPriority="9" w:unhideWhenUsed="1" w:qFormat="1"/>
+    <w:lsdException w:name="heading 8" w:semiHidden="1" w:uiPriority="9" w:unhideWhenUsed="1" w:qFormat="1"/>
+    <w:lsdException w:name="heading 9" w:semiHidden="1" w:uiPriority="9" w:unhideWhenUsed="1" w:qFormat="1"/>
     <w:lsdException w:name="index 1" w:semiHidden="1" w:unhideWhenUsed="1"/>
     <w:lsdException w:name="index 2" w:semiHidden="1" w:unhideWhenUsed="1"/>
     <w:lsdException w:name="index 3" w:semiHidden="1" w:unhideWhenUsed="1"/>
@@ -4730,22 +4339,22 @@
     <w:lsdException w:name="index 7" w:semiHidden="1" w:unhideWhenUsed="1"/>
     <w:lsdException w:name="index 8" w:semiHidden="1" w:unhideWhenUsed="1"/>
     <w:lsdException w:name="index 9" w:semiHidden="1" w:unhideWhenUsed="1"/>
-    <w:lsdException w:name="toc 1" w:uiPriority="39" w:semiHidden="1" w:unhideWhenUsed="1"/>
-    <w:lsdException w:name="toc 2" w:uiPriority="39" w:semiHidden="1" w:unhideWhenUsed="1"/>
-    <w:lsdException w:name="toc 3" w:uiPriority="39" w:semiHidden="1" w:unhideWhenUsed="1"/>
-    <w:lsdException w:name="toc 4" w:uiPriority="39" w:semiHidden="1" w:unhideWhenUsed="1"/>
-    <w:lsdException w:name="toc 5" w:uiPriority="39" w:semiHidden="1" w:unhideWhenUsed="1"/>
-    <w:lsdException w:name="toc 6" w:uiPriority="39" w:semiHidden="1" w:unhideWhenUsed="1"/>
-    <w:lsdException w:name="toc 7" w:uiPriority="39" w:semiHidden="1" w:unhideWhenUsed="1"/>
-    <w:lsdException w:name="toc 8" w:uiPriority="39" w:semiHidden="1" w:unhideWhenUsed="1"/>
-    <w:lsdException w:name="toc 9" w:uiPriority="39" w:semiHidden="1" w:unhideWhenUsed="1"/>
+    <w:lsdException w:name="toc 1" w:semiHidden="1" w:uiPriority="39" w:unhideWhenUsed="1"/>
+    <w:lsdException w:name="toc 2" w:semiHidden="1" w:uiPriority="39" w:unhideWhenUsed="1"/>
+    <w:lsdException w:name="toc 3" w:semiHidden="1" w:uiPriority="39" w:unhideWhenUsed="1"/>
+    <w:lsdException w:name="toc 4" w:semiHidden="1" w:uiPriority="39" w:unhideWhenUsed="1"/>
+    <w:lsdException w:name="toc 5" w:semiHidden="1" w:uiPriority="39" w:unhideWhenUsed="1"/>
+    <w:lsdException w:name="toc 6" w:semiHidden="1" w:uiPriority="39" w:unhideWhenUsed="1"/>
+    <w:lsdException w:name="toc 7" w:semiHidden="1" w:uiPriority="39" w:unhideWhenUsed="1"/>
+    <w:lsdException w:name="toc 8" w:semiHidden="1" w:uiPriority="39" w:unhideWhenUsed="1"/>
+    <w:lsdException w:name="toc 9" w:semiHidden="1" w:uiPriority="39" w:unhideWhenUsed="1"/>
     <w:lsdException w:name="Normal Indent" w:semiHidden="1" w:unhideWhenUsed="1"/>
     <w:lsdException w:name="footnote text" w:semiHidden="1" w:unhideWhenUsed="1"/>
     <w:lsdException w:name="annotation text" w:semiHidden="1" w:unhideWhenUsed="1"/>
     <w:lsdException w:name="header" w:semiHidden="1" w:unhideWhenUsed="1"/>
     <w:lsdException w:name="footer" w:semiHidden="1" w:unhideWhenUsed="1"/>
     <w:lsdException w:name="index heading" w:semiHidden="1" w:unhideWhenUsed="1"/>
-    <w:lsdException w:name="caption" w:uiPriority="35" w:semiHidden="1" w:unhideWhenUsed="1" w:qFormat="1"/>
+    <w:lsdException w:name="caption" w:semiHidden="1" w:uiPriority="35" w:unhideWhenUsed="1" w:qFormat="1"/>
     <w:lsdException w:name="table of figures" w:semiHidden="1" w:unhideWhenUsed="1"/>
     <w:lsdException w:name="envelope address" w:semiHidden="1" w:unhideWhenUsed="1"/>
     <w:lsdException w:name="envelope return" w:semiHidden="1" w:unhideWhenUsed="1"/>
@@ -4776,7 +4385,7 @@
     <w:lsdException w:name="Title" w:uiPriority="10" w:qFormat="1"/>
     <w:lsdException w:name="Closing" w:semiHidden="1" w:unhideWhenUsed="1"/>
     <w:lsdException w:name="Signature" w:semiHidden="1" w:unhideWhenUsed="1"/>
-    <w:lsdException w:name="Default Paragraph Font" w:uiPriority="1" w:semiHidden="1" w:unhideWhenUsed="1"/>
+    <w:lsdException w:name="Default Paragraph Font" w:semiHidden="1" w:uiPriority="1" w:unhideWhenUsed="1"/>
     <w:lsdException w:name="Body Text" w:semiHidden="1" w:unhideWhenUsed="1"/>
     <w:lsdException w:name="Body Text Indent" w:semiHidden="1" w:unhideWhenUsed="1"/>
     <w:lsdException w:name="List Continue" w:semiHidden="1" w:unhideWhenUsed="1"/>
@@ -4976,8 +4585,8 @@
     <w:lsdException w:name="Subtle Reference" w:uiPriority="31" w:qFormat="1"/>
     <w:lsdException w:name="Intense Reference" w:uiPriority="32" w:qFormat="1"/>
     <w:lsdException w:name="Book Title" w:uiPriority="33" w:qFormat="1"/>
-    <w:lsdException w:name="Bibliography" w:uiPriority="37" w:semiHidden="1" w:unhideWhenUsed="1"/>
-    <w:lsdException w:name="TOC Heading" w:uiPriority="39" w:semiHidden="1" w:unhideWhenUsed="1" w:qFormat="1"/>
+    <w:lsdException w:name="Bibliography" w:semiHidden="1" w:uiPriority="37" w:unhideWhenUsed="1"/>
+    <w:lsdException w:name="TOC Heading" w:semiHidden="1" w:uiPriority="39" w:unhideWhenUsed="1" w:qFormat="1"/>
     <w:lsdException w:name="Plain Table 1" w:uiPriority="41"/>
     <w:lsdException w:name="Plain Table 2" w:uiPriority="42"/>
     <w:lsdException w:name="Plain Table 3" w:uiPriority="43"/>
@@ -5088,11 +4697,11 @@
     <w:lsdException w:name="Unresolved Mention" w:semiHidden="1" w:unhideWhenUsed="1"/>
     <w:lsdException w:name="Smart Link" w:semiHidden="1" w:unhideWhenUsed="1"/>
   </w:latentStyles>
-  <w:style w:type="paragraph" w:styleId="Normal" w:default="1">
+  <w:style w:type="paragraph" w:default="1" w:styleId="Normal">
     <w:name w:val="Normal"/>
     <w:qFormat/>
     <w:rPr>
-      <w:rFonts w:ascii="BC Sans" w:hAnsi="BC Sans" w:eastAsia="BC Sans" w:cs="BC Sans"/>
+      <w:rFonts w:ascii="BC Sans" w:eastAsia="BC Sans" w:hAnsi="BC Sans" w:cs="BC Sans"/>
     </w:rPr>
   </w:style>
   <w:style w:type="paragraph" w:styleId="Heading1">
@@ -5160,13 +4769,13 @@
       <w:szCs w:val="21"/>
     </w:rPr>
   </w:style>
-  <w:style w:type="character" w:styleId="DefaultParagraphFont" w:default="1">
+  <w:style w:type="character" w:default="1" w:styleId="DefaultParagraphFont">
     <w:name w:val="Default Paragraph Font"/>
     <w:uiPriority w:val="1"/>
     <w:semiHidden/>
     <w:unhideWhenUsed/>
   </w:style>
-  <w:style w:type="table" w:styleId="TableNormal" w:default="1">
+  <w:style w:type="table" w:default="1" w:styleId="TableNormal">
     <w:name w:val="Normal Table"/>
     <w:uiPriority w:val="99"/>
     <w:semiHidden/>
@@ -5181,7 +4790,7 @@
       </w:tblCellMar>
     </w:tblPr>
   </w:style>
-  <w:style w:type="numbering" w:styleId="NoList" w:default="1">
+  <w:style w:type="numbering" w:default="1" w:styleId="NoList">
     <w:name w:val="No List"/>
     <w:uiPriority w:val="99"/>
     <w:semiHidden/>
@@ -5207,7 +4816,7 @@
       <w:ind w:left="888" w:hanging="300"/>
     </w:pPr>
   </w:style>
-  <w:style w:type="paragraph" w:styleId="TableParagraph" w:customStyle="1">
+  <w:style w:type="paragraph" w:customStyle="1" w:styleId="TableParagraph">
     <w:name w:val="Table Paragraph"/>
     <w:basedOn w:val="Normal"/>
     <w:uiPriority w:val="1"/>
@@ -5227,14 +4836,14 @@
       </w:tabs>
     </w:pPr>
   </w:style>
-  <w:style w:type="character" w:styleId="HeaderChar" w:customStyle="1">
+  <w:style w:type="character" w:customStyle="1" w:styleId="HeaderChar">
     <w:name w:val="Header Char"/>
     <w:basedOn w:val="DefaultParagraphFont"/>
     <w:link w:val="Header"/>
     <w:uiPriority w:val="99"/>
     <w:rsid w:val="00A0192E"/>
     <w:rPr>
-      <w:rFonts w:ascii="BC Sans" w:hAnsi="BC Sans" w:eastAsia="BC Sans" w:cs="BC Sans"/>
+      <w:rFonts w:ascii="BC Sans" w:eastAsia="BC Sans" w:hAnsi="BC Sans" w:cs="BC Sans"/>
     </w:rPr>
   </w:style>
   <w:style w:type="paragraph" w:styleId="Footer">
@@ -5251,14 +4860,14 @@
       </w:tabs>
     </w:pPr>
   </w:style>
-  <w:style w:type="character" w:styleId="FooterChar" w:customStyle="1">
+  <w:style w:type="character" w:customStyle="1" w:styleId="FooterChar">
     <w:name w:val="Footer Char"/>
     <w:basedOn w:val="DefaultParagraphFont"/>
     <w:link w:val="Footer"/>
     <w:uiPriority w:val="99"/>
     <w:rsid w:val="00A0192E"/>
     <w:rPr>
-      <w:rFonts w:ascii="BC Sans" w:hAnsi="BC Sans" w:eastAsia="BC Sans" w:cs="BC Sans"/>
+      <w:rFonts w:ascii="BC Sans" w:eastAsia="BC Sans" w:hAnsi="BC Sans" w:cs="BC Sans"/>
     </w:rPr>
   </w:style>
 </w:styles>
@@ -5548,12 +5157,6 @@
 </file>
 
 <file path=customXml/item1.xml><?xml version="1.0" encoding="utf-8"?>
-<p:properties xmlns:p="http://schemas.microsoft.com/office/2006/metadata/properties" xmlns:xsi="http://www.w3.org/2001/XMLSchema-instance" xmlns:pc="http://schemas.microsoft.com/office/infopath/2007/PartnerControls">
-  <documentManagement/>
-</p:properties>
-</file>
-
-<file path=customXml/item2.xml><?xml version="1.0" encoding="utf-8"?>
 <?mso-contentType ?>
 <FormTemplates xmlns="http://schemas.microsoft.com/sharepoint/v3/contenttype/forms">
   <Display>DocumentLibraryForm</Display>
@@ -5562,7 +5165,7 @@
 </FormTemplates>
 </file>
 
-<file path=customXml/item3.xml><?xml version="1.0" encoding="utf-8"?>
+<file path=customXml/item2.xml><?xml version="1.0" encoding="utf-8"?>
 <ct:contentTypeSchema xmlns:ct="http://schemas.microsoft.com/office/2006/metadata/contentType" xmlns:ma="http://schemas.microsoft.com/office/2006/metadata/properties/metaAttributes" ct:_="" ma:_="" ma:contentTypeName="Document" ma:contentTypeID="0x010100509BE9200A38E64D9D18C153BE6F8B4F" ma:contentTypeVersion="3" ma:contentTypeDescription="Create a new document." ma:contentTypeScope="" ma:versionID="f98e03e7cfcf3df5a098c23cb7aa5017">
   <xsd:schema xmlns:xsd="http://www.w3.org/2001/XMLSchema" xmlns:xs="http://www.w3.org/2001/XMLSchema" xmlns:p="http://schemas.microsoft.com/office/2006/metadata/properties" xmlns:ns2="8f7b6709-ac4f-46eb-8fb3-db1e9e84870e" targetNamespace="http://schemas.microsoft.com/office/2006/metadata/properties" ma:root="true" ma:fieldsID="4b9ae4755b89800b76703b35e57b8845" ns2:_="">
     <xsd:import namespace="8f7b6709-ac4f-46eb-8fb3-db1e9e84870e"/>
@@ -5700,16 +5303,13 @@
 </ct:contentTypeSchema>
 </file>
 
-<file path=customXml/itemProps1.xml><?xml version="1.0" encoding="utf-8"?>
-<ds:datastoreItem xmlns:ds="http://schemas.openxmlformats.org/officeDocument/2006/customXml" ds:itemID="{FB28D713-AE56-4600-A1B5-878C5B119E51}">
-  <ds:schemaRefs>
-    <ds:schemaRef ds:uri="http://schemas.microsoft.com/office/2006/metadata/properties"/>
-    <ds:schemaRef ds:uri="http://schemas.microsoft.com/office/infopath/2007/PartnerControls"/>
-  </ds:schemaRefs>
-</ds:datastoreItem>
+<file path=customXml/item3.xml><?xml version="1.0" encoding="utf-8"?>
+<p:properties xmlns:p="http://schemas.microsoft.com/office/2006/metadata/properties" xmlns:xsi="http://www.w3.org/2001/XMLSchema-instance" xmlns:pc="http://schemas.microsoft.com/office/infopath/2007/PartnerControls">
+  <documentManagement/>
+</p:properties>
 </file>
 
-<file path=customXml/itemProps2.xml><?xml version="1.0" encoding="utf-8"?>
+<file path=customXml/itemProps1.xml><?xml version="1.0" encoding="utf-8"?>
 <ds:datastoreItem xmlns:ds="http://schemas.openxmlformats.org/officeDocument/2006/customXml" ds:itemID="{CC456AED-91D3-415B-ACC0-E9510B41E420}">
   <ds:schemaRefs>
     <ds:schemaRef ds:uri="http://schemas.microsoft.com/sharepoint/v3/contenttype/forms"/>
@@ -5717,6 +5317,29 @@
 </ds:datastoreItem>
 </file>
 
+<file path=customXml/itemProps2.xml><?xml version="1.0" encoding="utf-8"?>
+<ds:datastoreItem xmlns:ds="http://schemas.openxmlformats.org/officeDocument/2006/customXml" ds:itemID="{F31AED45-8785-46FC-8033-C7ADF9FCDC31}">
+  <ds:schemaRefs>
+    <ds:schemaRef ds:uri="http://schemas.microsoft.com/office/2006/metadata/contentType"/>
+    <ds:schemaRef ds:uri="http://schemas.microsoft.com/office/2006/metadata/properties/metaAttributes"/>
+    <ds:schemaRef ds:uri="http://www.w3.org/2001/XMLSchema"/>
+    <ds:schemaRef ds:uri="http://schemas.microsoft.com/office/2006/metadata/properties"/>
+    <ds:schemaRef ds:uri="8f7b6709-ac4f-46eb-8fb3-db1e9e84870e"/>
+    <ds:schemaRef ds:uri="http://schemas.microsoft.com/office/2006/documentManagement/types"/>
+    <ds:schemaRef ds:uri="http://schemas.microsoft.com/office/infopath/2007/PartnerControls"/>
+    <ds:schemaRef ds:uri="http://schemas.openxmlformats.org/package/2006/metadata/core-properties"/>
+    <ds:schemaRef ds:uri="http://purl.org/dc/elements/1.1/"/>
+    <ds:schemaRef ds:uri="http://purl.org/dc/terms/"/>
+    <ds:schemaRef ds:uri="http://schemas.microsoft.com/internal/obd"/>
+  </ds:schemaRefs>
+</ds:datastoreItem>
+</file>
+
 <file path=customXml/itemProps3.xml><?xml version="1.0" encoding="utf-8"?>
-<ds:datastoreItem xmlns:ds="http://schemas.openxmlformats.org/officeDocument/2006/customXml" ds:itemID="{F31AED45-8785-46FC-8033-C7ADF9FCDC31}"/>
+<ds:datastoreItem xmlns:ds="http://schemas.openxmlformats.org/officeDocument/2006/customXml" ds:itemID="{FB28D713-AE56-4600-A1B5-878C5B119E51}">
+  <ds:schemaRefs>
+    <ds:schemaRef ds:uri="http://schemas.microsoft.com/office/2006/metadata/properties"/>
+    <ds:schemaRef ds:uri="http://schemas.microsoft.com/office/infopath/2007/PartnerControls"/>
+  </ds:schemaRefs>
+</ds:datastoreItem>
 </file>
</xml_diff>

<commit_message>
REPGRANT-625: Fix address region enrichment + template update (#125)
* REPGRANT-625: Fix address region enrichment + template update

* fix duplications
</commit_message>
<xml_diff>
--- a/api/Templates/P1.docx
+++ b/api/Templates/P1.docx
@@ -1,6 +1,6 @@
 
 <file path=word/document.xml><?xml version="1.0" encoding="utf-8"?>
-<w:document xmlns:wpc="http://schemas.microsoft.com/office/word/2010/wordprocessingCanvas" xmlns:cx="http://schemas.microsoft.com/office/drawing/2014/chartex" xmlns:cx1="http://schemas.microsoft.com/office/drawing/2015/9/8/chartex" xmlns:cx2="http://schemas.microsoft.com/office/drawing/2015/10/21/chartex" xmlns:cx3="http://schemas.microsoft.com/office/drawing/2016/5/9/chartex" xmlns:cx4="http://schemas.microsoft.com/office/drawing/2016/5/10/chartex" xmlns:cx5="http://schemas.microsoft.com/office/drawing/2016/5/11/chartex" xmlns:cx6="http://schemas.microsoft.com/office/drawing/2016/5/12/chartex" xmlns:cx7="http://schemas.microsoft.com/office/drawing/2016/5/13/chartex" xmlns:cx8="http://schemas.microsoft.com/office/drawing/2016/5/14/chartex" xmlns:mc="http://schemas.openxmlformats.org/markup-compatibility/2006" xmlns:aink="http://schemas.microsoft.com/office/drawing/2016/ink" xmlns:am3d="http://schemas.microsoft.com/office/drawing/2017/model3d" xmlns:o="urn:schemas-microsoft-com:office:office" xmlns:oel="http://schemas.microsoft.com/office/2019/extlst" xmlns:r="http://schemas.openxmlformats.org/officeDocument/2006/relationships" xmlns:m="http://schemas.openxmlformats.org/officeDocument/2006/math" xmlns:v="urn:schemas-microsoft-com:vml" xmlns:wp14="http://schemas.microsoft.com/office/word/2010/wordprocessingDrawing" xmlns:wp="http://schemas.openxmlformats.org/drawingml/2006/wordprocessingDrawing" xmlns:w10="urn:schemas-microsoft-com:office:word" xmlns:w="http://schemas.openxmlformats.org/wordprocessingml/2006/main" xmlns:w14="http://schemas.microsoft.com/office/word/2010/wordml" xmlns:w15="http://schemas.microsoft.com/office/word/2012/wordml" xmlns:w16cex="http://schemas.microsoft.com/office/word/2018/wordml/cex" xmlns:w16cid="http://schemas.microsoft.com/office/word/2016/wordml/cid" xmlns:w16="http://schemas.microsoft.com/office/word/2018/wordml" xmlns:w16du="http://schemas.microsoft.com/office/word/2023/wordml/word16du" xmlns:w16sdtdh="http://schemas.microsoft.com/office/word/2020/wordml/sdtdatahash" xmlns:w16sdtfl="http://schemas.microsoft.com/office/word/2024/wordml/sdtformatlock" xmlns:w16se="http://schemas.microsoft.com/office/word/2015/wordml/symex" xmlns:wpg="http://schemas.microsoft.com/office/word/2010/wordprocessingGroup" xmlns:wpi="http://schemas.microsoft.com/office/word/2010/wordprocessingInk" xmlns:wne="http://schemas.microsoft.com/office/word/2006/wordml" xmlns:wps="http://schemas.microsoft.com/office/word/2010/wordprocessingShape" mc:Ignorable="w14 w15 w16se w16cid w16 w16cex w16sdtdh w16sdtfl w16du wp14">
+<w:document xmlns:wpc="http://schemas.microsoft.com/office/word/2010/wordprocessingCanvas" xmlns:cx="http://schemas.microsoft.com/office/drawing/2014/chartex" xmlns:cx1="http://schemas.microsoft.com/office/drawing/2015/9/8/chartex" xmlns:cx2="http://schemas.microsoft.com/office/drawing/2015/10/21/chartex" xmlns:cx3="http://schemas.microsoft.com/office/drawing/2016/5/9/chartex" xmlns:cx4="http://schemas.microsoft.com/office/drawing/2016/5/10/chartex" xmlns:cx5="http://schemas.microsoft.com/office/drawing/2016/5/11/chartex" xmlns:cx6="http://schemas.microsoft.com/office/drawing/2016/5/12/chartex" xmlns:cx7="http://schemas.microsoft.com/office/drawing/2016/5/13/chartex" xmlns:cx8="http://schemas.microsoft.com/office/drawing/2016/5/14/chartex" xmlns:mc="http://schemas.openxmlformats.org/markup-compatibility/2006" xmlns:aink="http://schemas.microsoft.com/office/drawing/2016/ink" xmlns:am3d="http://schemas.microsoft.com/office/drawing/2017/model3d" xmlns:o="urn:schemas-microsoft-com:office:office" xmlns:oel="http://schemas.microsoft.com/office/2019/extlst" xmlns:r="http://schemas.openxmlformats.org/officeDocument/2006/relationships" xmlns:m="http://schemas.openxmlformats.org/officeDocument/2006/math" xmlns:v="urn:schemas-microsoft-com:vml" xmlns:wp14="http://schemas.microsoft.com/office/word/2010/wordprocessingDrawing" xmlns:wp="http://schemas.openxmlformats.org/drawingml/2006/wordprocessingDrawing" xmlns:w10="urn:schemas-microsoft-com:office:word" xmlns:w="http://schemas.openxmlformats.org/wordprocessingml/2006/main" xmlns:w14="http://schemas.microsoft.com/office/word/2010/wordml" xmlns:w15="http://schemas.microsoft.com/office/word/2012/wordml" xmlns:w16cei="http://schemas.microsoft.com/office/word/2026/wordml/cei" xmlns:w16cex="http://schemas.microsoft.com/office/word/2018/wordml/cex" xmlns:w16cid="http://schemas.microsoft.com/office/word/2016/wordml/cid" xmlns:w16="http://schemas.microsoft.com/office/word/2018/wordml" xmlns:w16du="http://schemas.microsoft.com/office/word/2023/wordml/word16du" xmlns:w16sdtdh="http://schemas.microsoft.com/office/word/2020/wordml/sdtdatahash" xmlns:w16sdtfl="http://schemas.microsoft.com/office/word/2024/wordml/sdtformatlock" xmlns:w16se="http://schemas.microsoft.com/office/word/2015/wordml/symex" xmlns:wpg="http://schemas.microsoft.com/office/word/2010/wordprocessingGroup" xmlns:wpi="http://schemas.microsoft.com/office/word/2010/wordprocessingInk" xmlns:wne="http://schemas.microsoft.com/office/word/2006/wordml" xmlns:wps="http://schemas.microsoft.com/office/word/2010/wordprocessingShape" mc:Ignorable="w14 w15 w16se w16cid w16 w16cex w16sdtdh w16sdtfl w16du wp14">
   <w:body>
     <w:p>
       <w:pPr>
@@ -14,8 +14,8 @@
       </w:pPr>
       <w:r>
         <w:rPr>
-          <w:b w:val="1"/>
-          <w:bCs w:val="1"/>
+          <w:b/>
+          <w:bCs/>
           <w:color w:val="313131"/>
           <w:sz w:val="21"/>
           <w:szCs w:val="21"/>
@@ -24,8 +24,8 @@
       </w:r>
       <w:r>
         <w:rPr>
-          <w:b w:val="1"/>
-          <w:bCs w:val="1"/>
+          <w:b/>
+          <w:bCs/>
           <w:color w:val="313131"/>
           <w:spacing w:val="-1"/>
           <w:sz w:val="21"/>
@@ -39,7 +39,7 @@
           <w:sz w:val="21"/>
           <w:szCs w:val="21"/>
         </w:rPr>
-        <w:t xml:space="preserve">(RULE 25-2 (3</w:t>
+        <w:t>(RULE 25-2 (3</w:t>
       </w:r>
       <w:r>
         <w:rPr>
@@ -47,7 +47,7 @@
           <w:sz w:val="21"/>
           <w:szCs w:val="21"/>
         </w:rPr>
-        <w:t xml:space="preserve">)</w:t>
+        <w:t>)</w:t>
       </w:r>
       <w:r>
         <w:rPr>
@@ -272,32 +272,31 @@
       </w:r>
       <w:r>
         <w:rPr>
-          <w:b w:val="1"/>
-          <w:bCs w:val="1"/>
-          <w:u w:val="none"/>
-        </w:rPr>
-        <w:t xml:space="preserve">{</w:t>
-      </w:r>
-      <w:r>
-        <w:rPr>
-          <w:b w:val="1"/>
-          <w:bCs w:val="1"/>
-          <w:u w:val="none"/>
-        </w:rPr>
-        <w:t xml:space="preserve">d.applicant.applicantName</w:t>
-      </w:r>
-      <w:r>
-        <w:rPr>
-          <w:b w:val="1"/>
-          <w:bCs w:val="1"/>
-          <w:u w:val="none"/>
-        </w:rPr>
-        <w:t xml:space="preserve">}</w:t>
-      </w:r>
-      <w:r>
-        <w:rPr>
-          <w:b w:val="1"/>
-          <w:bCs w:val="1"/>
+          <w:b/>
+          <w:bCs/>
+        </w:rPr>
+        <w:t>{</w:t>
+      </w:r>
+      <w:proofErr w:type="gramStart"/>
+      <w:r>
+        <w:rPr>
+          <w:b/>
+          <w:bCs/>
+        </w:rPr>
+        <w:t>d.applicant</w:t>
+      </w:r>
+      <w:proofErr w:type="gramEnd"/>
+      <w:r>
+        <w:rPr>
+          <w:b/>
+          <w:bCs/>
+        </w:rPr>
+        <w:t>.applicantName}</w:t>
+      </w:r>
+      <w:r>
+        <w:rPr>
+          <w:b/>
+          <w:bCs/>
           <w:spacing w:val="-10"/>
         </w:rPr>
         <w:t xml:space="preserve"> </w:t>
@@ -389,40 +388,45 @@
       </w:r>
       <w:r>
         <w:rPr>
-          <w:b w:val="1"/>
-          <w:bCs w:val="1"/>
-          <w:u w:val="none"/>
-        </w:rPr>
-        <w:t xml:space="preserve">{</w:t>
-      </w:r>
-      <w:r>
-        <w:rPr>
-          <w:b w:val="1"/>
-          <w:bCs w:val="1"/>
-          <w:u w:val="none"/>
-        </w:rPr>
-        <w:t xml:space="preserve">d.applicant.applicantCourthouse</w:t>
-      </w:r>
-      <w:r>
-        <w:rPr>
-          <w:b w:val="1"/>
-          <w:bCs w:val="1"/>
-          <w:u w:val="none"/>
-        </w:rPr>
-        <w:t xml:space="preserve">Name</w:t>
-      </w:r>
-      <w:r>
-        <w:rPr>
-          <w:b w:val="1"/>
-          <w:bCs w:val="1"/>
-          <w:u w:val="none"/>
-        </w:rPr>
-        <w:t xml:space="preserve">}</w:t>
-      </w:r>
-      <w:r>
-        <w:rPr>
-          <w:b w:val="1"/>
-          <w:bCs w:val="1"/>
+          <w:b/>
+          <w:bCs/>
+        </w:rPr>
+        <w:t>{</w:t>
+      </w:r>
+      <w:proofErr w:type="gramStart"/>
+      <w:r>
+        <w:rPr>
+          <w:b/>
+          <w:bCs/>
+        </w:rPr>
+        <w:t>d.applicant</w:t>
+      </w:r>
+      <w:proofErr w:type="gramEnd"/>
+      <w:r>
+        <w:rPr>
+          <w:b/>
+          <w:bCs/>
+        </w:rPr>
+        <w:t>.applicantCourthouse</w:t>
+      </w:r>
+      <w:r>
+        <w:rPr>
+          <w:b/>
+          <w:bCs/>
+        </w:rPr>
+        <w:t>Name</w:t>
+      </w:r>
+      <w:r>
+        <w:rPr>
+          <w:b/>
+          <w:bCs/>
+        </w:rPr>
+        <w:t>}</w:t>
+      </w:r>
+      <w:r>
+        <w:rPr>
+          <w:b/>
+          <w:bCs/>
           <w:spacing w:val="-10"/>
         </w:rPr>
         <w:t xml:space="preserve"> </w:t>
@@ -480,23 +484,23 @@
       </w:r>
       <w:r>
         <w:rPr>
-          <w:b w:val="1"/>
-          <w:bCs w:val="1"/>
+          <w:b/>
+          <w:bCs/>
         </w:rPr>
         <w:t>Grant</w:t>
       </w:r>
       <w:r>
         <w:rPr>
-          <w:b w:val="1"/>
-          <w:bCs w:val="1"/>
+          <w:b/>
+          <w:bCs/>
           <w:spacing w:val="-5"/>
         </w:rPr>
         <w:t xml:space="preserve"> </w:t>
       </w:r>
       <w:r>
         <w:rPr>
-          <w:b w:val="1"/>
-          <w:bCs w:val="1"/>
+          <w:b/>
+          <w:bCs/>
         </w:rPr>
         <w:t xml:space="preserve">of Administration Without Will Annexed </w:t>
       </w:r>
@@ -506,7 +510,7 @@
           <w:sz w:val="20"/>
           <w:szCs w:val="20"/>
         </w:rPr>
-        <w:t xml:space="preserve">in relation to the estate of the deceased described below who died on</w:t>
+        <w:t>in relation to the estate of the deceased described below who died on</w:t>
       </w:r>
       <w:r>
         <w:rPr>
@@ -516,22 +520,34 @@
         </w:rPr>
         <w:t xml:space="preserve"> {</w:t>
       </w:r>
+      <w:proofErr w:type="gramStart"/>
       <w:r>
         <w:rPr>
           <w:color w:val="313131"/>
           <w:sz w:val="20"/>
           <w:szCs w:val="20"/>
         </w:rPr>
-        <w:t>d.deceasedDeathDate:formatD</w:t>
-      </w:r>
+        <w:t>d.deceasedDeathDate</w:t>
+      </w:r>
+      <w:proofErr w:type="gramEnd"/>
       <w:r>
         <w:rPr>
           <w:color w:val="313131"/>
           <w:sz w:val="20"/>
           <w:szCs w:val="20"/>
         </w:rPr>
-        <w:t>(</w:t>
-      </w:r>
+        <w:t>:</w:t>
+      </w:r>
+      <w:proofErr w:type="gramStart"/>
+      <w:r>
+        <w:rPr>
+          <w:color w:val="313131"/>
+          <w:sz w:val="20"/>
+          <w:szCs w:val="20"/>
+        </w:rPr>
+        <w:t>formatD(</w:t>
+      </w:r>
+      <w:proofErr w:type="gramEnd"/>
       <w:r>
         <w:rPr>
           <w:color w:val="313131"/>
@@ -581,107 +597,78 @@
       <w:pPr>
         <w:pStyle w:val="Heading3"/>
         <w:rPr>
-          <w:b w:val="1"/>
-          <w:bCs w:val="1"/>
           <w:u w:val="single"/>
           <w:lang w:val="fr-FR"/>
         </w:rPr>
       </w:pPr>
       <w:r>
         <w:rPr>
-          <w:b w:val="1"/>
-          <w:bCs w:val="1"/>
-          <w:u w:val="none"/>
           <w:lang w:val="fr-FR"/>
         </w:rPr>
         <w:t>{</w:t>
       </w:r>
-      <w:r>
-        <w:rPr>
-          <w:b w:val="1"/>
-          <w:bCs w:val="1"/>
-          <w:u w:val="none"/>
+      <w:proofErr w:type="gramStart"/>
+      <w:r>
+        <w:rPr>
           <w:lang w:val="fr-FR"/>
         </w:rPr>
         <w:t>d.firstNameGivenName</w:t>
       </w:r>
-      <w:r>
-        <w:rPr>
-          <w:b w:val="1"/>
-          <w:bCs w:val="1"/>
-          <w:u w:val="none"/>
+      <w:proofErr w:type="gramEnd"/>
+      <w:r>
+        <w:rPr>
           <w:lang w:val="fr-FR"/>
         </w:rPr>
         <w:t>}</w:t>
       </w:r>
       <w:r>
         <w:rPr>
-          <w:b w:val="1"/>
-          <w:bCs w:val="1"/>
-          <w:u w:val="none"/>
           <w:lang w:val="fr-FR"/>
         </w:rPr>
         <w:t xml:space="preserve"> </w:t>
       </w:r>
       <w:r>
         <w:rPr>
-          <w:b w:val="1"/>
-          <w:bCs w:val="1"/>
-          <w:u w:val="none"/>
           <w:lang w:val="fr-FR"/>
         </w:rPr>
         <w:t>{</w:t>
       </w:r>
-      <w:r>
-        <w:rPr>
-          <w:b w:val="1"/>
-          <w:bCs w:val="1"/>
-          <w:u w:val="none"/>
+      <w:proofErr w:type="gramStart"/>
+      <w:r>
+        <w:rPr>
           <w:lang w:val="fr-FR"/>
         </w:rPr>
         <w:t>d.middleNameS</w:t>
       </w:r>
-      <w:r>
-        <w:rPr>
-          <w:b w:val="1"/>
-          <w:bCs w:val="1"/>
-          <w:u w:val="none"/>
+      <w:proofErr w:type="gramEnd"/>
+      <w:r>
+        <w:rPr>
           <w:lang w:val="fr-FR"/>
         </w:rPr>
         <w:t>}</w:t>
       </w:r>
       <w:r>
         <w:rPr>
-          <w:b w:val="1"/>
-          <w:bCs w:val="1"/>
-          <w:u w:val="none"/>
           <w:lang w:val="fr-FR"/>
         </w:rPr>
         <w:t xml:space="preserve"> </w:t>
       </w:r>
       <w:r>
         <w:rPr>
-          <w:b w:val="1"/>
-          <w:bCs w:val="1"/>
-          <w:u w:val="none"/>
           <w:lang w:val="fr-FR"/>
         </w:rPr>
         <w:t>{</w:t>
       </w:r>
-      <w:r>
-        <w:rPr>
-          <w:b w:val="1"/>
-          <w:bCs w:val="1"/>
-          <w:u w:val="none"/>
+      <w:proofErr w:type="gramStart"/>
+      <w:r>
+        <w:rPr>
           <w:lang w:val="fr-FR"/>
         </w:rPr>
         <w:t>d.lastNameFamilyNameOrSurname</w:t>
       </w:r>
-      <w:r>
-        <w:rPr>
-          <w:b w:val="1"/>
-          <w:bCs w:val="1"/>
-          <w:u w:val="none"/>
+      <w:proofErr w:type="gramEnd"/>
+      <w:r>
+        <w:rPr>
           <w:lang w:val="fr-FR"/>
         </w:rPr>
         <w:t>}</w:t>
@@ -777,211 +764,223 @@
     </w:p>
     <w:p>
       <w:pPr>
-        <w:pStyle w:val="Normal"/>
         <w:spacing w:before="29"/>
         <w:ind w:left="288"/>
         <w:rPr>
-          <w:b w:val="1"/>
-          <w:bCs w:val="1"/>
+          <w:b/>
+          <w:bCs/>
           <w:u w:val="single"/>
-          <w:lang w:val="en-US"/>
         </w:rPr>
       </w:pPr>
       <w:r>
         <w:rPr>
-          <w:b w:val="1"/>
-          <w:bCs w:val="1"/>
-          <w:u w:val="none"/>
+          <w:b/>
+          <w:bCs/>
           <w:lang w:val="fr-FR"/>
         </w:rPr>
         <w:t>{</w:t>
       </w:r>
-      <w:r>
-        <w:rPr>
-          <w:b w:val="1"/>
-          <w:bCs w:val="1"/>
-          <w:u w:val="none"/>
+      <w:proofErr w:type="spellStart"/>
+      <w:proofErr w:type="gramStart"/>
+      <w:r>
+        <w:rPr>
+          <w:b/>
+          <w:bCs/>
           <w:lang w:val="fr-FR"/>
         </w:rPr>
         <w:t>d.deceasedAddressStreet</w:t>
       </w:r>
-      <w:r>
-        <w:rPr>
-          <w:b w:val="1"/>
-          <w:bCs w:val="1"/>
-          <w:u w:val="none"/>
+      <w:proofErr w:type="spellEnd"/>
+      <w:proofErr w:type="gramEnd"/>
+      <w:r>
+        <w:rPr>
+          <w:b/>
+          <w:bCs/>
           <w:lang w:val="fr-FR"/>
         </w:rPr>
         <w:t>}, {</w:t>
       </w:r>
-      <w:r>
-        <w:rPr>
-          <w:b w:val="1"/>
-          <w:bCs w:val="1"/>
-          <w:u w:val="none"/>
+      <w:proofErr w:type="spellStart"/>
+      <w:proofErr w:type="gramStart"/>
+      <w:r>
+        <w:rPr>
+          <w:b/>
+          <w:bCs/>
           <w:lang w:val="fr-FR"/>
         </w:rPr>
         <w:t>d.deceasedAddressCity</w:t>
       </w:r>
-      <w:r>
-        <w:rPr>
-          <w:b w:val="1"/>
-          <w:bCs w:val="1"/>
-          <w:u w:val="none"/>
+      <w:proofErr w:type="spellEnd"/>
+      <w:proofErr w:type="gramEnd"/>
+      <w:r>
+        <w:rPr>
+          <w:b/>
+          <w:bCs/>
           <w:lang w:val="fr-FR"/>
         </w:rPr>
         <w:t>}, {</w:t>
       </w:r>
-      <w:r>
-        <w:rPr>
-          <w:b w:val="1"/>
-          <w:bCs w:val="1"/>
-          <w:u w:val="none"/>
+      <w:proofErr w:type="spellStart"/>
+      <w:proofErr w:type="gramStart"/>
+      <w:r>
+        <w:rPr>
+          <w:b/>
+          <w:bCs/>
           <w:lang w:val="fr-FR"/>
         </w:rPr>
         <w:t>d.deceasedAddressProvince</w:t>
       </w:r>
-      <w:r>
-        <w:rPr>
-          <w:b w:val="1"/>
-          <w:bCs w:val="1"/>
-          <w:u w:val="none"/>
+      <w:proofErr w:type="spellEnd"/>
+      <w:r>
+        <w:rPr>
+          <w:b/>
+          <w:bCs/>
           <w:lang w:val="fr-FR"/>
         </w:rPr>
         <w:t>}</w:t>
       </w:r>
       <w:r>
         <w:rPr>
-          <w:b w:val="1"/>
-          <w:bCs w:val="1"/>
-          <w:u w:val="none"/>
+          <w:b/>
+          <w:bCs/>
           <w:lang w:val="fr-FR"/>
         </w:rPr>
-        <w:t xml:space="preserve"> </w:t>
-      </w:r>
-      <w:r>
-        <w:rPr>
-          <w:b w:val="1"/>
-          <w:bCs w:val="1"/>
-          <w:u w:val="none"/>
+        <w:t>{</w:t>
+      </w:r>
+      <w:proofErr w:type="gramEnd"/>
+      <w:r>
+        <w:rPr>
+          <w:b/>
+          <w:bCs/>
           <w:lang w:val="fr-FR"/>
         </w:rPr>
+        <w:t xml:space="preserve">d. </w:t>
+      </w:r>
+      <w:proofErr w:type="spellStart"/>
+      <w:proofErr w:type="gramStart"/>
+      <w:r>
+        <w:rPr>
+          <w:b/>
+          <w:bCs/>
+          <w:lang w:val="fr-FR"/>
+        </w:rPr>
+        <w:t>deceasedAddressState</w:t>
+      </w:r>
+      <w:proofErr w:type="spellEnd"/>
+      <w:r>
+        <w:rPr>
+          <w:b/>
+          <w:bCs/>
+          <w:lang w:val="fr-FR"/>
+        </w:rPr>
+        <w:t>}</w:t>
+      </w:r>
+      <w:r>
+        <w:rPr>
+          <w:b/>
+          <w:bCs/>
+          <w:lang w:val="fr-FR"/>
+        </w:rPr>
         <w:t>{</w:t>
       </w:r>
-      <w:r>
-        <w:rPr>
-          <w:b w:val="1"/>
-          <w:bCs w:val="1"/>
-          <w:u w:val="none"/>
+      <w:proofErr w:type="spellStart"/>
+      <w:r>
+        <w:rPr>
+          <w:b/>
+          <w:bCs/>
           <w:lang w:val="fr-FR"/>
         </w:rPr>
-        <w:t xml:space="preserve">d. </w:t>
-      </w:r>
-      <w:r>
-        <w:rPr>
-          <w:b w:val="1"/>
-          <w:bCs w:val="1"/>
-          <w:u w:val="none"/>
+        <w:t>d.</w:t>
+      </w:r>
+      <w:r>
+        <w:rPr>
+          <w:b/>
+          <w:bCs/>
           <w:lang w:val="fr-FR"/>
         </w:rPr>
-        <w:t>deceasedAddressState</w:t>
-      </w:r>
-      <w:r>
-        <w:rPr>
-          <w:b w:val="1"/>
-          <w:bCs w:val="1"/>
-          <w:u w:val="none"/>
+        <w:t>deceasedAddressProvinceText</w:t>
+      </w:r>
+      <w:proofErr w:type="spellEnd"/>
+      <w:proofErr w:type="gramEnd"/>
+      <w:r>
+        <w:rPr>
+          <w:b/>
+          <w:bCs/>
           <w:lang w:val="fr-FR"/>
         </w:rPr>
         <w:t>}</w:t>
       </w:r>
       <w:r>
         <w:rPr>
-          <w:b w:val="1"/>
-          <w:bCs w:val="1"/>
-          <w:u w:val="none"/>
+          <w:b/>
+          <w:bCs/>
           <w:lang w:val="fr-FR"/>
         </w:rPr>
         <w:t xml:space="preserve">, </w:t>
       </w:r>
       <w:r>
         <w:rPr>
-          <w:b w:val="1"/>
-          <w:bCs w:val="1"/>
-          <w:u w:val="none"/>
+          <w:b/>
+          <w:bCs/>
           <w:lang w:val="fr-FR"/>
         </w:rPr>
         <w:t>{</w:t>
       </w:r>
-      <w:r>
-        <w:rPr>
-          <w:b w:val="1"/>
-          <w:bCs w:val="1"/>
-          <w:u w:val="none"/>
+      <w:proofErr w:type="spellStart"/>
+      <w:proofErr w:type="gramStart"/>
+      <w:r>
+        <w:rPr>
+          <w:b/>
+          <w:bCs/>
           <w:lang w:val="fr-FR"/>
         </w:rPr>
         <w:t>d.deceasedAddressPostalCode</w:t>
       </w:r>
-      <w:r>
-        <w:rPr>
-          <w:b w:val="1"/>
-          <w:bCs w:val="1"/>
-          <w:u w:val="none"/>
+      <w:proofErr w:type="spellEnd"/>
+      <w:proofErr w:type="gramEnd"/>
+      <w:r>
+        <w:rPr>
+          <w:b/>
+          <w:bCs/>
           <w:lang w:val="fr-FR"/>
         </w:rPr>
         <w:t>}</w:t>
       </w:r>
       <w:r>
         <w:rPr>
-          <w:b w:val="1"/>
-          <w:bCs w:val="1"/>
-          <w:u w:val="none"/>
+          <w:b/>
+          <w:bCs/>
           <w:lang w:val="fr-FR"/>
         </w:rPr>
         <w:t xml:space="preserve"> </w:t>
       </w:r>
       <w:r>
         <w:rPr>
-          <w:b w:val="1"/>
-          <w:bCs w:val="1"/>
-          <w:u w:val="none"/>
-          <w:lang w:val="en-US"/>
+          <w:b/>
+          <w:bCs/>
         </w:rPr>
         <w:t>{</w:t>
       </w:r>
-      <w:r>
-        <w:rPr>
-          <w:b w:val="1"/>
-          <w:bCs w:val="1"/>
-          <w:u w:val="none"/>
-          <w:lang w:val="en-US"/>
+      <w:proofErr w:type="gramStart"/>
+      <w:r>
+        <w:rPr>
+          <w:b/>
+          <w:bCs/>
         </w:rPr>
         <w:t>d.</w:t>
       </w:r>
       <w:r>
         <w:rPr>
-          <w:b w:val="1"/>
-          <w:bCs w:val="1"/>
-          <w:u w:val="none"/>
-          <w:lang w:val="en-US"/>
-        </w:rPr>
-        <w:t>deceasedAddressCo</w:t>
-      </w:r>
-      <w:r>
-        <w:rPr>
-          <w:b w:val="1"/>
-          <w:bCs w:val="1"/>
-          <w:u w:val="none"/>
-          <w:lang w:val="en-US"/>
-        </w:rPr>
-        <w:t>untry</w:t>
-      </w:r>
-      <w:r>
-        <w:rPr>
-          <w:b w:val="1"/>
-          <w:bCs w:val="1"/>
-          <w:u w:val="none"/>
-          <w:lang w:val="en-US"/>
+          <w:b/>
+          <w:bCs/>
+        </w:rPr>
+        <w:t>deceasedAddressCountry</w:t>
+      </w:r>
+      <w:proofErr w:type="gramEnd"/>
+      <w:r>
+        <w:rPr>
+          <w:b/>
+          <w:bCs/>
         </w:rPr>
         <w:t>}</w:t>
       </w:r>
@@ -2169,13 +2168,23 @@
         </w:rPr>
         <w:t xml:space="preserve">the </w:t>
       </w:r>
+      <w:proofErr w:type="gramStart"/>
       <w:r>
         <w:rPr>
           <w:color w:val="313131"/>
           <w:spacing w:val="-2"/>
           <w:sz w:val="20"/>
         </w:rPr>
-        <w:t>estate.</w:t>
+        <w:t>estate</w:t>
+      </w:r>
+      <w:proofErr w:type="gramEnd"/>
+      <w:r>
+        <w:rPr>
+          <w:color w:val="313131"/>
+          <w:spacing w:val="-2"/>
+          <w:sz w:val="20"/>
+        </w:rPr>
+        <w:t>.</w:t>
       </w:r>
     </w:p>
     <w:p>
@@ -2235,7 +2244,23 @@
           <w:color w:val="313131"/>
           <w:sz w:val="20"/>
         </w:rPr>
-        <w:t>An authorization to obtain estate information or a grant may issue to the applicant on any date that is at</w:t>
+        <w:t xml:space="preserve">An authorization to obtain estate information or a grant may </w:t>
+      </w:r>
+      <w:proofErr w:type="gramStart"/>
+      <w:r>
+        <w:rPr>
+          <w:color w:val="313131"/>
+          <w:sz w:val="20"/>
+        </w:rPr>
+        <w:t>issue</w:t>
+      </w:r>
+      <w:proofErr w:type="gramEnd"/>
+      <w:r>
+        <w:rPr>
+          <w:color w:val="313131"/>
+          <w:sz w:val="20"/>
+        </w:rPr>
+        <w:t xml:space="preserve"> to the applicant on any date that is at</w:t>
       </w:r>
       <w:r>
         <w:rPr>
@@ -2579,7 +2604,7 @@
           <w:headerReference w:type="first" r:id="rId14"/>
           <w:footerReference w:type="first" r:id="rId15"/>
           <w:type w:val="continuous"/>
-          <w:pgSz w:w="12240" w:h="15840" w:orient="portrait"/>
+          <w:pgSz w:w="12240" w:h="15840"/>
           <w:pgMar w:top="940" w:right="720" w:bottom="740" w:left="720" w:header="0" w:footer="543" w:gutter="0"/>
           <w:pgNumType w:start="1"/>
           <w:cols w:space="720"/>
@@ -2609,7 +2634,39 @@
           <w:sz w:val="20"/>
         </w:rPr>
         <w:lastRenderedPageBreak/>
-        <w:t>If an authorization to obtain estate information issues to the applicant, the applicant may apply for a grant without further notice.</w:t>
+        <w:t xml:space="preserve">If an authorization </w:t>
+      </w:r>
+      <w:proofErr w:type="gramStart"/>
+      <w:r>
+        <w:rPr>
+          <w:color w:val="313131"/>
+          <w:sz w:val="20"/>
+        </w:rPr>
+        <w:t>to obtain</w:t>
+      </w:r>
+      <w:proofErr w:type="gramEnd"/>
+      <w:r>
+        <w:rPr>
+          <w:color w:val="313131"/>
+          <w:sz w:val="20"/>
+        </w:rPr>
+        <w:t xml:space="preserve"> estate information </w:t>
+      </w:r>
+      <w:proofErr w:type="gramStart"/>
+      <w:r>
+        <w:rPr>
+          <w:color w:val="313131"/>
+          <w:sz w:val="20"/>
+        </w:rPr>
+        <w:t>issues</w:t>
+      </w:r>
+      <w:proofErr w:type="gramEnd"/>
+      <w:r>
+        <w:rPr>
+          <w:color w:val="313131"/>
+          <w:sz w:val="20"/>
+        </w:rPr>
+        <w:t xml:space="preserve"> to the applicant, the applicant may apply for a grant without further notice.</w:t>
       </w:r>
     </w:p>
     <w:p>
@@ -2634,7 +2691,23 @@
           <w:color w:val="313131"/>
           <w:sz w:val="20"/>
         </w:rPr>
-        <w:t>If a grant issues to the applicant, the applicant must provide, to intestate successors of the deceased, an accounting as to how the estate was administered and how the estate assets were distributed.</w:t>
+        <w:t xml:space="preserve">If a grant </w:t>
+      </w:r>
+      <w:proofErr w:type="gramStart"/>
+      <w:r>
+        <w:rPr>
+          <w:color w:val="313131"/>
+          <w:sz w:val="20"/>
+        </w:rPr>
+        <w:t>issues</w:t>
+      </w:r>
+      <w:proofErr w:type="gramEnd"/>
+      <w:r>
+        <w:rPr>
+          <w:color w:val="313131"/>
+          <w:sz w:val="20"/>
+        </w:rPr>
+        <w:t xml:space="preserve"> to the applicant, the applicant must provide, to intestate successors of the deceased, an accounting as to how the estate was administered and how the estate assets were distributed.</w:t>
       </w:r>
     </w:p>
     <w:p>
@@ -2699,9 +2772,8 @@
         <w:spacing w:before="272"/>
         <w:ind w:left="288"/>
         <w:rPr>
-          <w:b w:val="1"/>
-          <w:bCs w:val="1"/>
-          <w:u w:val="none"/>
+          <w:b/>
+          <w:bCs/>
         </w:rPr>
       </w:pPr>
       <w:r>
@@ -2723,627 +2795,442 @@
       </w:r>
       <w:r>
         <w:rPr>
-          <w:b w:val="1"/>
-          <w:bCs w:val="1"/>
-          <w:u w:val="none"/>
-        </w:rPr>
-        <w:t xml:space="preserve">{</w:t>
-      </w:r>
-      <w:r>
-        <w:rPr>
-          <w:b w:val="1"/>
-          <w:bCs w:val="1"/>
-          <w:u w:val="none"/>
-        </w:rPr>
-        <w:t xml:space="preserve">d.applicant.applicantName</w:t>
-      </w:r>
-      <w:r>
-        <w:rPr>
-          <w:b w:val="1"/>
-          <w:bCs w:val="1"/>
-          <w:u w:val="none"/>
-        </w:rPr>
-        <w:t xml:space="preserve">}</w:t>
+          <w:b/>
+          <w:bCs/>
+        </w:rPr>
+        <w:t>{</w:t>
+      </w:r>
+      <w:proofErr w:type="spellStart"/>
+      <w:r>
+        <w:rPr>
+          <w:b/>
+          <w:bCs/>
+        </w:rPr>
+        <w:t>d.applicant.applicantName</w:t>
+      </w:r>
+      <w:proofErr w:type="spellEnd"/>
+      <w:r>
+        <w:rPr>
+          <w:b/>
+          <w:bCs/>
+        </w:rPr>
+        <w:t>}</w:t>
       </w:r>
       <w:r>
         <w:br/>
       </w:r>
       <w:r>
         <w:rPr>
-          <w:b w:val="1"/>
-          <w:bCs w:val="1"/>
-          <w:u w:val="none"/>
+          <w:b/>
+          <w:bCs/>
+        </w:rPr>
+        <w:t>{d.applicant.applicantOrdinaryAddressReceiveMail:ifEQ('yes')</w:t>
+      </w:r>
+      <w:r>
+        <w:rPr>
+          <w:b/>
+          <w:bCs/>
+        </w:rPr>
+        <w:t>:showBegin</w:t>
+      </w:r>
+      <w:r>
+        <w:rPr>
+          <w:b/>
+          <w:bCs/>
+        </w:rPr>
+        <w:t>}</w:t>
+      </w:r>
+      <w:r>
+        <w:br/>
+      </w:r>
+      <w:r>
+        <w:rPr>
+          <w:color w:val="313131"/>
+          <w:sz w:val="20"/>
+          <w:szCs w:val="20"/>
+        </w:rPr>
+        <w:t xml:space="preserve">Mailing address: </w:t>
+      </w:r>
+      <w:r>
+        <w:rPr>
+          <w:b/>
+          <w:bCs/>
         </w:rPr>
         <w:t>{</w:t>
       </w:r>
-      <w:r>
-        <w:rPr>
-          <w:b w:val="1"/>
-          <w:bCs w:val="1"/>
-          <w:u w:val="none"/>
-        </w:rPr>
-        <w:t>d.applicant.</w:t>
-      </w:r>
-      <w:r>
-        <w:rPr>
-          <w:b w:val="1"/>
-          <w:bCs w:val="1"/>
-          <w:u w:val="none"/>
-        </w:rPr>
-        <w:t>applicantOrdinaryAddressReceiveMail</w:t>
-      </w:r>
-      <w:r>
-        <w:rPr>
-          <w:b w:val="1"/>
-          <w:bCs w:val="1"/>
-          <w:u w:val="none"/>
-        </w:rPr>
-        <w:t>:ifEQ</w:t>
-      </w:r>
-      <w:r>
-        <w:rPr>
-          <w:b w:val="1"/>
-          <w:bCs w:val="1"/>
-          <w:u w:val="none"/>
-        </w:rPr>
-        <w:t>('</w:t>
-      </w:r>
-      <w:r>
-        <w:rPr>
-          <w:b w:val="1"/>
-          <w:bCs w:val="1"/>
-          <w:u w:val="none"/>
-        </w:rPr>
-        <w:t>yes'</w:t>
-      </w:r>
-      <w:r>
-        <w:rPr>
-          <w:b w:val="1"/>
-          <w:bCs w:val="1"/>
-          <w:u w:val="none"/>
-        </w:rPr>
-        <w:t>)</w:t>
-      </w:r>
-      <w:r>
-        <w:rPr>
-          <w:b w:val="1"/>
-          <w:bCs w:val="1"/>
-          <w:u w:val="none"/>
-        </w:rPr>
-        <w:t>:</w:t>
-      </w:r>
-      <w:r>
-        <w:rPr>
-          <w:b w:val="1"/>
-          <w:bCs w:val="1"/>
-          <w:u w:val="none"/>
-        </w:rPr>
-        <w:t>showBegin</w:t>
-      </w:r>
-      <w:r>
-        <w:rPr>
-          <w:b w:val="1"/>
-          <w:bCs w:val="1"/>
-          <w:u w:val="none"/>
+      <w:proofErr w:type="spellStart"/>
+      <w:r>
+        <w:rPr>
+          <w:b/>
+          <w:bCs/>
+        </w:rPr>
+        <w:t>d.applicant.applicantOrdinaryAddressStreet</w:t>
+      </w:r>
+      <w:proofErr w:type="spellEnd"/>
+      <w:r>
+        <w:rPr>
+          <w:b/>
+          <w:bCs/>
+        </w:rPr>
+        <w:t>},</w:t>
+      </w:r>
+      <w:r>
+        <w:rPr>
+          <w:b/>
+          <w:bCs/>
+        </w:rPr>
+        <w:t xml:space="preserve"> </w:t>
+      </w:r>
+      <w:r>
+        <w:rPr>
+          <w:b/>
+          <w:bCs/>
+        </w:rPr>
+        <w:t>{</w:t>
+      </w:r>
+      <w:proofErr w:type="spellStart"/>
+      <w:r>
+        <w:rPr>
+          <w:b/>
+          <w:bCs/>
+        </w:rPr>
+        <w:t>d.applicant.applicantOrdinaryAddressCity</w:t>
+      </w:r>
+      <w:proofErr w:type="spellEnd"/>
+      <w:r>
+        <w:rPr>
+          <w:b/>
+          <w:bCs/>
         </w:rPr>
         <w:t>}</w:t>
       </w:r>
       <w:r>
+        <w:rPr>
+          <w:b/>
+          <w:bCs/>
+        </w:rPr>
+        <w:t>,</w:t>
+      </w:r>
+      <w:r>
+        <w:rPr>
+          <w:b/>
+          <w:bCs/>
+        </w:rPr>
+        <w:t xml:space="preserve"> {d.applicant.applicant</w:t>
+      </w:r>
+      <w:r>
+        <w:rPr>
+          <w:b/>
+          <w:bCs/>
+        </w:rPr>
+        <w:t>Ordinary</w:t>
+      </w:r>
+      <w:r>
+        <w:rPr>
+          <w:b/>
+          <w:bCs/>
+        </w:rPr>
+        <w:t>AddressProvince}</w:t>
+      </w:r>
+      <w:r>
+        <w:rPr>
+          <w:b/>
+          <w:bCs/>
+        </w:rPr>
+        <w:t>{d.applicant.applicantOrdinaryAddressState}</w:t>
+      </w:r>
+      <w:r>
+        <w:rPr>
+          <w:b/>
+          <w:bCs/>
+        </w:rPr>
+        <w:t>{d.</w:t>
+      </w:r>
+      <w:r>
+        <w:rPr>
+          <w:b/>
+          <w:bCs/>
+        </w:rPr>
+        <w:t>applicant.</w:t>
+      </w:r>
+      <w:r>
+        <w:rPr>
+          <w:b/>
+          <w:bCs/>
+        </w:rPr>
+        <w:t xml:space="preserve">applicantOrdinaryAddressProvinceText </w:t>
+      </w:r>
+      <w:r>
+        <w:rPr>
+          <w:b/>
+          <w:bCs/>
+        </w:rPr>
+        <w:t>}</w:t>
+      </w:r>
+      <w:r>
+        <w:rPr>
+          <w:b/>
+          <w:bCs/>
+        </w:rPr>
+        <w:t>,</w:t>
+      </w:r>
+      <w:r>
+        <w:rPr>
+          <w:b/>
+          <w:bCs/>
+        </w:rPr>
+        <w:t xml:space="preserve"> {</w:t>
+      </w:r>
+      <w:proofErr w:type="spellStart"/>
+      <w:r>
+        <w:rPr>
+          <w:b/>
+          <w:bCs/>
+        </w:rPr>
+        <w:t>d.applicant.applicant</w:t>
+      </w:r>
+      <w:r>
+        <w:rPr>
+          <w:b/>
+          <w:bCs/>
+        </w:rPr>
+        <w:t>Ordinary</w:t>
+      </w:r>
+      <w:r>
+        <w:rPr>
+          <w:b/>
+          <w:bCs/>
+        </w:rPr>
+        <w:t>AddressPostalCode</w:t>
+      </w:r>
+      <w:proofErr w:type="spellEnd"/>
+      <w:r>
+        <w:rPr>
+          <w:b/>
+          <w:bCs/>
+        </w:rPr>
+        <w:t>}, {d.applicant.applicant</w:t>
+      </w:r>
+      <w:r>
+        <w:rPr>
+          <w:b/>
+          <w:bCs/>
+        </w:rPr>
+        <w:t>Ordinary</w:t>
+      </w:r>
+      <w:r>
+        <w:rPr>
+          <w:b/>
+          <w:bCs/>
+        </w:rPr>
+        <w:t>AddressCountry</w:t>
+      </w:r>
+      <w:r>
+        <w:rPr>
+          <w:b/>
+          <w:bCs/>
+        </w:rPr>
+        <w:t>}</w:t>
+      </w:r>
+      <w:r>
+        <w:rPr>
+          <w:b/>
+          <w:bCs/>
+        </w:rPr>
+        <w:t>{</w:t>
+      </w:r>
+      <w:r>
+        <w:rPr>
+          <w:b/>
+          <w:bCs/>
+        </w:rPr>
+        <w:t>d.applicant.applicantOrdinaryAddressReceiveMail</w:t>
+      </w:r>
+      <w:r>
+        <w:rPr>
+          <w:b/>
+          <w:bCs/>
+        </w:rPr>
+        <w:t>:showEnd</w:t>
+      </w:r>
+      <w:r>
+        <w:rPr>
+          <w:b/>
+          <w:bCs/>
+        </w:rPr>
+        <w:t>}</w:t>
+      </w:r>
+      <w:r>
         <w:br/>
       </w:r>
       <w:r>
         <w:rPr>
-          <w:b w:val="0"/>
-          <w:bCs w:val="0"/>
+          <w:b/>
+          <w:bCs/>
+        </w:rPr>
+        <w:t>{d.applicant.applicantOrdinaryAddressReceiveMail:ifEQ('yes')</w:t>
+      </w:r>
+      <w:r>
+        <w:rPr>
+          <w:b/>
+          <w:bCs/>
+        </w:rPr>
+        <w:t>:hideBegin</w:t>
+      </w:r>
+      <w:r>
+        <w:rPr>
+          <w:b/>
+          <w:bCs/>
+        </w:rPr>
+        <w:t>}</w:t>
+      </w:r>
+      <w:r>
+        <w:br/>
+      </w:r>
+      <w:r>
+        <w:rPr>
           <w:color w:val="313131"/>
           <w:sz w:val="20"/>
           <w:szCs w:val="20"/>
-          <w:u w:val="none"/>
         </w:rPr>
         <w:t xml:space="preserve">Mailing address: </w:t>
       </w:r>
       <w:r>
         <w:rPr>
-          <w:b w:val="1"/>
-          <w:bCs w:val="1"/>
-          <w:u w:val="none"/>
+          <w:b/>
+          <w:bCs/>
         </w:rPr>
         <w:t>{</w:t>
       </w:r>
-      <w:r>
-        <w:rPr>
-          <w:b w:val="1"/>
-          <w:bCs w:val="1"/>
-          <w:u w:val="none"/>
-        </w:rPr>
-        <w:t>d.applicant.applicantOrdinaryAddressStreet</w:t>
-      </w:r>
-      <w:r>
-        <w:rPr>
-          <w:b w:val="1"/>
-          <w:bCs w:val="1"/>
-          <w:u w:val="none"/>
+      <w:proofErr w:type="spellStart"/>
+      <w:r>
+        <w:rPr>
+          <w:b/>
+          <w:bCs/>
+        </w:rPr>
+        <w:t>d.applicant.applicantMailingAddressStreet</w:t>
+      </w:r>
+      <w:proofErr w:type="spellEnd"/>
+      <w:r>
+        <w:rPr>
+          <w:b/>
+          <w:bCs/>
+        </w:rPr>
+        <w:t>}, {</w:t>
+      </w:r>
+      <w:proofErr w:type="spellStart"/>
+      <w:r>
+        <w:rPr>
+          <w:b/>
+          <w:bCs/>
+        </w:rPr>
+        <w:t>d.applicant.applicantMailingAddressCity</w:t>
+      </w:r>
+      <w:proofErr w:type="spellEnd"/>
+      <w:r>
+        <w:rPr>
+          <w:b/>
+          <w:bCs/>
+        </w:rPr>
+        <w:t>}, {d.applicant.applicantMailingAddressProvince}</w:t>
+      </w:r>
+      <w:r>
+        <w:rPr>
+          <w:b/>
+          <w:bCs/>
+        </w:rPr>
+        <w:t>{d.applicant.applicantMailingAddressState}</w:t>
+      </w:r>
+      <w:r>
+        <w:rPr>
+          <w:b/>
+          <w:bCs/>
+        </w:rPr>
+        <w:t>{d</w:t>
+      </w:r>
+      <w:r>
+        <w:rPr>
+          <w:b/>
+          <w:bCs/>
+        </w:rPr>
+        <w:t>.applicant</w:t>
+      </w:r>
+      <w:r>
+        <w:rPr>
+          <w:b/>
+          <w:bCs/>
+        </w:rPr>
+        <w:t>.</w:t>
+      </w:r>
+      <w:r>
+        <w:rPr>
+          <w:b/>
+          <w:bCs/>
+        </w:rPr>
+        <w:t xml:space="preserve">applicantMailingAddressProvinceText </w:t>
+      </w:r>
+      <w:r>
+        <w:rPr>
+          <w:b/>
+          <w:bCs/>
         </w:rPr>
         <w:t>},</w:t>
       </w:r>
       <w:r>
         <w:rPr>
-          <w:b w:val="1"/>
-          <w:bCs w:val="1"/>
-          <w:u w:val="none"/>
-        </w:rPr>
-        <w:t xml:space="preserve"> </w:t>
-      </w:r>
-      <w:r>
-        <w:rPr>
-          <w:b w:val="1"/>
-          <w:bCs w:val="1"/>
-          <w:u w:val="none"/>
+          <w:b/>
+          <w:bCs/>
+        </w:rPr>
+        <w:t xml:space="preserve"> {</w:t>
+      </w:r>
+      <w:proofErr w:type="spellStart"/>
+      <w:r>
+        <w:rPr>
+          <w:b/>
+          <w:bCs/>
+        </w:rPr>
+        <w:t>d.applicant.applicantMailingAddressPostalCode</w:t>
+      </w:r>
+      <w:proofErr w:type="spellEnd"/>
+      <w:r>
+        <w:rPr>
+          <w:b/>
+          <w:bCs/>
+        </w:rPr>
+        <w:t>}, {d.applicant.applicantMailingAddressCountry</w:t>
+      </w:r>
+      <w:r>
+        <w:rPr>
+          <w:b/>
+          <w:bCs/>
+        </w:rPr>
+        <w:t>}</w:t>
+      </w:r>
+      <w:r>
+        <w:rPr>
+          <w:b/>
+          <w:bCs/>
         </w:rPr>
         <w:t>{</w:t>
       </w:r>
       <w:r>
         <w:rPr>
-          <w:b w:val="1"/>
-          <w:bCs w:val="1"/>
-          <w:u w:val="none"/>
-        </w:rPr>
-        <w:t>d.applicant.applicantOrdinaryAddressCity</w:t>
-      </w:r>
-      <w:r>
-        <w:rPr>
-          <w:b w:val="1"/>
-          <w:bCs w:val="1"/>
-          <w:u w:val="none"/>
-        </w:rPr>
-        <w:t>}</w:t>
-      </w:r>
-      <w:r>
-        <w:rPr>
-          <w:b w:val="1"/>
-          <w:bCs w:val="1"/>
-          <w:u w:val="none"/>
-        </w:rPr>
-        <w:t>,</w:t>
-      </w:r>
-      <w:r>
-        <w:rPr>
-          <w:b w:val="1"/>
-          <w:bCs w:val="1"/>
-          <w:u w:val="none"/>
-        </w:rPr>
-        <w:t xml:space="preserve"> {</w:t>
-      </w:r>
-      <w:r>
-        <w:rPr>
-          <w:b w:val="1"/>
-          <w:bCs w:val="1"/>
-          <w:u w:val="none"/>
-        </w:rPr>
-        <w:t>d.applicant.applicant</w:t>
-      </w:r>
-      <w:r>
-        <w:rPr>
-          <w:b w:val="1"/>
-          <w:bCs w:val="1"/>
-          <w:u w:val="none"/>
-        </w:rPr>
-        <w:t>Ordinary</w:t>
-      </w:r>
-      <w:r>
-        <w:rPr>
-          <w:b w:val="1"/>
-          <w:bCs w:val="1"/>
-          <w:u w:val="none"/>
-        </w:rPr>
-        <w:t>AddressProvince</w:t>
-      </w:r>
-      <w:r>
-        <w:rPr>
-          <w:b w:val="1"/>
-          <w:bCs w:val="1"/>
-          <w:u w:val="none"/>
-        </w:rPr>
-        <w:t>}</w:t>
-      </w:r>
-      <w:r>
-        <w:rPr>
-          <w:b w:val="1"/>
-          <w:bCs w:val="1"/>
-          <w:u w:val="none"/>
-        </w:rPr>
-        <w:t>{</w:t>
-      </w:r>
-      <w:r>
-        <w:rPr>
-          <w:b w:val="1"/>
-          <w:bCs w:val="1"/>
-          <w:u w:val="none"/>
-        </w:rPr>
-        <w:t>d.applicant.applicantOrdinaryAddressState</w:t>
-      </w:r>
-      <w:r>
-        <w:rPr>
-          <w:b w:val="1"/>
-          <w:bCs w:val="1"/>
-          <w:u w:val="none"/>
-        </w:rPr>
-        <w:t>}</w:t>
-      </w:r>
-      <w:r>
-        <w:rPr>
-          <w:b w:val="1"/>
-          <w:bCs w:val="1"/>
-          <w:u w:val="none"/>
-        </w:rPr>
-        <w:t>,</w:t>
-      </w:r>
-      <w:r>
-        <w:rPr>
-          <w:b w:val="1"/>
-          <w:bCs w:val="1"/>
-          <w:u w:val="none"/>
-        </w:rPr>
-        <w:t xml:space="preserve"> {</w:t>
-      </w:r>
-      <w:r>
-        <w:rPr>
-          <w:b w:val="1"/>
-          <w:bCs w:val="1"/>
-          <w:u w:val="none"/>
-        </w:rPr>
-        <w:t>d.applicant.applicant</w:t>
-      </w:r>
-      <w:r>
-        <w:rPr>
-          <w:b w:val="1"/>
-          <w:bCs w:val="1"/>
-          <w:u w:val="none"/>
-        </w:rPr>
-        <w:t>Ordinary</w:t>
-      </w:r>
-      <w:r>
-        <w:rPr>
-          <w:b w:val="1"/>
-          <w:bCs w:val="1"/>
-          <w:u w:val="none"/>
-        </w:rPr>
-        <w:t>AddressPostalCode</w:t>
-      </w:r>
-      <w:r>
-        <w:rPr>
-          <w:b w:val="1"/>
-          <w:bCs w:val="1"/>
-          <w:u w:val="none"/>
-        </w:rPr>
-        <w:t>}, {</w:t>
-      </w:r>
-      <w:r>
-        <w:rPr>
-          <w:b w:val="1"/>
-          <w:bCs w:val="1"/>
-          <w:u w:val="none"/>
-        </w:rPr>
-        <w:t>d.applicant.applicant</w:t>
-      </w:r>
-      <w:r>
-        <w:rPr>
-          <w:b w:val="1"/>
-          <w:bCs w:val="1"/>
-          <w:u w:val="none"/>
-        </w:rPr>
-        <w:t>Ordinary</w:t>
-      </w:r>
-      <w:r>
-        <w:rPr>
-          <w:b w:val="1"/>
-          <w:bCs w:val="1"/>
-          <w:u w:val="none"/>
-        </w:rPr>
-        <w:t>AddressCountry</w:t>
-      </w:r>
-      <w:r>
-        <w:rPr>
-          <w:b w:val="1"/>
-          <w:bCs w:val="1"/>
-          <w:u w:val="none"/>
-        </w:rPr>
-        <w:t>}</w:t>
-      </w:r>
-      <w:r>
-        <w:rPr>
-          <w:b w:val="1"/>
-          <w:bCs w:val="1"/>
-          <w:u w:val="none"/>
-        </w:rPr>
-        <w:t>{</w:t>
-      </w:r>
-      <w:r>
-        <w:rPr>
-          <w:b w:val="1"/>
-          <w:bCs w:val="1"/>
-          <w:u w:val="none"/>
-        </w:rPr>
-        <w:t>d.applicant.</w:t>
-      </w:r>
-      <w:r>
-        <w:rPr>
-          <w:b w:val="1"/>
-          <w:bCs w:val="1"/>
-          <w:u w:val="none"/>
-        </w:rPr>
-        <w:t>applicantOrdinaryAddressReceiveMail</w:t>
-      </w:r>
-      <w:r>
-        <w:rPr>
-          <w:b w:val="1"/>
-          <w:bCs w:val="1"/>
-          <w:u w:val="none"/>
-        </w:rPr>
-        <w:t>:showEnd</w:t>
-      </w:r>
-      <w:r>
-        <w:rPr>
-          <w:b w:val="1"/>
-          <w:bCs w:val="1"/>
-          <w:u w:val="none"/>
-        </w:rPr>
-        <w:t>}</w:t>
-      </w:r>
-      <w:r>
-        <w:br/>
-      </w:r>
-      <w:r>
-        <w:rPr>
-          <w:b w:val="1"/>
-          <w:bCs w:val="1"/>
-          <w:u w:val="none"/>
-        </w:rPr>
-        <w:t>{</w:t>
-      </w:r>
-      <w:r>
-        <w:rPr>
-          <w:b w:val="1"/>
-          <w:bCs w:val="1"/>
-          <w:u w:val="none"/>
-        </w:rPr>
-        <w:t>d.applicant.</w:t>
-      </w:r>
-      <w:r>
-        <w:rPr>
-          <w:b w:val="1"/>
-          <w:bCs w:val="1"/>
-          <w:u w:val="none"/>
-        </w:rPr>
-        <w:t>applicantOrdinaryAddressReceiveMail</w:t>
-      </w:r>
-      <w:r>
-        <w:rPr>
-          <w:b w:val="1"/>
-          <w:bCs w:val="1"/>
-          <w:u w:val="none"/>
-        </w:rPr>
-        <w:t>:ifEQ</w:t>
-      </w:r>
-      <w:r>
-        <w:rPr>
-          <w:b w:val="1"/>
-          <w:bCs w:val="1"/>
-          <w:u w:val="none"/>
-        </w:rPr>
-        <w:t>('</w:t>
-      </w:r>
-      <w:r>
-        <w:rPr>
-          <w:b w:val="1"/>
-          <w:bCs w:val="1"/>
-          <w:u w:val="none"/>
-        </w:rPr>
-        <w:t>yes'</w:t>
-      </w:r>
-      <w:r>
-        <w:rPr>
-          <w:b w:val="1"/>
-          <w:bCs w:val="1"/>
-          <w:u w:val="none"/>
-        </w:rPr>
-        <w:t>)</w:t>
-      </w:r>
-      <w:r>
-        <w:rPr>
-          <w:b w:val="1"/>
-          <w:bCs w:val="1"/>
-          <w:u w:val="none"/>
-        </w:rPr>
-        <w:t>:</w:t>
-      </w:r>
-      <w:r>
-        <w:rPr>
-          <w:b w:val="1"/>
-          <w:bCs w:val="1"/>
-          <w:u w:val="none"/>
-        </w:rPr>
-        <w:t>hideBegin</w:t>
-      </w:r>
-      <w:r>
-        <w:rPr>
-          <w:b w:val="1"/>
-          <w:bCs w:val="1"/>
-          <w:u w:val="none"/>
-        </w:rPr>
-        <w:t>}</w:t>
-      </w:r>
-      <w:r>
-        <w:br/>
-      </w:r>
-      <w:r>
-        <w:rPr>
-          <w:b w:val="0"/>
-          <w:bCs w:val="0"/>
-          <w:color w:val="313131"/>
-          <w:sz w:val="20"/>
-          <w:szCs w:val="20"/>
-          <w:u w:val="none"/>
-        </w:rPr>
-        <w:t xml:space="preserve">Mailing address: </w:t>
-      </w:r>
-      <w:r>
-        <w:rPr>
-          <w:b w:val="1"/>
-          <w:bCs w:val="1"/>
-          <w:u w:val="none"/>
-        </w:rPr>
-        <w:t>{</w:t>
-      </w:r>
-      <w:r>
-        <w:rPr>
-          <w:b w:val="1"/>
-          <w:bCs w:val="1"/>
-          <w:u w:val="none"/>
-        </w:rPr>
-        <w:t>d.applicant.applicantMailingAddressStreet</w:t>
-      </w:r>
-      <w:r>
-        <w:rPr>
-          <w:b w:val="1"/>
-          <w:bCs w:val="1"/>
-          <w:u w:val="none"/>
-        </w:rPr>
-        <w:t>}, {</w:t>
-      </w:r>
-      <w:r>
-        <w:rPr>
-          <w:b w:val="1"/>
-          <w:bCs w:val="1"/>
-          <w:u w:val="none"/>
-        </w:rPr>
-        <w:t>d.applicant.applicantMailingAddressCity</w:t>
-      </w:r>
-      <w:r>
-        <w:rPr>
-          <w:b w:val="1"/>
-          <w:bCs w:val="1"/>
-          <w:u w:val="none"/>
-        </w:rPr>
-        <w:t>}, {</w:t>
-      </w:r>
-      <w:r>
-        <w:rPr>
-          <w:b w:val="1"/>
-          <w:bCs w:val="1"/>
-          <w:u w:val="none"/>
-        </w:rPr>
-        <w:t>d.applicant.applicantMailingAddressProvince</w:t>
-      </w:r>
-      <w:r>
-        <w:rPr>
-          <w:b w:val="1"/>
-          <w:bCs w:val="1"/>
-          <w:u w:val="none"/>
-        </w:rPr>
-        <w:t>}</w:t>
-      </w:r>
-      <w:r>
-        <w:rPr>
-          <w:b w:val="1"/>
-          <w:bCs w:val="1"/>
-          <w:u w:val="none"/>
-        </w:rPr>
-        <w:t>{</w:t>
-      </w:r>
-      <w:r>
-        <w:rPr>
-          <w:b w:val="1"/>
-          <w:bCs w:val="1"/>
-          <w:u w:val="none"/>
-        </w:rPr>
-        <w:t>d.applicant.applicantMailingAddressState</w:t>
-      </w:r>
-      <w:r>
-        <w:rPr>
-          <w:b w:val="1"/>
-          <w:bCs w:val="1"/>
-          <w:u w:val="none"/>
-        </w:rPr>
-        <w:t>}</w:t>
-      </w:r>
-      <w:r>
-        <w:rPr>
-          <w:b w:val="1"/>
-          <w:bCs w:val="1"/>
-          <w:u w:val="none"/>
-        </w:rPr>
-        <w:t xml:space="preserve"> {</w:t>
-      </w:r>
-      <w:r>
-        <w:rPr>
-          <w:b w:val="1"/>
-          <w:bCs w:val="1"/>
-          <w:u w:val="none"/>
-        </w:rPr>
-        <w:t>d.applicant.applicantMailingAddressPostalCode</w:t>
-      </w:r>
-      <w:r>
-        <w:rPr>
-          <w:b w:val="1"/>
-          <w:bCs w:val="1"/>
-          <w:u w:val="none"/>
-        </w:rPr>
-        <w:t>}, {</w:t>
-      </w:r>
-      <w:r>
-        <w:rPr>
-          <w:b w:val="1"/>
-          <w:bCs w:val="1"/>
-          <w:u w:val="none"/>
-        </w:rPr>
-        <w:t>d.applicant.applicantMailingAddressCountry</w:t>
-      </w:r>
-      <w:r>
-        <w:rPr>
-          <w:b w:val="1"/>
-          <w:bCs w:val="1"/>
-          <w:u w:val="none"/>
-        </w:rPr>
-        <w:t>}</w:t>
-      </w:r>
-      <w:r>
-        <w:rPr>
-          <w:b w:val="1"/>
-          <w:bCs w:val="1"/>
-          <w:u w:val="none"/>
-        </w:rPr>
-        <w:t>{</w:t>
-      </w:r>
-      <w:r>
-        <w:rPr>
-          <w:b w:val="1"/>
-          <w:bCs w:val="1"/>
-          <w:u w:val="none"/>
-        </w:rPr>
-        <w:t>d.applicant.</w:t>
-      </w:r>
-      <w:r>
-        <w:rPr>
-          <w:b w:val="1"/>
-          <w:bCs w:val="1"/>
-          <w:u w:val="none"/>
-        </w:rPr>
-        <w:t>applicantOrdinaryAddressReceiveMail</w:t>
-      </w:r>
-      <w:r>
-        <w:rPr>
-          <w:b w:val="1"/>
-          <w:bCs w:val="1"/>
-          <w:u w:val="none"/>
+          <w:b/>
+          <w:bCs/>
+        </w:rPr>
+        <w:t>d.applicant.applicantOrdinaryAddressReceiveMail</w:t>
+      </w:r>
+      <w:r>
+        <w:rPr>
+          <w:b/>
+          <w:bCs/>
         </w:rPr>
         <w:t>:hideEnd</w:t>
       </w:r>
       <w:r>
         <w:rPr>
-          <w:b w:val="1"/>
-          <w:bCs w:val="1"/>
-          <w:u w:val="none"/>
+          <w:b/>
+          <w:bCs/>
         </w:rPr>
         <w:t>}</w:t>
       </w:r>
@@ -3356,7 +3243,6 @@
     </w:p>
     <w:p>
       <w:pPr>
-        <w:pStyle w:val="Normal"/>
         <w:spacing w:before="54"/>
         <w:ind w:left="288"/>
         <w:rPr>
@@ -3367,61 +3253,7 @@
         <w:rPr>
           <w:color w:val="313131"/>
         </w:rPr>
-        <w:t>{</w:t>
-      </w:r>
-      <w:r>
-        <w:rPr>
-          <w:color w:val="313131"/>
-        </w:rPr>
-        <w:t>d.isApplicantOrg:ifEQ</w:t>
-      </w:r>
-      <w:r>
-        <w:rPr>
-          <w:color w:val="313131"/>
-        </w:rPr>
-        <w:t>('</w:t>
-      </w:r>
-      <w:r>
-        <w:rPr>
-          <w:color w:val="313131"/>
-        </w:rPr>
-        <w:t>yes'</w:t>
-      </w:r>
-      <w:r>
-        <w:rPr>
-          <w:color w:val="313131"/>
-        </w:rPr>
-        <w:t>):</w:t>
-      </w:r>
-      <w:r>
-        <w:rPr>
-          <w:color w:val="313131"/>
-        </w:rPr>
-        <w:t>showBegin</w:t>
-      </w:r>
-      <w:r>
-        <w:rPr>
-          <w:color w:val="313131"/>
-        </w:rPr>
-        <w:t xml:space="preserve">}This applicant is not an </w:t>
-      </w:r>
-      <w:r>
-        <w:rPr>
-          <w:color w:val="313131"/>
-        </w:rPr>
-        <w:t>individual.{</w:t>
-      </w:r>
-      <w:r>
-        <w:rPr>
-          <w:color w:val="313131"/>
-        </w:rPr>
-        <w:t>d.isApplicantOrg:showEnd</w:t>
-      </w:r>
-      <w:r>
-        <w:rPr>
-          <w:color w:val="313131"/>
-        </w:rPr>
-        <w:t>}</w:t>
+        <w:t>{d.isApplicantOrg:ifEQ('yes'):showBegin}This applicant is not an individual.{d.isApplicantOrg:showEnd}</w:t>
       </w:r>
       <w:r>
         <w:br/>
@@ -3430,115 +3262,13 @@
         <w:rPr>
           <w:color w:val="313131"/>
         </w:rPr>
-        <w:t>{</w:t>
-      </w:r>
-      <w:r>
-        <w:rPr>
-          <w:color w:val="313131"/>
-        </w:rPr>
-        <w:t>d.isApplicantOrg:ifEQ</w:t>
-      </w:r>
-      <w:r>
-        <w:rPr>
-          <w:color w:val="313131"/>
-        </w:rPr>
-        <w:t>('</w:t>
-      </w:r>
-      <w:r>
-        <w:rPr>
-          <w:color w:val="313131"/>
-        </w:rPr>
-        <w:t>yes'</w:t>
-      </w:r>
-      <w:r>
-        <w:rPr>
-          <w:color w:val="313131"/>
-        </w:rPr>
-        <w:t>):</w:t>
-      </w:r>
-      <w:r>
-        <w:rPr>
-          <w:color w:val="313131"/>
-        </w:rPr>
-        <w:t>h</w:t>
-      </w:r>
-      <w:r>
-        <w:rPr>
-          <w:color w:val="313131"/>
-        </w:rPr>
-        <w:t>ideBegin</w:t>
-      </w:r>
-      <w:r>
-        <w:rPr>
-          <w:color w:val="313131"/>
-        </w:rPr>
-        <w:t>}{</w:t>
-      </w:r>
-      <w:r>
-        <w:rPr>
-          <w:color w:val="313131"/>
-        </w:rPr>
-        <w:t>d.applicant.applicantOrdinaryAddressReceiveMail:ifEQ</w:t>
-      </w:r>
-      <w:r>
-        <w:rPr>
-          <w:color w:val="313131"/>
-        </w:rPr>
-        <w:t>('</w:t>
-      </w:r>
-      <w:r>
-        <w:rPr>
-          <w:color w:val="313131"/>
-        </w:rPr>
-        <w:t>yes'</w:t>
-      </w:r>
-      <w:r>
-        <w:rPr>
-          <w:color w:val="313131"/>
-        </w:rPr>
-        <w:t>):</w:t>
-      </w:r>
-      <w:r>
-        <w:rPr>
-          <w:color w:val="313131"/>
-        </w:rPr>
-        <w:t>showBegin</w:t>
-      </w:r>
-      <w:r>
-        <w:rPr>
-          <w:color w:val="313131"/>
-        </w:rPr>
-        <w:t>}</w:t>
-      </w:r>
-      <w:r>
-        <w:rPr>
-          <w:color w:val="313131"/>
-        </w:rPr>
-        <w:t xml:space="preserve">This applicant is an individual and ordinarily lives </w:t>
-      </w:r>
-      <w:r>
-        <w:rPr>
-          <w:color w:val="313131"/>
-        </w:rPr>
-        <w:t xml:space="preserve">at the mailing address noted </w:t>
-      </w:r>
-      <w:r>
-        <w:rPr>
-          <w:color w:val="313131"/>
-        </w:rPr>
-        <w:t>above.{</w:t>
-      </w:r>
-      <w:r>
-        <w:rPr>
-          <w:color w:val="313131"/>
-        </w:rPr>
-        <w:t>d.applicant.applicantOrdinaryAddressReceiveMail:showEnd</w:t>
-      </w:r>
-      <w:r>
-        <w:rPr>
-          <w:color w:val="313131"/>
-        </w:rPr>
-        <w:t>}</w:t>
+        <w:t>{d.isApplicantOrg:ifEQ('yes'):hideBegin}{d.applicant.applicantOrdinaryAddressReceiveMail:ifEQ('yes'):showBegin}</w:t>
+      </w:r>
+      <w:r>
+        <w:rPr>
+          <w:color w:val="313131"/>
+        </w:rPr>
+        <w:t>This applicant is an individual and ordinarily lives at the mailing address noted above.{d.applicant.applicantOrdinaryAddressReceiveMail:showEnd}</w:t>
       </w:r>
       <w:r>
         <w:br/>
@@ -3547,49 +3277,7 @@
         <w:rPr>
           <w:color w:val="313131"/>
         </w:rPr>
-        <w:t>{</w:t>
-      </w:r>
-      <w:r>
-        <w:rPr>
-          <w:color w:val="313131"/>
-        </w:rPr>
-        <w:t>d.applicant.applicantOrdinaryAddressRece</w:t>
-      </w:r>
-      <w:r>
-        <w:rPr>
-          <w:color w:val="313131"/>
-        </w:rPr>
-        <w:t>iveMail:ifEQ</w:t>
-      </w:r>
-      <w:r>
-        <w:rPr>
-          <w:color w:val="313131"/>
-        </w:rPr>
-        <w:t>('</w:t>
-      </w:r>
-      <w:r>
-        <w:rPr>
-          <w:color w:val="313131"/>
-        </w:rPr>
-        <w:t>yes'</w:t>
-      </w:r>
-      <w:r>
-        <w:rPr>
-          <w:color w:val="313131"/>
-        </w:rPr>
-        <w:t>):</w:t>
-      </w:r>
-      <w:r>
-        <w:rPr>
-          <w:color w:val="313131"/>
-        </w:rPr>
-        <w:t>hideBegin</w:t>
-      </w:r>
-      <w:r>
-        <w:rPr>
-          <w:color w:val="313131"/>
-        </w:rPr>
-        <w:t>}</w:t>
+        <w:t>{d.applicant.applicantOrdinaryAddressReceiveMail:ifEQ('yes'):hideBegin}</w:t>
       </w:r>
       <w:r>
         <w:br/>
@@ -3598,61 +3286,7 @@
         <w:rPr>
           <w:color w:val="313131"/>
         </w:rPr>
-        <w:t>This applicant is an individual and lives in the following city and country: {</w:t>
-      </w:r>
-      <w:r>
-        <w:rPr>
-          <w:color w:val="313131"/>
-        </w:rPr>
-        <w:t>d.applicant.applicantOrdinaryAddressCity</w:t>
-      </w:r>
-      <w:r>
-        <w:rPr>
-          <w:color w:val="313131"/>
-        </w:rPr>
-        <w:t>}, {</w:t>
-      </w:r>
-      <w:r>
-        <w:rPr>
-          <w:color w:val="313131"/>
-        </w:rPr>
-        <w:t>d.applicant.applicantOrdinaryAddressCountry</w:t>
-      </w:r>
-      <w:r>
-        <w:rPr>
-          <w:color w:val="313131"/>
-        </w:rPr>
-        <w:t>}</w:t>
-      </w:r>
-      <w:r>
-        <w:rPr>
-          <w:color w:val="313131"/>
-        </w:rPr>
-        <w:t>{</w:t>
-      </w:r>
-      <w:r>
-        <w:rPr>
-          <w:color w:val="313131"/>
-        </w:rPr>
-        <w:t>d.applicant.applicantOrdinaryAddressReceiveMail:hideEnd</w:t>
-      </w:r>
-      <w:r>
-        <w:rPr>
-          <w:color w:val="313131"/>
-        </w:rPr>
-        <w:t>}{</w:t>
-      </w:r>
-      <w:r>
-        <w:rPr>
-          <w:color w:val="313131"/>
-        </w:rPr>
-        <w:t>d.isApplicantOrg:hideEnd</w:t>
-      </w:r>
-      <w:r>
-        <w:rPr>
-          <w:color w:val="313131"/>
-        </w:rPr>
-        <w:t>}</w:t>
+        <w:t>This applicant is an individual and lives in the following city and country: {d.applicant.applicantOrdinaryAddressCity}, {d.applicant.applicantOrdinaryAddressCountry}{d.applicant.applicantOrdinaryAddressReceiveMail:hideEnd}{d.isApplicantOrg:hideEnd}</w:t>
       </w:r>
     </w:p>
     <w:p>
@@ -3703,11 +3337,6 @@
       <w:pPr>
         <w:pStyle w:val="Heading3"/>
         <w:spacing w:before="272"/>
-        <w:rPr>
-          <w:b w:val="1"/>
-          <w:bCs w:val="1"/>
-          <w:u w:val="none"/>
-        </w:rPr>
       </w:pPr>
       <w:r>
         <w:rPr>
@@ -3748,122 +3377,110 @@
           <w:spacing w:val="-3"/>
           <w:sz w:val="20"/>
           <w:szCs w:val="20"/>
-          <w:u w:val="none"/>
-        </w:rPr>
-        <w:t xml:space="preserve"> </w:t>
-      </w:r>
-      <w:r>
-        <w:rPr>
-          <w:u w:val="none"/>
-        </w:rPr>
-        <w:t xml:space="preserve">{</w:t>
-      </w:r>
-      <w:r>
-        <w:rPr>
-          <w:u w:val="none"/>
-        </w:rPr>
-        <w:t xml:space="preserve">d.applicant.applicantServiceAddressStreet</w:t>
-      </w:r>
-      <w:r>
-        <w:rPr>
-          <w:u w:val="none"/>
-        </w:rPr>
-        <w:t xml:space="preserve">}, {</w:t>
-      </w:r>
-      <w:r>
-        <w:rPr>
-          <w:u w:val="none"/>
-        </w:rPr>
-        <w:t xml:space="preserve">d.applicant.applicantServiceAddressCity</w:t>
-      </w:r>
-      <w:r>
-        <w:rPr>
-          <w:u w:val="none"/>
-        </w:rPr>
-        <w:t xml:space="preserve">}, {</w:t>
-      </w:r>
-      <w:r>
-        <w:rPr>
-          <w:u w:val="none"/>
-        </w:rPr>
-        <w:t xml:space="preserve">d.applicant.applicantServiceAddressProvince</w:t>
-      </w:r>
-      <w:r>
-        <w:rPr>
-          <w:u w:val="none"/>
-        </w:rPr>
-        <w:t xml:space="preserve">}</w:t>
-      </w:r>
-      <w:r>
-        <w:rPr>
-          <w:u w:val="none"/>
-        </w:rPr>
-        <w:t xml:space="preserve"> {</w:t>
-      </w:r>
-      <w:r>
-        <w:rPr>
-          <w:u w:val="none"/>
-        </w:rPr>
-        <w:t>d.applicant.applicantServiceAddressState</w:t>
-      </w:r>
-      <w:r>
-        <w:rPr>
-          <w:u w:val="none"/>
-        </w:rPr>
+        </w:rPr>
+        <w:t xml:space="preserve"> </w:t>
+      </w:r>
+      <w:r>
+        <w:t>{</w:t>
+      </w:r>
+      <w:proofErr w:type="spellStart"/>
+      <w:proofErr w:type="gramStart"/>
+      <w:r>
+        <w:t>d.applicant</w:t>
+      </w:r>
+      <w:proofErr w:type="gramEnd"/>
+      <w:r>
+        <w:t>.applicantServiceAddressStreet</w:t>
+      </w:r>
+      <w:proofErr w:type="spellEnd"/>
+      <w:r>
+        <w:t>}, {</w:t>
+      </w:r>
+      <w:proofErr w:type="spellStart"/>
+      <w:proofErr w:type="gramStart"/>
+      <w:r>
+        <w:t>d.applicant</w:t>
+      </w:r>
+      <w:proofErr w:type="gramEnd"/>
+      <w:r>
+        <w:t>.applicantServiceAddressCity</w:t>
+      </w:r>
+      <w:proofErr w:type="spellEnd"/>
+      <w:r>
+        <w:t>}, {</w:t>
+      </w:r>
+      <w:proofErr w:type="gramStart"/>
+      <w:r>
+        <w:t>d.applicant</w:t>
+      </w:r>
+      <w:proofErr w:type="gramEnd"/>
+      <w:r>
+        <w:t>.</w:t>
+      </w:r>
+      <w:proofErr w:type="gramStart"/>
+      <w:r>
+        <w:t>applicantServiceAddressProvince}</w:t>
+      </w:r>
+      <w:r>
+        <w:t>{d.applicant</w:t>
+      </w:r>
+      <w:proofErr w:type="gramEnd"/>
+      <w:r>
+        <w:t>.</w:t>
+      </w:r>
+      <w:proofErr w:type="gramStart"/>
+      <w:r>
+        <w:t>applicantServiceAddressState}</w:t>
+      </w:r>
+      <w:r>
+        <w:t>{d.</w:t>
+      </w:r>
+      <w:r>
+        <w:t>applicant</w:t>
+      </w:r>
+      <w:proofErr w:type="gramEnd"/>
+      <w:r>
+        <w:t>.</w:t>
+      </w:r>
+      <w:r>
+        <w:t>applicantServiceAddressProvinceText</w:t>
+      </w:r>
+      <w:r>
         <w:t>}</w:t>
       </w:r>
       <w:r>
-        <w:rPr>
-          <w:u w:val="none"/>
-        </w:rPr>
         <w:t xml:space="preserve">, </w:t>
       </w:r>
       <w:r>
-        <w:rPr>
-          <w:u w:val="none"/>
-        </w:rPr>
-        <w:t xml:space="preserve">{</w:t>
-      </w:r>
-      <w:r>
-        <w:rPr>
-          <w:u w:val="none"/>
-        </w:rPr>
-        <w:t xml:space="preserve">d.applicant.applicantServiceAddressPostalCode</w:t>
-      </w:r>
-      <w:r>
-        <w:rPr>
-          <w:u w:val="none"/>
-        </w:rPr>
-        <w:t xml:space="preserve">}</w:t>
-      </w:r>
-      <w:r>
-        <w:rPr>
-          <w:u w:val="none"/>
-        </w:rPr>
-        <w:t xml:space="preserve">, </w:t>
-      </w:r>
-      <w:r>
-        <w:rPr>
-          <w:b w:val="1"/>
-          <w:bCs w:val="1"/>
-          <w:u w:val="none"/>
-        </w:rPr>
         <w:t>{</w:t>
       </w:r>
-      <w:r>
-        <w:rPr>
-          <w:b w:val="1"/>
-          <w:bCs w:val="1"/>
-          <w:u w:val="none"/>
-        </w:rPr>
-        <w:t>d.applicant.applicantServiceAddressCountry</w:t>
-      </w:r>
-      <w:r>
-        <w:rPr>
-          <w:b w:val="1"/>
-          <w:bCs w:val="1"/>
-          <w:u w:val="none"/>
-        </w:rPr>
+      <w:proofErr w:type="spellStart"/>
+      <w:proofErr w:type="gramStart"/>
+      <w:r>
+        <w:t>d.applicant</w:t>
+      </w:r>
+      <w:proofErr w:type="gramEnd"/>
+      <w:r>
+        <w:t>.applicantServiceAddressPostalCode</w:t>
+      </w:r>
+      <w:proofErr w:type="spellEnd"/>
+      <w:r>
+        <w:t>}</w:t>
+      </w:r>
+      <w:r>
+        <w:t>, {</w:t>
+      </w:r>
+      <w:proofErr w:type="spellStart"/>
+      <w:proofErr w:type="gramStart"/>
+      <w:r>
+        <w:t>d.applicant</w:t>
+      </w:r>
+      <w:proofErr w:type="gramEnd"/>
+      <w:r>
+        <w:t>.applicantServiceAddressCountry</w:t>
+      </w:r>
+      <w:proofErr w:type="spellEnd"/>
+      <w:r>
         <w:t>}</w:t>
       </w:r>
     </w:p>
@@ -3872,9 +3489,8 @@
         <w:spacing w:before="54"/>
         <w:ind w:left="288"/>
         <w:rPr>
-          <w:b w:val="1"/>
-          <w:bCs w:val="1"/>
-          <w:u w:val="none"/>
+          <w:b/>
+          <w:bCs/>
         </w:rPr>
       </w:pPr>
       <w:r>
@@ -3882,7 +3498,6 @@
           <w:color w:val="313131"/>
           <w:sz w:val="20"/>
           <w:szCs w:val="20"/>
-          <w:u w:val="none"/>
         </w:rPr>
         <w:t>Telephone</w:t>
       </w:r>
@@ -3892,16 +3507,15 @@
           <w:spacing w:val="-8"/>
           <w:sz w:val="20"/>
           <w:szCs w:val="20"/>
-          <w:u w:val="none"/>
-        </w:rPr>
-        <w:t xml:space="preserve"> </w:t>
-      </w:r>
+        </w:rPr>
+        <w:t xml:space="preserve"> </w:t>
+      </w:r>
+      <w:proofErr w:type="gramStart"/>
       <w:r>
         <w:rPr>
           <w:color w:val="313131"/>
           <w:sz w:val="20"/>
           <w:szCs w:val="20"/>
-          <w:u w:val="none"/>
         </w:rPr>
         <w:t>number:</w:t>
       </w:r>
@@ -3911,27 +3525,32 @@
           <w:spacing w:val="-1"/>
           <w:sz w:val="20"/>
           <w:szCs w:val="20"/>
-          <w:u w:val="none"/>
-        </w:rPr>
-        <w:t xml:space="preserve"> </w:t>
-      </w:r>
-      <w:r>
-        <w:rPr>
-          <w:b w:val="1"/>
-          <w:bCs w:val="1"/>
-          <w:u w:val="none"/>
-        </w:rPr>
-        <w:t xml:space="preserve">{d.applicant.applicantServicePhone}</w:t>
+        </w:rPr>
+        <w:t xml:space="preserve"> </w:t>
+      </w:r>
+      <w:r>
+        <w:rPr>
+          <w:b/>
+          <w:bCs/>
+        </w:rPr>
+        <w:t>{d.applicant</w:t>
+      </w:r>
+      <w:proofErr w:type="gramEnd"/>
+      <w:r>
+        <w:rPr>
+          <w:b/>
+          <w:bCs/>
+        </w:rPr>
+        <w:t>.applicantServicePhone}</w:t>
       </w:r>
     </w:p>
     <w:p>
       <w:pPr>
-        <w:pStyle w:val="Normal"/>
         <w:spacing w:before="54"/>
         <w:ind w:left="288"/>
         <w:rPr>
-          <w:b w:val="1"/>
-          <w:bCs w:val="1"/>
+          <w:b/>
+          <w:bCs/>
         </w:rPr>
       </w:pPr>
       <w:r>
@@ -3939,7 +3558,6 @@
           <w:color w:val="313131"/>
           <w:sz w:val="20"/>
           <w:szCs w:val="20"/>
-          <w:u w:val="none"/>
         </w:rPr>
         <w:t>E-mail</w:t>
       </w:r>
@@ -3949,7 +3567,6 @@
           <w:spacing w:val="-3"/>
           <w:sz w:val="20"/>
           <w:szCs w:val="20"/>
-          <w:u w:val="none"/>
         </w:rPr>
         <w:t xml:space="preserve"> </w:t>
       </w:r>
@@ -3958,7 +3575,6 @@
           <w:color w:val="313131"/>
           <w:sz w:val="20"/>
           <w:szCs w:val="20"/>
-          <w:u w:val="none"/>
         </w:rPr>
         <w:t>address:</w:t>
       </w:r>
@@ -3968,106 +3584,221 @@
           <w:spacing w:val="-2"/>
           <w:sz w:val="20"/>
           <w:szCs w:val="20"/>
-          <w:u w:val="none"/>
-        </w:rPr>
-        <w:t xml:space="preserve"> </w:t>
-      </w:r>
-      <w:r>
-        <w:rPr>
-          <w:b w:val="1"/>
-          <w:bCs w:val="1"/>
-          <w:u w:val="none"/>
-        </w:rPr>
-        <w:t xml:space="preserve">{</w:t>
-      </w:r>
-      <w:r>
-        <w:rPr>
-          <w:b w:val="1"/>
-          <w:bCs w:val="1"/>
-          <w:u w:val="none"/>
-        </w:rPr>
-        <w:t xml:space="preserve">d.applicant.applicantServiceEmai</w:t>
-      </w:r>
-      <w:r>
-        <w:rPr>
-          <w:b w:val="1"/>
-          <w:bCs w:val="1"/>
-          <w:u w:val="none"/>
-        </w:rPr>
-        <w:t xml:space="preserve">l</w:t>
-      </w:r>
-      <w:r>
-        <w:rPr>
-          <w:b w:val="1"/>
-          <w:bCs w:val="1"/>
-          <w:u w:val="none"/>
-        </w:rPr>
-        <w:t xml:space="preserve">}</w:t>
+        </w:rPr>
+        <w:t xml:space="preserve"> </w:t>
+      </w:r>
+      <w:r>
+        <w:rPr>
+          <w:b/>
+          <w:bCs/>
+        </w:rPr>
+        <w:t>{</w:t>
+      </w:r>
+      <w:proofErr w:type="gramStart"/>
+      <w:r>
+        <w:rPr>
+          <w:b/>
+          <w:bCs/>
+        </w:rPr>
+        <w:t>d.applicant</w:t>
+      </w:r>
+      <w:proofErr w:type="gramEnd"/>
+      <w:r>
+        <w:rPr>
+          <w:b/>
+          <w:bCs/>
+        </w:rPr>
+        <w:t>.applicantServiceEmai</w:t>
+      </w:r>
+      <w:r>
+        <w:rPr>
+          <w:b/>
+          <w:bCs/>
+        </w:rPr>
+        <w:t>l</w:t>
+      </w:r>
+      <w:r>
+        <w:rPr>
+          <w:b/>
+          <w:bCs/>
+        </w:rPr>
+        <w:t>}</w:t>
       </w:r>
       <w:r>
         <w:br/>
       </w:r>
       <w:r>
         <w:rPr>
-          <w:b w:val="1"/>
-          <w:bCs w:val="1"/>
-          <w:u w:val="none"/>
+          <w:b/>
+          <w:bCs/>
         </w:rPr>
         <w:t>{</w:t>
       </w:r>
-      <w:r>
-        <w:rPr>
-          <w:b w:val="1"/>
-          <w:bCs w:val="1"/>
-          <w:u w:val="none"/>
-        </w:rPr>
-        <w:t>d.applicant.applicantHasFax:ifEQ</w:t>
-      </w:r>
-      <w:r>
-        <w:rPr>
-          <w:b w:val="1"/>
-          <w:bCs w:val="1"/>
-          <w:u w:val="none"/>
-        </w:rPr>
-        <w:t>('</w:t>
-      </w:r>
-      <w:r>
-        <w:rPr>
-          <w:b w:val="1"/>
-          <w:bCs w:val="1"/>
-          <w:u w:val="none"/>
-        </w:rPr>
-        <w:t>yes'</w:t>
-      </w:r>
-      <w:r>
-        <w:rPr>
-          <w:b w:val="1"/>
-          <w:bCs w:val="1"/>
-          <w:u w:val="none"/>
+      <w:proofErr w:type="gramStart"/>
+      <w:r>
+        <w:rPr>
+          <w:b/>
+          <w:bCs/>
+        </w:rPr>
+        <w:t>d.applicant</w:t>
+      </w:r>
+      <w:proofErr w:type="gramEnd"/>
+      <w:r>
+        <w:rPr>
+          <w:b/>
+          <w:bCs/>
+        </w:rPr>
+        <w:t>.</w:t>
+      </w:r>
+      <w:proofErr w:type="gramStart"/>
+      <w:r>
+        <w:rPr>
+          <w:b/>
+          <w:bCs/>
+        </w:rPr>
+        <w:t>applicantHasFax:ifEQ</w:t>
+      </w:r>
+      <w:proofErr w:type="gramEnd"/>
+      <w:r>
+        <w:rPr>
+          <w:b/>
+          <w:bCs/>
+        </w:rPr>
+        <w:t>('yes'</w:t>
+      </w:r>
+      <w:proofErr w:type="gramStart"/>
+      <w:r>
+        <w:rPr>
+          <w:b/>
+          <w:bCs/>
         </w:rPr>
         <w:t>)</w:t>
       </w:r>
       <w:r>
         <w:rPr>
-          <w:b w:val="1"/>
-          <w:bCs w:val="1"/>
-          <w:u w:val="none"/>
+          <w:b/>
+          <w:bCs/>
+        </w:rPr>
+        <w:t>:showBegin</w:t>
+      </w:r>
+      <w:proofErr w:type="gramEnd"/>
+      <w:r>
+        <w:rPr>
+          <w:b/>
+          <w:bCs/>
+        </w:rPr>
+        <w:t>}</w:t>
+      </w:r>
+      <w:r>
+        <w:br/>
+      </w:r>
+      <w:r>
+        <w:rPr>
+          <w:color w:val="313131"/>
+          <w:sz w:val="20"/>
+          <w:szCs w:val="20"/>
+        </w:rPr>
+        <w:t>Fax number</w:t>
+      </w:r>
+      <w:r>
+        <w:rPr>
+          <w:color w:val="313131"/>
+          <w:sz w:val="20"/>
+          <w:szCs w:val="20"/>
         </w:rPr>
         <w:t>:</w:t>
       </w:r>
       <w:r>
         <w:rPr>
-          <w:b w:val="1"/>
-          <w:bCs w:val="1"/>
-          <w:u w:val="none"/>
-        </w:rPr>
-        <w:t>showBegin</w:t>
-      </w:r>
-      <w:r>
-        <w:rPr>
-          <w:b w:val="1"/>
-          <w:bCs w:val="1"/>
-          <w:u w:val="none"/>
+          <w:color w:val="313131"/>
+          <w:sz w:val="20"/>
+          <w:szCs w:val="20"/>
+        </w:rPr>
+        <w:t xml:space="preserve"> </w:t>
+      </w:r>
+      <w:r>
+        <w:rPr>
+          <w:b/>
+          <w:bCs/>
+        </w:rPr>
+        <w:t>{</w:t>
+      </w:r>
+      <w:proofErr w:type="gramStart"/>
+      <w:r>
+        <w:rPr>
+          <w:b/>
+          <w:bCs/>
+        </w:rPr>
+        <w:t>d.</w:t>
+      </w:r>
+      <w:r>
+        <w:rPr>
+          <w:b/>
+          <w:bCs/>
+        </w:rPr>
+        <w:t>applicant</w:t>
+      </w:r>
+      <w:proofErr w:type="gramEnd"/>
+      <w:r>
+        <w:rPr>
+          <w:b/>
+          <w:bCs/>
+        </w:rPr>
+        <w:t>.</w:t>
+      </w:r>
+      <w:r>
+        <w:rPr>
+          <w:b/>
+          <w:bCs/>
+        </w:rPr>
+        <w:t>applicantServiceFax}</w:t>
+      </w:r>
+      <w:r>
+        <w:br/>
+      </w:r>
+      <w:r>
+        <w:rPr>
+          <w:b/>
+          <w:bCs/>
+        </w:rPr>
+        <w:t>{</w:t>
+      </w:r>
+      <w:proofErr w:type="gramStart"/>
+      <w:r>
+        <w:rPr>
+          <w:b/>
+          <w:bCs/>
+        </w:rPr>
+        <w:t>d.applicant</w:t>
+      </w:r>
+      <w:proofErr w:type="gramEnd"/>
+      <w:r>
+        <w:rPr>
+          <w:b/>
+          <w:bCs/>
+        </w:rPr>
+        <w:t>.</w:t>
+      </w:r>
+      <w:proofErr w:type="gramStart"/>
+      <w:r>
+        <w:rPr>
+          <w:b/>
+          <w:bCs/>
+        </w:rPr>
+        <w:t>applicantHasFax</w:t>
+      </w:r>
+      <w:r>
+        <w:rPr>
+          <w:b/>
+          <w:bCs/>
+        </w:rPr>
+        <w:t>:showEnd</w:t>
+      </w:r>
+      <w:proofErr w:type="gramEnd"/>
+      <w:r>
+        <w:rPr>
+          <w:b/>
+          <w:bCs/>
         </w:rPr>
         <w:t>}</w:t>
       </w:r>
@@ -4079,220 +3810,69 @@
           <w:color w:val="313131"/>
           <w:sz w:val="20"/>
           <w:szCs w:val="20"/>
-          <w:u w:val="none"/>
-        </w:rPr>
-        <w:t>Fax number</w:t>
-      </w:r>
-      <w:r>
-        <w:rPr>
-          <w:color w:val="313131"/>
-          <w:sz w:val="20"/>
-          <w:szCs w:val="20"/>
-          <w:u w:val="none"/>
-        </w:rPr>
-        <w:t>:</w:t>
-      </w:r>
-      <w:r>
-        <w:rPr>
-          <w:color w:val="313131"/>
-          <w:sz w:val="20"/>
-          <w:szCs w:val="20"/>
-          <w:u w:val="none"/>
-        </w:rPr>
-        <w:t xml:space="preserve"> </w:t>
-      </w:r>
-      <w:r>
-        <w:rPr>
-          <w:b w:val="1"/>
-          <w:bCs w:val="1"/>
-          <w:u w:val="none"/>
+        </w:rPr>
+        <w:lastRenderedPageBreak/>
+        <w:t xml:space="preserve">Date: </w:t>
+      </w:r>
+      <w:r>
+        <w:rPr>
+          <w:b/>
+          <w:bCs/>
         </w:rPr>
         <w:t>{</w:t>
       </w:r>
-      <w:r>
-        <w:rPr>
-          <w:b w:val="1"/>
-          <w:bCs w:val="1"/>
-          <w:u w:val="none"/>
-        </w:rPr>
-        <w:t>d.</w:t>
-      </w:r>
-      <w:r>
-        <w:rPr>
-          <w:b w:val="1"/>
-          <w:bCs w:val="1"/>
-          <w:u w:val="none"/>
-        </w:rPr>
-        <w:t>applicant.</w:t>
-      </w:r>
-      <w:r>
-        <w:rPr>
-          <w:b w:val="1"/>
-          <w:bCs w:val="1"/>
-          <w:u w:val="none"/>
-        </w:rPr>
-        <w:t>applicantServiceFax</w:t>
-      </w:r>
-      <w:r>
-        <w:rPr>
-          <w:b w:val="1"/>
-          <w:bCs w:val="1"/>
-          <w:u w:val="none"/>
+      <w:proofErr w:type="gramStart"/>
+      <w:r>
+        <w:rPr>
+          <w:b/>
+          <w:bCs/>
+        </w:rPr>
+        <w:t>d.applicationDate</w:t>
+      </w:r>
+      <w:proofErr w:type="gramEnd"/>
+      <w:r>
+        <w:rPr>
+          <w:b/>
+          <w:bCs/>
         </w:rPr>
         <w:t>}</w:t>
       </w:r>
       <w:r>
-        <w:br/>
-      </w:r>
-      <w:r>
-        <w:rPr>
-          <w:b w:val="1"/>
-          <w:bCs w:val="1"/>
-          <w:u w:val="none"/>
+        <w:tab/>
+      </w:r>
+      <w:r>
+        <w:rPr>
+          <w:b/>
+          <w:bCs/>
+          <w:u w:val="single"/>
+        </w:rPr>
+        <w:t xml:space="preserve">Signed Electronically by </w:t>
+      </w:r>
+      <w:r>
+        <w:rPr>
+          <w:b/>
+          <w:bCs/>
+          <w:u w:val="single"/>
         </w:rPr>
         <w:t>{</w:t>
       </w:r>
-      <w:r>
-        <w:rPr>
-          <w:b w:val="1"/>
-          <w:bCs w:val="1"/>
-          <w:u w:val="none"/>
-        </w:rPr>
-        <w:t>d.applicant.applicantHasFax</w:t>
-      </w:r>
-      <w:r>
-        <w:rPr>
-          <w:b w:val="1"/>
-          <w:bCs w:val="1"/>
-          <w:u w:val="none"/>
-        </w:rPr>
-        <w:t>:showEnd</w:t>
-      </w:r>
-      <w:r>
-        <w:rPr>
-          <w:b w:val="1"/>
-          <w:bCs w:val="1"/>
-          <w:u w:val="none"/>
-        </w:rPr>
-        <w:t>}</w:t>
-      </w:r>
-      <w:r>
-        <w:br/>
-      </w:r>
-      <w:r>
-        <w:rPr>
-          <w:color w:val="313131"/>
-          <w:sz w:val="20"/>
-          <w:szCs w:val="20"/>
-        </w:rPr>
-        <w:t>Date:</w:t>
-      </w:r>
-      <w:r>
-        <w:rPr>
-          <w:color w:val="313131"/>
-          <w:sz w:val="20"/>
-          <w:szCs w:val="20"/>
-        </w:rPr>
-        <w:t xml:space="preserve"> </w:t>
-      </w:r>
-      <w:r>
-        <w:rPr>
-          <w:b w:val="1"/>
-          <w:bCs w:val="1"/>
-          <w:u w:val="none"/>
-        </w:rPr>
-        <w:t>{</w:t>
-      </w:r>
-      <w:r>
-        <w:rPr>
-          <w:b w:val="1"/>
-          <w:bCs w:val="1"/>
-          <w:u w:val="none"/>
-        </w:rPr>
-        <w:t>d.applicationDate</w:t>
-      </w:r>
-      <w:r>
-        <w:rPr>
-          <w:b w:val="1"/>
-          <w:bCs w:val="1"/>
-          <w:u w:val="none"/>
-        </w:rPr>
-        <w:t>}</w:t>
-      </w:r>
-      <w:r>
-        <w:tab/>
-      </w:r>
-      <w:r>
-        <w:rPr>
-          <w:b w:val="1"/>
-          <w:bCs w:val="1"/>
+      <w:proofErr w:type="gramStart"/>
+      <w:r>
+        <w:rPr>
+          <w:b/>
+          <w:bCs/>
           <w:u w:val="single"/>
         </w:rPr>
-        <w:t>Signed</w:t>
-      </w:r>
-      <w:r>
-        <w:rPr>
-          <w:b w:val="1"/>
-          <w:bCs w:val="1"/>
+        <w:t>d.applicant</w:t>
+      </w:r>
+      <w:proofErr w:type="gramEnd"/>
+      <w:r>
+        <w:rPr>
+          <w:b/>
+          <w:bCs/>
           <w:u w:val="single"/>
         </w:rPr>
-        <w:t xml:space="preserve"> </w:t>
-      </w:r>
-      <w:r>
-        <w:rPr>
-          <w:b w:val="1"/>
-          <w:bCs w:val="1"/>
-          <w:u w:val="single"/>
-        </w:rPr>
-        <w:t>Electronically</w:t>
-      </w:r>
-      <w:r>
-        <w:rPr>
-          <w:b w:val="1"/>
-          <w:bCs w:val="1"/>
-          <w:u w:val="single"/>
-        </w:rPr>
-        <w:t xml:space="preserve"> </w:t>
-      </w:r>
-      <w:r>
-        <w:rPr>
-          <w:b w:val="1"/>
-          <w:bCs w:val="1"/>
-          <w:u w:val="single"/>
-        </w:rPr>
-        <w:t>by</w:t>
-      </w:r>
-      <w:r>
-        <w:rPr>
-          <w:b w:val="1"/>
-          <w:bCs w:val="1"/>
-          <w:u w:val="single"/>
-        </w:rPr>
-        <w:t xml:space="preserve"> </w:t>
-      </w:r>
-      <w:r>
-        <w:rPr>
-          <w:b w:val="1"/>
-          <w:bCs w:val="1"/>
-          <w:u w:val="single"/>
-        </w:rPr>
-        <w:t>{</w:t>
-      </w:r>
-      <w:r>
-        <w:rPr>
-          <w:b w:val="1"/>
-          <w:bCs w:val="1"/>
-          <w:u w:val="single"/>
-        </w:rPr>
-        <w:t>d.applicant.applicantName</w:t>
-      </w:r>
-      <w:r>
-        <w:rPr>
-          <w:b w:val="1"/>
-          <w:bCs w:val="1"/>
-          <w:u w:val="single"/>
-        </w:rPr>
-        <w:t>}</w:t>
+        <w:t>.applicantName}</w:t>
       </w:r>
     </w:p>
     <w:p>
@@ -4327,20 +3907,32 @@
         <w:rPr>
           <w:color w:val="313131"/>
           <w:spacing w:val="-1"/>
-          <w:u w:val="none"/>
-        </w:rPr>
-        <w:t xml:space="preserve"> </w:t>
-      </w:r>
-      <w:r>
-        <w:rPr>
-          <w:color w:val="313131"/>
-          <w:u w:val="none"/>
-        </w:rPr>
-        <w:t xml:space="preserve">{d.applicant.applicantName}</w:t>
+        </w:rPr>
+        <w:t xml:space="preserve"> </w:t>
+      </w:r>
+      <w:r>
+        <w:rPr>
+          <w:color w:val="313131"/>
+        </w:rPr>
+        <w:t>{</w:t>
+      </w:r>
+      <w:proofErr w:type="gramStart"/>
+      <w:r>
+        <w:rPr>
+          <w:color w:val="313131"/>
+        </w:rPr>
+        <w:t>d.applicant</w:t>
+      </w:r>
+      <w:proofErr w:type="gramEnd"/>
+      <w:r>
+        <w:rPr>
+          <w:color w:val="313131"/>
+        </w:rPr>
+        <w:t>.applicantName}</w:t>
       </w:r>
     </w:p>
     <w:sectPr>
-      <w:pgSz w:w="12240" w:h="15840" w:orient="portrait"/>
+      <w:pgSz w:w="12240" w:h="15840"/>
       <w:pgMar w:top="940" w:right="720" w:bottom="740" w:left="720" w:header="0" w:footer="543" w:gutter="0"/>
       <w:cols w:space="720"/>
     </w:sectPr>
@@ -4349,7 +3941,7 @@
 </file>
 
 <file path=word/endnotes.xml><?xml version="1.0" encoding="utf-8"?>
-<w:endnotes xmlns:wpc="http://schemas.microsoft.com/office/word/2010/wordprocessingCanvas" xmlns:cx="http://schemas.microsoft.com/office/drawing/2014/chartex" xmlns:cx1="http://schemas.microsoft.com/office/drawing/2015/9/8/chartex" xmlns:cx2="http://schemas.microsoft.com/office/drawing/2015/10/21/chartex" xmlns:cx3="http://schemas.microsoft.com/office/drawing/2016/5/9/chartex" xmlns:cx4="http://schemas.microsoft.com/office/drawing/2016/5/10/chartex" xmlns:cx5="http://schemas.microsoft.com/office/drawing/2016/5/11/chartex" xmlns:cx6="http://schemas.microsoft.com/office/drawing/2016/5/12/chartex" xmlns:cx7="http://schemas.microsoft.com/office/drawing/2016/5/13/chartex" xmlns:cx8="http://schemas.microsoft.com/office/drawing/2016/5/14/chartex" xmlns:mc="http://schemas.openxmlformats.org/markup-compatibility/2006" xmlns:aink="http://schemas.microsoft.com/office/drawing/2016/ink" xmlns:am3d="http://schemas.microsoft.com/office/drawing/2017/model3d" xmlns:o="urn:schemas-microsoft-com:office:office" xmlns:oel="http://schemas.microsoft.com/office/2019/extlst" xmlns:r="http://schemas.openxmlformats.org/officeDocument/2006/relationships" xmlns:m="http://schemas.openxmlformats.org/officeDocument/2006/math" xmlns:v="urn:schemas-microsoft-com:vml" xmlns:wp14="http://schemas.microsoft.com/office/word/2010/wordprocessingDrawing" xmlns:wp="http://schemas.openxmlformats.org/drawingml/2006/wordprocessingDrawing" xmlns:w10="urn:schemas-microsoft-com:office:word" xmlns:w="http://schemas.openxmlformats.org/wordprocessingml/2006/main" xmlns:w14="http://schemas.microsoft.com/office/word/2010/wordml" xmlns:w15="http://schemas.microsoft.com/office/word/2012/wordml" xmlns:w16cex="http://schemas.microsoft.com/office/word/2018/wordml/cex" xmlns:w16cid="http://schemas.microsoft.com/office/word/2016/wordml/cid" xmlns:w16="http://schemas.microsoft.com/office/word/2018/wordml" xmlns:w16du="http://schemas.microsoft.com/office/word/2023/wordml/word16du" xmlns:w16sdtdh="http://schemas.microsoft.com/office/word/2020/wordml/sdtdatahash" xmlns:w16sdtfl="http://schemas.microsoft.com/office/word/2024/wordml/sdtformatlock" xmlns:w16se="http://schemas.microsoft.com/office/word/2015/wordml/symex" xmlns:wpg="http://schemas.microsoft.com/office/word/2010/wordprocessingGroup" xmlns:wpi="http://schemas.microsoft.com/office/word/2010/wordprocessingInk" xmlns:wne="http://schemas.microsoft.com/office/word/2006/wordml" xmlns:wps="http://schemas.microsoft.com/office/word/2010/wordprocessingShape" mc:Ignorable="w14 w15 w16se w16cid w16 w16cex w16sdtdh w16sdtfl w16du wp14">
+<w:endnotes xmlns:wpc="http://schemas.microsoft.com/office/word/2010/wordprocessingCanvas" xmlns:cx="http://schemas.microsoft.com/office/drawing/2014/chartex" xmlns:cx1="http://schemas.microsoft.com/office/drawing/2015/9/8/chartex" xmlns:cx2="http://schemas.microsoft.com/office/drawing/2015/10/21/chartex" xmlns:cx3="http://schemas.microsoft.com/office/drawing/2016/5/9/chartex" xmlns:cx4="http://schemas.microsoft.com/office/drawing/2016/5/10/chartex" xmlns:cx5="http://schemas.microsoft.com/office/drawing/2016/5/11/chartex" xmlns:cx6="http://schemas.microsoft.com/office/drawing/2016/5/12/chartex" xmlns:cx7="http://schemas.microsoft.com/office/drawing/2016/5/13/chartex" xmlns:cx8="http://schemas.microsoft.com/office/drawing/2016/5/14/chartex" xmlns:mc="http://schemas.openxmlformats.org/markup-compatibility/2006" xmlns:aink="http://schemas.microsoft.com/office/drawing/2016/ink" xmlns:am3d="http://schemas.microsoft.com/office/drawing/2017/model3d" xmlns:o="urn:schemas-microsoft-com:office:office" xmlns:oel="http://schemas.microsoft.com/office/2019/extlst" xmlns:r="http://schemas.openxmlformats.org/officeDocument/2006/relationships" xmlns:m="http://schemas.openxmlformats.org/officeDocument/2006/math" xmlns:v="urn:schemas-microsoft-com:vml" xmlns:wp14="http://schemas.microsoft.com/office/word/2010/wordprocessingDrawing" xmlns:wp="http://schemas.openxmlformats.org/drawingml/2006/wordprocessingDrawing" xmlns:w10="urn:schemas-microsoft-com:office:word" xmlns:w="http://schemas.openxmlformats.org/wordprocessingml/2006/main" xmlns:w14="http://schemas.microsoft.com/office/word/2010/wordml" xmlns:w15="http://schemas.microsoft.com/office/word/2012/wordml" xmlns:w16cei="http://schemas.microsoft.com/office/word/2026/wordml/cei" xmlns:w16cex="http://schemas.microsoft.com/office/word/2018/wordml/cex" xmlns:w16cid="http://schemas.microsoft.com/office/word/2016/wordml/cid" xmlns:w16="http://schemas.microsoft.com/office/word/2018/wordml" xmlns:w16du="http://schemas.microsoft.com/office/word/2023/wordml/word16du" xmlns:w16sdtdh="http://schemas.microsoft.com/office/word/2020/wordml/sdtdatahash" xmlns:w16sdtfl="http://schemas.microsoft.com/office/word/2024/wordml/sdtformatlock" xmlns:w16se="http://schemas.microsoft.com/office/word/2015/wordml/symex" xmlns:wpg="http://schemas.microsoft.com/office/word/2010/wordprocessingGroup" xmlns:wpi="http://schemas.microsoft.com/office/word/2010/wordprocessingInk" xmlns:wne="http://schemas.microsoft.com/office/word/2006/wordml" xmlns:wps="http://schemas.microsoft.com/office/word/2010/wordprocessingShape" mc:Ignorable="w14 w15 w16se w16cid w16 w16cex w16sdtdh w16sdtfl w16du wp14">
   <w:endnote w:type="separator" w:id="-1">
     <w:p>
       <w:r>
@@ -4368,7 +3960,7 @@
 </file>
 
 <file path=word/footer1.xml><?xml version="1.0" encoding="utf-8"?>
-<w:ftr xmlns:wpc="http://schemas.microsoft.com/office/word/2010/wordprocessingCanvas" xmlns:cx="http://schemas.microsoft.com/office/drawing/2014/chartex" xmlns:cx1="http://schemas.microsoft.com/office/drawing/2015/9/8/chartex" xmlns:cx2="http://schemas.microsoft.com/office/drawing/2015/10/21/chartex" xmlns:cx3="http://schemas.microsoft.com/office/drawing/2016/5/9/chartex" xmlns:cx4="http://schemas.microsoft.com/office/drawing/2016/5/10/chartex" xmlns:cx5="http://schemas.microsoft.com/office/drawing/2016/5/11/chartex" xmlns:cx6="http://schemas.microsoft.com/office/drawing/2016/5/12/chartex" xmlns:cx7="http://schemas.microsoft.com/office/drawing/2016/5/13/chartex" xmlns:cx8="http://schemas.microsoft.com/office/drawing/2016/5/14/chartex" xmlns:mc="http://schemas.openxmlformats.org/markup-compatibility/2006" xmlns:aink="http://schemas.microsoft.com/office/drawing/2016/ink" xmlns:am3d="http://schemas.microsoft.com/office/drawing/2017/model3d" xmlns:o="urn:schemas-microsoft-com:office:office" xmlns:oel="http://schemas.microsoft.com/office/2019/extlst" xmlns:r="http://schemas.openxmlformats.org/officeDocument/2006/relationships" xmlns:m="http://schemas.openxmlformats.org/officeDocument/2006/math" xmlns:v="urn:schemas-microsoft-com:vml" xmlns:wp14="http://schemas.microsoft.com/office/word/2010/wordprocessingDrawing" xmlns:wp="http://schemas.openxmlformats.org/drawingml/2006/wordprocessingDrawing" xmlns:w10="urn:schemas-microsoft-com:office:word" xmlns:w="http://schemas.openxmlformats.org/wordprocessingml/2006/main" xmlns:w14="http://schemas.microsoft.com/office/word/2010/wordml" xmlns:w15="http://schemas.microsoft.com/office/word/2012/wordml" xmlns:w16cex="http://schemas.microsoft.com/office/word/2018/wordml/cex" xmlns:w16cid="http://schemas.microsoft.com/office/word/2016/wordml/cid" xmlns:w16="http://schemas.microsoft.com/office/word/2018/wordml" xmlns:w16du="http://schemas.microsoft.com/office/word/2023/wordml/word16du" xmlns:w16sdtdh="http://schemas.microsoft.com/office/word/2020/wordml/sdtdatahash" xmlns:w16sdtfl="http://schemas.microsoft.com/office/word/2024/wordml/sdtformatlock" xmlns:w16se="http://schemas.microsoft.com/office/word/2015/wordml/symex" xmlns:wpg="http://schemas.microsoft.com/office/word/2010/wordprocessingGroup" xmlns:wpi="http://schemas.microsoft.com/office/word/2010/wordprocessingInk" xmlns:wne="http://schemas.microsoft.com/office/word/2006/wordml" xmlns:wps="http://schemas.microsoft.com/office/word/2010/wordprocessingShape" mc:Ignorable="w14 w15 w16se w16cid w16 w16cex w16sdtdh w16sdtfl w16du wp14">
+<w:ftr xmlns:wpc="http://schemas.microsoft.com/office/word/2010/wordprocessingCanvas" xmlns:cx="http://schemas.microsoft.com/office/drawing/2014/chartex" xmlns:cx1="http://schemas.microsoft.com/office/drawing/2015/9/8/chartex" xmlns:cx2="http://schemas.microsoft.com/office/drawing/2015/10/21/chartex" xmlns:cx3="http://schemas.microsoft.com/office/drawing/2016/5/9/chartex" xmlns:cx4="http://schemas.microsoft.com/office/drawing/2016/5/10/chartex" xmlns:cx5="http://schemas.microsoft.com/office/drawing/2016/5/11/chartex" xmlns:cx6="http://schemas.microsoft.com/office/drawing/2016/5/12/chartex" xmlns:cx7="http://schemas.microsoft.com/office/drawing/2016/5/13/chartex" xmlns:cx8="http://schemas.microsoft.com/office/drawing/2016/5/14/chartex" xmlns:mc="http://schemas.openxmlformats.org/markup-compatibility/2006" xmlns:aink="http://schemas.microsoft.com/office/drawing/2016/ink" xmlns:am3d="http://schemas.microsoft.com/office/drawing/2017/model3d" xmlns:o="urn:schemas-microsoft-com:office:office" xmlns:oel="http://schemas.microsoft.com/office/2019/extlst" xmlns:r="http://schemas.openxmlformats.org/officeDocument/2006/relationships" xmlns:m="http://schemas.openxmlformats.org/officeDocument/2006/math" xmlns:v="urn:schemas-microsoft-com:vml" xmlns:wp14="http://schemas.microsoft.com/office/word/2010/wordprocessingDrawing" xmlns:wp="http://schemas.openxmlformats.org/drawingml/2006/wordprocessingDrawing" xmlns:w10="urn:schemas-microsoft-com:office:word" xmlns:w="http://schemas.openxmlformats.org/wordprocessingml/2006/main" xmlns:w14="http://schemas.microsoft.com/office/word/2010/wordml" xmlns:w15="http://schemas.microsoft.com/office/word/2012/wordml" xmlns:w16cei="http://schemas.microsoft.com/office/word/2026/wordml/cei" xmlns:w16cex="http://schemas.microsoft.com/office/word/2018/wordml/cex" xmlns:w16cid="http://schemas.microsoft.com/office/word/2016/wordml/cid" xmlns:w16="http://schemas.microsoft.com/office/word/2018/wordml" xmlns:w16du="http://schemas.microsoft.com/office/word/2023/wordml/word16du" xmlns:w16sdtdh="http://schemas.microsoft.com/office/word/2020/wordml/sdtdatahash" xmlns:w16sdtfl="http://schemas.microsoft.com/office/word/2024/wordml/sdtformatlock" xmlns:w16se="http://schemas.microsoft.com/office/word/2015/wordml/symex" xmlns:wpg="http://schemas.microsoft.com/office/word/2010/wordprocessingGroup" xmlns:wpi="http://schemas.microsoft.com/office/word/2010/wordprocessingInk" xmlns:wne="http://schemas.microsoft.com/office/word/2006/wordml" xmlns:wps="http://schemas.microsoft.com/office/word/2010/wordprocessingShape" mc:Ignorable="w14 w15 w16se w16cid w16 w16cex w16sdtdh w16sdtfl w16du wp14">
   <w:p>
     <w:pPr>
       <w:pStyle w:val="Footer"/>
@@ -4378,7 +3970,7 @@
 </file>
 
 <file path=word/footer2.xml><?xml version="1.0" encoding="utf-8"?>
-<w:ftr xmlns:wpc="http://schemas.microsoft.com/office/word/2010/wordprocessingCanvas" xmlns:cx="http://schemas.microsoft.com/office/drawing/2014/chartex" xmlns:cx1="http://schemas.microsoft.com/office/drawing/2015/9/8/chartex" xmlns:cx2="http://schemas.microsoft.com/office/drawing/2015/10/21/chartex" xmlns:cx3="http://schemas.microsoft.com/office/drawing/2016/5/9/chartex" xmlns:cx4="http://schemas.microsoft.com/office/drawing/2016/5/10/chartex" xmlns:cx5="http://schemas.microsoft.com/office/drawing/2016/5/11/chartex" xmlns:cx6="http://schemas.microsoft.com/office/drawing/2016/5/12/chartex" xmlns:cx7="http://schemas.microsoft.com/office/drawing/2016/5/13/chartex" xmlns:cx8="http://schemas.microsoft.com/office/drawing/2016/5/14/chartex" xmlns:mc="http://schemas.openxmlformats.org/markup-compatibility/2006" xmlns:aink="http://schemas.microsoft.com/office/drawing/2016/ink" xmlns:am3d="http://schemas.microsoft.com/office/drawing/2017/model3d" xmlns:o="urn:schemas-microsoft-com:office:office" xmlns:oel="http://schemas.microsoft.com/office/2019/extlst" xmlns:r="http://schemas.openxmlformats.org/officeDocument/2006/relationships" xmlns:m="http://schemas.openxmlformats.org/officeDocument/2006/math" xmlns:v="urn:schemas-microsoft-com:vml" xmlns:wp14="http://schemas.microsoft.com/office/word/2010/wordprocessingDrawing" xmlns:wp="http://schemas.openxmlformats.org/drawingml/2006/wordprocessingDrawing" xmlns:w10="urn:schemas-microsoft-com:office:word" xmlns:w="http://schemas.openxmlformats.org/wordprocessingml/2006/main" xmlns:w14="http://schemas.microsoft.com/office/word/2010/wordml" xmlns:w15="http://schemas.microsoft.com/office/word/2012/wordml" xmlns:w16cex="http://schemas.microsoft.com/office/word/2018/wordml/cex" xmlns:w16cid="http://schemas.microsoft.com/office/word/2016/wordml/cid" xmlns:w16="http://schemas.microsoft.com/office/word/2018/wordml" xmlns:w16du="http://schemas.microsoft.com/office/word/2023/wordml/word16du" xmlns:w16sdtdh="http://schemas.microsoft.com/office/word/2020/wordml/sdtdatahash" xmlns:w16sdtfl="http://schemas.microsoft.com/office/word/2024/wordml/sdtformatlock" xmlns:w16se="http://schemas.microsoft.com/office/word/2015/wordml/symex" xmlns:wpg="http://schemas.microsoft.com/office/word/2010/wordprocessingGroup" xmlns:wpi="http://schemas.microsoft.com/office/word/2010/wordprocessingInk" xmlns:wne="http://schemas.microsoft.com/office/word/2006/wordml" xmlns:wps="http://schemas.microsoft.com/office/word/2010/wordprocessingShape" xmlns:a="http://schemas.openxmlformats.org/drawingml/2006/main" mc:Ignorable="w14 w15 w16se w16cid w16 w16cex w16sdtdh w16sdtfl w16du wp14">
+<w:ftr xmlns:wpc="http://schemas.microsoft.com/office/word/2010/wordprocessingCanvas" xmlns:cx="http://schemas.microsoft.com/office/drawing/2014/chartex" xmlns:cx1="http://schemas.microsoft.com/office/drawing/2015/9/8/chartex" xmlns:cx2="http://schemas.microsoft.com/office/drawing/2015/10/21/chartex" xmlns:cx3="http://schemas.microsoft.com/office/drawing/2016/5/9/chartex" xmlns:cx4="http://schemas.microsoft.com/office/drawing/2016/5/10/chartex" xmlns:cx5="http://schemas.microsoft.com/office/drawing/2016/5/11/chartex" xmlns:cx6="http://schemas.microsoft.com/office/drawing/2016/5/12/chartex" xmlns:cx7="http://schemas.microsoft.com/office/drawing/2016/5/13/chartex" xmlns:cx8="http://schemas.microsoft.com/office/drawing/2016/5/14/chartex" xmlns:mc="http://schemas.openxmlformats.org/markup-compatibility/2006" xmlns:aink="http://schemas.microsoft.com/office/drawing/2016/ink" xmlns:am3d="http://schemas.microsoft.com/office/drawing/2017/model3d" xmlns:o="urn:schemas-microsoft-com:office:office" xmlns:oel="http://schemas.microsoft.com/office/2019/extlst" xmlns:r="http://schemas.openxmlformats.org/officeDocument/2006/relationships" xmlns:m="http://schemas.openxmlformats.org/officeDocument/2006/math" xmlns:v="urn:schemas-microsoft-com:vml" xmlns:wp14="http://schemas.microsoft.com/office/word/2010/wordprocessingDrawing" xmlns:wp="http://schemas.openxmlformats.org/drawingml/2006/wordprocessingDrawing" xmlns:w10="urn:schemas-microsoft-com:office:word" xmlns:w="http://schemas.openxmlformats.org/wordprocessingml/2006/main" xmlns:w14="http://schemas.microsoft.com/office/word/2010/wordml" xmlns:w15="http://schemas.microsoft.com/office/word/2012/wordml" xmlns:w16cei="http://schemas.microsoft.com/office/word/2026/wordml/cei" xmlns:w16cex="http://schemas.microsoft.com/office/word/2018/wordml/cex" xmlns:w16cid="http://schemas.microsoft.com/office/word/2016/wordml/cid" xmlns:w16="http://schemas.microsoft.com/office/word/2018/wordml" xmlns:w16du="http://schemas.microsoft.com/office/word/2023/wordml/word16du" xmlns:w16sdtdh="http://schemas.microsoft.com/office/word/2020/wordml/sdtdatahash" xmlns:w16sdtfl="http://schemas.microsoft.com/office/word/2024/wordml/sdtformatlock" xmlns:w16se="http://schemas.microsoft.com/office/word/2015/wordml/symex" xmlns:wpg="http://schemas.microsoft.com/office/word/2010/wordprocessingGroup" xmlns:wpi="http://schemas.microsoft.com/office/word/2010/wordprocessingInk" xmlns:wne="http://schemas.microsoft.com/office/word/2006/wordml" xmlns:wps="http://schemas.microsoft.com/office/word/2010/wordprocessingShape" mc:Ignorable="w14 w15 w16se w16cid w16 w16cex w16sdtdh w16sdtfl w16du wp14">
   <w:p>
     <w:pPr>
       <w:pStyle w:val="BodyText"/>
@@ -4391,6 +3983,7 @@
       </w:rPr>
       <w:t xml:space="preserve">Generated </w:t>
     </w:r>
+    <w:proofErr w:type="gramStart"/>
     <w:r>
       <w:rPr>
         <w:sz w:val="16"/>
@@ -4398,6 +3991,7 @@
       </w:rPr>
       <w:t>by ”Probate</w:t>
     </w:r>
+    <w:proofErr w:type="gramEnd"/>
     <w:r>
       <w:rPr>
         <w:sz w:val="16"/>
@@ -4405,6 +3999,8 @@
       </w:rPr>
       <w:t xml:space="preserve"> Application” on {</w:t>
     </w:r>
+    <w:proofErr w:type="spellStart"/>
+    <w:proofErr w:type="gramStart"/>
     <w:r>
       <w:rPr>
         <w:sz w:val="16"/>
@@ -4412,6 +4008,8 @@
       </w:rPr>
       <w:t>d.applicationDate</w:t>
     </w:r>
+    <w:proofErr w:type="spellEnd"/>
+    <w:proofErr w:type="gramEnd"/>
     <w:r>
       <w:rPr>
         <w:sz w:val="16"/>
@@ -4451,26 +4049,37 @@
       <w:fldChar w:fldCharType="begin"/>
     </w:r>
     <w:r>
-      <w:instrText xml:space="preserve">PAGE</w:instrText>
+      <w:instrText>PAGE</w:instrText>
     </w:r>
     <w:r>
       <w:fldChar w:fldCharType="separate"/>
     </w:r>
     <w:r>
+      <w:rPr>
+        <w:noProof/>
+      </w:rPr>
+      <w:t>1</w:t>
+    </w:r>
+    <w:r>
       <w:fldChar w:fldCharType="end"/>
     </w:r>
     <w:r>
-      <w:rPr/>
       <w:t xml:space="preserve"> of </w:t>
     </w:r>
     <w:r>
       <w:fldChar w:fldCharType="begin"/>
     </w:r>
     <w:r>
-      <w:instrText xml:space="preserve">NUMPAGES</w:instrText>
+      <w:instrText>NUMPAGES</w:instrText>
     </w:r>
     <w:r>
       <w:fldChar w:fldCharType="separate"/>
+    </w:r>
+    <w:r>
+      <w:rPr>
+        <w:noProof/>
+      </w:rPr>
+      <w:t>2</w:t>
     </w:r>
     <w:r>
       <w:fldChar w:fldCharType="end"/>
@@ -4490,7 +4099,7 @@
 </file>
 
 <file path=word/footer3.xml><?xml version="1.0" encoding="utf-8"?>
-<w:ftr xmlns:wpc="http://schemas.microsoft.com/office/word/2010/wordprocessingCanvas" xmlns:cx="http://schemas.microsoft.com/office/drawing/2014/chartex" xmlns:cx1="http://schemas.microsoft.com/office/drawing/2015/9/8/chartex" xmlns:cx2="http://schemas.microsoft.com/office/drawing/2015/10/21/chartex" xmlns:cx3="http://schemas.microsoft.com/office/drawing/2016/5/9/chartex" xmlns:cx4="http://schemas.microsoft.com/office/drawing/2016/5/10/chartex" xmlns:cx5="http://schemas.microsoft.com/office/drawing/2016/5/11/chartex" xmlns:cx6="http://schemas.microsoft.com/office/drawing/2016/5/12/chartex" xmlns:cx7="http://schemas.microsoft.com/office/drawing/2016/5/13/chartex" xmlns:cx8="http://schemas.microsoft.com/office/drawing/2016/5/14/chartex" xmlns:mc="http://schemas.openxmlformats.org/markup-compatibility/2006" xmlns:aink="http://schemas.microsoft.com/office/drawing/2016/ink" xmlns:am3d="http://schemas.microsoft.com/office/drawing/2017/model3d" xmlns:o="urn:schemas-microsoft-com:office:office" xmlns:oel="http://schemas.microsoft.com/office/2019/extlst" xmlns:r="http://schemas.openxmlformats.org/officeDocument/2006/relationships" xmlns:m="http://schemas.openxmlformats.org/officeDocument/2006/math" xmlns:v="urn:schemas-microsoft-com:vml" xmlns:wp14="http://schemas.microsoft.com/office/word/2010/wordprocessingDrawing" xmlns:wp="http://schemas.openxmlformats.org/drawingml/2006/wordprocessingDrawing" xmlns:w10="urn:schemas-microsoft-com:office:word" xmlns:w="http://schemas.openxmlformats.org/wordprocessingml/2006/main" xmlns:w14="http://schemas.microsoft.com/office/word/2010/wordml" xmlns:w15="http://schemas.microsoft.com/office/word/2012/wordml" xmlns:w16cex="http://schemas.microsoft.com/office/word/2018/wordml/cex" xmlns:w16cid="http://schemas.microsoft.com/office/word/2016/wordml/cid" xmlns:w16="http://schemas.microsoft.com/office/word/2018/wordml" xmlns:w16du="http://schemas.microsoft.com/office/word/2023/wordml/word16du" xmlns:w16sdtdh="http://schemas.microsoft.com/office/word/2020/wordml/sdtdatahash" xmlns:w16sdtfl="http://schemas.microsoft.com/office/word/2024/wordml/sdtformatlock" xmlns:w16se="http://schemas.microsoft.com/office/word/2015/wordml/symex" xmlns:wpg="http://schemas.microsoft.com/office/word/2010/wordprocessingGroup" xmlns:wpi="http://schemas.microsoft.com/office/word/2010/wordprocessingInk" xmlns:wne="http://schemas.microsoft.com/office/word/2006/wordml" xmlns:wps="http://schemas.microsoft.com/office/word/2010/wordprocessingShape" mc:Ignorable="w14 w15 w16se w16cid w16 w16cex w16sdtdh w16sdtfl w16du wp14">
+<w:ftr xmlns:wpc="http://schemas.microsoft.com/office/word/2010/wordprocessingCanvas" xmlns:cx="http://schemas.microsoft.com/office/drawing/2014/chartex" xmlns:cx1="http://schemas.microsoft.com/office/drawing/2015/9/8/chartex" xmlns:cx2="http://schemas.microsoft.com/office/drawing/2015/10/21/chartex" xmlns:cx3="http://schemas.microsoft.com/office/drawing/2016/5/9/chartex" xmlns:cx4="http://schemas.microsoft.com/office/drawing/2016/5/10/chartex" xmlns:cx5="http://schemas.microsoft.com/office/drawing/2016/5/11/chartex" xmlns:cx6="http://schemas.microsoft.com/office/drawing/2016/5/12/chartex" xmlns:cx7="http://schemas.microsoft.com/office/drawing/2016/5/13/chartex" xmlns:cx8="http://schemas.microsoft.com/office/drawing/2016/5/14/chartex" xmlns:mc="http://schemas.openxmlformats.org/markup-compatibility/2006" xmlns:aink="http://schemas.microsoft.com/office/drawing/2016/ink" xmlns:am3d="http://schemas.microsoft.com/office/drawing/2017/model3d" xmlns:o="urn:schemas-microsoft-com:office:office" xmlns:oel="http://schemas.microsoft.com/office/2019/extlst" xmlns:r="http://schemas.openxmlformats.org/officeDocument/2006/relationships" xmlns:m="http://schemas.openxmlformats.org/officeDocument/2006/math" xmlns:v="urn:schemas-microsoft-com:vml" xmlns:wp14="http://schemas.microsoft.com/office/word/2010/wordprocessingDrawing" xmlns:wp="http://schemas.openxmlformats.org/drawingml/2006/wordprocessingDrawing" xmlns:w10="urn:schemas-microsoft-com:office:word" xmlns:w="http://schemas.openxmlformats.org/wordprocessingml/2006/main" xmlns:w14="http://schemas.microsoft.com/office/word/2010/wordml" xmlns:w15="http://schemas.microsoft.com/office/word/2012/wordml" xmlns:w16cei="http://schemas.microsoft.com/office/word/2026/wordml/cei" xmlns:w16cex="http://schemas.microsoft.com/office/word/2018/wordml/cex" xmlns:w16cid="http://schemas.microsoft.com/office/word/2016/wordml/cid" xmlns:w16="http://schemas.microsoft.com/office/word/2018/wordml" xmlns:w16du="http://schemas.microsoft.com/office/word/2023/wordml/word16du" xmlns:w16sdtdh="http://schemas.microsoft.com/office/word/2020/wordml/sdtdatahash" xmlns:w16sdtfl="http://schemas.microsoft.com/office/word/2024/wordml/sdtformatlock" xmlns:w16se="http://schemas.microsoft.com/office/word/2015/wordml/symex" xmlns:wpg="http://schemas.microsoft.com/office/word/2010/wordprocessingGroup" xmlns:wpi="http://schemas.microsoft.com/office/word/2010/wordprocessingInk" xmlns:wne="http://schemas.microsoft.com/office/word/2006/wordml" xmlns:wps="http://schemas.microsoft.com/office/word/2010/wordprocessingShape" mc:Ignorable="w14 w15 w16se w16cid w16 w16cex w16sdtdh w16sdtfl w16du wp14">
   <w:p>
     <w:pPr>
       <w:pStyle w:val="Footer"/>
@@ -4500,7 +4109,7 @@
 </file>
 
 <file path=word/footnotes.xml><?xml version="1.0" encoding="utf-8"?>
-<w:footnotes xmlns:wpc="http://schemas.microsoft.com/office/word/2010/wordprocessingCanvas" xmlns:cx="http://schemas.microsoft.com/office/drawing/2014/chartex" xmlns:cx1="http://schemas.microsoft.com/office/drawing/2015/9/8/chartex" xmlns:cx2="http://schemas.microsoft.com/office/drawing/2015/10/21/chartex" xmlns:cx3="http://schemas.microsoft.com/office/drawing/2016/5/9/chartex" xmlns:cx4="http://schemas.microsoft.com/office/drawing/2016/5/10/chartex" xmlns:cx5="http://schemas.microsoft.com/office/drawing/2016/5/11/chartex" xmlns:cx6="http://schemas.microsoft.com/office/drawing/2016/5/12/chartex" xmlns:cx7="http://schemas.microsoft.com/office/drawing/2016/5/13/chartex" xmlns:cx8="http://schemas.microsoft.com/office/drawing/2016/5/14/chartex" xmlns:mc="http://schemas.openxmlformats.org/markup-compatibility/2006" xmlns:aink="http://schemas.microsoft.com/office/drawing/2016/ink" xmlns:am3d="http://schemas.microsoft.com/office/drawing/2017/model3d" xmlns:o="urn:schemas-microsoft-com:office:office" xmlns:oel="http://schemas.microsoft.com/office/2019/extlst" xmlns:r="http://schemas.openxmlformats.org/officeDocument/2006/relationships" xmlns:m="http://schemas.openxmlformats.org/officeDocument/2006/math" xmlns:v="urn:schemas-microsoft-com:vml" xmlns:wp14="http://schemas.microsoft.com/office/word/2010/wordprocessingDrawing" xmlns:wp="http://schemas.openxmlformats.org/drawingml/2006/wordprocessingDrawing" xmlns:w10="urn:schemas-microsoft-com:office:word" xmlns:w="http://schemas.openxmlformats.org/wordprocessingml/2006/main" xmlns:w14="http://schemas.microsoft.com/office/word/2010/wordml" xmlns:w15="http://schemas.microsoft.com/office/word/2012/wordml" xmlns:w16cex="http://schemas.microsoft.com/office/word/2018/wordml/cex" xmlns:w16cid="http://schemas.microsoft.com/office/word/2016/wordml/cid" xmlns:w16="http://schemas.microsoft.com/office/word/2018/wordml" xmlns:w16du="http://schemas.microsoft.com/office/word/2023/wordml/word16du" xmlns:w16sdtdh="http://schemas.microsoft.com/office/word/2020/wordml/sdtdatahash" xmlns:w16sdtfl="http://schemas.microsoft.com/office/word/2024/wordml/sdtformatlock" xmlns:w16se="http://schemas.microsoft.com/office/word/2015/wordml/symex" xmlns:wpg="http://schemas.microsoft.com/office/word/2010/wordprocessingGroup" xmlns:wpi="http://schemas.microsoft.com/office/word/2010/wordprocessingInk" xmlns:wne="http://schemas.microsoft.com/office/word/2006/wordml" xmlns:wps="http://schemas.microsoft.com/office/word/2010/wordprocessingShape" mc:Ignorable="w14 w15 w16se w16cid w16 w16cex w16sdtdh w16sdtfl w16du wp14">
+<w:footnotes xmlns:wpc="http://schemas.microsoft.com/office/word/2010/wordprocessingCanvas" xmlns:cx="http://schemas.microsoft.com/office/drawing/2014/chartex" xmlns:cx1="http://schemas.microsoft.com/office/drawing/2015/9/8/chartex" xmlns:cx2="http://schemas.microsoft.com/office/drawing/2015/10/21/chartex" xmlns:cx3="http://schemas.microsoft.com/office/drawing/2016/5/9/chartex" xmlns:cx4="http://schemas.microsoft.com/office/drawing/2016/5/10/chartex" xmlns:cx5="http://schemas.microsoft.com/office/drawing/2016/5/11/chartex" xmlns:cx6="http://schemas.microsoft.com/office/drawing/2016/5/12/chartex" xmlns:cx7="http://schemas.microsoft.com/office/drawing/2016/5/13/chartex" xmlns:cx8="http://schemas.microsoft.com/office/drawing/2016/5/14/chartex" xmlns:mc="http://schemas.openxmlformats.org/markup-compatibility/2006" xmlns:aink="http://schemas.microsoft.com/office/drawing/2016/ink" xmlns:am3d="http://schemas.microsoft.com/office/drawing/2017/model3d" xmlns:o="urn:schemas-microsoft-com:office:office" xmlns:oel="http://schemas.microsoft.com/office/2019/extlst" xmlns:r="http://schemas.openxmlformats.org/officeDocument/2006/relationships" xmlns:m="http://schemas.openxmlformats.org/officeDocument/2006/math" xmlns:v="urn:schemas-microsoft-com:vml" xmlns:wp14="http://schemas.microsoft.com/office/word/2010/wordprocessingDrawing" xmlns:wp="http://schemas.openxmlformats.org/drawingml/2006/wordprocessingDrawing" xmlns:w10="urn:schemas-microsoft-com:office:word" xmlns:w="http://schemas.openxmlformats.org/wordprocessingml/2006/main" xmlns:w14="http://schemas.microsoft.com/office/word/2010/wordml" xmlns:w15="http://schemas.microsoft.com/office/word/2012/wordml" xmlns:w16cei="http://schemas.microsoft.com/office/word/2026/wordml/cei" xmlns:w16cex="http://schemas.microsoft.com/office/word/2018/wordml/cex" xmlns:w16cid="http://schemas.microsoft.com/office/word/2016/wordml/cid" xmlns:w16="http://schemas.microsoft.com/office/word/2018/wordml" xmlns:w16du="http://schemas.microsoft.com/office/word/2023/wordml/word16du" xmlns:w16sdtdh="http://schemas.microsoft.com/office/word/2020/wordml/sdtdatahash" xmlns:w16sdtfl="http://schemas.microsoft.com/office/word/2024/wordml/sdtformatlock" xmlns:w16se="http://schemas.microsoft.com/office/word/2015/wordml/symex" xmlns:wpg="http://schemas.microsoft.com/office/word/2010/wordprocessingGroup" xmlns:wpi="http://schemas.microsoft.com/office/word/2010/wordprocessingInk" xmlns:wne="http://schemas.microsoft.com/office/word/2006/wordml" xmlns:wps="http://schemas.microsoft.com/office/word/2010/wordprocessingShape" mc:Ignorable="w14 w15 w16se w16cid w16 w16cex w16sdtdh w16sdtfl w16du wp14">
   <w:footnote w:type="separator" w:id="-1">
     <w:p>
       <w:r>
@@ -4519,7 +4128,7 @@
 </file>
 
 <file path=word/header1.xml><?xml version="1.0" encoding="utf-8"?>
-<w:hdr xmlns:wpc="http://schemas.microsoft.com/office/word/2010/wordprocessingCanvas" xmlns:cx="http://schemas.microsoft.com/office/drawing/2014/chartex" xmlns:cx1="http://schemas.microsoft.com/office/drawing/2015/9/8/chartex" xmlns:cx2="http://schemas.microsoft.com/office/drawing/2015/10/21/chartex" xmlns:cx3="http://schemas.microsoft.com/office/drawing/2016/5/9/chartex" xmlns:cx4="http://schemas.microsoft.com/office/drawing/2016/5/10/chartex" xmlns:cx5="http://schemas.microsoft.com/office/drawing/2016/5/11/chartex" xmlns:cx6="http://schemas.microsoft.com/office/drawing/2016/5/12/chartex" xmlns:cx7="http://schemas.microsoft.com/office/drawing/2016/5/13/chartex" xmlns:cx8="http://schemas.microsoft.com/office/drawing/2016/5/14/chartex" xmlns:mc="http://schemas.openxmlformats.org/markup-compatibility/2006" xmlns:aink="http://schemas.microsoft.com/office/drawing/2016/ink" xmlns:am3d="http://schemas.microsoft.com/office/drawing/2017/model3d" xmlns:o="urn:schemas-microsoft-com:office:office" xmlns:oel="http://schemas.microsoft.com/office/2019/extlst" xmlns:r="http://schemas.openxmlformats.org/officeDocument/2006/relationships" xmlns:m="http://schemas.openxmlformats.org/officeDocument/2006/math" xmlns:v="urn:schemas-microsoft-com:vml" xmlns:wp14="http://schemas.microsoft.com/office/word/2010/wordprocessingDrawing" xmlns:wp="http://schemas.openxmlformats.org/drawingml/2006/wordprocessingDrawing" xmlns:w10="urn:schemas-microsoft-com:office:word" xmlns:w="http://schemas.openxmlformats.org/wordprocessingml/2006/main" xmlns:w14="http://schemas.microsoft.com/office/word/2010/wordml" xmlns:w15="http://schemas.microsoft.com/office/word/2012/wordml" xmlns:w16cex="http://schemas.microsoft.com/office/word/2018/wordml/cex" xmlns:w16cid="http://schemas.microsoft.com/office/word/2016/wordml/cid" xmlns:w16="http://schemas.microsoft.com/office/word/2018/wordml" xmlns:w16du="http://schemas.microsoft.com/office/word/2023/wordml/word16du" xmlns:w16sdtdh="http://schemas.microsoft.com/office/word/2020/wordml/sdtdatahash" xmlns:w16sdtfl="http://schemas.microsoft.com/office/word/2024/wordml/sdtformatlock" xmlns:w16se="http://schemas.microsoft.com/office/word/2015/wordml/symex" xmlns:wpg="http://schemas.microsoft.com/office/word/2010/wordprocessingGroup" xmlns:wpi="http://schemas.microsoft.com/office/word/2010/wordprocessingInk" xmlns:wne="http://schemas.microsoft.com/office/word/2006/wordml" xmlns:wps="http://schemas.microsoft.com/office/word/2010/wordprocessingShape" mc:Ignorable="w14 w15 w16se w16cid w16 w16cex w16sdtdh w16sdtfl w16du wp14">
+<w:hdr xmlns:wpc="http://schemas.microsoft.com/office/word/2010/wordprocessingCanvas" xmlns:cx="http://schemas.microsoft.com/office/drawing/2014/chartex" xmlns:cx1="http://schemas.microsoft.com/office/drawing/2015/9/8/chartex" xmlns:cx2="http://schemas.microsoft.com/office/drawing/2015/10/21/chartex" xmlns:cx3="http://schemas.microsoft.com/office/drawing/2016/5/9/chartex" xmlns:cx4="http://schemas.microsoft.com/office/drawing/2016/5/10/chartex" xmlns:cx5="http://schemas.microsoft.com/office/drawing/2016/5/11/chartex" xmlns:cx6="http://schemas.microsoft.com/office/drawing/2016/5/12/chartex" xmlns:cx7="http://schemas.microsoft.com/office/drawing/2016/5/13/chartex" xmlns:cx8="http://schemas.microsoft.com/office/drawing/2016/5/14/chartex" xmlns:mc="http://schemas.openxmlformats.org/markup-compatibility/2006" xmlns:aink="http://schemas.microsoft.com/office/drawing/2016/ink" xmlns:am3d="http://schemas.microsoft.com/office/drawing/2017/model3d" xmlns:o="urn:schemas-microsoft-com:office:office" xmlns:oel="http://schemas.microsoft.com/office/2019/extlst" xmlns:r="http://schemas.openxmlformats.org/officeDocument/2006/relationships" xmlns:m="http://schemas.openxmlformats.org/officeDocument/2006/math" xmlns:v="urn:schemas-microsoft-com:vml" xmlns:wp14="http://schemas.microsoft.com/office/word/2010/wordprocessingDrawing" xmlns:wp="http://schemas.openxmlformats.org/drawingml/2006/wordprocessingDrawing" xmlns:w10="urn:schemas-microsoft-com:office:word" xmlns:w="http://schemas.openxmlformats.org/wordprocessingml/2006/main" xmlns:w14="http://schemas.microsoft.com/office/word/2010/wordml" xmlns:w15="http://schemas.microsoft.com/office/word/2012/wordml" xmlns:w16cei="http://schemas.microsoft.com/office/word/2026/wordml/cei" xmlns:w16cex="http://schemas.microsoft.com/office/word/2018/wordml/cex" xmlns:w16cid="http://schemas.microsoft.com/office/word/2016/wordml/cid" xmlns:w16="http://schemas.microsoft.com/office/word/2018/wordml" xmlns:w16du="http://schemas.microsoft.com/office/word/2023/wordml/word16du" xmlns:w16sdtdh="http://schemas.microsoft.com/office/word/2020/wordml/sdtdatahash" xmlns:w16sdtfl="http://schemas.microsoft.com/office/word/2024/wordml/sdtformatlock" xmlns:w16se="http://schemas.microsoft.com/office/word/2015/wordml/symex" xmlns:wpg="http://schemas.microsoft.com/office/word/2010/wordprocessingGroup" xmlns:wpi="http://schemas.microsoft.com/office/word/2010/wordprocessingInk" xmlns:wne="http://schemas.microsoft.com/office/word/2006/wordml" xmlns:wps="http://schemas.microsoft.com/office/word/2010/wordprocessingShape" mc:Ignorable="w14 w15 w16se w16cid w16 w16cex w16sdtdh w16sdtfl w16du wp14">
   <w:p>
     <w:pPr>
       <w:pStyle w:val="Header"/>
@@ -4529,7 +4138,7 @@
 </file>
 
 <file path=word/header2.xml><?xml version="1.0" encoding="utf-8"?>
-<w:hdr xmlns:wpc="http://schemas.microsoft.com/office/word/2010/wordprocessingCanvas" xmlns:cx="http://schemas.microsoft.com/office/drawing/2014/chartex" xmlns:cx1="http://schemas.microsoft.com/office/drawing/2015/9/8/chartex" xmlns:cx2="http://schemas.microsoft.com/office/drawing/2015/10/21/chartex" xmlns:cx3="http://schemas.microsoft.com/office/drawing/2016/5/9/chartex" xmlns:cx4="http://schemas.microsoft.com/office/drawing/2016/5/10/chartex" xmlns:cx5="http://schemas.microsoft.com/office/drawing/2016/5/11/chartex" xmlns:cx6="http://schemas.microsoft.com/office/drawing/2016/5/12/chartex" xmlns:cx7="http://schemas.microsoft.com/office/drawing/2016/5/13/chartex" xmlns:cx8="http://schemas.microsoft.com/office/drawing/2016/5/14/chartex" xmlns:mc="http://schemas.openxmlformats.org/markup-compatibility/2006" xmlns:aink="http://schemas.microsoft.com/office/drawing/2016/ink" xmlns:am3d="http://schemas.microsoft.com/office/drawing/2017/model3d" xmlns:o="urn:schemas-microsoft-com:office:office" xmlns:oel="http://schemas.microsoft.com/office/2019/extlst" xmlns:r="http://schemas.openxmlformats.org/officeDocument/2006/relationships" xmlns:m="http://schemas.openxmlformats.org/officeDocument/2006/math" xmlns:v="urn:schemas-microsoft-com:vml" xmlns:wp14="http://schemas.microsoft.com/office/word/2010/wordprocessingDrawing" xmlns:wp="http://schemas.openxmlformats.org/drawingml/2006/wordprocessingDrawing" xmlns:w10="urn:schemas-microsoft-com:office:word" xmlns:w="http://schemas.openxmlformats.org/wordprocessingml/2006/main" xmlns:w14="http://schemas.microsoft.com/office/word/2010/wordml" xmlns:w15="http://schemas.microsoft.com/office/word/2012/wordml" xmlns:w16cex="http://schemas.microsoft.com/office/word/2018/wordml/cex" xmlns:w16cid="http://schemas.microsoft.com/office/word/2016/wordml/cid" xmlns:w16="http://schemas.microsoft.com/office/word/2018/wordml" xmlns:w16du="http://schemas.microsoft.com/office/word/2023/wordml/word16du" xmlns:w16sdtdh="http://schemas.microsoft.com/office/word/2020/wordml/sdtdatahash" xmlns:w16sdtfl="http://schemas.microsoft.com/office/word/2024/wordml/sdtformatlock" xmlns:w16se="http://schemas.microsoft.com/office/word/2015/wordml/symex" xmlns:wpg="http://schemas.microsoft.com/office/word/2010/wordprocessingGroup" xmlns:wpi="http://schemas.microsoft.com/office/word/2010/wordprocessingInk" xmlns:wne="http://schemas.microsoft.com/office/word/2006/wordml" xmlns:wps="http://schemas.microsoft.com/office/word/2010/wordprocessingShape" mc:Ignorable="w14 w15 w16se w16cid w16 w16cex w16sdtdh w16sdtfl w16du wp14">
+<w:hdr xmlns:wpc="http://schemas.microsoft.com/office/word/2010/wordprocessingCanvas" xmlns:cx="http://schemas.microsoft.com/office/drawing/2014/chartex" xmlns:cx1="http://schemas.microsoft.com/office/drawing/2015/9/8/chartex" xmlns:cx2="http://schemas.microsoft.com/office/drawing/2015/10/21/chartex" xmlns:cx3="http://schemas.microsoft.com/office/drawing/2016/5/9/chartex" xmlns:cx4="http://schemas.microsoft.com/office/drawing/2016/5/10/chartex" xmlns:cx5="http://schemas.microsoft.com/office/drawing/2016/5/11/chartex" xmlns:cx6="http://schemas.microsoft.com/office/drawing/2016/5/12/chartex" xmlns:cx7="http://schemas.microsoft.com/office/drawing/2016/5/13/chartex" xmlns:cx8="http://schemas.microsoft.com/office/drawing/2016/5/14/chartex" xmlns:mc="http://schemas.openxmlformats.org/markup-compatibility/2006" xmlns:aink="http://schemas.microsoft.com/office/drawing/2016/ink" xmlns:am3d="http://schemas.microsoft.com/office/drawing/2017/model3d" xmlns:o="urn:schemas-microsoft-com:office:office" xmlns:oel="http://schemas.microsoft.com/office/2019/extlst" xmlns:r="http://schemas.openxmlformats.org/officeDocument/2006/relationships" xmlns:m="http://schemas.openxmlformats.org/officeDocument/2006/math" xmlns:v="urn:schemas-microsoft-com:vml" xmlns:wp14="http://schemas.microsoft.com/office/word/2010/wordprocessingDrawing" xmlns:wp="http://schemas.openxmlformats.org/drawingml/2006/wordprocessingDrawing" xmlns:w10="urn:schemas-microsoft-com:office:word" xmlns:w="http://schemas.openxmlformats.org/wordprocessingml/2006/main" xmlns:w14="http://schemas.microsoft.com/office/word/2010/wordml" xmlns:w15="http://schemas.microsoft.com/office/word/2012/wordml" xmlns:w16cei="http://schemas.microsoft.com/office/word/2026/wordml/cei" xmlns:w16cex="http://schemas.microsoft.com/office/word/2018/wordml/cex" xmlns:w16cid="http://schemas.microsoft.com/office/word/2016/wordml/cid" xmlns:w16="http://schemas.microsoft.com/office/word/2018/wordml" xmlns:w16du="http://schemas.microsoft.com/office/word/2023/wordml/word16du" xmlns:w16sdtdh="http://schemas.microsoft.com/office/word/2020/wordml/sdtdatahash" xmlns:w16sdtfl="http://schemas.microsoft.com/office/word/2024/wordml/sdtformatlock" xmlns:w16se="http://schemas.microsoft.com/office/word/2015/wordml/symex" xmlns:wpg="http://schemas.microsoft.com/office/word/2010/wordprocessingGroup" xmlns:wpi="http://schemas.microsoft.com/office/word/2010/wordprocessingInk" xmlns:wne="http://schemas.microsoft.com/office/word/2006/wordml" xmlns:wps="http://schemas.microsoft.com/office/word/2010/wordprocessingShape" mc:Ignorable="w14 w15 w16se w16cid w16 w16cex w16sdtdh w16sdtfl w16du wp14">
   <w:p>
     <w:pPr>
       <w:pStyle w:val="Header"/>
@@ -4539,7 +4148,7 @@
 </file>
 
 <file path=word/header3.xml><?xml version="1.0" encoding="utf-8"?>
-<w:hdr xmlns:wpc="http://schemas.microsoft.com/office/word/2010/wordprocessingCanvas" xmlns:cx="http://schemas.microsoft.com/office/drawing/2014/chartex" xmlns:cx1="http://schemas.microsoft.com/office/drawing/2015/9/8/chartex" xmlns:cx2="http://schemas.microsoft.com/office/drawing/2015/10/21/chartex" xmlns:cx3="http://schemas.microsoft.com/office/drawing/2016/5/9/chartex" xmlns:cx4="http://schemas.microsoft.com/office/drawing/2016/5/10/chartex" xmlns:cx5="http://schemas.microsoft.com/office/drawing/2016/5/11/chartex" xmlns:cx6="http://schemas.microsoft.com/office/drawing/2016/5/12/chartex" xmlns:cx7="http://schemas.microsoft.com/office/drawing/2016/5/13/chartex" xmlns:cx8="http://schemas.microsoft.com/office/drawing/2016/5/14/chartex" xmlns:mc="http://schemas.openxmlformats.org/markup-compatibility/2006" xmlns:aink="http://schemas.microsoft.com/office/drawing/2016/ink" xmlns:am3d="http://schemas.microsoft.com/office/drawing/2017/model3d" xmlns:o="urn:schemas-microsoft-com:office:office" xmlns:oel="http://schemas.microsoft.com/office/2019/extlst" xmlns:r="http://schemas.openxmlformats.org/officeDocument/2006/relationships" xmlns:m="http://schemas.openxmlformats.org/officeDocument/2006/math" xmlns:v="urn:schemas-microsoft-com:vml" xmlns:wp14="http://schemas.microsoft.com/office/word/2010/wordprocessingDrawing" xmlns:wp="http://schemas.openxmlformats.org/drawingml/2006/wordprocessingDrawing" xmlns:w10="urn:schemas-microsoft-com:office:word" xmlns:w="http://schemas.openxmlformats.org/wordprocessingml/2006/main" xmlns:w14="http://schemas.microsoft.com/office/word/2010/wordml" xmlns:w15="http://schemas.microsoft.com/office/word/2012/wordml" xmlns:w16cex="http://schemas.microsoft.com/office/word/2018/wordml/cex" xmlns:w16cid="http://schemas.microsoft.com/office/word/2016/wordml/cid" xmlns:w16="http://schemas.microsoft.com/office/word/2018/wordml" xmlns:w16du="http://schemas.microsoft.com/office/word/2023/wordml/word16du" xmlns:w16sdtdh="http://schemas.microsoft.com/office/word/2020/wordml/sdtdatahash" xmlns:w16sdtfl="http://schemas.microsoft.com/office/word/2024/wordml/sdtformatlock" xmlns:w16se="http://schemas.microsoft.com/office/word/2015/wordml/symex" xmlns:wpg="http://schemas.microsoft.com/office/word/2010/wordprocessingGroup" xmlns:wpi="http://schemas.microsoft.com/office/word/2010/wordprocessingInk" xmlns:wne="http://schemas.microsoft.com/office/word/2006/wordml" xmlns:wps="http://schemas.microsoft.com/office/word/2010/wordprocessingShape" mc:Ignorable="w14 w15 w16se w16cid w16 w16cex w16sdtdh w16sdtfl w16du wp14">
+<w:hdr xmlns:wpc="http://schemas.microsoft.com/office/word/2010/wordprocessingCanvas" xmlns:cx="http://schemas.microsoft.com/office/drawing/2014/chartex" xmlns:cx1="http://schemas.microsoft.com/office/drawing/2015/9/8/chartex" xmlns:cx2="http://schemas.microsoft.com/office/drawing/2015/10/21/chartex" xmlns:cx3="http://schemas.microsoft.com/office/drawing/2016/5/9/chartex" xmlns:cx4="http://schemas.microsoft.com/office/drawing/2016/5/10/chartex" xmlns:cx5="http://schemas.microsoft.com/office/drawing/2016/5/11/chartex" xmlns:cx6="http://schemas.microsoft.com/office/drawing/2016/5/12/chartex" xmlns:cx7="http://schemas.microsoft.com/office/drawing/2016/5/13/chartex" xmlns:cx8="http://schemas.microsoft.com/office/drawing/2016/5/14/chartex" xmlns:mc="http://schemas.openxmlformats.org/markup-compatibility/2006" xmlns:aink="http://schemas.microsoft.com/office/drawing/2016/ink" xmlns:am3d="http://schemas.microsoft.com/office/drawing/2017/model3d" xmlns:o="urn:schemas-microsoft-com:office:office" xmlns:oel="http://schemas.microsoft.com/office/2019/extlst" xmlns:r="http://schemas.openxmlformats.org/officeDocument/2006/relationships" xmlns:m="http://schemas.openxmlformats.org/officeDocument/2006/math" xmlns:v="urn:schemas-microsoft-com:vml" xmlns:wp14="http://schemas.microsoft.com/office/word/2010/wordprocessingDrawing" xmlns:wp="http://schemas.openxmlformats.org/drawingml/2006/wordprocessingDrawing" xmlns:w10="urn:schemas-microsoft-com:office:word" xmlns:w="http://schemas.openxmlformats.org/wordprocessingml/2006/main" xmlns:w14="http://schemas.microsoft.com/office/word/2010/wordml" xmlns:w15="http://schemas.microsoft.com/office/word/2012/wordml" xmlns:w16cei="http://schemas.microsoft.com/office/word/2026/wordml/cei" xmlns:w16cex="http://schemas.microsoft.com/office/word/2018/wordml/cex" xmlns:w16cid="http://schemas.microsoft.com/office/word/2016/wordml/cid" xmlns:w16="http://schemas.microsoft.com/office/word/2018/wordml" xmlns:w16du="http://schemas.microsoft.com/office/word/2023/wordml/word16du" xmlns:w16sdtdh="http://schemas.microsoft.com/office/word/2020/wordml/sdtdatahash" xmlns:w16sdtfl="http://schemas.microsoft.com/office/word/2024/wordml/sdtformatlock" xmlns:w16se="http://schemas.microsoft.com/office/word/2015/wordml/symex" xmlns:wpg="http://schemas.microsoft.com/office/word/2010/wordprocessingGroup" xmlns:wpi="http://schemas.microsoft.com/office/word/2010/wordprocessingInk" xmlns:wne="http://schemas.microsoft.com/office/word/2006/wordml" xmlns:wps="http://schemas.microsoft.com/office/word/2010/wordprocessingShape" mc:Ignorable="w14 w15 w16se w16cid w16 w16cex w16sdtdh w16sdtfl w16du wp14">
   <w:p>
     <w:pPr>
       <w:pStyle w:val="Header"/>
@@ -4549,7 +4158,7 @@
 </file>
 
 <file path=word/numbering.xml><?xml version="1.0" encoding="utf-8"?>
-<w:numbering xmlns:wpc="http://schemas.microsoft.com/office/word/2010/wordprocessingCanvas" xmlns:cx="http://schemas.microsoft.com/office/drawing/2014/chartex" xmlns:cx1="http://schemas.microsoft.com/office/drawing/2015/9/8/chartex" xmlns:cx2="http://schemas.microsoft.com/office/drawing/2015/10/21/chartex" xmlns:cx3="http://schemas.microsoft.com/office/drawing/2016/5/9/chartex" xmlns:cx4="http://schemas.microsoft.com/office/drawing/2016/5/10/chartex" xmlns:cx5="http://schemas.microsoft.com/office/drawing/2016/5/11/chartex" xmlns:cx6="http://schemas.microsoft.com/office/drawing/2016/5/12/chartex" xmlns:cx7="http://schemas.microsoft.com/office/drawing/2016/5/13/chartex" xmlns:cx8="http://schemas.microsoft.com/office/drawing/2016/5/14/chartex" xmlns:mc="http://schemas.openxmlformats.org/markup-compatibility/2006" xmlns:aink="http://schemas.microsoft.com/office/drawing/2016/ink" xmlns:am3d="http://schemas.microsoft.com/office/drawing/2017/model3d" xmlns:o="urn:schemas-microsoft-com:office:office" xmlns:oel="http://schemas.microsoft.com/office/2019/extlst" xmlns:r="http://schemas.openxmlformats.org/officeDocument/2006/relationships" xmlns:m="http://schemas.openxmlformats.org/officeDocument/2006/math" xmlns:v="urn:schemas-microsoft-com:vml" xmlns:wp14="http://schemas.microsoft.com/office/word/2010/wordprocessingDrawing" xmlns:wp="http://schemas.openxmlformats.org/drawingml/2006/wordprocessingDrawing" xmlns:w10="urn:schemas-microsoft-com:office:word" xmlns:w="http://schemas.openxmlformats.org/wordprocessingml/2006/main" xmlns:w14="http://schemas.microsoft.com/office/word/2010/wordml" xmlns:w15="http://schemas.microsoft.com/office/word/2012/wordml" xmlns:w16cex="http://schemas.microsoft.com/office/word/2018/wordml/cex" xmlns:w16cid="http://schemas.microsoft.com/office/word/2016/wordml/cid" xmlns:w16="http://schemas.microsoft.com/office/word/2018/wordml" xmlns:w16du="http://schemas.microsoft.com/office/word/2023/wordml/word16du" xmlns:w16sdtdh="http://schemas.microsoft.com/office/word/2020/wordml/sdtdatahash" xmlns:w16sdtfl="http://schemas.microsoft.com/office/word/2024/wordml/sdtformatlock" xmlns:w16se="http://schemas.microsoft.com/office/word/2015/wordml/symex" xmlns:wpg="http://schemas.microsoft.com/office/word/2010/wordprocessingGroup" xmlns:wpi="http://schemas.microsoft.com/office/word/2010/wordprocessingInk" xmlns:wne="http://schemas.microsoft.com/office/word/2006/wordml" xmlns:wps="http://schemas.microsoft.com/office/word/2010/wordprocessingShape" mc:Ignorable="w14 w15 w16se w16cid w16 w16cex w16sdtdh w16sdtfl w16du wp14">
+<w:numbering xmlns:wpc="http://schemas.microsoft.com/office/word/2010/wordprocessingCanvas" xmlns:cx="http://schemas.microsoft.com/office/drawing/2014/chartex" xmlns:cx1="http://schemas.microsoft.com/office/drawing/2015/9/8/chartex" xmlns:cx2="http://schemas.microsoft.com/office/drawing/2015/10/21/chartex" xmlns:cx3="http://schemas.microsoft.com/office/drawing/2016/5/9/chartex" xmlns:cx4="http://schemas.microsoft.com/office/drawing/2016/5/10/chartex" xmlns:cx5="http://schemas.microsoft.com/office/drawing/2016/5/11/chartex" xmlns:cx6="http://schemas.microsoft.com/office/drawing/2016/5/12/chartex" xmlns:cx7="http://schemas.microsoft.com/office/drawing/2016/5/13/chartex" xmlns:cx8="http://schemas.microsoft.com/office/drawing/2016/5/14/chartex" xmlns:mc="http://schemas.openxmlformats.org/markup-compatibility/2006" xmlns:aink="http://schemas.microsoft.com/office/drawing/2016/ink" xmlns:am3d="http://schemas.microsoft.com/office/drawing/2017/model3d" xmlns:o="urn:schemas-microsoft-com:office:office" xmlns:oel="http://schemas.microsoft.com/office/2019/extlst" xmlns:r="http://schemas.openxmlformats.org/officeDocument/2006/relationships" xmlns:m="http://schemas.openxmlformats.org/officeDocument/2006/math" xmlns:v="urn:schemas-microsoft-com:vml" xmlns:wp14="http://schemas.microsoft.com/office/word/2010/wordprocessingDrawing" xmlns:wp="http://schemas.openxmlformats.org/drawingml/2006/wordprocessingDrawing" xmlns:w10="urn:schemas-microsoft-com:office:word" xmlns:w="http://schemas.openxmlformats.org/wordprocessingml/2006/main" xmlns:w14="http://schemas.microsoft.com/office/word/2010/wordml" xmlns:w15="http://schemas.microsoft.com/office/word/2012/wordml" xmlns:w16cei="http://schemas.microsoft.com/office/word/2026/wordml/cei" xmlns:w16cex="http://schemas.microsoft.com/office/word/2018/wordml/cex" xmlns:w16cid="http://schemas.microsoft.com/office/word/2016/wordml/cid" xmlns:w16="http://schemas.microsoft.com/office/word/2018/wordml" xmlns:w16du="http://schemas.microsoft.com/office/word/2023/wordml/word16du" xmlns:w16sdtdh="http://schemas.microsoft.com/office/word/2020/wordml/sdtdatahash" xmlns:w16sdtfl="http://schemas.microsoft.com/office/word/2024/wordml/sdtformatlock" xmlns:w16se="http://schemas.microsoft.com/office/word/2015/wordml/symex" xmlns:wpg="http://schemas.microsoft.com/office/word/2010/wordprocessingGroup" xmlns:wpi="http://schemas.microsoft.com/office/word/2010/wordprocessingInk" xmlns:wne="http://schemas.microsoft.com/office/word/2006/wordml" xmlns:wps="http://schemas.microsoft.com/office/word/2010/wordprocessingShape" mc:Ignorable="w14 w15 w16se w16cid w16 w16cex w16sdtdh w16sdtfl w16du wp14">
   <w:abstractNum w:abstractNumId="0" w15:restartNumberingAfterBreak="0">
     <w:nsid w:val="56246D06"/>
     <w:multiLevelType w:val="hybridMultilevel"/>
@@ -4564,7 +4173,7 @@
         <w:jc w:val="left"/>
       </w:pPr>
       <w:rPr>
-        <w:rFonts w:hint="default" w:ascii="BC Sans" w:hAnsi="BC Sans" w:eastAsia="BC Sans" w:cs="BC Sans"/>
+        <w:rFonts w:ascii="BC Sans" w:eastAsia="BC Sans" w:hAnsi="BC Sans" w:cs="BC Sans" w:hint="default"/>
         <w:b/>
         <w:bCs/>
         <w:i w:val="0"/>
@@ -4587,7 +4196,7 @@
         <w:jc w:val="left"/>
       </w:pPr>
       <w:rPr>
-        <w:rFonts w:hint="default" w:ascii="BC Sans" w:hAnsi="BC Sans" w:eastAsia="BC Sans" w:cs="BC Sans"/>
+        <w:rFonts w:ascii="BC Sans" w:eastAsia="BC Sans" w:hAnsi="BC Sans" w:cs="BC Sans" w:hint="default"/>
         <w:b w:val="0"/>
         <w:bCs w:val="0"/>
         <w:i w:val="0"/>
@@ -4696,7 +4305,7 @@
   <w:docDefaults>
     <w:rPrDefault>
       <w:rPr>
-        <w:rFonts w:asciiTheme="minorHAnsi" w:hAnsiTheme="minorHAnsi" w:eastAsiaTheme="minorHAnsi" w:cstheme="minorBidi"/>
+        <w:rFonts w:asciiTheme="minorHAnsi" w:eastAsiaTheme="minorHAnsi" w:hAnsiTheme="minorHAnsi" w:cstheme="minorBidi"/>
         <w:sz w:val="22"/>
         <w:szCs w:val="22"/>
         <w:lang w:val="en-US" w:eastAsia="en-US" w:bidi="ar-SA"/>
@@ -4713,14 +4322,14 @@
   <w:latentStyles w:defLockedState="0" w:defUIPriority="99" w:defSemiHidden="0" w:defUnhideWhenUsed="0" w:defQFormat="0" w:count="376">
     <w:lsdException w:name="Normal" w:uiPriority="0" w:qFormat="1"/>
     <w:lsdException w:name="heading 1" w:uiPriority="9" w:qFormat="1"/>
-    <w:lsdException w:name="heading 2" w:uiPriority="9" w:semiHidden="1" w:unhideWhenUsed="1" w:qFormat="1"/>
-    <w:lsdException w:name="heading 3" w:uiPriority="9" w:semiHidden="1" w:unhideWhenUsed="1" w:qFormat="1"/>
-    <w:lsdException w:name="heading 4" w:uiPriority="9" w:semiHidden="1" w:unhideWhenUsed="1" w:qFormat="1"/>
-    <w:lsdException w:name="heading 5" w:uiPriority="9" w:semiHidden="1" w:unhideWhenUsed="1" w:qFormat="1"/>
-    <w:lsdException w:name="heading 6" w:uiPriority="9" w:semiHidden="1" w:unhideWhenUsed="1" w:qFormat="1"/>
-    <w:lsdException w:name="heading 7" w:uiPriority="9" w:semiHidden="1" w:unhideWhenUsed="1" w:qFormat="1"/>
-    <w:lsdException w:name="heading 8" w:uiPriority="9" w:semiHidden="1" w:unhideWhenUsed="1" w:qFormat="1"/>
-    <w:lsdException w:name="heading 9" w:uiPriority="9" w:semiHidden="1" w:unhideWhenUsed="1" w:qFormat="1"/>
+    <w:lsdException w:name="heading 2" w:semiHidden="1" w:uiPriority="9" w:unhideWhenUsed="1" w:qFormat="1"/>
+    <w:lsdException w:name="heading 3" w:semiHidden="1" w:uiPriority="9" w:unhideWhenUsed="1" w:qFormat="1"/>
+    <w:lsdException w:name="heading 4" w:semiHidden="1" w:uiPriority="9" w:unhideWhenUsed="1" w:qFormat="1"/>
+    <w:lsdException w:name="heading 5" w:semiHidden="1" w:uiPriority="9" w:unhideWhenUsed="1" w:qFormat="1"/>
+    <w:lsdException w:name="heading 6" w:semiHidden="1" w:uiPriority="9" w:unhideWhenUsed="1" w:qFormat="1"/>
+    <w:lsdException w:name="heading 7" w:semiHidden="1" w:uiPriority="9" w:unhideWhenUsed="1" w:qFormat="1"/>
+    <w:lsdException w:name="heading 8" w:semiHidden="1" w:uiPriority="9" w:unhideWhenUsed="1" w:qFormat="1"/>
+    <w:lsdException w:name="heading 9" w:semiHidden="1" w:uiPriority="9" w:unhideWhenUsed="1" w:qFormat="1"/>
     <w:lsdException w:name="index 1" w:semiHidden="1" w:unhideWhenUsed="1"/>
     <w:lsdException w:name="index 2" w:semiHidden="1" w:unhideWhenUsed="1"/>
     <w:lsdException w:name="index 3" w:semiHidden="1" w:unhideWhenUsed="1"/>
@@ -4730,22 +4339,22 @@
     <w:lsdException w:name="index 7" w:semiHidden="1" w:unhideWhenUsed="1"/>
     <w:lsdException w:name="index 8" w:semiHidden="1" w:unhideWhenUsed="1"/>
     <w:lsdException w:name="index 9" w:semiHidden="1" w:unhideWhenUsed="1"/>
-    <w:lsdException w:name="toc 1" w:uiPriority="39" w:semiHidden="1" w:unhideWhenUsed="1"/>
-    <w:lsdException w:name="toc 2" w:uiPriority="39" w:semiHidden="1" w:unhideWhenUsed="1"/>
-    <w:lsdException w:name="toc 3" w:uiPriority="39" w:semiHidden="1" w:unhideWhenUsed="1"/>
-    <w:lsdException w:name="toc 4" w:uiPriority="39" w:semiHidden="1" w:unhideWhenUsed="1"/>
-    <w:lsdException w:name="toc 5" w:uiPriority="39" w:semiHidden="1" w:unhideWhenUsed="1"/>
-    <w:lsdException w:name="toc 6" w:uiPriority="39" w:semiHidden="1" w:unhideWhenUsed="1"/>
-    <w:lsdException w:name="toc 7" w:uiPriority="39" w:semiHidden="1" w:unhideWhenUsed="1"/>
-    <w:lsdException w:name="toc 8" w:uiPriority="39" w:semiHidden="1" w:unhideWhenUsed="1"/>
-    <w:lsdException w:name="toc 9" w:uiPriority="39" w:semiHidden="1" w:unhideWhenUsed="1"/>
+    <w:lsdException w:name="toc 1" w:semiHidden="1" w:uiPriority="39" w:unhideWhenUsed="1"/>
+    <w:lsdException w:name="toc 2" w:semiHidden="1" w:uiPriority="39" w:unhideWhenUsed="1"/>
+    <w:lsdException w:name="toc 3" w:semiHidden="1" w:uiPriority="39" w:unhideWhenUsed="1"/>
+    <w:lsdException w:name="toc 4" w:semiHidden="1" w:uiPriority="39" w:unhideWhenUsed="1"/>
+    <w:lsdException w:name="toc 5" w:semiHidden="1" w:uiPriority="39" w:unhideWhenUsed="1"/>
+    <w:lsdException w:name="toc 6" w:semiHidden="1" w:uiPriority="39" w:unhideWhenUsed="1"/>
+    <w:lsdException w:name="toc 7" w:semiHidden="1" w:uiPriority="39" w:unhideWhenUsed="1"/>
+    <w:lsdException w:name="toc 8" w:semiHidden="1" w:uiPriority="39" w:unhideWhenUsed="1"/>
+    <w:lsdException w:name="toc 9" w:semiHidden="1" w:uiPriority="39" w:unhideWhenUsed="1"/>
     <w:lsdException w:name="Normal Indent" w:semiHidden="1" w:unhideWhenUsed="1"/>
     <w:lsdException w:name="footnote text" w:semiHidden="1" w:unhideWhenUsed="1"/>
     <w:lsdException w:name="annotation text" w:semiHidden="1" w:unhideWhenUsed="1"/>
     <w:lsdException w:name="header" w:semiHidden="1" w:unhideWhenUsed="1"/>
     <w:lsdException w:name="footer" w:semiHidden="1" w:unhideWhenUsed="1"/>
     <w:lsdException w:name="index heading" w:semiHidden="1" w:unhideWhenUsed="1"/>
-    <w:lsdException w:name="caption" w:uiPriority="35" w:semiHidden="1" w:unhideWhenUsed="1" w:qFormat="1"/>
+    <w:lsdException w:name="caption" w:semiHidden="1" w:uiPriority="35" w:unhideWhenUsed="1" w:qFormat="1"/>
     <w:lsdException w:name="table of figures" w:semiHidden="1" w:unhideWhenUsed="1"/>
     <w:lsdException w:name="envelope address" w:semiHidden="1" w:unhideWhenUsed="1"/>
     <w:lsdException w:name="envelope return" w:semiHidden="1" w:unhideWhenUsed="1"/>
@@ -4776,7 +4385,7 @@
     <w:lsdException w:name="Title" w:uiPriority="10" w:qFormat="1"/>
     <w:lsdException w:name="Closing" w:semiHidden="1" w:unhideWhenUsed="1"/>
     <w:lsdException w:name="Signature" w:semiHidden="1" w:unhideWhenUsed="1"/>
-    <w:lsdException w:name="Default Paragraph Font" w:uiPriority="1" w:semiHidden="1" w:unhideWhenUsed="1"/>
+    <w:lsdException w:name="Default Paragraph Font" w:semiHidden="1" w:uiPriority="1" w:unhideWhenUsed="1"/>
     <w:lsdException w:name="Body Text" w:semiHidden="1" w:unhideWhenUsed="1"/>
     <w:lsdException w:name="Body Text Indent" w:semiHidden="1" w:unhideWhenUsed="1"/>
     <w:lsdException w:name="List Continue" w:semiHidden="1" w:unhideWhenUsed="1"/>
@@ -4976,8 +4585,8 @@
     <w:lsdException w:name="Subtle Reference" w:uiPriority="31" w:qFormat="1"/>
     <w:lsdException w:name="Intense Reference" w:uiPriority="32" w:qFormat="1"/>
     <w:lsdException w:name="Book Title" w:uiPriority="33" w:qFormat="1"/>
-    <w:lsdException w:name="Bibliography" w:uiPriority="37" w:semiHidden="1" w:unhideWhenUsed="1"/>
-    <w:lsdException w:name="TOC Heading" w:uiPriority="39" w:semiHidden="1" w:unhideWhenUsed="1" w:qFormat="1"/>
+    <w:lsdException w:name="Bibliography" w:semiHidden="1" w:uiPriority="37" w:unhideWhenUsed="1"/>
+    <w:lsdException w:name="TOC Heading" w:semiHidden="1" w:uiPriority="39" w:unhideWhenUsed="1" w:qFormat="1"/>
     <w:lsdException w:name="Plain Table 1" w:uiPriority="41"/>
     <w:lsdException w:name="Plain Table 2" w:uiPriority="42"/>
     <w:lsdException w:name="Plain Table 3" w:uiPriority="43"/>
@@ -5088,11 +4697,11 @@
     <w:lsdException w:name="Unresolved Mention" w:semiHidden="1" w:unhideWhenUsed="1"/>
     <w:lsdException w:name="Smart Link" w:semiHidden="1" w:unhideWhenUsed="1"/>
   </w:latentStyles>
-  <w:style w:type="paragraph" w:styleId="Normal" w:default="1">
+  <w:style w:type="paragraph" w:default="1" w:styleId="Normal">
     <w:name w:val="Normal"/>
     <w:qFormat/>
     <w:rPr>
-      <w:rFonts w:ascii="BC Sans" w:hAnsi="BC Sans" w:eastAsia="BC Sans" w:cs="BC Sans"/>
+      <w:rFonts w:ascii="BC Sans" w:eastAsia="BC Sans" w:hAnsi="BC Sans" w:cs="BC Sans"/>
     </w:rPr>
   </w:style>
   <w:style w:type="paragraph" w:styleId="Heading1">
@@ -5160,13 +4769,13 @@
       <w:szCs w:val="21"/>
     </w:rPr>
   </w:style>
-  <w:style w:type="character" w:styleId="DefaultParagraphFont" w:default="1">
+  <w:style w:type="character" w:default="1" w:styleId="DefaultParagraphFont">
     <w:name w:val="Default Paragraph Font"/>
     <w:uiPriority w:val="1"/>
     <w:semiHidden/>
     <w:unhideWhenUsed/>
   </w:style>
-  <w:style w:type="table" w:styleId="TableNormal" w:default="1">
+  <w:style w:type="table" w:default="1" w:styleId="TableNormal">
     <w:name w:val="Normal Table"/>
     <w:uiPriority w:val="99"/>
     <w:semiHidden/>
@@ -5181,7 +4790,7 @@
       </w:tblCellMar>
     </w:tblPr>
   </w:style>
-  <w:style w:type="numbering" w:styleId="NoList" w:default="1">
+  <w:style w:type="numbering" w:default="1" w:styleId="NoList">
     <w:name w:val="No List"/>
     <w:uiPriority w:val="99"/>
     <w:semiHidden/>
@@ -5207,7 +4816,7 @@
       <w:ind w:left="888" w:hanging="300"/>
     </w:pPr>
   </w:style>
-  <w:style w:type="paragraph" w:styleId="TableParagraph" w:customStyle="1">
+  <w:style w:type="paragraph" w:customStyle="1" w:styleId="TableParagraph">
     <w:name w:val="Table Paragraph"/>
     <w:basedOn w:val="Normal"/>
     <w:uiPriority w:val="1"/>
@@ -5227,14 +4836,14 @@
       </w:tabs>
     </w:pPr>
   </w:style>
-  <w:style w:type="character" w:styleId="HeaderChar" w:customStyle="1">
+  <w:style w:type="character" w:customStyle="1" w:styleId="HeaderChar">
     <w:name w:val="Header Char"/>
     <w:basedOn w:val="DefaultParagraphFont"/>
     <w:link w:val="Header"/>
     <w:uiPriority w:val="99"/>
     <w:rsid w:val="00A0192E"/>
     <w:rPr>
-      <w:rFonts w:ascii="BC Sans" w:hAnsi="BC Sans" w:eastAsia="BC Sans" w:cs="BC Sans"/>
+      <w:rFonts w:ascii="BC Sans" w:eastAsia="BC Sans" w:hAnsi="BC Sans" w:cs="BC Sans"/>
     </w:rPr>
   </w:style>
   <w:style w:type="paragraph" w:styleId="Footer">
@@ -5251,14 +4860,14 @@
       </w:tabs>
     </w:pPr>
   </w:style>
-  <w:style w:type="character" w:styleId="FooterChar" w:customStyle="1">
+  <w:style w:type="character" w:customStyle="1" w:styleId="FooterChar">
     <w:name w:val="Footer Char"/>
     <w:basedOn w:val="DefaultParagraphFont"/>
     <w:link w:val="Footer"/>
     <w:uiPriority w:val="99"/>
     <w:rsid w:val="00A0192E"/>
     <w:rPr>
-      <w:rFonts w:ascii="BC Sans" w:hAnsi="BC Sans" w:eastAsia="BC Sans" w:cs="BC Sans"/>
+      <w:rFonts w:ascii="BC Sans" w:eastAsia="BC Sans" w:hAnsi="BC Sans" w:cs="BC Sans"/>
     </w:rPr>
   </w:style>
 </w:styles>
@@ -5548,12 +5157,6 @@
 </file>
 
 <file path=customXml/item1.xml><?xml version="1.0" encoding="utf-8"?>
-<p:properties xmlns:p="http://schemas.microsoft.com/office/2006/metadata/properties" xmlns:xsi="http://www.w3.org/2001/XMLSchema-instance" xmlns:pc="http://schemas.microsoft.com/office/infopath/2007/PartnerControls">
-  <documentManagement/>
-</p:properties>
-</file>
-
-<file path=customXml/item2.xml><?xml version="1.0" encoding="utf-8"?>
 <?mso-contentType ?>
 <FormTemplates xmlns="http://schemas.microsoft.com/sharepoint/v3/contenttype/forms">
   <Display>DocumentLibraryForm</Display>
@@ -5562,7 +5165,7 @@
 </FormTemplates>
 </file>
 
-<file path=customXml/item3.xml><?xml version="1.0" encoding="utf-8"?>
+<file path=customXml/item2.xml><?xml version="1.0" encoding="utf-8"?>
 <ct:contentTypeSchema xmlns:ct="http://schemas.microsoft.com/office/2006/metadata/contentType" xmlns:ma="http://schemas.microsoft.com/office/2006/metadata/properties/metaAttributes" ct:_="" ma:_="" ma:contentTypeName="Document" ma:contentTypeID="0x010100509BE9200A38E64D9D18C153BE6F8B4F" ma:contentTypeVersion="3" ma:contentTypeDescription="Create a new document." ma:contentTypeScope="" ma:versionID="f98e03e7cfcf3df5a098c23cb7aa5017">
   <xsd:schema xmlns:xsd="http://www.w3.org/2001/XMLSchema" xmlns:xs="http://www.w3.org/2001/XMLSchema" xmlns:p="http://schemas.microsoft.com/office/2006/metadata/properties" xmlns:ns2="8f7b6709-ac4f-46eb-8fb3-db1e9e84870e" targetNamespace="http://schemas.microsoft.com/office/2006/metadata/properties" ma:root="true" ma:fieldsID="4b9ae4755b89800b76703b35e57b8845" ns2:_="">
     <xsd:import namespace="8f7b6709-ac4f-46eb-8fb3-db1e9e84870e"/>
@@ -5700,16 +5303,13 @@
 </ct:contentTypeSchema>
 </file>
 
-<file path=customXml/itemProps1.xml><?xml version="1.0" encoding="utf-8"?>
-<ds:datastoreItem xmlns:ds="http://schemas.openxmlformats.org/officeDocument/2006/customXml" ds:itemID="{FB28D713-AE56-4600-A1B5-878C5B119E51}">
-  <ds:schemaRefs>
-    <ds:schemaRef ds:uri="http://schemas.microsoft.com/office/2006/metadata/properties"/>
-    <ds:schemaRef ds:uri="http://schemas.microsoft.com/office/infopath/2007/PartnerControls"/>
-  </ds:schemaRefs>
-</ds:datastoreItem>
+<file path=customXml/item3.xml><?xml version="1.0" encoding="utf-8"?>
+<p:properties xmlns:p="http://schemas.microsoft.com/office/2006/metadata/properties" xmlns:xsi="http://www.w3.org/2001/XMLSchema-instance" xmlns:pc="http://schemas.microsoft.com/office/infopath/2007/PartnerControls">
+  <documentManagement/>
+</p:properties>
 </file>
 
-<file path=customXml/itemProps2.xml><?xml version="1.0" encoding="utf-8"?>
+<file path=customXml/itemProps1.xml><?xml version="1.0" encoding="utf-8"?>
 <ds:datastoreItem xmlns:ds="http://schemas.openxmlformats.org/officeDocument/2006/customXml" ds:itemID="{CC456AED-91D3-415B-ACC0-E9510B41E420}">
   <ds:schemaRefs>
     <ds:schemaRef ds:uri="http://schemas.microsoft.com/sharepoint/v3/contenttype/forms"/>
@@ -5717,6 +5317,29 @@
 </ds:datastoreItem>
 </file>
 
+<file path=customXml/itemProps2.xml><?xml version="1.0" encoding="utf-8"?>
+<ds:datastoreItem xmlns:ds="http://schemas.openxmlformats.org/officeDocument/2006/customXml" ds:itemID="{F31AED45-8785-46FC-8033-C7ADF9FCDC31}">
+  <ds:schemaRefs>
+    <ds:schemaRef ds:uri="http://schemas.microsoft.com/office/2006/metadata/contentType"/>
+    <ds:schemaRef ds:uri="http://schemas.microsoft.com/office/2006/metadata/properties/metaAttributes"/>
+    <ds:schemaRef ds:uri="http://www.w3.org/2001/XMLSchema"/>
+    <ds:schemaRef ds:uri="http://schemas.microsoft.com/office/2006/metadata/properties"/>
+    <ds:schemaRef ds:uri="8f7b6709-ac4f-46eb-8fb3-db1e9e84870e"/>
+    <ds:schemaRef ds:uri="http://schemas.microsoft.com/office/2006/documentManagement/types"/>
+    <ds:schemaRef ds:uri="http://schemas.microsoft.com/office/infopath/2007/PartnerControls"/>
+    <ds:schemaRef ds:uri="http://schemas.openxmlformats.org/package/2006/metadata/core-properties"/>
+    <ds:schemaRef ds:uri="http://purl.org/dc/elements/1.1/"/>
+    <ds:schemaRef ds:uri="http://purl.org/dc/terms/"/>
+    <ds:schemaRef ds:uri="http://schemas.microsoft.com/internal/obd"/>
+  </ds:schemaRefs>
+</ds:datastoreItem>
+</file>
+
 <file path=customXml/itemProps3.xml><?xml version="1.0" encoding="utf-8"?>
-<ds:datastoreItem xmlns:ds="http://schemas.openxmlformats.org/officeDocument/2006/customXml" ds:itemID="{F31AED45-8785-46FC-8033-C7ADF9FCDC31}"/>
+<ds:datastoreItem xmlns:ds="http://schemas.openxmlformats.org/officeDocument/2006/customXml" ds:itemID="{FB28D713-AE56-4600-A1B5-878C5B119E51}">
+  <ds:schemaRefs>
+    <ds:schemaRef ds:uri="http://schemas.microsoft.com/office/2006/metadata/properties"/>
+    <ds:schemaRef ds:uri="http://schemas.microsoft.com/office/infopath/2007/PartnerControls"/>
+  </ds:schemaRefs>
+</ds:datastoreItem>
 </file>
</xml_diff>

<commit_message>
Updated formatting in templates (#140)
* updated templates

* updated PGT
</commit_message>
<xml_diff>
--- a/api/Templates/P1.docx
+++ b/api/Templates/P1.docx
@@ -1,6 +1,6 @@
 
 <file path=word/document.xml><?xml version="1.0" encoding="utf-8"?>
-<w:document xmlns:wpc="http://schemas.microsoft.com/office/word/2010/wordprocessingCanvas" xmlns:cx="http://schemas.microsoft.com/office/drawing/2014/chartex" xmlns:cx1="http://schemas.microsoft.com/office/drawing/2015/9/8/chartex" xmlns:cx2="http://schemas.microsoft.com/office/drawing/2015/10/21/chartex" xmlns:cx3="http://schemas.microsoft.com/office/drawing/2016/5/9/chartex" xmlns:cx4="http://schemas.microsoft.com/office/drawing/2016/5/10/chartex" xmlns:cx5="http://schemas.microsoft.com/office/drawing/2016/5/11/chartex" xmlns:cx6="http://schemas.microsoft.com/office/drawing/2016/5/12/chartex" xmlns:cx7="http://schemas.microsoft.com/office/drawing/2016/5/13/chartex" xmlns:cx8="http://schemas.microsoft.com/office/drawing/2016/5/14/chartex" xmlns:mc="http://schemas.openxmlformats.org/markup-compatibility/2006" xmlns:m="http://schemas.openxmlformats.org/officeDocument/2006/math" xmlns:aink="http://schemas.microsoft.com/office/drawing/2016/ink" xmlns:am3d="http://schemas.microsoft.com/office/drawing/2017/model3d" xmlns:oel="http://schemas.microsoft.com/office/2019/extlst" xmlns:r="http://schemas.openxmlformats.org/officeDocument/2006/relationships" xmlns:wp14="http://schemas.microsoft.com/office/word/2010/wordprocessingDrawing" xmlns:wp="http://schemas.openxmlformats.org/drawingml/2006/wordprocessingDrawing" xmlns:wpg="http://schemas.microsoft.com/office/word/2010/wordprocessingGroup" xmlns:wpi="http://schemas.microsoft.com/office/word/2010/wordprocessingInk" xmlns:wps="http://schemas.microsoft.com/office/word/2010/wordprocessingShape" xmlns:o="urn:schemas-microsoft-com:office:office" xmlns:v="urn:schemas-microsoft-com:vml" xmlns:w10="urn:schemas-microsoft-com:office:word" xmlns:w="http://schemas.openxmlformats.org/wordprocessingml/2006/main" xmlns:w14="http://schemas.microsoft.com/office/word/2010/wordml" xmlns:w15="http://schemas.microsoft.com/office/word/2012/wordml" xmlns:w16cei="http://schemas.microsoft.com/office/word/2026/wordml/cei" xmlns:w16cex="http://schemas.microsoft.com/office/word/2018/wordml/cex" xmlns:w16cid="http://schemas.microsoft.com/office/word/2016/wordml/cid" xmlns:w16="http://schemas.microsoft.com/office/word/2018/wordml" xmlns:w16sdtdh="http://schemas.microsoft.com/office/word/2020/wordml/sdtdatahash" xmlns:w16sdtfl="http://schemas.microsoft.com/office/word/2024/wordml/sdtformatlock" xmlns:w16se="http://schemas.microsoft.com/office/word/2015/wordml/symex" xmlns:w16du="http://schemas.microsoft.com/office/word/2023/wordml/word16du" xmlns:wne="http://schemas.microsoft.com/office/word/2006/wordml" mc:Ignorable="w14 w15 w16se w16cid w16 w16cex w16sdtdh w16sdtfl w16du wp14">
+<w:document xmlns:wpc="http://schemas.microsoft.com/office/word/2010/wordprocessingCanvas" xmlns:cx="http://schemas.microsoft.com/office/drawing/2014/chartex" xmlns:cx1="http://schemas.microsoft.com/office/drawing/2015/9/8/chartex" xmlns:cx2="http://schemas.microsoft.com/office/drawing/2015/10/21/chartex" xmlns:cx3="http://schemas.microsoft.com/office/drawing/2016/5/9/chartex" xmlns:cx4="http://schemas.microsoft.com/office/drawing/2016/5/10/chartex" xmlns:cx5="http://schemas.microsoft.com/office/drawing/2016/5/11/chartex" xmlns:cx6="http://schemas.microsoft.com/office/drawing/2016/5/12/chartex" xmlns:cx7="http://schemas.microsoft.com/office/drawing/2016/5/13/chartex" xmlns:cx8="http://schemas.microsoft.com/office/drawing/2016/5/14/chartex" xmlns:mc="http://schemas.openxmlformats.org/markup-compatibility/2006" xmlns:aink="http://schemas.microsoft.com/office/drawing/2016/ink" xmlns:am3d="http://schemas.microsoft.com/office/drawing/2017/model3d" xmlns:o="urn:schemas-microsoft-com:office:office" xmlns:oel="http://schemas.microsoft.com/office/2019/extlst" xmlns:r="http://schemas.openxmlformats.org/officeDocument/2006/relationships" xmlns:m="http://schemas.openxmlformats.org/officeDocument/2006/math" xmlns:v="urn:schemas-microsoft-com:vml" xmlns:wp14="http://schemas.microsoft.com/office/word/2010/wordprocessingDrawing" xmlns:wp="http://schemas.openxmlformats.org/drawingml/2006/wordprocessingDrawing" xmlns:w10="urn:schemas-microsoft-com:office:word" xmlns:w="http://schemas.openxmlformats.org/wordprocessingml/2006/main" xmlns:w14="http://schemas.microsoft.com/office/word/2010/wordml" xmlns:w15="http://schemas.microsoft.com/office/word/2012/wordml" xmlns:w16cex="http://schemas.microsoft.com/office/word/2018/wordml/cex" xmlns:w16cid="http://schemas.microsoft.com/office/word/2016/wordml/cid" xmlns:w16="http://schemas.microsoft.com/office/word/2018/wordml" xmlns:w16du="http://schemas.microsoft.com/office/word/2023/wordml/word16du" xmlns:w16sdtdh="http://schemas.microsoft.com/office/word/2020/wordml/sdtdatahash" xmlns:w16sdtfl="http://schemas.microsoft.com/office/word/2024/wordml/sdtformatlock" xmlns:w16se="http://schemas.microsoft.com/office/word/2015/wordml/symex" xmlns:wpg="http://schemas.microsoft.com/office/word/2010/wordprocessingGroup" xmlns:wpi="http://schemas.microsoft.com/office/word/2010/wordprocessingInk" xmlns:wne="http://schemas.microsoft.com/office/word/2006/wordml" xmlns:wps="http://schemas.microsoft.com/office/word/2010/wordprocessingShape" mc:Ignorable="w14 w15 w16se w16cid w16 w16cex w16sdtdh w16sdtfl w16du wp14">
   <w:body>
     <w:p>
       <w:pPr>
@@ -275,23 +275,7 @@
           <w:b/>
           <w:bCs/>
         </w:rPr>
-        <w:t>{</w:t>
-      </w:r>
-      <w:proofErr w:type="gramStart"/>
-      <w:r>
-        <w:rPr>
-          <w:b/>
-          <w:bCs/>
-        </w:rPr>
-        <w:t>d.applicant</w:t>
-      </w:r>
-      <w:proofErr w:type="gramEnd"/>
-      <w:r>
-        <w:rPr>
-          <w:b/>
-          <w:bCs/>
-        </w:rPr>
-        <w:t>.applicantName}</w:t>
+        <w:t>{d.applicant.applicantName}</w:t>
       </w:r>
       <w:r>
         <w:rPr>
@@ -391,23 +375,7 @@
           <w:b/>
           <w:bCs/>
         </w:rPr>
-        <w:t>{</w:t>
-      </w:r>
-      <w:proofErr w:type="gramStart"/>
-      <w:r>
-        <w:rPr>
-          <w:b/>
-          <w:bCs/>
-        </w:rPr>
-        <w:t>d.applicant</w:t>
-      </w:r>
-      <w:proofErr w:type="gramEnd"/>
-      <w:r>
-        <w:rPr>
-          <w:b/>
-          <w:bCs/>
-        </w:rPr>
-        <w:t>.applicantCourthouse</w:t>
+        <w:t>{d.applicant.applicantCourthouse</w:t>
       </w:r>
       <w:r>
         <w:rPr>
@@ -518,36 +486,8 @@
           <w:sz w:val="20"/>
           <w:szCs w:val="20"/>
         </w:rPr>
-        <w:t xml:space="preserve"> {</w:t>
-      </w:r>
-      <w:proofErr w:type="gramStart"/>
-      <w:r>
-        <w:rPr>
-          <w:color w:val="313131"/>
-          <w:sz w:val="20"/>
-          <w:szCs w:val="20"/>
-        </w:rPr>
-        <w:t>d.deceasedDeathDate</w:t>
-      </w:r>
-      <w:proofErr w:type="gramEnd"/>
-      <w:r>
-        <w:rPr>
-          <w:color w:val="313131"/>
-          <w:sz w:val="20"/>
-          <w:szCs w:val="20"/>
-        </w:rPr>
-        <w:t>:</w:t>
-      </w:r>
-      <w:proofErr w:type="gramStart"/>
-      <w:r>
-        <w:rPr>
-          <w:color w:val="313131"/>
-          <w:sz w:val="20"/>
-          <w:szCs w:val="20"/>
-        </w:rPr>
-        <w:t>formatD(</w:t>
-      </w:r>
-      <w:proofErr w:type="gramEnd"/>
+        <w:t xml:space="preserve"> {d.deceasedDeathDate:formatD(</w:t>
+      </w:r>
       <w:r>
         <w:rPr>
           <w:color w:val="313131"/>
@@ -610,7 +550,6 @@
         <w:t>{</w:t>
       </w:r>
       <w:proofErr w:type="spellStart"/>
-      <w:proofErr w:type="gramStart"/>
       <w:r>
         <w:rPr>
           <w:b/>
@@ -619,7 +558,6 @@
         <w:t>d.deceasedName</w:t>
       </w:r>
       <w:proofErr w:type="spellEnd"/>
-      <w:proofErr w:type="gramEnd"/>
       <w:r>
         <w:rPr>
           <w:b/>
@@ -735,7 +673,6 @@
         <w:t>{</w:t>
       </w:r>
       <w:proofErr w:type="spellStart"/>
-      <w:proofErr w:type="gramStart"/>
       <w:r>
         <w:rPr>
           <w:b/>
@@ -745,7 +682,6 @@
         <w:t>d.deceasedAddressStreet</w:t>
       </w:r>
       <w:proofErr w:type="spellEnd"/>
-      <w:proofErr w:type="gramEnd"/>
       <w:r>
         <w:rPr>
           <w:b/>
@@ -755,7 +691,6 @@
         <w:t>}, {</w:t>
       </w:r>
       <w:proofErr w:type="spellStart"/>
-      <w:proofErr w:type="gramStart"/>
       <w:r>
         <w:rPr>
           <w:b/>
@@ -765,7 +700,6 @@
         <w:t>d.deceasedAddressCity</w:t>
       </w:r>
       <w:proofErr w:type="spellEnd"/>
-      <w:proofErr w:type="gramEnd"/>
       <w:r>
         <w:rPr>
           <w:b/>
@@ -791,7 +725,6 @@
         <w:t>{</w:t>
       </w:r>
       <w:proofErr w:type="spellStart"/>
-      <w:proofErr w:type="gramStart"/>
       <w:r>
         <w:rPr>
           <w:b/>
@@ -815,26 +748,84 @@
           <w:bCs/>
           <w:lang w:val="fr-FR"/>
         </w:rPr>
+        <w:t xml:space="preserve">{d. </w:t>
+      </w:r>
+      <w:proofErr w:type="spellStart"/>
+      <w:r>
+        <w:rPr>
+          <w:b/>
+          <w:bCs/>
+          <w:lang w:val="fr-FR"/>
+        </w:rPr>
+        <w:t>deceasedAddressState</w:t>
+      </w:r>
+      <w:proofErr w:type="spellEnd"/>
+      <w:r>
+        <w:rPr>
+          <w:b/>
+          <w:bCs/>
+          <w:lang w:val="fr-FR"/>
+        </w:rPr>
+        <w:t>}</w:t>
+      </w:r>
+      <w:r>
+        <w:rPr>
+          <w:b/>
+          <w:bCs/>
+          <w:lang w:val="fr-FR"/>
+        </w:rPr>
         <w:t>{</w:t>
       </w:r>
-      <w:proofErr w:type="gramEnd"/>
+      <w:proofErr w:type="spellStart"/>
       <w:r>
         <w:rPr>
           <w:b/>
           <w:bCs/>
           <w:lang w:val="fr-FR"/>
         </w:rPr>
-        <w:t xml:space="preserve">d. </w:t>
+        <w:t>d.</w:t>
+      </w:r>
+      <w:r>
+        <w:rPr>
+          <w:b/>
+          <w:bCs/>
+          <w:lang w:val="fr-FR"/>
+        </w:rPr>
+        <w:t>deceasedAddressProvinceText</w:t>
+      </w:r>
+      <w:proofErr w:type="spellEnd"/>
+      <w:r>
+        <w:rPr>
+          <w:b/>
+          <w:bCs/>
+          <w:lang w:val="fr-FR"/>
+        </w:rPr>
+        <w:t>}</w:t>
+      </w:r>
+      <w:r>
+        <w:rPr>
+          <w:b/>
+          <w:bCs/>
+          <w:lang w:val="fr-FR"/>
+        </w:rPr>
+        <w:t xml:space="preserve">, </w:t>
+      </w:r>
+      <w:r>
+        <w:rPr>
+          <w:b/>
+          <w:bCs/>
+          <w:lang w:val="fr-FR"/>
+        </w:rPr>
+        <w:t>{</w:t>
       </w:r>
       <w:proofErr w:type="spellStart"/>
-      <w:proofErr w:type="gramStart"/>
       <w:r>
         <w:rPr>
           <w:b/>
           <w:bCs/>
           <w:lang w:val="fr-FR"/>
         </w:rPr>
-        <w:t>deceasedAddressState</w:t>
+        <w:t>d.deceasedAddressPostalCode</w:t>
       </w:r>
       <w:proofErr w:type="spellEnd"/>
       <w:r>
@@ -851,6 +842,13 @@
           <w:bCs/>
           <w:lang w:val="fr-FR"/>
         </w:rPr>
+        <w:t xml:space="preserve">, </w:t>
+      </w:r>
+      <w:r>
+        <w:rPr>
+          <w:b/>
+          <w:bCs/>
+        </w:rPr>
         <w:t>{</w:t>
       </w:r>
       <w:proofErr w:type="spellStart"/>
@@ -858,7 +856,6 @@
         <w:rPr>
           <w:b/>
           <w:bCs/>
-          <w:lang w:val="fr-FR"/>
         </w:rPr>
         <w:t>d.</w:t>
       </w:r>
@@ -866,89 +863,10 @@
         <w:rPr>
           <w:b/>
           <w:bCs/>
-          <w:lang w:val="fr-FR"/>
-        </w:rPr>
-        <w:t>deceasedAddressProvinceText</w:t>
+        </w:rPr>
+        <w:t>deceasedAddressCountry</w:t>
       </w:r>
       <w:proofErr w:type="spellEnd"/>
-      <w:proofErr w:type="gramEnd"/>
-      <w:r>
-        <w:rPr>
-          <w:b/>
-          <w:bCs/>
-          <w:lang w:val="fr-FR"/>
-        </w:rPr>
-        <w:t>}</w:t>
-      </w:r>
-      <w:r>
-        <w:rPr>
-          <w:b/>
-          <w:bCs/>
-          <w:lang w:val="fr-FR"/>
-        </w:rPr>
-        <w:t xml:space="preserve">, </w:t>
-      </w:r>
-      <w:r>
-        <w:rPr>
-          <w:b/>
-          <w:bCs/>
-          <w:lang w:val="fr-FR"/>
-        </w:rPr>
-        <w:t>{</w:t>
-      </w:r>
-      <w:proofErr w:type="spellStart"/>
-      <w:proofErr w:type="gramStart"/>
-      <w:r>
-        <w:rPr>
-          <w:b/>
-          <w:bCs/>
-          <w:lang w:val="fr-FR"/>
-        </w:rPr>
-        <w:t>d.deceasedAddressPostalCode</w:t>
-      </w:r>
-      <w:proofErr w:type="spellEnd"/>
-      <w:proofErr w:type="gramEnd"/>
-      <w:r>
-        <w:rPr>
-          <w:b/>
-          <w:bCs/>
-          <w:lang w:val="fr-FR"/>
-        </w:rPr>
-        <w:t>}</w:t>
-      </w:r>
-      <w:r>
-        <w:rPr>
-          <w:b/>
-          <w:bCs/>
-          <w:lang w:val="fr-FR"/>
-        </w:rPr>
-        <w:t xml:space="preserve">, </w:t>
-      </w:r>
-      <w:r>
-        <w:rPr>
-          <w:b/>
-          <w:bCs/>
-        </w:rPr>
-        <w:t>{</w:t>
-      </w:r>
-      <w:proofErr w:type="spellStart"/>
-      <w:proofErr w:type="gramStart"/>
-      <w:r>
-        <w:rPr>
-          <w:b/>
-          <w:bCs/>
-        </w:rPr>
-        <w:t>d.</w:t>
-      </w:r>
-      <w:r>
-        <w:rPr>
-          <w:b/>
-          <w:bCs/>
-        </w:rPr>
-        <w:t>deceasedAddressCountry</w:t>
-      </w:r>
-      <w:proofErr w:type="spellEnd"/>
-      <w:proofErr w:type="gramEnd"/>
       <w:r>
         <w:rPr>
           <w:b/>
@@ -2571,7 +2489,6 @@
           <w:color w:val="313131"/>
           <w:sz w:val="20"/>
         </w:rPr>
-        <w:lastRenderedPageBreak/>
         <w:t>If an authorization to obtain estate information issues to the applicant, the applicant may apply for a grant without further notice.</w:t>
       </w:r>
     </w:p>
@@ -2613,6 +2530,8 @@
       <w:r>
         <w:rPr>
           <w:color w:val="313131"/>
+          <w:sz w:val="27"/>
+          <w:szCs w:val="27"/>
         </w:rPr>
         <w:t>INFORMATION</w:t>
       </w:r>
@@ -2620,12 +2539,16 @@
         <w:rPr>
           <w:color w:val="313131"/>
           <w:spacing w:val="-8"/>
-        </w:rPr>
-        <w:t xml:space="preserve"> </w:t>
-      </w:r>
-      <w:r>
-        <w:rPr>
-          <w:color w:val="313131"/>
+          <w:sz w:val="27"/>
+          <w:szCs w:val="27"/>
+        </w:rPr>
+        <w:t xml:space="preserve"> </w:t>
+      </w:r>
+      <w:r>
+        <w:rPr>
+          <w:color w:val="313131"/>
+          <w:sz w:val="27"/>
+          <w:szCs w:val="27"/>
         </w:rPr>
         <w:t>ABOUT</w:t>
       </w:r>
@@ -2633,12 +2556,16 @@
         <w:rPr>
           <w:color w:val="313131"/>
           <w:spacing w:val="-7"/>
-        </w:rPr>
-        <w:t xml:space="preserve"> </w:t>
-      </w:r>
-      <w:r>
-        <w:rPr>
-          <w:color w:val="313131"/>
+          <w:sz w:val="27"/>
+          <w:szCs w:val="27"/>
+        </w:rPr>
+        <w:t xml:space="preserve"> </w:t>
+      </w:r>
+      <w:r>
+        <w:rPr>
+          <w:color w:val="313131"/>
+          <w:sz w:val="27"/>
+          <w:szCs w:val="27"/>
         </w:rPr>
         <w:t>EACH</w:t>
       </w:r>
@@ -2646,6 +2573,8 @@
         <w:rPr>
           <w:color w:val="313131"/>
           <w:spacing w:val="-7"/>
+          <w:sz w:val="27"/>
+          <w:szCs w:val="27"/>
         </w:rPr>
         <w:t xml:space="preserve"> </w:t>
       </w:r>
@@ -2653,6 +2582,8 @@
         <w:rPr>
           <w:color w:val="313131"/>
           <w:spacing w:val="-2"/>
+          <w:sz w:val="27"/>
+          <w:szCs w:val="27"/>
         </w:rPr>
         <w:t>APPLICANT</w:t>
       </w:r>
@@ -3188,6 +3119,8 @@
       <w:r>
         <w:rPr>
           <w:color w:val="313131"/>
+          <w:sz w:val="27"/>
+          <w:szCs w:val="27"/>
         </w:rPr>
         <w:t>INFORMATION</w:t>
       </w:r>
@@ -3195,12 +3128,16 @@
         <w:rPr>
           <w:color w:val="313131"/>
           <w:spacing w:val="-9"/>
-        </w:rPr>
-        <w:t xml:space="preserve"> </w:t>
-      </w:r>
-      <w:r>
-        <w:rPr>
-          <w:color w:val="313131"/>
+          <w:sz w:val="27"/>
+          <w:szCs w:val="27"/>
+        </w:rPr>
+        <w:t xml:space="preserve"> </w:t>
+      </w:r>
+      <w:r>
+        <w:rPr>
+          <w:color w:val="313131"/>
+          <w:sz w:val="27"/>
+          <w:szCs w:val="27"/>
         </w:rPr>
         <w:t>FOR</w:t>
       </w:r>
@@ -3208,6 +3145,8 @@
         <w:rPr>
           <w:color w:val="313131"/>
           <w:spacing w:val="-8"/>
+          <w:sz w:val="27"/>
+          <w:szCs w:val="27"/>
         </w:rPr>
         <w:t xml:space="preserve"> </w:t>
       </w:r>
@@ -3215,6 +3154,8 @@
         <w:rPr>
           <w:color w:val="313131"/>
           <w:spacing w:val="-2"/>
+          <w:sz w:val="27"/>
+          <w:szCs w:val="27"/>
         </w:rPr>
         <w:t>SERVICE</w:t>
       </w:r>
@@ -3270,26 +3211,16 @@
         <w:t>{</w:t>
       </w:r>
       <w:proofErr w:type="spellStart"/>
-      <w:proofErr w:type="gramStart"/>
-      <w:r>
-        <w:t>d.applicant</w:t>
-      </w:r>
-      <w:proofErr w:type="gramEnd"/>
-      <w:r>
-        <w:t>.applicantServiceAddressStreet</w:t>
+      <w:r>
+        <w:t>d.applicant.applicantServiceAddressStreet</w:t>
       </w:r>
       <w:proofErr w:type="spellEnd"/>
       <w:r>
         <w:t>}, {</w:t>
       </w:r>
       <w:proofErr w:type="spellStart"/>
-      <w:proofErr w:type="gramStart"/>
-      <w:r>
-        <w:t>d.applicant</w:t>
-      </w:r>
-      <w:proofErr w:type="gramEnd"/>
-      <w:r>
-        <w:t>.applicantServiceAddressCity</w:t>
+      <w:r>
+        <w:t>d.applicant.applicantServiceAddressCity</w:t>
       </w:r>
       <w:proofErr w:type="spellEnd"/>
       <w:r>
@@ -3299,83 +3230,49 @@
         <w:t xml:space="preserve"> </w:t>
       </w:r>
       <w:r>
+        <w:t>{d.applicant.applicantServiceAddressProvince}</w:t>
+      </w:r>
+      <w:r>
+        <w:t>{d.applicant.applicantServiceAddressState}</w:t>
+      </w:r>
+      <w:r>
+        <w:t>{d.</w:t>
+      </w:r>
+      <w:r>
+        <w:t>applicant.</w:t>
+      </w:r>
+      <w:r>
+        <w:t>applicantServiceAddressProvinceText</w:t>
+      </w:r>
+      <w:r>
+        <w:t>}</w:t>
+      </w:r>
+      <w:r>
+        <w:t xml:space="preserve">, </w:t>
+      </w:r>
+      <w:r>
         <w:t>{</w:t>
       </w:r>
-      <w:proofErr w:type="gramStart"/>
-      <w:r>
-        <w:t>d.applicant</w:t>
-      </w:r>
-      <w:proofErr w:type="gramEnd"/>
-      <w:r>
-        <w:t>.</w:t>
-      </w:r>
-      <w:proofErr w:type="gramStart"/>
-      <w:r>
-        <w:t>applicantServiceAddressProvince}</w:t>
-      </w:r>
-      <w:r>
-        <w:t>{d.applicant</w:t>
-      </w:r>
-      <w:proofErr w:type="gramEnd"/>
-      <w:r>
-        <w:t>.</w:t>
-      </w:r>
-      <w:proofErr w:type="gramStart"/>
-      <w:r>
-        <w:t>applicantServiceAddressState}</w:t>
-      </w:r>
-      <w:r>
-        <w:t>{d.</w:t>
-      </w:r>
-      <w:r>
-        <w:t>applicant</w:t>
-      </w:r>
-      <w:proofErr w:type="gramEnd"/>
-      <w:r>
-        <w:t>.</w:t>
-      </w:r>
-      <w:r>
-        <w:t>applicantServiceAddressProvinceText</w:t>
-      </w:r>
+      <w:proofErr w:type="spellStart"/>
+      <w:r>
+        <w:t>d.applicant.applicantServiceAddressPostalCode</w:t>
+      </w:r>
+      <w:proofErr w:type="spellEnd"/>
       <w:r>
         <w:t>}</w:t>
       </w:r>
       <w:r>
-        <w:t xml:space="preserve">, </w:t>
+        <w:t>,</w:t>
+      </w:r>
+      <w:r>
+        <w:t xml:space="preserve"> </w:t>
       </w:r>
       <w:r>
         <w:t>{</w:t>
       </w:r>
       <w:proofErr w:type="spellStart"/>
-      <w:proofErr w:type="gramStart"/>
-      <w:r>
-        <w:t>d.applicant</w:t>
-      </w:r>
-      <w:proofErr w:type="gramEnd"/>
-      <w:r>
-        <w:t>.applicantServiceAddressPostalCode</w:t>
-      </w:r>
-      <w:proofErr w:type="spellEnd"/>
-      <w:r>
-        <w:t>}</w:t>
-      </w:r>
-      <w:r>
-        <w:t>,</w:t>
-      </w:r>
-      <w:r>
-        <w:t xml:space="preserve"> </w:t>
-      </w:r>
-      <w:r>
-        <w:t>{</w:t>
-      </w:r>
-      <w:proofErr w:type="spellStart"/>
-      <w:proofErr w:type="gramStart"/>
-      <w:r>
-        <w:t>d.applicant</w:t>
-      </w:r>
-      <w:proofErr w:type="gramEnd"/>
-      <w:r>
-        <w:t>.applicantServiceAddressCountry</w:t>
+      <w:r>
+        <w:t>d.applicant.applicantServiceAddressCountry</w:t>
       </w:r>
       <w:proofErr w:type="spellEnd"/>
       <w:r>
@@ -3430,23 +3327,7 @@
           <w:b/>
           <w:bCs/>
         </w:rPr>
-        <w:t>{</w:t>
-      </w:r>
-      <w:proofErr w:type="gramStart"/>
-      <w:r>
-        <w:rPr>
-          <w:b/>
-          <w:bCs/>
-        </w:rPr>
-        <w:t>d.applicant</w:t>
-      </w:r>
-      <w:proofErr w:type="gramEnd"/>
-      <w:r>
-        <w:rPr>
-          <w:b/>
-          <w:bCs/>
-        </w:rPr>
-        <w:t>.applicantServicePhone}</w:t>
+        <w:t>{d.applicant.applicantServicePhone}</w:t>
       </w:r>
     </w:p>
     <w:p>
@@ -3500,21 +3381,12 @@
         <w:t>{</w:t>
       </w:r>
       <w:proofErr w:type="spellStart"/>
-      <w:proofErr w:type="gramStart"/>
-      <w:r>
-        <w:rPr>
-          <w:b/>
-          <w:bCs/>
-        </w:rPr>
-        <w:t>d.applicant</w:t>
-      </w:r>
-      <w:proofErr w:type="gramEnd"/>
-      <w:r>
-        <w:rPr>
-          <w:b/>
-          <w:bCs/>
-        </w:rPr>
-        <w:t>.applicantServiceEmai</w:t>
+      <w:r>
+        <w:rPr>
+          <w:b/>
+          <w:bCs/>
+        </w:rPr>
+        <w:t>d.applicant.applicantServiceEmai</w:t>
       </w:r>
       <w:r>
         <w:rPr>
@@ -3542,32 +3414,14 @@
         <w:t>{</w:t>
       </w:r>
       <w:proofErr w:type="spellStart"/>
-      <w:proofErr w:type="gramStart"/>
-      <w:r>
-        <w:rPr>
-          <w:b/>
-          <w:bCs/>
-        </w:rPr>
-        <w:t>d.applicant</w:t>
-      </w:r>
-      <w:proofErr w:type="gramEnd"/>
-      <w:r>
-        <w:rPr>
-          <w:b/>
-          <w:bCs/>
-        </w:rPr>
-        <w:t>.</w:t>
-      </w:r>
-      <w:proofErr w:type="gramStart"/>
-      <w:r>
-        <w:rPr>
-          <w:b/>
-          <w:bCs/>
-        </w:rPr>
-        <w:t>applicantHasFax:ifEQ</w:t>
+      <w:r>
+        <w:rPr>
+          <w:b/>
+          <w:bCs/>
+        </w:rPr>
+        <w:t>d.applicant.applicantHasFax:ifEQ</w:t>
       </w:r>
       <w:proofErr w:type="spellEnd"/>
-      <w:proofErr w:type="gramEnd"/>
       <w:r>
         <w:rPr>
           <w:b/>
@@ -3584,7 +3438,6 @@
         <w:t>yes'</w:t>
       </w:r>
       <w:proofErr w:type="spellEnd"/>
-      <w:proofErr w:type="gramStart"/>
       <w:r>
         <w:rPr>
           <w:b/>
@@ -3608,7 +3461,6 @@
         <w:t>showBegin</w:t>
       </w:r>
       <w:proofErr w:type="spellEnd"/>
-      <w:proofErr w:type="gramEnd"/>
       <w:r>
         <w:rPr>
           <w:b/>
@@ -3645,32 +3497,15 @@
           <w:b/>
           <w:bCs/>
         </w:rPr>
-        <w:t>{</w:t>
-      </w:r>
-      <w:proofErr w:type="gramStart"/>
-      <w:r>
-        <w:rPr>
-          <w:b/>
-          <w:bCs/>
-        </w:rPr>
-        <w:t>d.</w:t>
-      </w:r>
-      <w:r>
-        <w:rPr>
-          <w:b/>
-          <w:bCs/>
-        </w:rPr>
-        <w:t>applicant</w:t>
-      </w:r>
-      <w:proofErr w:type="gramEnd"/>
-      <w:r>
-        <w:rPr>
-          <w:b/>
-          <w:bCs/>
-        </w:rPr>
-        <w:t>.</w:t>
-      </w:r>
-      <w:proofErr w:type="gramStart"/>
+        <w:t>{d.</w:t>
+      </w:r>
+      <w:r>
+        <w:rPr>
+          <w:b/>
+          <w:bCs/>
+        </w:rPr>
+        <w:t>applicant.</w:t>
+      </w:r>
       <w:r>
         <w:rPr>
           <w:b/>
@@ -3683,23 +3518,7 @@
           <w:b/>
           <w:bCs/>
         </w:rPr>
-        <w:t>d.applicant</w:t>
-      </w:r>
-      <w:proofErr w:type="gramEnd"/>
-      <w:r>
-        <w:rPr>
-          <w:b/>
-          <w:bCs/>
-        </w:rPr>
-        <w:t>.</w:t>
-      </w:r>
-      <w:proofErr w:type="gramStart"/>
-      <w:r>
-        <w:rPr>
-          <w:b/>
-          <w:bCs/>
-        </w:rPr>
-        <w:t>applicantHasFax</w:t>
+        <w:t>d.applicant.applicantHasFax</w:t>
       </w:r>
       <w:r>
         <w:rPr>
@@ -3708,7 +3527,6 @@
         </w:rPr>
         <w:t>:showEnd</w:t>
       </w:r>
-      <w:proofErr w:type="gramEnd"/>
       <w:r>
         <w:rPr>
           <w:b/>
@@ -3769,7 +3587,6 @@
               <w:t>{</w:t>
             </w:r>
             <w:proofErr w:type="spellStart"/>
-            <w:proofErr w:type="gramStart"/>
             <w:r>
               <w:rPr>
                 <w:b/>
@@ -3779,7 +3596,6 @@
               <w:t>c.now:formatD</w:t>
             </w:r>
             <w:proofErr w:type="spellEnd"/>
-            <w:proofErr w:type="gramEnd"/>
             <w:r>
               <w:rPr>
                 <w:b/>
@@ -3829,23 +3645,13 @@
               <w:t>{</w:t>
             </w:r>
             <w:proofErr w:type="spellStart"/>
-            <w:proofErr w:type="gramStart"/>
             <w:r>
               <w:rPr>
                 <w:b/>
                 <w:bCs/>
                 <w:u w:val="single"/>
               </w:rPr>
-              <w:t>d.applicant</w:t>
-            </w:r>
-            <w:proofErr w:type="gramEnd"/>
-            <w:r>
-              <w:rPr>
-                <w:b/>
-                <w:bCs/>
-                <w:u w:val="single"/>
-              </w:rPr>
-              <w:t>.applicantName</w:t>
+              <w:t>d.applicant.applicantName</w:t>
             </w:r>
             <w:proofErr w:type="spellEnd"/>
             <w:r>
@@ -3895,19 +3701,11 @@
               <w:t>{</w:t>
             </w:r>
             <w:proofErr w:type="spellStart"/>
-            <w:proofErr w:type="gramStart"/>
             <w:r>
               <w:rPr>
                 <w:color w:val="313131"/>
               </w:rPr>
-              <w:t>d.applicant</w:t>
-            </w:r>
-            <w:proofErr w:type="gramEnd"/>
-            <w:r>
-              <w:rPr>
-                <w:color w:val="313131"/>
-              </w:rPr>
-              <w:t>.applicantName</w:t>
+              <w:t>d.applicant.applicantName</w:t>
             </w:r>
             <w:proofErr w:type="spellEnd"/>
             <w:r>
@@ -3936,7 +3734,7 @@
 </file>
 
 <file path=word/endnotes.xml><?xml version="1.0" encoding="utf-8"?>
-<w:endnotes xmlns:wpc="http://schemas.microsoft.com/office/word/2010/wordprocessingCanvas" xmlns:cx="http://schemas.microsoft.com/office/drawing/2014/chartex" xmlns:cx1="http://schemas.microsoft.com/office/drawing/2015/9/8/chartex" xmlns:cx2="http://schemas.microsoft.com/office/drawing/2015/10/21/chartex" xmlns:cx3="http://schemas.microsoft.com/office/drawing/2016/5/9/chartex" xmlns:cx4="http://schemas.microsoft.com/office/drawing/2016/5/10/chartex" xmlns:cx5="http://schemas.microsoft.com/office/drawing/2016/5/11/chartex" xmlns:cx6="http://schemas.microsoft.com/office/drawing/2016/5/12/chartex" xmlns:cx7="http://schemas.microsoft.com/office/drawing/2016/5/13/chartex" xmlns:cx8="http://schemas.microsoft.com/office/drawing/2016/5/14/chartex" xmlns:mc="http://schemas.openxmlformats.org/markup-compatibility/2006" xmlns:m="http://schemas.openxmlformats.org/officeDocument/2006/math" xmlns:aink="http://schemas.microsoft.com/office/drawing/2016/ink" xmlns:am3d="http://schemas.microsoft.com/office/drawing/2017/model3d" xmlns:oel="http://schemas.microsoft.com/office/2019/extlst" xmlns:r="http://schemas.openxmlformats.org/officeDocument/2006/relationships" xmlns:wp14="http://schemas.microsoft.com/office/word/2010/wordprocessingDrawing" xmlns:wp="http://schemas.openxmlformats.org/drawingml/2006/wordprocessingDrawing" xmlns:wpg="http://schemas.microsoft.com/office/word/2010/wordprocessingGroup" xmlns:wpi="http://schemas.microsoft.com/office/word/2010/wordprocessingInk" xmlns:wps="http://schemas.microsoft.com/office/word/2010/wordprocessingShape" xmlns:o="urn:schemas-microsoft-com:office:office" xmlns:v="urn:schemas-microsoft-com:vml" xmlns:w10="urn:schemas-microsoft-com:office:word" xmlns:w="http://schemas.openxmlformats.org/wordprocessingml/2006/main" xmlns:w14="http://schemas.microsoft.com/office/word/2010/wordml" xmlns:w15="http://schemas.microsoft.com/office/word/2012/wordml" xmlns:w16cei="http://schemas.microsoft.com/office/word/2026/wordml/cei" xmlns:w16cex="http://schemas.microsoft.com/office/word/2018/wordml/cex" xmlns:w16cid="http://schemas.microsoft.com/office/word/2016/wordml/cid" xmlns:w16="http://schemas.microsoft.com/office/word/2018/wordml" xmlns:w16sdtdh="http://schemas.microsoft.com/office/word/2020/wordml/sdtdatahash" xmlns:w16sdtfl="http://schemas.microsoft.com/office/word/2024/wordml/sdtformatlock" xmlns:w16se="http://schemas.microsoft.com/office/word/2015/wordml/symex" xmlns:w16du="http://schemas.microsoft.com/office/word/2023/wordml/word16du" xmlns:wne="http://schemas.microsoft.com/office/word/2006/wordml" mc:Ignorable="w14 w15 w16se w16cid w16 w16cex w16sdtdh w16sdtfl w16du wp14">
+<w:endnotes xmlns:wpc="http://schemas.microsoft.com/office/word/2010/wordprocessingCanvas" xmlns:cx="http://schemas.microsoft.com/office/drawing/2014/chartex" xmlns:cx1="http://schemas.microsoft.com/office/drawing/2015/9/8/chartex" xmlns:cx2="http://schemas.microsoft.com/office/drawing/2015/10/21/chartex" xmlns:cx3="http://schemas.microsoft.com/office/drawing/2016/5/9/chartex" xmlns:cx4="http://schemas.microsoft.com/office/drawing/2016/5/10/chartex" xmlns:cx5="http://schemas.microsoft.com/office/drawing/2016/5/11/chartex" xmlns:cx6="http://schemas.microsoft.com/office/drawing/2016/5/12/chartex" xmlns:cx7="http://schemas.microsoft.com/office/drawing/2016/5/13/chartex" xmlns:cx8="http://schemas.microsoft.com/office/drawing/2016/5/14/chartex" xmlns:mc="http://schemas.openxmlformats.org/markup-compatibility/2006" xmlns:aink="http://schemas.microsoft.com/office/drawing/2016/ink" xmlns:am3d="http://schemas.microsoft.com/office/drawing/2017/model3d" xmlns:o="urn:schemas-microsoft-com:office:office" xmlns:oel="http://schemas.microsoft.com/office/2019/extlst" xmlns:r="http://schemas.openxmlformats.org/officeDocument/2006/relationships" xmlns:m="http://schemas.openxmlformats.org/officeDocument/2006/math" xmlns:v="urn:schemas-microsoft-com:vml" xmlns:wp14="http://schemas.microsoft.com/office/word/2010/wordprocessingDrawing" xmlns:wp="http://schemas.openxmlformats.org/drawingml/2006/wordprocessingDrawing" xmlns:w10="urn:schemas-microsoft-com:office:word" xmlns:w="http://schemas.openxmlformats.org/wordprocessingml/2006/main" xmlns:w14="http://schemas.microsoft.com/office/word/2010/wordml" xmlns:w15="http://schemas.microsoft.com/office/word/2012/wordml" xmlns:w16cex="http://schemas.microsoft.com/office/word/2018/wordml/cex" xmlns:w16cid="http://schemas.microsoft.com/office/word/2016/wordml/cid" xmlns:w16="http://schemas.microsoft.com/office/word/2018/wordml" xmlns:w16du="http://schemas.microsoft.com/office/word/2023/wordml/word16du" xmlns:w16sdtdh="http://schemas.microsoft.com/office/word/2020/wordml/sdtdatahash" xmlns:w16sdtfl="http://schemas.microsoft.com/office/word/2024/wordml/sdtformatlock" xmlns:w16se="http://schemas.microsoft.com/office/word/2015/wordml/symex" xmlns:wpg="http://schemas.microsoft.com/office/word/2010/wordprocessingGroup" xmlns:wpi="http://schemas.microsoft.com/office/word/2010/wordprocessingInk" xmlns:wne="http://schemas.microsoft.com/office/word/2006/wordml" xmlns:wps="http://schemas.microsoft.com/office/word/2010/wordprocessingShape" mc:Ignorable="w14 w15 w16se w16cid w16 w16cex w16sdtdh w16sdtfl w16du wp14">
   <w:endnote w:type="separator" w:id="-1">
     <w:p>
       <w:r>
@@ -3955,7 +3753,7 @@
 </file>
 
 <file path=word/footer1.xml><?xml version="1.0" encoding="utf-8"?>
-<w:ftr xmlns:wpc="http://schemas.microsoft.com/office/word/2010/wordprocessingCanvas" xmlns:cx="http://schemas.microsoft.com/office/drawing/2014/chartex" xmlns:cx1="http://schemas.microsoft.com/office/drawing/2015/9/8/chartex" xmlns:cx2="http://schemas.microsoft.com/office/drawing/2015/10/21/chartex" xmlns:cx3="http://schemas.microsoft.com/office/drawing/2016/5/9/chartex" xmlns:cx4="http://schemas.microsoft.com/office/drawing/2016/5/10/chartex" xmlns:cx5="http://schemas.microsoft.com/office/drawing/2016/5/11/chartex" xmlns:cx6="http://schemas.microsoft.com/office/drawing/2016/5/12/chartex" xmlns:cx7="http://schemas.microsoft.com/office/drawing/2016/5/13/chartex" xmlns:cx8="http://schemas.microsoft.com/office/drawing/2016/5/14/chartex" xmlns:mc="http://schemas.openxmlformats.org/markup-compatibility/2006" xmlns:m="http://schemas.openxmlformats.org/officeDocument/2006/math" xmlns:aink="http://schemas.microsoft.com/office/drawing/2016/ink" xmlns:am3d="http://schemas.microsoft.com/office/drawing/2017/model3d" xmlns:oel="http://schemas.microsoft.com/office/2019/extlst" xmlns:r="http://schemas.openxmlformats.org/officeDocument/2006/relationships" xmlns:wp14="http://schemas.microsoft.com/office/word/2010/wordprocessingDrawing" xmlns:wp="http://schemas.openxmlformats.org/drawingml/2006/wordprocessingDrawing" xmlns:wpg="http://schemas.microsoft.com/office/word/2010/wordprocessingGroup" xmlns:wpi="http://schemas.microsoft.com/office/word/2010/wordprocessingInk" xmlns:wps="http://schemas.microsoft.com/office/word/2010/wordprocessingShape" xmlns:o="urn:schemas-microsoft-com:office:office" xmlns:v="urn:schemas-microsoft-com:vml" xmlns:w10="urn:schemas-microsoft-com:office:word" xmlns:w="http://schemas.openxmlformats.org/wordprocessingml/2006/main" xmlns:w14="http://schemas.microsoft.com/office/word/2010/wordml" xmlns:w15="http://schemas.microsoft.com/office/word/2012/wordml" xmlns:w16cei="http://schemas.microsoft.com/office/word/2026/wordml/cei" xmlns:w16cex="http://schemas.microsoft.com/office/word/2018/wordml/cex" xmlns:w16cid="http://schemas.microsoft.com/office/word/2016/wordml/cid" xmlns:w16="http://schemas.microsoft.com/office/word/2018/wordml" xmlns:w16sdtdh="http://schemas.microsoft.com/office/word/2020/wordml/sdtdatahash" xmlns:w16sdtfl="http://schemas.microsoft.com/office/word/2024/wordml/sdtformatlock" xmlns:w16se="http://schemas.microsoft.com/office/word/2015/wordml/symex" xmlns:w16du="http://schemas.microsoft.com/office/word/2023/wordml/word16du" xmlns:wne="http://schemas.microsoft.com/office/word/2006/wordml" mc:Ignorable="w14 w15 w16se w16cid w16 w16cex w16sdtdh w16sdtfl w16du wp14">
+<w:ftr xmlns:wpc="http://schemas.microsoft.com/office/word/2010/wordprocessingCanvas" xmlns:cx="http://schemas.microsoft.com/office/drawing/2014/chartex" xmlns:cx1="http://schemas.microsoft.com/office/drawing/2015/9/8/chartex" xmlns:cx2="http://schemas.microsoft.com/office/drawing/2015/10/21/chartex" xmlns:cx3="http://schemas.microsoft.com/office/drawing/2016/5/9/chartex" xmlns:cx4="http://schemas.microsoft.com/office/drawing/2016/5/10/chartex" xmlns:cx5="http://schemas.microsoft.com/office/drawing/2016/5/11/chartex" xmlns:cx6="http://schemas.microsoft.com/office/drawing/2016/5/12/chartex" xmlns:cx7="http://schemas.microsoft.com/office/drawing/2016/5/13/chartex" xmlns:cx8="http://schemas.microsoft.com/office/drawing/2016/5/14/chartex" xmlns:mc="http://schemas.openxmlformats.org/markup-compatibility/2006" xmlns:aink="http://schemas.microsoft.com/office/drawing/2016/ink" xmlns:am3d="http://schemas.microsoft.com/office/drawing/2017/model3d" xmlns:o="urn:schemas-microsoft-com:office:office" xmlns:oel="http://schemas.microsoft.com/office/2019/extlst" xmlns:r="http://schemas.openxmlformats.org/officeDocument/2006/relationships" xmlns:m="http://schemas.openxmlformats.org/officeDocument/2006/math" xmlns:v="urn:schemas-microsoft-com:vml" xmlns:wp14="http://schemas.microsoft.com/office/word/2010/wordprocessingDrawing" xmlns:wp="http://schemas.openxmlformats.org/drawingml/2006/wordprocessingDrawing" xmlns:w10="urn:schemas-microsoft-com:office:word" xmlns:w="http://schemas.openxmlformats.org/wordprocessingml/2006/main" xmlns:w14="http://schemas.microsoft.com/office/word/2010/wordml" xmlns:w15="http://schemas.microsoft.com/office/word/2012/wordml" xmlns:w16cex="http://schemas.microsoft.com/office/word/2018/wordml/cex" xmlns:w16cid="http://schemas.microsoft.com/office/word/2016/wordml/cid" xmlns:w16="http://schemas.microsoft.com/office/word/2018/wordml" xmlns:w16du="http://schemas.microsoft.com/office/word/2023/wordml/word16du" xmlns:w16sdtdh="http://schemas.microsoft.com/office/word/2020/wordml/sdtdatahash" xmlns:w16sdtfl="http://schemas.microsoft.com/office/word/2024/wordml/sdtformatlock" xmlns:w16se="http://schemas.microsoft.com/office/word/2015/wordml/symex" xmlns:wpg="http://schemas.microsoft.com/office/word/2010/wordprocessingGroup" xmlns:wpi="http://schemas.microsoft.com/office/word/2010/wordprocessingInk" xmlns:wne="http://schemas.microsoft.com/office/word/2006/wordml" xmlns:wps="http://schemas.microsoft.com/office/word/2010/wordprocessingShape" mc:Ignorable="w14 w15 w16se w16cid w16 w16cex w16sdtdh w16sdtfl w16du wp14">
   <w:sdt>
     <w:sdtPr>
       <w:rPr>
@@ -4020,7 +3818,7 @@
 </file>
 
 <file path=word/footer2.xml><?xml version="1.0" encoding="utf-8"?>
-<w:ftr xmlns:wpc="http://schemas.microsoft.com/office/word/2010/wordprocessingCanvas" xmlns:cx="http://schemas.microsoft.com/office/drawing/2014/chartex" xmlns:cx1="http://schemas.microsoft.com/office/drawing/2015/9/8/chartex" xmlns:cx2="http://schemas.microsoft.com/office/drawing/2015/10/21/chartex" xmlns:cx3="http://schemas.microsoft.com/office/drawing/2016/5/9/chartex" xmlns:cx4="http://schemas.microsoft.com/office/drawing/2016/5/10/chartex" xmlns:cx5="http://schemas.microsoft.com/office/drawing/2016/5/11/chartex" xmlns:cx6="http://schemas.microsoft.com/office/drawing/2016/5/12/chartex" xmlns:cx7="http://schemas.microsoft.com/office/drawing/2016/5/13/chartex" xmlns:cx8="http://schemas.microsoft.com/office/drawing/2016/5/14/chartex" xmlns:mc="http://schemas.openxmlformats.org/markup-compatibility/2006" xmlns:m="http://schemas.openxmlformats.org/officeDocument/2006/math" xmlns:aink="http://schemas.microsoft.com/office/drawing/2016/ink" xmlns:am3d="http://schemas.microsoft.com/office/drawing/2017/model3d" xmlns:oel="http://schemas.microsoft.com/office/2019/extlst" xmlns:r="http://schemas.openxmlformats.org/officeDocument/2006/relationships" xmlns:wp14="http://schemas.microsoft.com/office/word/2010/wordprocessingDrawing" xmlns:wp="http://schemas.openxmlformats.org/drawingml/2006/wordprocessingDrawing" xmlns:wpg="http://schemas.microsoft.com/office/word/2010/wordprocessingGroup" xmlns:wpi="http://schemas.microsoft.com/office/word/2010/wordprocessingInk" xmlns:wps="http://schemas.microsoft.com/office/word/2010/wordprocessingShape" xmlns:o="urn:schemas-microsoft-com:office:office" xmlns:v="urn:schemas-microsoft-com:vml" xmlns:w10="urn:schemas-microsoft-com:office:word" xmlns:w="http://schemas.openxmlformats.org/wordprocessingml/2006/main" xmlns:w14="http://schemas.microsoft.com/office/word/2010/wordml" xmlns:w15="http://schemas.microsoft.com/office/word/2012/wordml" xmlns:w16cei="http://schemas.microsoft.com/office/word/2026/wordml/cei" xmlns:w16cex="http://schemas.microsoft.com/office/word/2018/wordml/cex" xmlns:w16cid="http://schemas.microsoft.com/office/word/2016/wordml/cid" xmlns:w16="http://schemas.microsoft.com/office/word/2018/wordml" xmlns:w16sdtdh="http://schemas.microsoft.com/office/word/2020/wordml/sdtdatahash" xmlns:w16sdtfl="http://schemas.microsoft.com/office/word/2024/wordml/sdtformatlock" xmlns:w16se="http://schemas.microsoft.com/office/word/2015/wordml/symex" xmlns:w16du="http://schemas.microsoft.com/office/word/2023/wordml/word16du" xmlns:wne="http://schemas.microsoft.com/office/word/2006/wordml" mc:Ignorable="w14 w15 w16se w16cid w16 w16cex w16sdtdh w16sdtfl w16du wp14">
+<w:ftr xmlns:wpc="http://schemas.microsoft.com/office/word/2010/wordprocessingCanvas" xmlns:cx="http://schemas.microsoft.com/office/drawing/2014/chartex" xmlns:cx1="http://schemas.microsoft.com/office/drawing/2015/9/8/chartex" xmlns:cx2="http://schemas.microsoft.com/office/drawing/2015/10/21/chartex" xmlns:cx3="http://schemas.microsoft.com/office/drawing/2016/5/9/chartex" xmlns:cx4="http://schemas.microsoft.com/office/drawing/2016/5/10/chartex" xmlns:cx5="http://schemas.microsoft.com/office/drawing/2016/5/11/chartex" xmlns:cx6="http://schemas.microsoft.com/office/drawing/2016/5/12/chartex" xmlns:cx7="http://schemas.microsoft.com/office/drawing/2016/5/13/chartex" xmlns:cx8="http://schemas.microsoft.com/office/drawing/2016/5/14/chartex" xmlns:mc="http://schemas.openxmlformats.org/markup-compatibility/2006" xmlns:aink="http://schemas.microsoft.com/office/drawing/2016/ink" xmlns:am3d="http://schemas.microsoft.com/office/drawing/2017/model3d" xmlns:o="urn:schemas-microsoft-com:office:office" xmlns:oel="http://schemas.microsoft.com/office/2019/extlst" xmlns:r="http://schemas.openxmlformats.org/officeDocument/2006/relationships" xmlns:m="http://schemas.openxmlformats.org/officeDocument/2006/math" xmlns:v="urn:schemas-microsoft-com:vml" xmlns:wp14="http://schemas.microsoft.com/office/word/2010/wordprocessingDrawing" xmlns:wp="http://schemas.openxmlformats.org/drawingml/2006/wordprocessingDrawing" xmlns:w10="urn:schemas-microsoft-com:office:word" xmlns:w="http://schemas.openxmlformats.org/wordprocessingml/2006/main" xmlns:w14="http://schemas.microsoft.com/office/word/2010/wordml" xmlns:w15="http://schemas.microsoft.com/office/word/2012/wordml" xmlns:w16cex="http://schemas.microsoft.com/office/word/2018/wordml/cex" xmlns:w16cid="http://schemas.microsoft.com/office/word/2016/wordml/cid" xmlns:w16="http://schemas.microsoft.com/office/word/2018/wordml" xmlns:w16du="http://schemas.microsoft.com/office/word/2023/wordml/word16du" xmlns:w16sdtdh="http://schemas.microsoft.com/office/word/2020/wordml/sdtdatahash" xmlns:w16sdtfl="http://schemas.microsoft.com/office/word/2024/wordml/sdtformatlock" xmlns:w16se="http://schemas.microsoft.com/office/word/2015/wordml/symex" xmlns:wpg="http://schemas.microsoft.com/office/word/2010/wordprocessingGroup" xmlns:wpi="http://schemas.microsoft.com/office/word/2010/wordprocessingInk" xmlns:wne="http://schemas.microsoft.com/office/word/2006/wordml" xmlns:wps="http://schemas.microsoft.com/office/word/2010/wordprocessingShape" mc:Ignorable="w14 w15 w16se w16cid w16 w16cex w16sdtdh w16sdtfl w16du wp14">
   <w:tbl>
     <w:tblPr>
       <w:tblStyle w:val="TableGrid"/>
@@ -4066,27 +3864,7 @@
               <w:szCs w:val="20"/>
               <w:lang w:val="en-CA"/>
             </w:rPr>
-            <w:t>{</w:t>
-          </w:r>
-          <w:proofErr w:type="spellStart"/>
-          <w:proofErr w:type="gramStart"/>
-          <w:r>
-            <w:rPr>
-              <w:sz w:val="20"/>
-              <w:szCs w:val="20"/>
-              <w:lang w:val="en-CA"/>
-            </w:rPr>
-            <w:t>c.now:formatD</w:t>
-          </w:r>
-          <w:proofErr w:type="spellEnd"/>
-          <w:proofErr w:type="gramEnd"/>
-          <w:r>
-            <w:rPr>
-              <w:sz w:val="20"/>
-              <w:szCs w:val="20"/>
-              <w:lang w:val="en-CA"/>
-            </w:rPr>
-            <w:t>(LL)}</w:t>
+            <w:t>{c.now:formatD(LL)}</w:t>
           </w:r>
         </w:p>
       </w:tc>
@@ -4226,7 +4004,7 @@
 </file>
 
 <file path=word/footer3.xml><?xml version="1.0" encoding="utf-8"?>
-<w:ftr xmlns:wpc="http://schemas.microsoft.com/office/word/2010/wordprocessingCanvas" xmlns:cx="http://schemas.microsoft.com/office/drawing/2014/chartex" xmlns:cx1="http://schemas.microsoft.com/office/drawing/2015/9/8/chartex" xmlns:cx2="http://schemas.microsoft.com/office/drawing/2015/10/21/chartex" xmlns:cx3="http://schemas.microsoft.com/office/drawing/2016/5/9/chartex" xmlns:cx4="http://schemas.microsoft.com/office/drawing/2016/5/10/chartex" xmlns:cx5="http://schemas.microsoft.com/office/drawing/2016/5/11/chartex" xmlns:cx6="http://schemas.microsoft.com/office/drawing/2016/5/12/chartex" xmlns:cx7="http://schemas.microsoft.com/office/drawing/2016/5/13/chartex" xmlns:cx8="http://schemas.microsoft.com/office/drawing/2016/5/14/chartex" xmlns:mc="http://schemas.openxmlformats.org/markup-compatibility/2006" xmlns:m="http://schemas.openxmlformats.org/officeDocument/2006/math" xmlns:aink="http://schemas.microsoft.com/office/drawing/2016/ink" xmlns:am3d="http://schemas.microsoft.com/office/drawing/2017/model3d" xmlns:oel="http://schemas.microsoft.com/office/2019/extlst" xmlns:r="http://schemas.openxmlformats.org/officeDocument/2006/relationships" xmlns:wp14="http://schemas.microsoft.com/office/word/2010/wordprocessingDrawing" xmlns:wp="http://schemas.openxmlformats.org/drawingml/2006/wordprocessingDrawing" xmlns:wpg="http://schemas.microsoft.com/office/word/2010/wordprocessingGroup" xmlns:wpi="http://schemas.microsoft.com/office/word/2010/wordprocessingInk" xmlns:wps="http://schemas.microsoft.com/office/word/2010/wordprocessingShape" xmlns:o="urn:schemas-microsoft-com:office:office" xmlns:v="urn:schemas-microsoft-com:vml" xmlns:w10="urn:schemas-microsoft-com:office:word" xmlns:w="http://schemas.openxmlformats.org/wordprocessingml/2006/main" xmlns:w14="http://schemas.microsoft.com/office/word/2010/wordml" xmlns:w15="http://schemas.microsoft.com/office/word/2012/wordml" xmlns:w16cei="http://schemas.microsoft.com/office/word/2026/wordml/cei" xmlns:w16cex="http://schemas.microsoft.com/office/word/2018/wordml/cex" xmlns:w16cid="http://schemas.microsoft.com/office/word/2016/wordml/cid" xmlns:w16="http://schemas.microsoft.com/office/word/2018/wordml" xmlns:w16sdtdh="http://schemas.microsoft.com/office/word/2020/wordml/sdtdatahash" xmlns:w16sdtfl="http://schemas.microsoft.com/office/word/2024/wordml/sdtformatlock" xmlns:w16se="http://schemas.microsoft.com/office/word/2015/wordml/symex" xmlns:w16du="http://schemas.microsoft.com/office/word/2023/wordml/word16du" xmlns:wne="http://schemas.microsoft.com/office/word/2006/wordml" mc:Ignorable="w14 w15 w16se w16cid w16 w16cex w16sdtdh w16sdtfl w16du wp14">
+<w:ftr xmlns:wpc="http://schemas.microsoft.com/office/word/2010/wordprocessingCanvas" xmlns:cx="http://schemas.microsoft.com/office/drawing/2014/chartex" xmlns:cx1="http://schemas.microsoft.com/office/drawing/2015/9/8/chartex" xmlns:cx2="http://schemas.microsoft.com/office/drawing/2015/10/21/chartex" xmlns:cx3="http://schemas.microsoft.com/office/drawing/2016/5/9/chartex" xmlns:cx4="http://schemas.microsoft.com/office/drawing/2016/5/10/chartex" xmlns:cx5="http://schemas.microsoft.com/office/drawing/2016/5/11/chartex" xmlns:cx6="http://schemas.microsoft.com/office/drawing/2016/5/12/chartex" xmlns:cx7="http://schemas.microsoft.com/office/drawing/2016/5/13/chartex" xmlns:cx8="http://schemas.microsoft.com/office/drawing/2016/5/14/chartex" xmlns:mc="http://schemas.openxmlformats.org/markup-compatibility/2006" xmlns:aink="http://schemas.microsoft.com/office/drawing/2016/ink" xmlns:am3d="http://schemas.microsoft.com/office/drawing/2017/model3d" xmlns:o="urn:schemas-microsoft-com:office:office" xmlns:oel="http://schemas.microsoft.com/office/2019/extlst" xmlns:r="http://schemas.openxmlformats.org/officeDocument/2006/relationships" xmlns:m="http://schemas.openxmlformats.org/officeDocument/2006/math" xmlns:v="urn:schemas-microsoft-com:vml" xmlns:wp14="http://schemas.microsoft.com/office/word/2010/wordprocessingDrawing" xmlns:wp="http://schemas.openxmlformats.org/drawingml/2006/wordprocessingDrawing" xmlns:w10="urn:schemas-microsoft-com:office:word" xmlns:w="http://schemas.openxmlformats.org/wordprocessingml/2006/main" xmlns:w14="http://schemas.microsoft.com/office/word/2010/wordml" xmlns:w15="http://schemas.microsoft.com/office/word/2012/wordml" xmlns:w16cex="http://schemas.microsoft.com/office/word/2018/wordml/cex" xmlns:w16cid="http://schemas.microsoft.com/office/word/2016/wordml/cid" xmlns:w16="http://schemas.microsoft.com/office/word/2018/wordml" xmlns:w16du="http://schemas.microsoft.com/office/word/2023/wordml/word16du" xmlns:w16sdtdh="http://schemas.microsoft.com/office/word/2020/wordml/sdtdatahash" xmlns:w16sdtfl="http://schemas.microsoft.com/office/word/2024/wordml/sdtformatlock" xmlns:w16se="http://schemas.microsoft.com/office/word/2015/wordml/symex" xmlns:wpg="http://schemas.microsoft.com/office/word/2010/wordprocessingGroup" xmlns:wpi="http://schemas.microsoft.com/office/word/2010/wordprocessingInk" xmlns:wne="http://schemas.microsoft.com/office/word/2006/wordml" xmlns:wps="http://schemas.microsoft.com/office/word/2010/wordprocessingShape" mc:Ignorable="w14 w15 w16se w16cid w16 w16cex w16sdtdh w16sdtfl w16du wp14">
   <w:p>
     <w:pPr>
       <w:pStyle w:val="Footer"/>
@@ -4236,7 +4014,7 @@
 </file>
 
 <file path=word/footnotes.xml><?xml version="1.0" encoding="utf-8"?>
-<w:footnotes xmlns:wpc="http://schemas.microsoft.com/office/word/2010/wordprocessingCanvas" xmlns:cx="http://schemas.microsoft.com/office/drawing/2014/chartex" xmlns:cx1="http://schemas.microsoft.com/office/drawing/2015/9/8/chartex" xmlns:cx2="http://schemas.microsoft.com/office/drawing/2015/10/21/chartex" xmlns:cx3="http://schemas.microsoft.com/office/drawing/2016/5/9/chartex" xmlns:cx4="http://schemas.microsoft.com/office/drawing/2016/5/10/chartex" xmlns:cx5="http://schemas.microsoft.com/office/drawing/2016/5/11/chartex" xmlns:cx6="http://schemas.microsoft.com/office/drawing/2016/5/12/chartex" xmlns:cx7="http://schemas.microsoft.com/office/drawing/2016/5/13/chartex" xmlns:cx8="http://schemas.microsoft.com/office/drawing/2016/5/14/chartex" xmlns:mc="http://schemas.openxmlformats.org/markup-compatibility/2006" xmlns:m="http://schemas.openxmlformats.org/officeDocument/2006/math" xmlns:aink="http://schemas.microsoft.com/office/drawing/2016/ink" xmlns:am3d="http://schemas.microsoft.com/office/drawing/2017/model3d" xmlns:oel="http://schemas.microsoft.com/office/2019/extlst" xmlns:r="http://schemas.openxmlformats.org/officeDocument/2006/relationships" xmlns:wp14="http://schemas.microsoft.com/office/word/2010/wordprocessingDrawing" xmlns:wp="http://schemas.openxmlformats.org/drawingml/2006/wordprocessingDrawing" xmlns:wpg="http://schemas.microsoft.com/office/word/2010/wordprocessingGroup" xmlns:wpi="http://schemas.microsoft.com/office/word/2010/wordprocessingInk" xmlns:wps="http://schemas.microsoft.com/office/word/2010/wordprocessingShape" xmlns:o="urn:schemas-microsoft-com:office:office" xmlns:v="urn:schemas-microsoft-com:vml" xmlns:w10="urn:schemas-microsoft-com:office:word" xmlns:w="http://schemas.openxmlformats.org/wordprocessingml/2006/main" xmlns:w14="http://schemas.microsoft.com/office/word/2010/wordml" xmlns:w15="http://schemas.microsoft.com/office/word/2012/wordml" xmlns:w16cei="http://schemas.microsoft.com/office/word/2026/wordml/cei" xmlns:w16cex="http://schemas.microsoft.com/office/word/2018/wordml/cex" xmlns:w16cid="http://schemas.microsoft.com/office/word/2016/wordml/cid" xmlns:w16="http://schemas.microsoft.com/office/word/2018/wordml" xmlns:w16sdtdh="http://schemas.microsoft.com/office/word/2020/wordml/sdtdatahash" xmlns:w16sdtfl="http://schemas.microsoft.com/office/word/2024/wordml/sdtformatlock" xmlns:w16se="http://schemas.microsoft.com/office/word/2015/wordml/symex" xmlns:w16du="http://schemas.microsoft.com/office/word/2023/wordml/word16du" xmlns:wne="http://schemas.microsoft.com/office/word/2006/wordml" mc:Ignorable="w14 w15 w16se w16cid w16 w16cex w16sdtdh w16sdtfl w16du wp14">
+<w:footnotes xmlns:wpc="http://schemas.microsoft.com/office/word/2010/wordprocessingCanvas" xmlns:cx="http://schemas.microsoft.com/office/drawing/2014/chartex" xmlns:cx1="http://schemas.microsoft.com/office/drawing/2015/9/8/chartex" xmlns:cx2="http://schemas.microsoft.com/office/drawing/2015/10/21/chartex" xmlns:cx3="http://schemas.microsoft.com/office/drawing/2016/5/9/chartex" xmlns:cx4="http://schemas.microsoft.com/office/drawing/2016/5/10/chartex" xmlns:cx5="http://schemas.microsoft.com/office/drawing/2016/5/11/chartex" xmlns:cx6="http://schemas.microsoft.com/office/drawing/2016/5/12/chartex" xmlns:cx7="http://schemas.microsoft.com/office/drawing/2016/5/13/chartex" xmlns:cx8="http://schemas.microsoft.com/office/drawing/2016/5/14/chartex" xmlns:mc="http://schemas.openxmlformats.org/markup-compatibility/2006" xmlns:aink="http://schemas.microsoft.com/office/drawing/2016/ink" xmlns:am3d="http://schemas.microsoft.com/office/drawing/2017/model3d" xmlns:o="urn:schemas-microsoft-com:office:office" xmlns:oel="http://schemas.microsoft.com/office/2019/extlst" xmlns:r="http://schemas.openxmlformats.org/officeDocument/2006/relationships" xmlns:m="http://schemas.openxmlformats.org/officeDocument/2006/math" xmlns:v="urn:schemas-microsoft-com:vml" xmlns:wp14="http://schemas.microsoft.com/office/word/2010/wordprocessingDrawing" xmlns:wp="http://schemas.openxmlformats.org/drawingml/2006/wordprocessingDrawing" xmlns:w10="urn:schemas-microsoft-com:office:word" xmlns:w="http://schemas.openxmlformats.org/wordprocessingml/2006/main" xmlns:w14="http://schemas.microsoft.com/office/word/2010/wordml" xmlns:w15="http://schemas.microsoft.com/office/word/2012/wordml" xmlns:w16cex="http://schemas.microsoft.com/office/word/2018/wordml/cex" xmlns:w16cid="http://schemas.microsoft.com/office/word/2016/wordml/cid" xmlns:w16="http://schemas.microsoft.com/office/word/2018/wordml" xmlns:w16du="http://schemas.microsoft.com/office/word/2023/wordml/word16du" xmlns:w16sdtdh="http://schemas.microsoft.com/office/word/2020/wordml/sdtdatahash" xmlns:w16sdtfl="http://schemas.microsoft.com/office/word/2024/wordml/sdtformatlock" xmlns:w16se="http://schemas.microsoft.com/office/word/2015/wordml/symex" xmlns:wpg="http://schemas.microsoft.com/office/word/2010/wordprocessingGroup" xmlns:wpi="http://schemas.microsoft.com/office/word/2010/wordprocessingInk" xmlns:wne="http://schemas.microsoft.com/office/word/2006/wordml" xmlns:wps="http://schemas.microsoft.com/office/word/2010/wordprocessingShape" mc:Ignorable="w14 w15 w16se w16cid w16 w16cex w16sdtdh w16sdtfl w16du wp14">
   <w:footnote w:type="separator" w:id="-1">
     <w:p>
       <w:r>
@@ -4255,7 +4033,7 @@
 </file>
 
 <file path=word/header1.xml><?xml version="1.0" encoding="utf-8"?>
-<w:hdr xmlns:wpc="http://schemas.microsoft.com/office/word/2010/wordprocessingCanvas" xmlns:cx="http://schemas.microsoft.com/office/drawing/2014/chartex" xmlns:cx1="http://schemas.microsoft.com/office/drawing/2015/9/8/chartex" xmlns:cx2="http://schemas.microsoft.com/office/drawing/2015/10/21/chartex" xmlns:cx3="http://schemas.microsoft.com/office/drawing/2016/5/9/chartex" xmlns:cx4="http://schemas.microsoft.com/office/drawing/2016/5/10/chartex" xmlns:cx5="http://schemas.microsoft.com/office/drawing/2016/5/11/chartex" xmlns:cx6="http://schemas.microsoft.com/office/drawing/2016/5/12/chartex" xmlns:cx7="http://schemas.microsoft.com/office/drawing/2016/5/13/chartex" xmlns:cx8="http://schemas.microsoft.com/office/drawing/2016/5/14/chartex" xmlns:mc="http://schemas.openxmlformats.org/markup-compatibility/2006" xmlns:m="http://schemas.openxmlformats.org/officeDocument/2006/math" xmlns:aink="http://schemas.microsoft.com/office/drawing/2016/ink" xmlns:am3d="http://schemas.microsoft.com/office/drawing/2017/model3d" xmlns:oel="http://schemas.microsoft.com/office/2019/extlst" xmlns:r="http://schemas.openxmlformats.org/officeDocument/2006/relationships" xmlns:wp14="http://schemas.microsoft.com/office/word/2010/wordprocessingDrawing" xmlns:wp="http://schemas.openxmlformats.org/drawingml/2006/wordprocessingDrawing" xmlns:wpg="http://schemas.microsoft.com/office/word/2010/wordprocessingGroup" xmlns:wpi="http://schemas.microsoft.com/office/word/2010/wordprocessingInk" xmlns:wps="http://schemas.microsoft.com/office/word/2010/wordprocessingShape" xmlns:o="urn:schemas-microsoft-com:office:office" xmlns:v="urn:schemas-microsoft-com:vml" xmlns:w10="urn:schemas-microsoft-com:office:word" xmlns:w="http://schemas.openxmlformats.org/wordprocessingml/2006/main" xmlns:w14="http://schemas.microsoft.com/office/word/2010/wordml" xmlns:w15="http://schemas.microsoft.com/office/word/2012/wordml" xmlns:w16cei="http://schemas.microsoft.com/office/word/2026/wordml/cei" xmlns:w16cex="http://schemas.microsoft.com/office/word/2018/wordml/cex" xmlns:w16cid="http://schemas.microsoft.com/office/word/2016/wordml/cid" xmlns:w16="http://schemas.microsoft.com/office/word/2018/wordml" xmlns:w16sdtdh="http://schemas.microsoft.com/office/word/2020/wordml/sdtdatahash" xmlns:w16sdtfl="http://schemas.microsoft.com/office/word/2024/wordml/sdtformatlock" xmlns:w16se="http://schemas.microsoft.com/office/word/2015/wordml/symex" xmlns:w16du="http://schemas.microsoft.com/office/word/2023/wordml/word16du" xmlns:wne="http://schemas.microsoft.com/office/word/2006/wordml" mc:Ignorable="w14 w15 w16se w16cid w16 w16cex w16sdtdh w16sdtfl w16du wp14">
+<w:hdr xmlns:wpc="http://schemas.microsoft.com/office/word/2010/wordprocessingCanvas" xmlns:cx="http://schemas.microsoft.com/office/drawing/2014/chartex" xmlns:cx1="http://schemas.microsoft.com/office/drawing/2015/9/8/chartex" xmlns:cx2="http://schemas.microsoft.com/office/drawing/2015/10/21/chartex" xmlns:cx3="http://schemas.microsoft.com/office/drawing/2016/5/9/chartex" xmlns:cx4="http://schemas.microsoft.com/office/drawing/2016/5/10/chartex" xmlns:cx5="http://schemas.microsoft.com/office/drawing/2016/5/11/chartex" xmlns:cx6="http://schemas.microsoft.com/office/drawing/2016/5/12/chartex" xmlns:cx7="http://schemas.microsoft.com/office/drawing/2016/5/13/chartex" xmlns:cx8="http://schemas.microsoft.com/office/drawing/2016/5/14/chartex" xmlns:mc="http://schemas.openxmlformats.org/markup-compatibility/2006" xmlns:aink="http://schemas.microsoft.com/office/drawing/2016/ink" xmlns:am3d="http://schemas.microsoft.com/office/drawing/2017/model3d" xmlns:o="urn:schemas-microsoft-com:office:office" xmlns:oel="http://schemas.microsoft.com/office/2019/extlst" xmlns:r="http://schemas.openxmlformats.org/officeDocument/2006/relationships" xmlns:m="http://schemas.openxmlformats.org/officeDocument/2006/math" xmlns:v="urn:schemas-microsoft-com:vml" xmlns:wp14="http://schemas.microsoft.com/office/word/2010/wordprocessingDrawing" xmlns:wp="http://schemas.openxmlformats.org/drawingml/2006/wordprocessingDrawing" xmlns:w10="urn:schemas-microsoft-com:office:word" xmlns:w="http://schemas.openxmlformats.org/wordprocessingml/2006/main" xmlns:w14="http://schemas.microsoft.com/office/word/2010/wordml" xmlns:w15="http://schemas.microsoft.com/office/word/2012/wordml" xmlns:w16cex="http://schemas.microsoft.com/office/word/2018/wordml/cex" xmlns:w16cid="http://schemas.microsoft.com/office/word/2016/wordml/cid" xmlns:w16="http://schemas.microsoft.com/office/word/2018/wordml" xmlns:w16du="http://schemas.microsoft.com/office/word/2023/wordml/word16du" xmlns:w16sdtdh="http://schemas.microsoft.com/office/word/2020/wordml/sdtdatahash" xmlns:w16sdtfl="http://schemas.microsoft.com/office/word/2024/wordml/sdtformatlock" xmlns:w16se="http://schemas.microsoft.com/office/word/2015/wordml/symex" xmlns:wpg="http://schemas.microsoft.com/office/word/2010/wordprocessingGroup" xmlns:wpi="http://schemas.microsoft.com/office/word/2010/wordprocessingInk" xmlns:wne="http://schemas.microsoft.com/office/word/2006/wordml" xmlns:wps="http://schemas.microsoft.com/office/word/2010/wordprocessingShape" mc:Ignorable="w14 w15 w16se w16cid w16 w16cex w16sdtdh w16sdtfl w16du wp14">
   <w:p>
     <w:pPr>
       <w:pStyle w:val="Header"/>
@@ -4265,7 +4043,7 @@
 </file>
 
 <file path=word/header2.xml><?xml version="1.0" encoding="utf-8"?>
-<w:hdr xmlns:wpc="http://schemas.microsoft.com/office/word/2010/wordprocessingCanvas" xmlns:cx="http://schemas.microsoft.com/office/drawing/2014/chartex" xmlns:cx1="http://schemas.microsoft.com/office/drawing/2015/9/8/chartex" xmlns:cx2="http://schemas.microsoft.com/office/drawing/2015/10/21/chartex" xmlns:cx3="http://schemas.microsoft.com/office/drawing/2016/5/9/chartex" xmlns:cx4="http://schemas.microsoft.com/office/drawing/2016/5/10/chartex" xmlns:cx5="http://schemas.microsoft.com/office/drawing/2016/5/11/chartex" xmlns:cx6="http://schemas.microsoft.com/office/drawing/2016/5/12/chartex" xmlns:cx7="http://schemas.microsoft.com/office/drawing/2016/5/13/chartex" xmlns:cx8="http://schemas.microsoft.com/office/drawing/2016/5/14/chartex" xmlns:mc="http://schemas.openxmlformats.org/markup-compatibility/2006" xmlns:m="http://schemas.openxmlformats.org/officeDocument/2006/math" xmlns:aink="http://schemas.microsoft.com/office/drawing/2016/ink" xmlns:am3d="http://schemas.microsoft.com/office/drawing/2017/model3d" xmlns:oel="http://schemas.microsoft.com/office/2019/extlst" xmlns:r="http://schemas.openxmlformats.org/officeDocument/2006/relationships" xmlns:wp14="http://schemas.microsoft.com/office/word/2010/wordprocessingDrawing" xmlns:wp="http://schemas.openxmlformats.org/drawingml/2006/wordprocessingDrawing" xmlns:wpg="http://schemas.microsoft.com/office/word/2010/wordprocessingGroup" xmlns:wpi="http://schemas.microsoft.com/office/word/2010/wordprocessingInk" xmlns:wps="http://schemas.microsoft.com/office/word/2010/wordprocessingShape" xmlns:o="urn:schemas-microsoft-com:office:office" xmlns:v="urn:schemas-microsoft-com:vml" xmlns:w10="urn:schemas-microsoft-com:office:word" xmlns:w="http://schemas.openxmlformats.org/wordprocessingml/2006/main" xmlns:w14="http://schemas.microsoft.com/office/word/2010/wordml" xmlns:w15="http://schemas.microsoft.com/office/word/2012/wordml" xmlns:w16cei="http://schemas.microsoft.com/office/word/2026/wordml/cei" xmlns:w16cex="http://schemas.microsoft.com/office/word/2018/wordml/cex" xmlns:w16cid="http://schemas.microsoft.com/office/word/2016/wordml/cid" xmlns:w16="http://schemas.microsoft.com/office/word/2018/wordml" xmlns:w16sdtdh="http://schemas.microsoft.com/office/word/2020/wordml/sdtdatahash" xmlns:w16sdtfl="http://schemas.microsoft.com/office/word/2024/wordml/sdtformatlock" xmlns:w16se="http://schemas.microsoft.com/office/word/2015/wordml/symex" xmlns:w16du="http://schemas.microsoft.com/office/word/2023/wordml/word16du" xmlns:wne="http://schemas.microsoft.com/office/word/2006/wordml" mc:Ignorable="w14 w15 w16se w16cid w16 w16cex w16sdtdh w16sdtfl w16du wp14">
+<w:hdr xmlns:wpc="http://schemas.microsoft.com/office/word/2010/wordprocessingCanvas" xmlns:cx="http://schemas.microsoft.com/office/drawing/2014/chartex" xmlns:cx1="http://schemas.microsoft.com/office/drawing/2015/9/8/chartex" xmlns:cx2="http://schemas.microsoft.com/office/drawing/2015/10/21/chartex" xmlns:cx3="http://schemas.microsoft.com/office/drawing/2016/5/9/chartex" xmlns:cx4="http://schemas.microsoft.com/office/drawing/2016/5/10/chartex" xmlns:cx5="http://schemas.microsoft.com/office/drawing/2016/5/11/chartex" xmlns:cx6="http://schemas.microsoft.com/office/drawing/2016/5/12/chartex" xmlns:cx7="http://schemas.microsoft.com/office/drawing/2016/5/13/chartex" xmlns:cx8="http://schemas.microsoft.com/office/drawing/2016/5/14/chartex" xmlns:mc="http://schemas.openxmlformats.org/markup-compatibility/2006" xmlns:aink="http://schemas.microsoft.com/office/drawing/2016/ink" xmlns:am3d="http://schemas.microsoft.com/office/drawing/2017/model3d" xmlns:o="urn:schemas-microsoft-com:office:office" xmlns:oel="http://schemas.microsoft.com/office/2019/extlst" xmlns:r="http://schemas.openxmlformats.org/officeDocument/2006/relationships" xmlns:m="http://schemas.openxmlformats.org/officeDocument/2006/math" xmlns:v="urn:schemas-microsoft-com:vml" xmlns:wp14="http://schemas.microsoft.com/office/word/2010/wordprocessingDrawing" xmlns:wp="http://schemas.openxmlformats.org/drawingml/2006/wordprocessingDrawing" xmlns:w10="urn:schemas-microsoft-com:office:word" xmlns:w="http://schemas.openxmlformats.org/wordprocessingml/2006/main" xmlns:w14="http://schemas.microsoft.com/office/word/2010/wordml" xmlns:w15="http://schemas.microsoft.com/office/word/2012/wordml" xmlns:w16cex="http://schemas.microsoft.com/office/word/2018/wordml/cex" xmlns:w16cid="http://schemas.microsoft.com/office/word/2016/wordml/cid" xmlns:w16="http://schemas.microsoft.com/office/word/2018/wordml" xmlns:w16du="http://schemas.microsoft.com/office/word/2023/wordml/word16du" xmlns:w16sdtdh="http://schemas.microsoft.com/office/word/2020/wordml/sdtdatahash" xmlns:w16sdtfl="http://schemas.microsoft.com/office/word/2024/wordml/sdtformatlock" xmlns:w16se="http://schemas.microsoft.com/office/word/2015/wordml/symex" xmlns:wpg="http://schemas.microsoft.com/office/word/2010/wordprocessingGroup" xmlns:wpi="http://schemas.microsoft.com/office/word/2010/wordprocessingInk" xmlns:wne="http://schemas.microsoft.com/office/word/2006/wordml" xmlns:wps="http://schemas.microsoft.com/office/word/2010/wordprocessingShape" mc:Ignorable="w14 w15 w16se w16cid w16 w16cex w16sdtdh w16sdtfl w16du wp14">
   <w:p>
     <w:pPr>
       <w:pStyle w:val="Header"/>
@@ -4275,7 +4053,7 @@
 </file>
 
 <file path=word/header3.xml><?xml version="1.0" encoding="utf-8"?>
-<w:hdr xmlns:wpc="http://schemas.microsoft.com/office/word/2010/wordprocessingCanvas" xmlns:cx="http://schemas.microsoft.com/office/drawing/2014/chartex" xmlns:cx1="http://schemas.microsoft.com/office/drawing/2015/9/8/chartex" xmlns:cx2="http://schemas.microsoft.com/office/drawing/2015/10/21/chartex" xmlns:cx3="http://schemas.microsoft.com/office/drawing/2016/5/9/chartex" xmlns:cx4="http://schemas.microsoft.com/office/drawing/2016/5/10/chartex" xmlns:cx5="http://schemas.microsoft.com/office/drawing/2016/5/11/chartex" xmlns:cx6="http://schemas.microsoft.com/office/drawing/2016/5/12/chartex" xmlns:cx7="http://schemas.microsoft.com/office/drawing/2016/5/13/chartex" xmlns:cx8="http://schemas.microsoft.com/office/drawing/2016/5/14/chartex" xmlns:mc="http://schemas.openxmlformats.org/markup-compatibility/2006" xmlns:m="http://schemas.openxmlformats.org/officeDocument/2006/math" xmlns:aink="http://schemas.microsoft.com/office/drawing/2016/ink" xmlns:am3d="http://schemas.microsoft.com/office/drawing/2017/model3d" xmlns:oel="http://schemas.microsoft.com/office/2019/extlst" xmlns:r="http://schemas.openxmlformats.org/officeDocument/2006/relationships" xmlns:wp14="http://schemas.microsoft.com/office/word/2010/wordprocessingDrawing" xmlns:wp="http://schemas.openxmlformats.org/drawingml/2006/wordprocessingDrawing" xmlns:wpg="http://schemas.microsoft.com/office/word/2010/wordprocessingGroup" xmlns:wpi="http://schemas.microsoft.com/office/word/2010/wordprocessingInk" xmlns:wps="http://schemas.microsoft.com/office/word/2010/wordprocessingShape" xmlns:o="urn:schemas-microsoft-com:office:office" xmlns:v="urn:schemas-microsoft-com:vml" xmlns:w10="urn:schemas-microsoft-com:office:word" xmlns:w="http://schemas.openxmlformats.org/wordprocessingml/2006/main" xmlns:w14="http://schemas.microsoft.com/office/word/2010/wordml" xmlns:w15="http://schemas.microsoft.com/office/word/2012/wordml" xmlns:w16cei="http://schemas.microsoft.com/office/word/2026/wordml/cei" xmlns:w16cex="http://schemas.microsoft.com/office/word/2018/wordml/cex" xmlns:w16cid="http://schemas.microsoft.com/office/word/2016/wordml/cid" xmlns:w16="http://schemas.microsoft.com/office/word/2018/wordml" xmlns:w16sdtdh="http://schemas.microsoft.com/office/word/2020/wordml/sdtdatahash" xmlns:w16sdtfl="http://schemas.microsoft.com/office/word/2024/wordml/sdtformatlock" xmlns:w16se="http://schemas.microsoft.com/office/word/2015/wordml/symex" xmlns:w16du="http://schemas.microsoft.com/office/word/2023/wordml/word16du" xmlns:wne="http://schemas.microsoft.com/office/word/2006/wordml" mc:Ignorable="w14 w15 w16se w16cid w16 w16cex w16sdtdh w16sdtfl w16du wp14">
+<w:hdr xmlns:wpc="http://schemas.microsoft.com/office/word/2010/wordprocessingCanvas" xmlns:cx="http://schemas.microsoft.com/office/drawing/2014/chartex" xmlns:cx1="http://schemas.microsoft.com/office/drawing/2015/9/8/chartex" xmlns:cx2="http://schemas.microsoft.com/office/drawing/2015/10/21/chartex" xmlns:cx3="http://schemas.microsoft.com/office/drawing/2016/5/9/chartex" xmlns:cx4="http://schemas.microsoft.com/office/drawing/2016/5/10/chartex" xmlns:cx5="http://schemas.microsoft.com/office/drawing/2016/5/11/chartex" xmlns:cx6="http://schemas.microsoft.com/office/drawing/2016/5/12/chartex" xmlns:cx7="http://schemas.microsoft.com/office/drawing/2016/5/13/chartex" xmlns:cx8="http://schemas.microsoft.com/office/drawing/2016/5/14/chartex" xmlns:mc="http://schemas.openxmlformats.org/markup-compatibility/2006" xmlns:aink="http://schemas.microsoft.com/office/drawing/2016/ink" xmlns:am3d="http://schemas.microsoft.com/office/drawing/2017/model3d" xmlns:o="urn:schemas-microsoft-com:office:office" xmlns:oel="http://schemas.microsoft.com/office/2019/extlst" xmlns:r="http://schemas.openxmlformats.org/officeDocument/2006/relationships" xmlns:m="http://schemas.openxmlformats.org/officeDocument/2006/math" xmlns:v="urn:schemas-microsoft-com:vml" xmlns:wp14="http://schemas.microsoft.com/office/word/2010/wordprocessingDrawing" xmlns:wp="http://schemas.openxmlformats.org/drawingml/2006/wordprocessingDrawing" xmlns:w10="urn:schemas-microsoft-com:office:word" xmlns:w="http://schemas.openxmlformats.org/wordprocessingml/2006/main" xmlns:w14="http://schemas.microsoft.com/office/word/2010/wordml" xmlns:w15="http://schemas.microsoft.com/office/word/2012/wordml" xmlns:w16cex="http://schemas.microsoft.com/office/word/2018/wordml/cex" xmlns:w16cid="http://schemas.microsoft.com/office/word/2016/wordml/cid" xmlns:w16="http://schemas.microsoft.com/office/word/2018/wordml" xmlns:w16du="http://schemas.microsoft.com/office/word/2023/wordml/word16du" xmlns:w16sdtdh="http://schemas.microsoft.com/office/word/2020/wordml/sdtdatahash" xmlns:w16sdtfl="http://schemas.microsoft.com/office/word/2024/wordml/sdtformatlock" xmlns:w16se="http://schemas.microsoft.com/office/word/2015/wordml/symex" xmlns:wpg="http://schemas.microsoft.com/office/word/2010/wordprocessingGroup" xmlns:wpi="http://schemas.microsoft.com/office/word/2010/wordprocessingInk" xmlns:wne="http://schemas.microsoft.com/office/word/2006/wordml" xmlns:wps="http://schemas.microsoft.com/office/word/2010/wordprocessingShape" mc:Ignorable="w14 w15 w16se w16cid w16 w16cex w16sdtdh w16sdtfl w16du wp14">
   <w:p>
     <w:pPr>
       <w:pStyle w:val="Header"/>
@@ -4285,7 +4063,7 @@
 </file>
 
 <file path=word/numbering.xml><?xml version="1.0" encoding="utf-8"?>
-<w:numbering xmlns:wpc="http://schemas.microsoft.com/office/word/2010/wordprocessingCanvas" xmlns:cx="http://schemas.microsoft.com/office/drawing/2014/chartex" xmlns:cx1="http://schemas.microsoft.com/office/drawing/2015/9/8/chartex" xmlns:cx2="http://schemas.microsoft.com/office/drawing/2015/10/21/chartex" xmlns:cx3="http://schemas.microsoft.com/office/drawing/2016/5/9/chartex" xmlns:cx4="http://schemas.microsoft.com/office/drawing/2016/5/10/chartex" xmlns:cx5="http://schemas.microsoft.com/office/drawing/2016/5/11/chartex" xmlns:cx6="http://schemas.microsoft.com/office/drawing/2016/5/12/chartex" xmlns:cx7="http://schemas.microsoft.com/office/drawing/2016/5/13/chartex" xmlns:cx8="http://schemas.microsoft.com/office/drawing/2016/5/14/chartex" xmlns:mc="http://schemas.openxmlformats.org/markup-compatibility/2006" xmlns:m="http://schemas.openxmlformats.org/officeDocument/2006/math" xmlns:aink="http://schemas.microsoft.com/office/drawing/2016/ink" xmlns:am3d="http://schemas.microsoft.com/office/drawing/2017/model3d" xmlns:oel="http://schemas.microsoft.com/office/2019/extlst" xmlns:r="http://schemas.openxmlformats.org/officeDocument/2006/relationships" xmlns:wp14="http://schemas.microsoft.com/office/word/2010/wordprocessingDrawing" xmlns:wp="http://schemas.openxmlformats.org/drawingml/2006/wordprocessingDrawing" xmlns:wpg="http://schemas.microsoft.com/office/word/2010/wordprocessingGroup" xmlns:wpi="http://schemas.microsoft.com/office/word/2010/wordprocessingInk" xmlns:wps="http://schemas.microsoft.com/office/word/2010/wordprocessingShape" xmlns:o="urn:schemas-microsoft-com:office:office" xmlns:v="urn:schemas-microsoft-com:vml" xmlns:w10="urn:schemas-microsoft-com:office:word" xmlns:w="http://schemas.openxmlformats.org/wordprocessingml/2006/main" xmlns:w14="http://schemas.microsoft.com/office/word/2010/wordml" xmlns:w15="http://schemas.microsoft.com/office/word/2012/wordml" xmlns:w16cei="http://schemas.microsoft.com/office/word/2026/wordml/cei" xmlns:w16cex="http://schemas.microsoft.com/office/word/2018/wordml/cex" xmlns:w16cid="http://schemas.microsoft.com/office/word/2016/wordml/cid" xmlns:w16="http://schemas.microsoft.com/office/word/2018/wordml" xmlns:w16sdtdh="http://schemas.microsoft.com/office/word/2020/wordml/sdtdatahash" xmlns:w16sdtfl="http://schemas.microsoft.com/office/word/2024/wordml/sdtformatlock" xmlns:w16se="http://schemas.microsoft.com/office/word/2015/wordml/symex" xmlns:w16du="http://schemas.microsoft.com/office/word/2023/wordml/word16du" xmlns:wne="http://schemas.microsoft.com/office/word/2006/wordml" mc:Ignorable="w14 w15 w16se w16cid w16 w16cex w16sdtdh w16sdtfl w16du wp14">
+<w:numbering xmlns:wpc="http://schemas.microsoft.com/office/word/2010/wordprocessingCanvas" xmlns:cx="http://schemas.microsoft.com/office/drawing/2014/chartex" xmlns:cx1="http://schemas.microsoft.com/office/drawing/2015/9/8/chartex" xmlns:cx2="http://schemas.microsoft.com/office/drawing/2015/10/21/chartex" xmlns:cx3="http://schemas.microsoft.com/office/drawing/2016/5/9/chartex" xmlns:cx4="http://schemas.microsoft.com/office/drawing/2016/5/10/chartex" xmlns:cx5="http://schemas.microsoft.com/office/drawing/2016/5/11/chartex" xmlns:cx6="http://schemas.microsoft.com/office/drawing/2016/5/12/chartex" xmlns:cx7="http://schemas.microsoft.com/office/drawing/2016/5/13/chartex" xmlns:cx8="http://schemas.microsoft.com/office/drawing/2016/5/14/chartex" xmlns:mc="http://schemas.openxmlformats.org/markup-compatibility/2006" xmlns:aink="http://schemas.microsoft.com/office/drawing/2016/ink" xmlns:am3d="http://schemas.microsoft.com/office/drawing/2017/model3d" xmlns:o="urn:schemas-microsoft-com:office:office" xmlns:oel="http://schemas.microsoft.com/office/2019/extlst" xmlns:r="http://schemas.openxmlformats.org/officeDocument/2006/relationships" xmlns:m="http://schemas.openxmlformats.org/officeDocument/2006/math" xmlns:v="urn:schemas-microsoft-com:vml" xmlns:wp14="http://schemas.microsoft.com/office/word/2010/wordprocessingDrawing" xmlns:wp="http://schemas.openxmlformats.org/drawingml/2006/wordprocessingDrawing" xmlns:w10="urn:schemas-microsoft-com:office:word" xmlns:w="http://schemas.openxmlformats.org/wordprocessingml/2006/main" xmlns:w14="http://schemas.microsoft.com/office/word/2010/wordml" xmlns:w15="http://schemas.microsoft.com/office/word/2012/wordml" xmlns:w16cex="http://schemas.microsoft.com/office/word/2018/wordml/cex" xmlns:w16cid="http://schemas.microsoft.com/office/word/2016/wordml/cid" xmlns:w16="http://schemas.microsoft.com/office/word/2018/wordml" xmlns:w16du="http://schemas.microsoft.com/office/word/2023/wordml/word16du" xmlns:w16sdtdh="http://schemas.microsoft.com/office/word/2020/wordml/sdtdatahash" xmlns:w16sdtfl="http://schemas.microsoft.com/office/word/2024/wordml/sdtformatlock" xmlns:w16se="http://schemas.microsoft.com/office/word/2015/wordml/symex" xmlns:wpg="http://schemas.microsoft.com/office/word/2010/wordprocessingGroup" xmlns:wpi="http://schemas.microsoft.com/office/word/2010/wordprocessingInk" xmlns:wne="http://schemas.microsoft.com/office/word/2006/wordml" xmlns:wps="http://schemas.microsoft.com/office/word/2010/wordprocessingShape" mc:Ignorable="w14 w15 w16se w16cid w16 w16cex w16sdtdh w16sdtfl w16du wp14">
   <w:abstractNum w:abstractNumId="0" w15:restartNumberingAfterBreak="0">
     <w:nsid w:val="56246D06"/>
     <w:multiLevelType w:val="hybridMultilevel"/>
@@ -4297,7 +4075,6 @@
       <w:lvlJc w:val="left"/>
       <w:pPr>
         <w:ind w:left="888" w:hanging="311"/>
-        <w:jc w:val="left"/>
       </w:pPr>
       <w:rPr>
         <w:rFonts w:ascii="BC Sans" w:eastAsia="BC Sans" w:hAnsi="BC Sans" w:cs="BC Sans" w:hint="default"/>
@@ -4320,7 +4097,6 @@
       <w:lvlJc w:val="left"/>
       <w:pPr>
         <w:ind w:left="1278" w:hanging="248"/>
-        <w:jc w:val="left"/>
       </w:pPr>
       <w:rPr>
         <w:rFonts w:ascii="BC Sans" w:eastAsia="BC Sans" w:hAnsi="BC Sans" w:cs="BC Sans" w:hint="default"/>
@@ -4428,7 +4204,7 @@
 </file>
 
 <file path=word/styles.xml><?xml version="1.0" encoding="utf-8"?>
-<w:styles xmlns:mc="http://schemas.openxmlformats.org/markup-compatibility/2006" xmlns:r="http://schemas.openxmlformats.org/officeDocument/2006/relationships" xmlns:w="http://schemas.openxmlformats.org/wordprocessingml/2006/main" xmlns:w14="http://schemas.microsoft.com/office/word/2010/wordml" xmlns:w15="http://schemas.microsoft.com/office/word/2012/wordml" xmlns:w16cex="http://schemas.microsoft.com/office/word/2018/wordml/cex" xmlns:w16cid="http://schemas.microsoft.com/office/word/2016/wordml/cid" xmlns:w16="http://schemas.microsoft.com/office/word/2018/wordml" xmlns:w16sdtdh="http://schemas.microsoft.com/office/word/2020/wordml/sdtdatahash" xmlns:w16sdtfl="http://schemas.microsoft.com/office/word/2024/wordml/sdtformatlock" xmlns:w16se="http://schemas.microsoft.com/office/word/2015/wordml/symex" xmlns:w16du="http://schemas.microsoft.com/office/word/2023/wordml/word16du" mc:Ignorable="w14 w15 w16se w16cid w16 w16cex w16sdtdh w16sdtfl w16du">
+<w:styles xmlns:mc="http://schemas.openxmlformats.org/markup-compatibility/2006" xmlns:r="http://schemas.openxmlformats.org/officeDocument/2006/relationships" xmlns:w="http://schemas.openxmlformats.org/wordprocessingml/2006/main" xmlns:w14="http://schemas.microsoft.com/office/word/2010/wordml" xmlns:w15="http://schemas.microsoft.com/office/word/2012/wordml" xmlns:w16cex="http://schemas.microsoft.com/office/word/2018/wordml/cex" xmlns:w16cid="http://schemas.microsoft.com/office/word/2016/wordml/cid" xmlns:w16="http://schemas.microsoft.com/office/word/2018/wordml" xmlns:w16du="http://schemas.microsoft.com/office/word/2023/wordml/word16du" xmlns:w16sdtdh="http://schemas.microsoft.com/office/word/2020/wordml/sdtdatahash" xmlns:w16sdtfl="http://schemas.microsoft.com/office/word/2024/wordml/sdtformatlock" xmlns:w16se="http://schemas.microsoft.com/office/word/2015/wordml/symex" mc:Ignorable="w14 w15 w16se w16cid w16 w16cex w16sdtdh w16sdtfl w16du">
   <w:docDefaults>
     <w:rPrDefault>
       <w:rPr>
@@ -5321,18 +5097,13 @@
 </file>
 
 <file path=customXml/item1.xml><?xml version="1.0" encoding="utf-8"?>
+<b:Sources xmlns:b="http://schemas.openxmlformats.org/officeDocument/2006/bibliography" xmlns="http://schemas.openxmlformats.org/officeDocument/2006/bibliography" SelectedStyle="/APASixthEditionOfficeOnline.xsl" StyleName="APA" Version="6"/>
+</file>
+
+<file path=customXml/item2.xml><?xml version="1.0" encoding="utf-8"?>
 <p:properties xmlns:p="http://schemas.microsoft.com/office/2006/metadata/properties" xmlns:xsi="http://www.w3.org/2001/XMLSchema-instance" xmlns:pc="http://schemas.microsoft.com/office/infopath/2007/PartnerControls">
   <documentManagement/>
 </p:properties>
-</file>
-
-<file path=customXml/item2.xml><?xml version="1.0" encoding="utf-8"?>
-<?mso-contentType ?>
-<FormTemplates xmlns="http://schemas.microsoft.com/sharepoint/v3/contenttype/forms">
-  <Display>DocumentLibraryForm</Display>
-  <Edit>DocumentLibraryForm</Edit>
-  <New>DocumentLibraryForm</New>
-</FormTemplates>
 </file>
 
 <file path=customXml/item3.xml><?xml version="1.0" encoding="utf-8"?>
@@ -5474,22 +5245,27 @@
 </file>
 
 <file path=customXml/item4.xml><?xml version="1.0" encoding="utf-8"?>
-<b:Sources xmlns:b="http://schemas.openxmlformats.org/officeDocument/2006/bibliography" xmlns="http://schemas.openxmlformats.org/officeDocument/2006/bibliography" SelectedStyle="/APASixthEditionOfficeOnline.xsl" StyleName="APA" Version="6"/>
+<?mso-contentType ?>
+<FormTemplates xmlns="http://schemas.microsoft.com/sharepoint/v3/contenttype/forms">
+  <Display>DocumentLibraryForm</Display>
+  <Edit>DocumentLibraryForm</Edit>
+  <New>DocumentLibraryForm</New>
+</FormTemplates>
 </file>
 
 <file path=customXml/itemProps1.xml><?xml version="1.0" encoding="utf-8"?>
-<ds:datastoreItem xmlns:ds="http://schemas.openxmlformats.org/officeDocument/2006/customXml" ds:itemID="{FB28D713-AE56-4600-A1B5-878C5B119E51}">
+<ds:datastoreItem xmlns:ds="http://schemas.openxmlformats.org/officeDocument/2006/customXml" ds:itemID="{1835E606-DD21-8B47-BCAF-5D624211E492}">
   <ds:schemaRefs>
-    <ds:schemaRef ds:uri="http://schemas.microsoft.com/office/2006/metadata/properties"/>
-    <ds:schemaRef ds:uri="http://schemas.microsoft.com/office/infopath/2007/PartnerControls"/>
+    <ds:schemaRef ds:uri="http://schemas.openxmlformats.org/officeDocument/2006/bibliography"/>
   </ds:schemaRefs>
 </ds:datastoreItem>
 </file>
 
 <file path=customXml/itemProps2.xml><?xml version="1.0" encoding="utf-8"?>
-<ds:datastoreItem xmlns:ds="http://schemas.openxmlformats.org/officeDocument/2006/customXml" ds:itemID="{CC456AED-91D3-415B-ACC0-E9510B41E420}">
+<ds:datastoreItem xmlns:ds="http://schemas.openxmlformats.org/officeDocument/2006/customXml" ds:itemID="{FB28D713-AE56-4600-A1B5-878C5B119E51}">
   <ds:schemaRefs>
-    <ds:schemaRef ds:uri="http://schemas.microsoft.com/sharepoint/v3/contenttype/forms"/>
+    <ds:schemaRef ds:uri="http://schemas.microsoft.com/office/2006/metadata/properties"/>
+    <ds:schemaRef ds:uri="http://schemas.microsoft.com/office/infopath/2007/PartnerControls"/>
   </ds:schemaRefs>
 </ds:datastoreItem>
 </file>
@@ -5513,9 +5289,9 @@
 </file>
 
 <file path=customXml/itemProps4.xml><?xml version="1.0" encoding="utf-8"?>
-<ds:datastoreItem xmlns:ds="http://schemas.openxmlformats.org/officeDocument/2006/customXml" ds:itemID="{1835E606-DD21-8B47-BCAF-5D624211E492}">
+<ds:datastoreItem xmlns:ds="http://schemas.openxmlformats.org/officeDocument/2006/customXml" ds:itemID="{CC456AED-91D3-415B-ACC0-E9510B41E420}">
   <ds:schemaRefs>
-    <ds:schemaRef ds:uri="http://schemas.openxmlformats.org/officeDocument/2006/bibliography"/>
+    <ds:schemaRef ds:uri="http://schemas.microsoft.com/sharepoint/v3/contenttype/forms"/>
   </ds:schemaRefs>
 </ds:datastoreItem>
 </file>
</xml_diff>